<commit_message>
fix: repair lock audio and lyric regressions
</commit_message>
<xml_diff>
--- a/docs/maintenance/AI开发项目_Bug修改规范.docx
+++ b/docs/maintenance/AI开发项目_Bug修改规范.docx
@@ -624,6 +624,66 @@
         <w:t>粤语使用汉字，禁止复用英语/日韩的“删除所有中文字符”朗读方案。新增粤语时必须同时核对：角色与 AI 账户选项、微信语音、系统/内置/外置 TTS、浏览器/外置/内置 STT、微信电话、电话软件、陌生来电、语音留言及影院陪看。当前标准映射为 MiniMax Chinese,Yue、浏览器 yue-HK、腾讯 16k_yue；外置 OpenAI 兼容转写使用 zh。提示词必须明确“自然粤语原文 + 逐句普通话中文翻译”，不能用“原文不能含中文”这种与粤语冲突的规则。</w:t>
       </w:r>
     </w:p>
+    <w:p>
+      <w:pPr>
+        <w:pStyle w:val="Heading1"/>
+      </w:pPr>
+      <w:r>
+        <w:t>回归规则补充（2026-08-05，v790）</w:t>
+      </w:r>
+    </w:p>
+    <w:p>
+      <w:pPr>
+        <w:pStyle w:val="Heading2"/>
+      </w:pPr>
+      <w:r>
+        <w:t>屏保与页面可见性</w:t>
+      </w:r>
+    </w:p>
+    <w:p>
+      <w:r>
+        <w:t>visibilitychange 不是“用户真正退出应用”的充分条件。禁止在 hidden 事件中无条件写 locked=true；应记录离开时间，在恢复时按持续时间判定，冷启动与 beforeunload 另行处理。锁屏测试必须同时包含短暂隐藏不锁、持续后台恢复后锁、首次启动锁三类。</w:t>
+      </w:r>
+    </w:p>
+    <w:p>
+      <w:pPr>
+        <w:pStyle w:val="Heading2"/>
+      </w:pPr>
+      <w:r>
+        <w:t>声音听感修复</w:t>
+      </w:r>
+    </w:p>
+    <w:p>
+      <w:r>
+        <w:t>用户报告刺耳/警报感时，不能只调 volume 或 waveform；必须同时检查频率走向、单音持续时间、循环密度、包络和静默间隔。保留兼容播放通道与保留旧旋律是两件事，禁止因担心 iOS 无声而原样保留问题音序。</w:t>
+      </w:r>
+    </w:p>
+    <w:p>
+      <w:pPr>
+        <w:pStyle w:val="Heading2"/>
+      </w:pPr>
+      <w:r>
+        <w:t>歌词真实生命周期</w:t>
+      </w:r>
+    </w:p>
+    <w:p>
+      <w:r>
+        <w:t>歌词测试不能只直接调用解析或 repaint 函数。必须覆盖媒体 metadata、play/playing、seeking/seeked、页面 DOM 重建和继续播放；每次都以 Audio.currentTime 重新计算当前句，不能依赖旧 DOM、旧索引或固定提前量。</w:t>
+      </w:r>
+    </w:p>
+    <w:p>
+      <w:pPr>
+        <w:pStyle w:val="Heading2"/>
+      </w:pPr>
+      <w:r>
+        <w:t>后台音乐与音频预热</w:t>
+      </w:r>
+    </w:p>
+    <w:p>
+      <w:r>
+        <w:t>HTMLAudio 即使播放近乎静音的短文件，也可能抢占 iOS/Android 媒体会话。禁止在 pageshow、visibility 恢复或普通导航点击中无条件预热媒体元素。WebAudio 普通解锁与电话/麦克风专用媒体硬唤醒必须分流，并用测试保证普通触摸不调用 audioMediaWake、话筒首按仍保留专用修复。</w:t>
+      </w:r>
+    </w:p>
     <w:sectPr>
       <w:pgSz w:w="12240" w:h="15840"/>
       <w:pgMar w:top="1440" w:right="1800" w:bottom="1440" w:left="1800" w:header="720" w:footer="720" w:gutter="0"/>

</xml_diff>

<commit_message>
feat: sync active dates into online chat
</commit_message>
<xml_diff>
--- a/docs/maintenance/AI开发项目_Bug修改规范.docx
+++ b/docs/maintenance/AI开发项目_Bug修改规范.docx
@@ -684,6 +684,53 @@
         <w:t>HTMLAudio 即使播放近乎静音的短文件，也可能抢占 iOS/Android 媒体会话。禁止在 pageshow、visibility 恢复或普通导航点击中无条件预热媒体元素。WebAudio 普通解锁与电话/麦克风专用媒体硬唤醒必须分流，并用测试保证普通触摸不调用 audioMediaWake、话筒首按仍保留专用修复。</w:t>
       </w:r>
     </w:p>
+    <w:p>
+      <w:pPr>
+        <w:pStyle w:val="Heading1"/>
+      </w:pPr>
+      <w:r>
+        <w:t>回归规则补充（2026-08-05，v791）</w:t>
+      </w:r>
+    </w:p>
+    <w:p>
+      <w:pPr>
+        <w:pStyle w:val="Heading2"/>
+      </w:pPr>
+      <w:r>
+        <w:t>跨会话实时状态与历史存档必须分层</w:t>
+      </w:r>
+    </w:p>
+    <w:p>
+      <w:r>
+        <w:t>分段总结、长期记忆和聊天历史只证明“已经发生过什么”，不能单独证明活动已经结束。线上需要感知线下、通话或其他会话的进行中状态时，必须读取明确的实时生命周期字段；活动结束后由同一生命周期字段自动失效，禁止再复制一份容易不同步的结束标记。</w:t>
+      </w:r>
+    </w:p>
+    <w:p>
+      <w:pPr>
+        <w:pStyle w:val="Heading2"/>
+      </w:pPr>
+      <w:r>
+        <w:t>互斥提示不得同时注入</w:t>
+      </w:r>
+    </w:p>
+    <w:p>
+      <w:r>
+        <w:t>新增高优先级实时状态时，必须检查同一提示构建链中的时间差、失联、离线、结束和旧事件提示。若旧提示与实时事实互斥，应在同一个条件分支中屏蔽或改写；禁止只追加新提示并把矛盾交给模型自行判断。</w:t>
+      </w:r>
+    </w:p>
+    <w:p>
+      <w:pPr>
+        <w:pStyle w:val="Heading2"/>
+      </w:pPr>
+      <w:r>
+        <w:t>跨空间同步必须可关闭且按角色隔离</w:t>
+      </w:r>
+    </w:p>
+    <w:p>
+      <w:r>
+        <w:t>线上/线下等空间的实时联动应提供清晰开关，旧存档缺少字段时要有安全默认值。状态只能注入给同一角色，不能泄漏给其他角色；关闭开关后必须恢复原有平行独立行为。相关测试至少覆盖默认值、同角色、其他角色、结束状态和关闭状态。</w:t>
+      </w:r>
+    </w:p>
     <w:sectPr>
       <w:pgSz w:w="12240" w:h="15840"/>
       <w:pgMar w:top="1440" w:right="1800" w:bottom="1440" w:left="1800" w:header="720" w:footer="720" w:gutter="0"/>

</xml_diff>

<commit_message>
fix: prioritize call audio and sync lyrics
</commit_message>
<xml_diff>
--- a/docs/maintenance/AI开发项目_Bug修改规范.docx
+++ b/docs/maintenance/AI开发项目_Bug修改规范.docx
@@ -731,6 +731,56 @@
         <w:t>线上/线下等空间的实时联动应提供清晰开关，旧存档缺少字段时要有安全默认值。状态只能注入给同一角色，不能泄漏给其他角色；关闭开关后必须恢复原有平行独立行为。相关测试至少覆盖默认值、同角色、其他角色、结束状态和关闭状态。</w:t>
       </w:r>
     </w:p>
+    <w:p>
+      <w:pPr>
+        <w:pStyle w:val="Heading1"/>
+      </w:pPr>
+      <w:r>
+        <w:t>回归规则补充（2026-08-05，v792）</w:t>
+      </w:r>
+    </w:p>
+    <w:p>
+      <w:pPr>
+        <w:pStyle w:val="Heading2"/>
+      </w:pPr>
+      <w:r>
+        <w:t>异步媒体切换必须具备提交令牌和资源身份</w:t>
+      </w:r>
+    </w:p>
+    <w:p>
+      <w:pPr/>
+      <w:r>
+        <w:t>歌曲、视频、图片等异步载入在用户可连续切换时，不能在 await 前永久提交当前对象，也不能让旧请求在返回后继续赋值 src、撤销 Blob URL 或重绘 UI。必须使用递增令牌/AbortController 过滤陈旧结果，并保存“当前媒体元素实际属于谁”的身份；进度、高亮、打轴和点击跳转都要先核对身份。测试必须覆盖后发请求先完成、先发请求后完成的反序场景。</w:t>
+      </w:r>
+    </w:p>
+    <w:p>
+      <w:pPr>
+        <w:pStyle w:val="Heading2"/>
+      </w:pPr>
+      <w:r>
+        <w:t>声音回归测试要约束听感结构，不只屏蔽旧频率</w:t>
+      </w:r>
+    </w:p>
+    <w:p>
+      <w:pPr/>
+      <w:r>
+        <w:t>用户要求电话声接近消息提示时，应直接复用同族的单音、包络和节奏原则。禁止仅把已知警报频率换成另一组双音后宣称修复；测试要限制音符数量、音高运动、单音时长、循环静默和缓存键。改变合成音序时必须升级显式缓存 key，避免当前会话复用旧 WAV。</w:t>
+      </w:r>
+    </w:p>
+    <w:p>
+      <w:pPr>
+        <w:pStyle w:val="Heading2"/>
+      </w:pPr>
+      <w:r>
+        <w:t>实时语音首句必须具有请求优先级</w:t>
+      </w:r>
+    </w:p>
+    <w:p>
+      <w:pPr/>
+      <w:r>
+        <w:t>通话等强实时场景中，第一句 TTS 不得与后续句同时抢占同一服务。应先完成首句，再利用首句播放时间预取后续；优化生成顺序时不得顺手重构麦克风、听筒、HTMLAudio 或 AudioContext。测试至少记录最大并发数并保证首句阶段为 1。</w:t>
+      </w:r>
+    </w:p>
     <w:sectPr>
       <w:pgSz w:w="12240" w:h="15840"/>
       <w:pgMar w:top="1440" w:right="1800" w:bottom="1440" w:left="1800" w:header="720" w:footer="720" w:gutter="0"/>

</xml_diff>

<commit_message>
fix: restore offline entry and lyric binding
</commit_message>
<xml_diff>
--- a/docs/maintenance/AI开发项目_Bug修改规范.docx
+++ b/docs/maintenance/AI开发项目_Bug修改规范.docx
@@ -781,6 +781,53 @@
         <w:t>通话等强实时场景中，第一句 TTS 不得与后续句同时抢占同一服务。应先完成首句，再利用首句播放时间预取后续；优化生成顺序时不得顺手重构麦克风、听筒、HTMLAudio 或 AudioContext。测试至少记录最大并发数并保证首句阶段为 1。</w:t>
       </w:r>
     </w:p>
+    <w:p>
+      <w:pPr>
+        <w:pStyle w:val="Heading1"/>
+      </w:pPr>
+      <w:r>
+        <w:t>回归规则补充（2026-08-05，v793）</w:t>
+      </w:r>
+    </w:p>
+    <w:p>
+      <w:pPr>
+        <w:pStyle w:val="Heading2"/>
+      </w:pPr>
+      <w:r>
+        <w:t>触摸事件中打开弹窗必须防尾随兼容点击</w:t>
+      </w:r>
+    </w:p>
+    <w:p>
+      <w:r>
+        <w:t>在 pointerup/touchend 阶段直接挂载 modal、菜单或遮罩时，同一物理触摸仍可能继续产生 click，并命中新出现的界面。若新遮罩支持点击关闭，必须把挂载延后到当前事件链结束，或用同一手势标识明确忽略尾随 click；不能只做 300~900ms 的业务防抖，因为尾随 click 可能作用于另一个新元素。测试要验证“一次物理点按后弹窗仍保持打开”，不能只断言打开函数被调用。</w:t>
+      </w:r>
+    </w:p>
+    <w:p>
+      <w:pPr>
+        <w:pStyle w:val="Heading2"/>
+      </w:pPr>
+      <w:r>
+        <w:t>一致性保护必须配套恢复入口</w:t>
+      </w:r>
+    </w:p>
+    <w:p>
+      <w:r>
+        <w:t>为媒体、账号或会话增加“界面身份必须等于真实资源身份”的提前返回后，必须逐一检查进入、展开、恢复、切换和用户直接跳转入口。发现错位时要有受令牌保护的重绑/恢复路径；否则保护条件会把可恢复状态变成永久静默。测试至少包含：身份错位时自动恢复、身份一致时不重复重启，以及点击跳转不是唯一恢复方法。</w:t>
+      </w:r>
+    </w:p>
+    <w:p>
+      <w:pPr>
+        <w:pStyle w:val="Heading2"/>
+      </w:pPr>
+      <w:r>
+        <w:t>现场症状能恢复时优先比较恢复路径差异</w:t>
+      </w:r>
+    </w:p>
+    <w:p>
+      <w:r>
+        <w:t>当用户明确描述“自动过程失败，但点某个控件后立刻正常”，应先比较该控件路径比自动入口多执行了哪些状态校验、资源绑定或用户手势解锁。不要继续调整 CSS、时间偏移或重复增加同类事件监听；恢复动作本身通常就是定位缺失步骤的直接证据。</w:t>
+      </w:r>
+    </w:p>
     <w:sectPr>
       <w:pgSz w:w="12240" w:h="15840"/>
       <w:pgMar w:top="1440" w:right="1800" w:bottom="1440" w:left="1800" w:header="720" w:footer="720" w:gutter="0"/>

</xml_diff>

<commit_message>
fix: restore lyric scrolling and manual browsing
</commit_message>
<xml_diff>
--- a/docs/maintenance/AI开发项目_Bug修改规范.docx
+++ b/docs/maintenance/AI开发项目_Bug修改规范.docx
@@ -828,6 +828,79 @@
         <w:t>当用户明确描述“自动过程失败，但点某个控件后立刻正常”，应先比较该控件路径比自动入口多执行了哪些状态校验、资源绑定或用户手势解锁。不要继续调整 CSS、时间偏移或重复增加同类事件监听；恢复动作本身通常就是定位缺失步骤的直接证据。</w:t>
       </w:r>
     </w:p>
+    <w:p>
+      <w:pPr>
+        <w:pStyle w:val="Heading1"/>
+      </w:pPr>
+      <w:r>
+        <w:rPr>
+          <w:rFonts w:ascii="Microsoft YaHei" w:hAnsi="Microsoft YaHei" w:eastAsia="微软雅黑"/>
+          <w:b/>
+          <w:sz w:val="30"/>
+        </w:rPr>
+        <w:t>v794 · 歌词滚动与真机验收规则（2026-08-05）</w:t>
+      </w:r>
+    </w:p>
+    <w:p>
+      <w:pPr>
+        <w:pStyle w:val="ListBullet"/>
+      </w:pPr>
+      <w:r>
+        <w:rPr>
+          <w:rFonts w:ascii="Microsoft YaHei" w:hAnsi="Microsoft YaHei" w:eastAsia="微软雅黑"/>
+          <w:sz w:val="21"/>
+        </w:rPr>
+        <w:t>同一歌词 Bug 连续两次未解决后，必须停止在播放事件或歌曲身份上继续叠补丁；重新从数据解析、音频时钟、DOM 渲染、CSS 可滚动性、触摸事件和 Service Worker 实际版本六层核对。</w:t>
+      </w:r>
+    </w:p>
+    <w:p>
+      <w:pPr>
+        <w:pStyle w:val="ListBullet"/>
+      </w:pPr>
+      <w:r>
+        <w:rPr>
+          <w:rFonts w:ascii="Microsoft YaHei" w:hAnsi="Microsoft YaHei" w:eastAsia="微软雅黑"/>
+          <w:sz w:val="21"/>
+        </w:rPr>
+        <w:t>歌词可用性不能用“函数被调用”代替验收。测试必须覆盖：按时间点高亮、当前句变化时滚动、同一句不重复滚动、手动上下滑动、手动浏览期间不被抢回、停止操作后恢复跟唱。</w:t>
+      </w:r>
+    </w:p>
+    <w:p>
+      <w:pPr>
+        <w:pStyle w:val="ListBullet"/>
+      </w:pPr>
+      <w:r>
+        <w:rPr>
+          <w:rFonts w:ascii="Microsoft YaHei" w:hAnsi="Microsoft YaHei" w:eastAsia="微软雅黑"/>
+          <w:sz w:val="21"/>
+        </w:rPr>
+        <w:t>不要在 60–100ms 高频刷新循环里反复启动 smooth scroll。带轴歌词只应在 cue 变化时滚动；纯文本连续进度滚动应使用非平滑更新。</w:t>
+      </w:r>
+    </w:p>
+    <w:p>
+      <w:pPr>
+        <w:pStyle w:val="ListBullet"/>
+      </w:pPr>
+      <w:r>
+        <w:rPr>
+          <w:rFonts w:ascii="Microsoft YaHei" w:hAnsi="Microsoft YaHei" w:eastAsia="微软雅黑"/>
+          <w:sz w:val="21"/>
+        </w:rPr>
+        <w:t>自动跟随和用户手动浏览必须有明确的控制权状态；不能只把 overflow 改为 auto，否则定时 scrollTop 仍会让手势看起来失效。</w:t>
+      </w:r>
+    </w:p>
+    <w:p>
+      <w:pPr>
+        <w:pStyle w:val="ListBullet"/>
+      </w:pPr>
+      <w:r>
+        <w:rPr>
+          <w:rFonts w:ascii="Microsoft YaHei" w:hAnsi="Microsoft YaHei" w:eastAsia="微软雅黑"/>
+          <w:sz w:val="21"/>
+        </w:rPr>
+        <w:t>发布后的复验必须先确认界面实际版本号与本次版本一致。Service Worker 当前页为保护聊天、通话和未保存输入不会强制刷新；版本不一致时先完全关闭再重新打开，不得把旧缓存表现误判为新代码结果。</w:t>
+      </w:r>
+    </w:p>
     <w:sectPr>
       <w:pgSz w:w="12240" w:h="15840"/>
       <w:pgMar w:top="1440" w:right="1800" w:bottom="1440" w:left="1800" w:header="720" w:footer="720" w:gutter="0"/>

</xml_diff>

<commit_message>
fix: center lyrics in the correct scroll coordinates
</commit_message>
<xml_diff>
--- a/docs/maintenance/AI开发项目_Bug修改规范.docx
+++ b/docs/maintenance/AI开发项目_Bug修改规范.docx
@@ -901,6 +901,55 @@
         <w:t>发布后的复验必须先确认界面实际版本号与本次版本一致。Service Worker 当前页为保护聊天、通话和未保存输入不会强制刷新；版本不一致时先完全关闭再重新打开，不得把旧缓存表现误判为新代码结果。</w:t>
       </w:r>
     </w:p>
+    <w:p>
+      <w:pPr>
+        <w:pStyle w:val="Heading1"/>
+      </w:pPr>
+      <w:r>
+        <w:rPr>
+          <w:rFonts w:ascii="Microsoft YaHei" w:hAnsi="Microsoft YaHei" w:eastAsia="微软雅黑"/>
+          <w:b/>
+          <w:sz w:val="30"/>
+        </w:rPr>
+        <w:t>v795 · 嵌套滚动坐标规则（2026-08-05）</w:t>
+      </w:r>
+    </w:p>
+    <w:p>
+      <w:pPr>
+        <w:pStyle w:val="ListBullet"/>
+      </w:pPr>
+      <w:r>
+        <w:rPr>
+          <w:rFonts w:ascii="Microsoft YaHei" w:hAnsi="Microsoft YaHei" w:eastAsia="微软雅黑"/>
+          <w:sz w:val="21"/>
+        </w:rPr>
+        <w:t>元素 offsetTop 与滚动容器 scrollTop 只有在确认共享同一 offsetParent/内容坐标系时才能直接运算。嵌套播放器、弹窗和非定位滚动容器应优先用双方 getBoundingClientRect 差值加当前 scrollTop。</w:t>
+      </w:r>
+    </w:p>
+    <w:p>
+      <w:pPr>
+        <w:pStyle w:val="ListBullet"/>
+      </w:pPr>
+      <w:r>
+        <w:rPr>
+          <w:rFonts w:ascii="Microsoft YaHei" w:hAnsi="Microsoft YaHei" w:eastAsia="微软雅黑"/>
+          <w:sz w:val="21"/>
+        </w:rPr>
+        <w:t>出现“高亮对象正确但窗口稳定跳到固定错误区域”时，应先检查坐标系和固定偏移，不得继续改 index、时间轴或定时器。固定方向、固定距离通常说明祖先布局偏移被重复计入。</w:t>
+      </w:r>
+    </w:p>
+    <w:p>
+      <w:pPr>
+        <w:pStyle w:val="ListBullet"/>
+      </w:pPr>
+      <w:r>
+        <w:rPr>
+          <w:rFonts w:ascii="Microsoft YaHei" w:hAnsi="Microsoft YaHei" w:eastAsia="微软雅黑"/>
+          <w:sz w:val="21"/>
+        </w:rPr>
+        <w:t>滚动测试不得把容器和子元素都默认放在页面坐标零点。至少加入一个非零父级偏移，并分别验证首次自动跟随、手动浏览暂停、恢复跟随和不同当前 scrollTop。</w:t>
+      </w:r>
+    </w:p>
     <w:sectPr>
       <w:pgSz w:w="12240" w:h="15840"/>
       <w:pgMar w:top="1440" w:right="1800" w:bottom="1440" w:left="1800" w:header="720" w:footer="720" w:gutter="0"/>

</xml_diff>

<commit_message>
fix: expand and rebalance music lyrics layout
</commit_message>
<xml_diff>
--- a/docs/maintenance/AI开发项目_Bug修改规范.docx
+++ b/docs/maintenance/AI开发项目_Bug修改规范.docx
@@ -950,6 +950,46 @@
         <w:t>滚动测试不得把容器和子元素都默认放在页面坐标零点。至少加入一个非零父级偏移，并分别验证首次自动跟随、手动浏览暂停、恢复跟随和不同当前 scrollTop。</w:t>
       </w:r>
     </w:p>
+    <w:p>
+      <w:pPr>
+        <w:pStyle w:val="Heading1"/>
+      </w:pPr>
+      <w:r>
+        <w:t>新增规则：播放器装饰区不得挤压核心内容区（v796）</w:t>
+      </w:r>
+    </w:p>
+    <w:p>
+      <w:pPr>
+        <w:pStyle w:val="ListBullet"/>
+      </w:pPr>
+      <w:r>
+        <w:t>音乐播放页调整视觉比例时，先计算歌词容器高度 ÷ 单行实际高度，明确普通屏和矮屏分别能看到多少行，不能只凭截图微调。</w:t>
+      </w:r>
+    </w:p>
+    <w:p>
+      <w:pPr>
+        <w:pStyle w:val="ListBullet"/>
+      </w:pPr>
+      <w:r>
+        <w:t>唱片、封面等装饰区域不要用无上限的 flex:1 吞掉剩余高度；关键内容需要空间时，应使用带最小值和最大值的响应式尺寸。</w:t>
+      </w:r>
+    </w:p>
+    <w:p>
+      <w:pPr>
+        <w:pStyle w:val="ListBullet"/>
+      </w:pPr>
+      <w:r>
+        <w:t>歌词布局与歌词时间轴属于不同模块。只处理间距、可见行数和字号时，不得顺带修改 active index、滚动目标或音频事件。</w:t>
+      </w:r>
+    </w:p>
+    <w:p>
+      <w:pPr>
+        <w:pStyle w:val="ListBullet"/>
+      </w:pPr>
+      <w:r>
+        <w:t>响应式排版修改必须同时覆盖普通屏和 max-height:720px 的矮屏规则，并为两套规则增加静态回归断言。</w:t>
+      </w:r>
+    </w:p>
     <w:sectPr>
       <w:pgSz w:w="12240" w:h="15840"/>
       <w:pgMar w:top="1440" w:right="1800" w:bottom="1440" w:left="1800" w:header="720" w:footer="720" w:gutter="0"/>

</xml_diff>

<commit_message>
fix: separate lyrics spacing from bottom controls
</commit_message>
<xml_diff>
--- a/docs/maintenance/AI开发项目_Bug修改规范.docx
+++ b/docs/maintenance/AI开发项目_Bug修改规范.docx
@@ -990,6 +990,46 @@
         <w:t>响应式排版修改必须同时覆盖普通屏和 max-height:720px 的矮屏规则，并为两套规则增加静态回归断言。</w:t>
       </w:r>
     </w:p>
+    <w:p>
+      <w:pPr>
+        <w:pStyle w:val="Heading1"/>
+      </w:pPr>
+      <w:r>
+        <w:t>新增规则：播放器中部内容与底部控制区必须解耦（v797）</w:t>
+      </w:r>
+    </w:p>
+    <w:p>
+      <w:pPr>
+        <w:pStyle w:val="ListBullet"/>
+      </w:pPr>
+      <w:r>
+        <w:t>调整唱片、标题或歌词的纵向间距时，进度条、播放按钮和聊天输入区必须作为独立底部区块验证，不能随中部内容一起漂移。</w:t>
+      </w:r>
+    </w:p>
+    <w:p>
+      <w:pPr>
+        <w:pStyle w:val="ListBullet"/>
+      </w:pPr>
+      <w:r>
+        <w:t>在纵向 flex 播放页中，优先用底部区块的 margin-top:auto 吸收剩余空间；不要为视觉固定直接使用可能覆盖歌词的绝对定位。</w:t>
+      </w:r>
+    </w:p>
+    <w:p>
+      <w:pPr>
+        <w:pStyle w:val="ListBullet"/>
+      </w:pPr>
+      <w:r>
+        <w:t>底部控制区必须同时验证聊天收起与展开两种高度，并保留可见底部内边距，避免进度条或输入框贴边。</w:t>
+      </w:r>
+    </w:p>
+    <w:p>
+      <w:pPr>
+        <w:pStyle w:val="ListBullet"/>
+      </w:pPr>
+      <w:r>
+        <w:t>同一功能中的辅助文字应与主内容字号建立明确对应；普通屏和矮屏都要有断言，不能只修改其中一套。</w:t>
+      </w:r>
+    </w:p>
     <w:sectPr>
       <w:pgSz w:w="12240" w:h="15840"/>
       <w:pgMar w:top="1440" w:right="1800" w:bottom="1440" w:left="1800" w:header="720" w:footer="720" w:gutter="0"/>

</xml_diff>

<commit_message>
feat: add companion device control prototype
</commit_message>
<xml_diff>
--- a/docs/maintenance/AI开发项目_Bug修改规范.docx
+++ b/docs/maintenance/AI开发项目_Bug修改规范.docx
@@ -1030,6 +1030,34 @@
         <w:t>同一功能中的辅助文字应与主内容字号建立明确对应；普通屏和矮屏都要有断言，不能只修改其中一套。</w:t>
       </w:r>
     </w:p>
+    <w:p>
+      <w:pPr>
+        <w:pStyle w:val="Heading1"/>
+      </w:pPr>
+      <w:r>
+        <w:t>双来源伴生设备数据与指令规范（v798 起）</w:t>
+      </w:r>
+    </w:p>
+    <w:p>
+      <w:r>
+        <w:t>一、写入规则：角色管控默认“内外同时”，但必须允许单次选择“仅内置”或“仅外置”。双端操作必须生成两条独立规则，分别等待各自执行与回执，禁止把两端合并成一条共享计时规则。</w:t>
+      </w:r>
+    </w:p>
+    <w:p>
+      <w:r>
+        <w:t>二、身份绑定：内置 App 和外置 iPhone App 必须使用不同的稳定 ID 建立映射。名称只能用于界面显示或解析用户意图，不能作为外置 App 的最终绑定依据；找不到稳定 ID 映射时必须拒绝双端下发。</w:t>
+      </w:r>
+    </w:p>
+    <w:p>
+      <w:r>
+        <w:t>三、读取来源：角色默认只读取外置 iPhone 的总屏幕时长、逐 App 时长、位置和足迹。不得混入小手机内置使用记录、剧情位置或原型数据。逐 App 数据尚未接入时必须显示“待接入”，不得估算、拆分或伪造。</w:t>
+      </w:r>
+    </w:p>
+    <w:p>
+      <w:r>
+        <w:t>四、状态与审计：界面必须区分真实设备、未连接和原型测试数据；内置与外置的已用时长、限额和锁定状态分别显示。每次锁定、解锁、修改限额和定位请求记录操作者、时间、目标范围及设备回执状态。</w:t>
+      </w:r>
+    </w:p>
     <w:sectPr>
       <w:pgSz w:w="12240" w:h="15840"/>
       <w:pgMar w:top="1440" w:right="1800" w:bottom="1440" w:left="1800" w:header="720" w:footer="720" w:gutter="0"/>

</xml_diff>

<commit_message>
fix: prevent music export from exiting the app
</commit_message>
<xml_diff>
--- a/docs/maintenance/AI开发项目_Bug修改规范.docx
+++ b/docs/maintenance/AI开发项目_Bug修改规范.docx
@@ -1058,6 +1058,54 @@
         <w:t>四、状态与审计：界面必须区分真实设备、未连接和原型测试数据；内置与外置的已用时长、限额和锁定状态分别显示。每次锁定、解锁、修改限额和定位请求记录操作者、时间、目标范围及设备回执状态。</w:t>
       </w:r>
     </w:p>
+    <w:p>
+      <w:pPr>
+        <w:pStyle w:val="Heading1"/>
+      </w:pPr>
+      <w:r>
+        <w:t>新增规则：移动端大文件导出必须限制内存峰值并保留用户手势（v799）</w:t>
+      </w:r>
+    </w:p>
+    <w:p>
+      <w:pPr>
+        <w:pStyle w:val="ListBullet"/>
+      </w:pPr>
+      <w:r>
+        <w:t>浏览器导出包含音频、视频等二进制内容时，禁止把全部文件同时转成 Base64 对象，再执行一次完整 JSON.stringify 和 Blob 复制。应优先使用二进制容器；必须兼容旧 JSON 时，应分片组装并设置保守体积上限。</w:t>
+      </w:r>
+    </w:p>
+    <w:p>
+      <w:pPr>
+        <w:pStyle w:val="ListBullet"/>
+      </w:pPr>
+      <w:r>
+        <w:t>内存溢出或 WebView 进程被系统杀死通常不会进入 JavaScript catch。不能把 catch 中的“文件太大”提示当成安全保护；必须在编码和复制前根据 Blob.size 预检。</w:t>
+      </w:r>
+    </w:p>
+    <w:p>
+      <w:pPr>
+        <w:pStyle w:val="ListBullet"/>
+      </w:pPr>
+      <w:r>
+        <w:t>异步生成文件后，不得直接自动点击下载链接。应先显示“文件已准备好”，让用户在新的真实点击中调用分享、文件选择或下载，避免 PWA 导航离开。</w:t>
+      </w:r>
+    </w:p>
+    <w:p>
+      <w:pPr>
+        <w:pStyle w:val="ListBullet"/>
+      </w:pPr>
+      <w:r>
+        <w:t>打包、压缩、批量上传等高内存动作必须有单任务锁；重复点击只能复用当前任务或提示等待，不能并发创建第二份大对象。</w:t>
+      </w:r>
+    </w:p>
+    <w:p>
+      <w:pPr>
+        <w:pStyle w:val="ListBullet"/>
+      </w:pPr>
+      <w:r>
+        <w:t>导出安全修复必须验证旧导入格式兼容、超限路径不执行 Base64、准备文件的自动释放，以及整包和单文件两条路径。</w:t>
+      </w:r>
+    </w:p>
     <w:sectPr>
       <w:pgSz w:w="12240" w:h="15840"/>
       <w:pgMar w:top="1440" w:right="1800" w:bottom="1440" w:left="1800" w:header="720" w:footer="720" w:gutter="0"/>

</xml_diff>

<commit_message>
feat: connect secure iPhone companion sync
</commit_message>
<xml_diff>
--- a/docs/maintenance/AI开发项目_Bug修改规范.docx
+++ b/docs/maintenance/AI开发项目_Bug修改规范.docx
@@ -1106,6 +1106,49 @@
         <w:t>导出安全修复必须验证旧导入格式兼容、超限路径不执行 Base64、准备文件的自动释放，以及整包和单文件两条路径。</w:t>
       </w:r>
     </w:p>
+    <w:p>
+      <w:r>
+        <w:br w:type="page"/>
+      </w:r>
+    </w:p>
+    <w:p>
+      <w:pPr>
+        <w:pStyle w:val="Heading1"/>
+      </w:pPr>
+      <w:r>
+        <w:t>真实伴生数据同步安全规则（v800）</w:t>
+      </w:r>
+    </w:p>
+    <w:p>
+      <w:r>
+        <w:t>1. 屏幕使用时长、逐 App 时长、定位和足迹属于敏感真实设备数据，禁止写入允许匿名直接查询的公共事件表。</w:t>
+      </w:r>
+    </w:p>
+    <w:p>
+      <w:r>
+        <w:t>2. 小手机角色端和 iPhone 设备端必须使用不同秘密；配对只能用短时一次性配对码，配对码不得作为长期凭据。</w:t>
+      </w:r>
+    </w:p>
+    <w:p>
+      <w:r>
+        <w:t>3. 同步表必须启用 RLS，并撤销 anon/authenticated 的直接表权限；读写只能经校验秘密的 security definer RPC。</w:t>
+      </w:r>
+    </w:p>
+    <w:p>
+      <w:r>
+        <w:t>4. 角色页读取来源固定为外置 iPhone。服务器无真实快照时显示“等待接入”，不得使用内置数据、演示数据或软件名称猜测来补全。</w:t>
+      </w:r>
+    </w:p>
+    <w:p>
+      <w:r>
+        <w:t>5. 内置 App ID 与外置 DeviceActivity ID 必须分开存储，通过明确绑定关系关联；名称只用于显示，不作为最终匹配键。</w:t>
+      </w:r>
+    </w:p>
+    <w:p>
+      <w:r>
+        <w:t>6. 锁定、解锁、修改限额和定位请求必须进入服务器命令队列，并由 iPhone 返回成功或失败回执；界面在回执前显示等待状态。</w:t>
+      </w:r>
+    </w:p>
     <w:sectPr>
       <w:pgSz w:w="12240" w:h="15840"/>
       <w:pgMar w:top="1440" w:right="1800" w:bottom="1440" w:left="1800" w:header="720" w:footer="720" w:gutter="0"/>

</xml_diff>

<commit_message>
fix: stabilize real iPhone companion sync
</commit_message>
<xml_diff>
--- a/docs/maintenance/AI开发项目_Bug修改规范.docx
+++ b/docs/maintenance/AI开发项目_Bug修改规范.docx
@@ -1149,6 +1149,51 @@
         <w:t>6. 锁定、解锁、修改限额和定位请求必须进入服务器命令队列，并由 iPhone 返回成功或失败回执；界面在回执前显示等待状态。</w:t>
       </w:r>
     </w:p>
+    <w:p>
+      <w:r>
+        <w:br w:type="page"/>
+      </w:r>
+    </w:p>
+    <w:p>
+      <w:pPr>
+        <w:pStyle w:val="Heading1"/>
+      </w:pPr>
+      <w:r>
+        <w:t>v801 新增维护约束（2026-08-05）</w:t>
+      </w:r>
+    </w:p>
+    <w:p>
+      <w:pPr>
+        <w:pStyle w:val="ListBullet"/>
+      </w:pPr>
+      <w:r>
+        <w:t>DeviceActivityReport 数据不是普通主动查询：任何依赖其快照的上传页必须实际承载同一 Context 的报告视图，不能只读 App Group 缓存。</w:t>
+      </w:r>
+    </w:p>
+    <w:p>
+      <w:pPr>
+        <w:pStyle w:val="ListBullet"/>
+      </w:pPr>
+      <w:r>
+        <w:t>用户明确点击某个外置 App 时，即使尚未绑定内置 ID，也必须允许仅外置操作；角色或默认 both 的双端操作仍必须稳定 ID 绑定，不能按名称猜测。</w:t>
+      </w:r>
+    </w:p>
+    <w:p>
+      <w:pPr>
+        <w:pStyle w:val="ListBullet"/>
+      </w:pPr>
+      <w:r>
+        <w:t>足迹清空与上传必须以持久化存储为准，禁止使用另一个页面实例的旧内存恢复已删除记录。静止去抖不得使用米级短间隔阈值冒充到访地点。</w:t>
+      </w:r>
+    </w:p>
+    <w:p>
+      <w:pPr>
+        <w:pStyle w:val="ListBullet"/>
+      </w:pPr>
+      <w:r>
+        <w:t>第三方 App 名称受 Apple 隐私限制时，使用系统 Token Label 供用户识别并维护显示别名；别名不得参与稳定 ID 绑定。</w:t>
+      </w:r>
+    </w:p>
     <w:sectPr>
       <w:pgSz w:w="12240" w:h="15840"/>
       <w:pgMar w:top="1440" w:right="1800" w:bottom="1440" w:left="1800" w:header="720" w:footer="720" w:gutter="0"/>

</xml_diff>

<commit_message>
fix: sync external companion data and controls
</commit_message>
<xml_diff>
--- a/docs/maintenance/AI开发项目_Bug修改规范.docx
+++ b/docs/maintenance/AI开发项目_Bug修改规范.docx
@@ -1194,6 +1194,26 @@
         <w:t>第三方 App 名称受 Apple 隐私限制时，使用系统 Token Label 供用户识别并维护显示别名；别名不得参与稳定 ID 绑定。</w:t>
       </w:r>
     </w:p>
+    <w:p>
+      <w:r>
+        <w:t>2026-08-05 · 新增规则：DeviceActivityReport 跨扩展同步</w:t>
+      </w:r>
+    </w:p>
+    <w:p>
+      <w:r>
+        <w:t>不得把 DeviceActivityReport 视图显示出来当成数据已同步。上传前必须验证 App Group 中存在本次触发后生成的新鲜快照；快照缺失或过期必须显示失败，不得上传 0 冒充成功。</w:t>
+      </w:r>
+    </w:p>
+    <w:p>
+      <w:r>
+        <w:t>远程控制不可只依赖当前 UI 选择临时重算 Token。stable externalAppID 与 ApplicationToken 必须在主 App 建立持久注册表，命令执行优先从注册表恢复。操作审计记录默认只保留 3 天，清理不得影响绑定、限额、屏幕时间、位置或足迹。</w:t>
+      </w:r>
+    </w:p>
+    <w:p>
+      <w:r>
+        <w:t>v802补充（2026-08-05）：角色端读取桥已统一为外置真实iPhone来源。角色查看定位、总屏幕时长和逐App时长时不再读取小手机内置数据；默认“内外同时”在外置未连接或稳定ID未绑定时整条拒绝，不再静默退化为仅内置。伴生端新增DeviceActivity报告可用标记，报告尚未生成时页面显示“待同步”，不得把0分钟当作真实结果。伴生设备操作记录仅保留三天。</w:t>
+      </w:r>
+    </w:p>
     <w:sectPr>
       <w:pgSz w:w="12240" w:h="15840"/>
       <w:pgMar w:top="1440" w:right="1800" w:bottom="1440" w:left="1800" w:header="720" w:footer="720" w:gutter="0"/>

</xml_diff>

<commit_message>
fix: preserve offline date narration format
</commit_message>
<xml_diff>
--- a/docs/maintenance/AI开发项目_Bug修改规范.docx
+++ b/docs/maintenance/AI开发项目_Bug修改规范.docx
@@ -1214,6 +1214,46 @@
         <w:t>v802补充（2026-08-05）：角色端读取桥已统一为外置真实iPhone来源。角色查看定位、总屏幕时长和逐App时长时不再读取小手机内置数据；默认“内外同时”在外置未连接或稳定ID未绑定时整条拒绝，不再静默退化为仅内置。伴生端新增DeviceActivity报告可用标记，报告尚未生成时页面显示“待同步”，不得把0分钟当作真实结果。伴生设备操作记录仅保留三天。</w:t>
       </w:r>
     </w:p>
+    <w:p>
+      <w:pPr>
+        <w:pStyle w:val="Heading1"/>
+      </w:pPr>
+      <w:r>
+        <w:t>新增规则：线下场景结构化内容必须先统一解析再落库（v803）</w:t>
+      </w:r>
+    </w:p>
+    <w:p>
+      <w:pPr>
+        <w:pStyle w:val="ListBullet"/>
+      </w:pPr>
+      <w:r>
+        <w:t>线下约会的旁白/台词类型不得在提示词、审计、去重和最终落库中各写一套正则。必须共享同一个解析入口，避免前面认为是旁白、落库时却写成角色台词。</w:t>
+      </w:r>
+    </w:p>
+    <w:p>
+      <w:pPr>
+        <w:pStyle w:val="ListBullet"/>
+      </w:pPr>
+      <w:r>
+        <w:t>兼容模型格式漂移时，只识别明确旁白标签或既有括号边界；禁止根据“他/她/两人”开头直接猜测旁白，防止普通问句和第三人称台词误判。</w:t>
+      </w:r>
+    </w:p>
+    <w:p>
+      <w:pPr>
+        <w:pStyle w:val="ListBullet"/>
+      </w:pPr>
+      <w:r>
+        <w:t>系统提示要求每轮含旁白时，生成后必须做结构校验。没有可识别旁白应先重写或使用受控兜底，不能把格式错误的原文直接写入会话。</w:t>
+      </w:r>
+    </w:p>
+    <w:p>
+      <w:pPr>
+        <w:pStyle w:val="ListBullet"/>
+      </w:pPr>
+      <w:r>
+        <w:t>回归测试至少覆盖：完整括号旁白、旁白标签、方括号标签、旁白与台词混排、普通第三人称台词、最终 who 字段和发布缓存版本。</w:t>
+      </w:r>
+    </w:p>
     <w:sectPr>
       <w:pgSz w:w="12240" w:h="15840"/>
       <w:pgMar w:top="1440" w:right="1800" w:bottom="1440" w:left="1800" w:header="720" w:footer="720" w:gutter="0"/>

</xml_diff>

<commit_message>
fix: restore music layout after keyboard closes
</commit_message>
<xml_diff>
--- a/docs/maintenance/AI开发项目_Bug修改规范.docx
+++ b/docs/maintenance/AI开发项目_Bug修改规范.docx
@@ -1252,6 +1252,54 @@
       </w:pPr>
       <w:r>
         <w:t>回归测试至少覆盖：完整括号旁白、旁白标签、方括号标签、旁白与台词混排、普通第三人称台词、最终 who 字段和发布缓存版本。</w:t>
+      </w:r>
+    </w:p>
+    <w:p>
+      <w:pPr>
+        <w:pStyle w:val="Heading1"/>
+      </w:pPr>
+      <w:r>
+        <w:t>新增规则：键盘残留位移必须按受影响页面局部恢复（v804）</w:t>
+      </w:r>
+    </w:p>
+    <w:p>
+      <w:pPr>
+        <w:pStyle w:val="ListBullet"/>
+      </w:pPr>
+      <w:r>
+        <w:t>输入框关闭后出现整个页面统一上移时，应先判断是浏览器键盘自动平移/滚动残留，还是组件自身 margin、transform、flex 高度变化。不得先改唱片、歌词或业务组件的位置参数掩盖页面级偏移。</w:t>
+      </w:r>
+    </w:p>
+    <w:p>
+      <w:pPr>
+        <w:pStyle w:val="ListBullet"/>
+      </w:pPr>
+      <w:r>
+        <w:t>修复键盘残留偏移必须限定在受影响页面和输入框生命周期内。恢复前至少校验当前页面标识和对应页面节点，禁止对所有页面无条件 window.scrollTo。</w:t>
+      </w:r>
+    </w:p>
+    <w:p>
+      <w:pPr>
+        <w:pStyle w:val="ListBullet"/>
+      </w:pPr>
+      <w:r>
+        <w:t>不得重新引入全局 --north-app-height、syncAppViewport、visualViewport resize/scroll 监听或动态改写 .phone 高度；这些方案曾造成全局外壳裁切、页面冻结和其他模块布局回归。</w:t>
+      </w:r>
+    </w:p>
+    <w:p>
+      <w:pPr>
+        <w:pStyle w:val="ListBullet"/>
+      </w:pPr>
+      <w:r>
+        <w:t>键盘展开期间不能抢夺用户滚动。只允许在输入框失焦、用户主动收起输入区、退出该页面，或窗口高度从键盘态恢复到聚焦前基准时执行归零；必要的延迟收尾必须次数有限。</w:t>
+      </w:r>
+    </w:p>
+    <w:p>
+      <w:pPr>
+        <w:pStyle w:val="ListBullet"/>
+      </w:pPr>
+      <w:r>
+        <w:t>回归测试至少覆盖：键盘展开不归零、键盘关闭归零、失焦归零、收起聊天归零、非目标页面不归零、目标节点不存在不归零，以及全局视口禁用规则仍然成立。</w:t>
       </w:r>
     </w:p>
     <w:sectPr>

</xml_diff>

<commit_message>
fix: stabilize home app entry and dock
</commit_message>
<xml_diff>
--- a/docs/maintenance/AI开发项目_Bug修改规范.docx
+++ b/docs/maintenance/AI开发项目_Bug修改规范.docx
@@ -1300,6 +1300,62 @@
       </w:pPr>
       <w:r>
         <w:t>回归测试至少覆盖：键盘展开不归零、键盘关闭归零、失焦归零、收起聊天归零、非目标页面不归零、目标节点不存在不归零，以及全局视口禁用规则仍然成立。</w:t>
+      </w:r>
+    </w:p>
+    <w:p>
+      <w:pPr>
+        <w:pStyle w:val="Heading1"/>
+      </w:pPr>
+      <w:r>
+        <w:t>新增规则：触屏跨页面启动必须同时防丢点击与防穿透（v805）</w:t>
+      </w:r>
+    </w:p>
+    <w:p>
+      <w:pPr>
+        <w:pStyle w:val="ListBullet"/>
+      </w:pPr>
+      <w:r>
+        <w:t>桌面 App 兼容 pointerup 与 click 时，必须分别处理两类失败：某些浏览器不生成 click，不能只依赖 click；pointerup 立即替换 DOM 时，尾随兼容 click 又可能命中新页面，不能同步挂载可点击的新界面。</w:t>
+      </w:r>
+    </w:p>
+    <w:p>
+      <w:pPr>
+        <w:pStyle w:val="ListBullet"/>
+      </w:pPr>
+      <w:r>
+        <w:t>推荐边界：pointerup 确认短按后记录防重标记，并把实际页面切换延迟到下一任务；旧 DOM 接收并结束兼容 click。不得针对微信、抖音逐个堆特殊延迟，所有桌面入口共享同一启动契约。</w:t>
+      </w:r>
+    </w:p>
+    <w:p>
+      <w:pPr>
+        <w:pStyle w:val="ListBullet"/>
+      </w:pPr>
+      <w:r>
+        <w:t>pointercancel 不得一律关闭 click 兜底。只有已经发生明显移动或真实拖拽时才能设置防点击窗口；无移动的取消事件必须允许浏览器 click 作为备用入口。</w:t>
+      </w:r>
+    </w:p>
+    <w:p>
+      <w:pPr>
+        <w:pStyle w:val="ListBullet"/>
+      </w:pPr>
+      <w:r>
+        <w:t>固定在 App 底部的 Dock 不得放进整页滚动流，也不要用相对浏览器窗口的 position:fixed 冒充应用内固定。应让内容进入独立滚动层，Dock 和分页提示留在外层 flex 固定区，并同时验证桌面外壳与手机全屏。</w:t>
+      </w:r>
+    </w:p>
+    <w:p>
+      <w:pPr>
+        <w:pStyle w:val="ListBullet"/>
+      </w:pPr>
+      <w:r>
+        <w:t>可由旧备份覆盖的 App 状态，不能只在脚本启动时迁移。入口和渲染边界应提供幂等结构修复，并测试缺失对象、错误数组类型和二次调用稳定性。</w:t>
+      </w:r>
+    </w:p>
+    <w:p>
+      <w:pPr>
+        <w:pStyle w:val="ListBullet"/>
+      </w:pPr>
+      <w:r>
+        <w:t>主屏全局外观参数必须覆盖普通应用与 Dock，提供明确默认值和复位入口，并纳入美化导出、完整备份恢复及清数据保留白名单测试。</w:t>
       </w:r>
     </w:p>
     <w:sectPr>

</xml_diff>

<commit_message>
fix: make incoming ringtone continuous
</commit_message>
<xml_diff>
--- a/docs/maintenance/AI开发项目_Bug修改规范.docx
+++ b/docs/maintenance/AI开发项目_Bug修改规范.docx
@@ -1356,6 +1356,46 @@
       </w:pPr>
       <w:r>
         <w:t>主屏全局外观参数必须覆盖普通应用与 Dock，提供明确默认值和复位入口，并纳入美化导出、完整备份恢复及清数据保留白名单测试。</w:t>
+      </w:r>
+    </w:p>
+    <w:p>
+      <w:pPr>
+        <w:pStyle w:val="Heading1"/>
+      </w:pPr>
+      <w:r>
+        <w:t>新增规则：连续来电铃声不得用长静默脉冲模拟（v806）</w:t>
+      </w:r>
+    </w:p>
+    <w:p>
+      <w:pPr>
+        <w:pStyle w:val="ListBullet"/>
+      </w:pPr>
+      <w:r>
+        <w:t>用户要求连续来电声时，验收指标必须同时约束有效发声占比、最长静默、循环接缝和备用播放路径。不能只检查 loop=true；一个 0.22 秒音频即使设置循环，只要附带 1 秒以上静默，听感仍是间歇提示音。</w:t>
+      </w:r>
+    </w:p>
+    <w:p>
+      <w:pPr>
+        <w:pStyle w:val="ListBullet"/>
+      </w:pPr>
+      <w:r>
+        <w:t>消除警报感不能依赖延长静默。应使用单频、低音量、无长间隔、短淡入淡出的连续素材；不得再次换成双音升降频，也不得恢复 520/660Hz 或 880/1174Hz 警报序列。</w:t>
+      </w:r>
+    </w:p>
+    <w:p>
+      <w:pPr>
+        <w:pStyle w:val="ListBullet"/>
+      </w:pPr>
+      <w:r>
+        <w:t>HTMLAudio 与 WebAudio 备用路径必须具有相同的连续性。备用分段播放时，下一段应在上一段结束前启动并保留 sustain 包络，不能把 setInterval 存在当作持续播放已经成立。</w:t>
+      </w:r>
+    </w:p>
+    <w:p>
+      <w:pPr>
+        <w:pStyle w:val="ListBullet"/>
+      </w:pPr>
+      <w:r>
+        <w:t>修改合成铃声的时长、包络、间隔或循环结构时必须升级缓存键和发布缓存版本。测试至少执行主路径参数、失败回退、重叠时序、停止清理，并保留主动拨号、消息提示、通话 TTS 与麦克风不受影响的边界。</w:t>
       </w:r>
     </w:p>
     <w:sectPr>

</xml_diff>

<commit_message>
fix: enable role iPhone controls and refresh companion UI
</commit_message>
<xml_diff>
--- a/docs/maintenance/AI开发项目_Bug修改规范.docx
+++ b/docs/maintenance/AI开发项目_Bug修改规范.docx
@@ -1396,6 +1396,54 @@
       </w:pPr>
       <w:r>
         <w:t>修改合成铃声的时长、包络、间隔或循环结构时必须升级缓存键和发布缓存版本。测试至少执行主路径参数、失败回退、重叠时序、停止清理，并保留主动拨号、消息提示、通话 TTS 与麦克风不受影响的边界。</w:t>
+      </w:r>
+    </w:p>
+    <w:p>
+      <w:pPr>
+        <w:pStyle w:val="Heading1"/>
+      </w:pPr>
+      <w:r>
+        <w:t>新增规则：角色外置控制不得被内置授权表预过滤（v807）</w:t>
+      </w:r>
+    </w:p>
+    <w:p>
+      <w:pPr>
+        <w:pStyle w:val="ListBullet"/>
+      </w:pPr>
+      <w:r>
+        <w:t>小手机内置 App 授权与真实 iPhone 外置 App 权限是两套独立边界。外置控制应先用用户已同步的显示名称解析稳定 externalAppID，再检查伴生 roleAccess 和具体权限；不得先用 S.couple.grant 把外置目标过滤掉。</w:t>
+      </w:r>
+    </w:p>
+    <w:p>
+      <w:pPr>
+        <w:pStyle w:val="ListBullet"/>
+      </w:pPr>
+      <w:r>
+        <w:t>默认“内外同时”仍不得静默降级。仅当目标只存在于已同步外置列表、没有对应已授权内置目标时，角色自然语言可以明确归类为仅外置；存在内置授权时必须继续走双端绑定和双授权校验。标签解析与自然语言解析必须共享同一作用域决策和命令分发器。</w:t>
+      </w:r>
+    </w:p>
+    <w:p>
+      <w:pPr>
+        <w:pStyle w:val="ListBullet"/>
+      </w:pPr>
+      <w:r>
+        <w:t>角色锁定和限额命令必须携带 actor，并由主 App 写入 App Group 后再由 Shield Configuration Extension 读取。系统受限页定制只能使用 ManagedSettingsUI 允许的背景、图标、标题、副标题和按钮，不得假装能完全接管系统页面，也不得在扩展内联网。</w:t>
+      </w:r>
+    </w:p>
+    <w:p>
+      <w:pPr>
+        <w:pStyle w:val="ListBullet"/>
+      </w:pPr>
+      <w:r>
+        <w:t>显示别名只能用于界面和语音匹配，不能替代稳定 ID。需要按 App 保存锁定执行者时，应在扩展可访问的 Token/标识范围内建立映射；不得用可修改名称作为永久键。</w:t>
+      </w:r>
+    </w:p>
+    <w:p>
+      <w:pPr>
+        <w:pStyle w:val="ListBullet"/>
+      </w:pPr>
+      <w:r>
+        <w:t>伴生设备视觉升级必须保持为展示层：不得改变稳定 ID、绑定、权限、服务器命令、三日审计清理和同步轮询。回归测试至少覆盖无内置授权外置直达、有内置授权保持双端、角色权限关闭不发送、actor 显示转义、锁定红色状态和完整发布缓存。</w:t>
       </w:r>
     </w:p>
     <w:sectPr>

</xml_diff>

<commit_message>
fix: lock companion page to vertical scrolling
</commit_message>
<xml_diff>
--- a/docs/maintenance/AI开发项目_Bug修改规范.docx
+++ b/docs/maintenance/AI开发项目_Bug修改规范.docx
@@ -1444,6 +1444,34 @@
       </w:pPr>
       <w:r>
         <w:t>伴生设备视觉升级必须保持为展示层：不得改变稳定 ID、绑定、权限、服务器命令、三日审计清理和同步轮询。回归测试至少覆盖无内置授权外置直达、有内置授权保持双端、角色权限关闭不发送、actor 显示转义、锁定红色状态和完整发布缓存。</w:t>
+      </w:r>
+    </w:p>
+    <w:p>
+      <w:pPr>
+        <w:pStyle w:val="Heading1"/>
+      </w:pPr>
+      <w:r>
+        <w:t>规则：伴生设备等纵向长页不得产生文档级横向溢出（v808）</w:t>
+      </w:r>
+    </w:p>
+    <w:p>
+      <w:r>
+        <w:t>纵向滚动容器内禁止通过左右负外边距制造全宽背景；需要通栏视觉时，应让内部容器 width/max-width:100% 并在容器内部使用 padding。</w:t>
+      </w:r>
+    </w:p>
+    <w:p>
+      <w:r>
+        <w:t>含“正文 + 右侧操作按钮”的 Grid/Flex 卡片，外层及可收缩正文必须显式 min-width:0；输入框、选择器和卡片必须使用 box-sizing:border-box 与 max-width:100%。</w:t>
+      </w:r>
+    </w:p>
+    <w:p>
+      <w:r>
+        <w:t>只在具体页面作用域关闭 overflow-x 和 overscroll-behavior-x，并设置 touch-action:pan-y；不得全局关闭横向手势，以免影响桌面翻页、相册等已有交互。</w:t>
+      </w:r>
+    </w:p>
+    <w:p>
+      <w:r>
+        <w:t>每次修复横向摇晃必须增加静态回归，至少断言：无水平负外边距、页面 overflow-x 被限制、卡片宽度受限、右侧操作区不再依赖正 margin-left 撑开布局。</w:t>
       </w:r>
     </w:p>
     <w:sectPr>

</xml_diff>

<commit_message>
fix: replace incoming tone with soft ringtone
</commit_message>
<xml_diff>
--- a/docs/maintenance/AI开发项目_Bug修改规范.docx
+++ b/docs/maintenance/AI开发项目_Bug修改规范.docx
@@ -1472,6 +1472,46 @@
     <w:p>
       <w:r>
         <w:t>每次修复横向摇晃必须增加静态回归，至少断言：无水平负外边距、页面 overflow-x 被限制、卡片宽度受限、右侧操作区不再依赖正 margin-left 撑开布局。</w:t>
+      </w:r>
+    </w:p>
+    <w:p>
+      <w:pPr>
+        <w:pStyle w:val="Heading1"/>
+      </w:pPr>
+      <w:r>
+        <w:t>新增规则：连续且舒缓的铃声必须使用独立音乐性素材（v809 热修）</w:t>
+      </w:r>
+    </w:p>
+    <w:p>
+      <w:pPr>
+        <w:pStyle w:val="ListBullet"/>
+      </w:pPr>
+      <w:r>
+        <w:t>连续性只说明没有长静默，不能证明声音舒适。超过约 0.5 秒的持续单频正弦，即使音量很低，也可能在手机扬声器上形成刺耳共振；用户要求舒缓铃声时禁止再用长持续纯音。</w:t>
+      </w:r>
+    </w:p>
+    <w:p>
+      <w:pPr>
+        <w:pStyle w:val="ListBullet"/>
+      </w:pPr>
+      <w:r>
+        <w:t>同一声音听感连续三次现场失败后，必须停止微调频率、波形、音量、包络和间隔，改为独立可试听的音频素材。素材应有低中频支撑、缓慢起落、有限高频、无警报式升降音，并验证循环接缝和最长静默。</w:t>
+      </w:r>
+    </w:p>
+    <w:p>
+      <w:pPr>
+        <w:pStyle w:val="ListBullet"/>
+      </w:pPr>
+      <w:r>
+        <w:t>独立铃声应使用独立持久媒体元素，避免消息提示覆盖；iOS 兼容回退可以复用已解锁的媒体元素，但必须播放同一份素材，禁止悄悄退回 oscillator 或旧合成音。</w:t>
+      </w:r>
+    </w:p>
+    <w:p>
+      <w:pPr>
+        <w:pStyle w:val="ListBullet"/>
+      </w:pPr>
+      <w:r>
+        <w:t>音频验收至少包含格式、时长、峰值/RMS、短窗口静默、循环接缝、主/回退路径、停止、关闭声音、离线缓存和旧方案禁止断言。自动测试只能验证结构与路由，最终听感必须保留真机试听结论。</w:t>
       </w:r>
     </w:p>
     <w:sectPr>

</xml_diff>

<commit_message>
feat: publish companion battery alerts and stable app labels
</commit_message>
<xml_diff>
--- a/docs/maintenance/AI开发项目_Bug修改规范.docx
+++ b/docs/maintenance/AI开发项目_Bug修改规范.docx
@@ -1512,6 +1512,34 @@
       </w:pPr>
       <w:r>
         <w:t>音频验收至少包含格式、时长、峰值/RMS、短窗口静默、循环接缝、主/回退路径、停止、关闭声音、离线缓存和旧方案禁止断言。自动测试只能验证结构与路由，最终听感必须保留真机试听结论。</w:t>
+      </w:r>
+    </w:p>
+    <w:p>
+      <w:pPr>
+        <w:pStyle w:val="Heading1"/>
+      </w:pPr>
+      <w:r>
+        <w:t>2026-08-06 v814 外置 App 稳定编号与可选绑定</w:t>
+      </w:r>
+    </w:p>
+    <w:p>
+      <w:r>
+        <w:t>处理 FamilyControls.ApplicationToken 时，禁止假设可以从 token 提取可上传的真实 App 名称；系统 Label(token) 仅用于本机渲染。跨端识别应使用稳定外置 ID、稳定排序编号和用户可选别名。</w:t>
+      </w:r>
+    </w:p>
+    <w:p>
+      <w:r>
+        <w:t>稳定编号不得依赖使用时长、报告返回顺序或本次上传顺序，否则数据刷新会造成 App 对应关系漂移。</w:t>
+      </w:r>
+    </w:p>
+    <w:p>
+      <w:r>
+        <w:t>小手机内置 App 与真实 iPhone 外置 App 的绑定必须保持可选。未绑定不能成为禁用真实 iPhone 锁定、解锁或每日限额的理由；绑定只用于明确的双端联动。</w:t>
+      </w:r>
+    </w:p>
+    <w:p>
+      <w:r>
+        <w:t>修复显示与绑定问题时，不得顺带要求用户重新授权、重选 App、重建 App Groups，或改动 Report/Monitor/Shield 核心链路。</w:t>
       </w:r>
     </w:p>
     <w:sectPr>

</xml_diff>

<commit_message>
docs: record v814 Swift inference hotfix
</commit_message>
<xml_diff>
--- a/docs/maintenance/AI开发项目_Bug修改规范.docx
+++ b/docs/maintenance/AI开发项目_Bug修改规范.docx
@@ -1540,6 +1540,24 @@
     <w:p>
       <w:r>
         <w:t>修复显示与绑定问题时，不得顺带要求用户重新授权、重选 App、重建 App Groups，或改动 Report/Monitor/Shield 核心链路。</w:t>
+      </w:r>
+    </w:p>
+    <w:p>
+      <w:pPr>
+        <w:pStyle w:val="Heading1"/>
+      </w:pPr>
+      <w:r>
+        <w:t>2026-08-06 v814 Xcode 26 泛型推断热修</w:t>
+      </w:r>
+    </w:p>
+    <w:p>
+      <w:r>
+        <w:t>面向 Xcode 26 编写 Swift 时，跨 optional、compactMap 元组、Set、sorted 和 Dictionary(uniqueKeysWithValues:) 的组合表达式应优先拆成显式中间类型与普通循环，尤其是在 Windows 无 Swift 编译器的交接场景。</w:t>
+      </w:r>
+    </w:p>
+    <w:p>
+      <w:r>
+        <w:t>Windows 静态核对不能视为原生编译通过；交接文本必须明确标注等待 Mac Command+B，出现首条红错时只修对应表达式，不牵连授权、App Groups 或已验证核心链路。</w:t>
       </w:r>
     </w:p>
     <w:sectPr>

</xml_diff>

<commit_message>
fix: unify companion limits and persist bindings
</commit_message>
<xml_diff>
--- a/docs/maintenance/AI开发项目_Bug修改规范.docx
+++ b/docs/maintenance/AI开发项目_Bug修改规范.docx
@@ -1558,6 +1558,62 @@
     <w:p>
       <w:r>
         <w:t>Windows 静态核对不能视为原生编译通过；交接文本必须明确标注等待 Mac Command+B，出现首条红错时只修对应表达式，不牵连授权、App Groups 或已验证核心链路。</w:t>
+      </w:r>
+    </w:p>
+    <w:p>
+      <w:r>
+        <w:br w:type="page"/>
+      </w:r>
+    </w:p>
+    <w:p>
+      <w:pPr>
+        <w:pStyle w:val="Heading1"/>
+      </w:pPr>
+      <w:r>
+        <w:rPr>
+          <w:rFonts w:ascii="Microsoft YaHei" w:hAnsi="Microsoft YaHei" w:eastAsia="Microsoft YaHei"/>
+        </w:rPr>
+        <w:t>v815 新增规范：统一配置、独立执行（2026-08-06）</w:t>
+      </w:r>
+    </w:p>
+    <w:p>
+      <w:r>
+        <w:rPr>
+          <w:rFonts w:ascii="Microsoft YaHei" w:hAnsi="Microsoft YaHei" w:eastAsia="Microsoft YaHei"/>
+        </w:rPr>
+        <w:t>1. 绑定的内置/外置 App 只能存在一份用户可编辑的每日限额。limit 命令必须强制双端，不得沿用锁定/解锁的 scope 形成仅内置或仅外置限额。</w:t>
+      </w:r>
+    </w:p>
+    <w:p>
+      <w:r>
+        <w:rPr>
+          <w:rFonts w:ascii="Microsoft YaHei" w:hAnsi="Microsoft YaHei" w:eastAsia="Microsoft YaHei"/>
+        </w:rPr>
+        <w:t>2. “统一限额”不等于合并计时。内置与外置必须保留各自独立的使用时长来源、阈值判断和锁定执行，禁止相加或互相伪造使用时长。</w:t>
+      </w:r>
+    </w:p>
+    <w:p>
+      <w:r>
+        <w:rPr>
+          <w:rFonts w:ascii="Microsoft YaHei" w:hAnsi="Microsoft YaHei" w:eastAsia="Microsoft YaHei"/>
+        </w:rPr>
+        <w:t>3. 未完成稳定 ID 绑定的外置 App 可以单独锁定/解锁，但不得显示或接受独立限额输入。角色限额命令也必须拒绝未绑定目标。</w:t>
+      </w:r>
+    </w:p>
+    <w:p>
+      <w:r>
+        <w:rPr>
+          <w:rFonts w:ascii="Microsoft YaHei" w:hAnsi="Microsoft YaHei" w:eastAsia="Microsoft YaHei"/>
+        </w:rPr>
+        <w:t>4. select/onchange 等轻量配置操作不得调用全局 render。应立即持久化，并局部刷新所属面板；涉及滚动容器时必须保存和恢复 scrollTop，防止闪屏、跳页或控件瞬时回退。</w:t>
+      </w:r>
+    </w:p>
+    <w:p>
+      <w:r>
+        <w:rPr>
+          <w:rFonts w:ascii="Microsoft YaHei" w:hAnsi="Microsoft YaHei" w:eastAsia="Microsoft YaHei"/>
+        </w:rPr>
+        <w:t>5. 绑定映射是本机核心配置。用户完成选择后必须立即写入，不得只依赖延迟防抖保存；服务端快照刷新不得覆盖本机 bindings。</w:t>
       </w:r>
     </w:p>
     <w:sectPr>

</xml_diff>

<commit_message>
feat: ship electronic pet and WeChat autonomy mode
</commit_message>
<xml_diff>
--- a/docs/maintenance/AI开发项目_Bug修改规范.docx
+++ b/docs/maintenance/AI开发项目_Bug修改规范.docx
@@ -1614,6 +1614,45 @@
           <w:rFonts w:ascii="Microsoft YaHei" w:hAnsi="Microsoft YaHei" w:eastAsia="Microsoft YaHei"/>
         </w:rPr>
         <w:t>5. 绑定映射是本机核心配置。用户完成选择后必须立即写入，不得只依赖延迟防抖保存；服务端快照刷新不得覆盖本机 bindings。</w:t>
+      </w:r>
+    </w:p>
+    <w:p/>
+    <w:p>
+      <w:pPr>
+        <w:pStyle w:val="Heading1"/>
+      </w:pPr>
+      <w:r>
+        <w:t>v816 新增规范：功能分支上线、角色自主边界与版本回报（2026-08-06）</w:t>
+      </w:r>
+    </w:p>
+    <w:p>
+      <w:pPr/>
+      <w:r>
+        <w:t>1. 推送功能分支不等于线上发布。用户要求上线后，必须核对站点实际部署分支、origin/main 提交、页面版本号和 Service Worker BUILD；只有远端 main 指向新提交后才能报告已推送。</w:t>
+      </w:r>
+    </w:p>
+    <w:p>
+      <w:pPr/>
+      <w:r>
+        <w:t>2. 功能分支落后于 main 时，禁止整分支覆盖或强推。必须以最新 main 为基线，只移植目标功能与对应测试，并确认期间新增的锁软件、伴生设备、存储、电话和音乐修复仍保留。</w:t>
+      </w:r>
+    </w:p>
+    <w:p>
+      <w:pPr/>
+      <w:r>
+        <w:t>3. 微信自主模式只能停用系统强制的心情值、亲密度、怀疑升级、久未回复催促、固定跟进和固定电话反应；不得删除角色可自主选择的来电能力，也不得绕过或破坏软件锁、权限、限额、稳定 ID 绑定和命令执行。</w:t>
+      </w:r>
+    </w:p>
+    <w:p>
+      <w:pPr/>
+      <w:r>
+        <w:t>4. 电子宠物应保持为独立模块和独立持久状态。房间交互、换装、双宠拖动与成长修复不得顺带改游戏大厅其他游戏、微信数据或伴生设备状态。</w:t>
+      </w:r>
+    </w:p>
+    <w:p>
+      <w:pPr/>
+      <w:r>
+        <w:t>5. 每次完成修改必须明确告诉用户正式版本号；若尚未合入部署分支，只能说明功能分支或预览分支名称，不能把它称为线上版本。</w:t>
       </w:r>
     </w:p>
     <w:sectPr>

</xml_diff>

<commit_message>
fix: restore mobile pet taps and add ringtone choices
</commit_message>
<xml_diff>
--- a/docs/maintenance/AI开发项目_Bug修改规范.docx
+++ b/docs/maintenance/AI开发项目_Bug修改规范.docx
@@ -1653,6 +1653,94 @@
       <w:pPr/>
       <w:r>
         <w:t>5. 每次完成修改必须明确告诉用户正式版本号；若尚未合入部署分支，只能说明功能分支或预览分支名称，不能把它称为线上版本。</w:t>
+      </w:r>
+    </w:p>
+    <w:p>
+      <w:pPr>
+        <w:pStyle w:val="Heading2"/>
+      </w:pPr>
+      <w:r>
+        <w:t>移动端可拖动控件的轻点兼容规则（2026-08-06）</w:t>
+      </w:r>
+    </w:p>
+    <w:p>
+      <w:pPr>
+        <w:pStyle w:val="ListBullet"/>
+      </w:pPr>
+      <w:r>
+        <w:t>同一元素既能拖动又能轻点时，必须在 pointer 生命周期内用位移阈值明确区分，不能把关键轻点行为只交给后续合成 click。</w:t>
+      </w:r>
+    </w:p>
+    <w:p>
+      <w:pPr>
+        <w:pStyle w:val="ListBullet"/>
+      </w:pPr>
+      <w:r>
+        <w:t>如果 pointerdown/pointerup 使用 preventDefault、指针捕获或会重绘 DOM，无位移的 pointerup 应直接完成轻点行为，并加入一次性或短时重复 click 防护。</w:t>
+      </w:r>
+    </w:p>
+    <w:p>
+      <w:pPr>
+        <w:pStyle w:val="ListBullet"/>
+      </w:pPr>
+      <w:r>
+        <w:t>pointercancel 只负责清理状态，不得误触发轻点、喂食、进窝等业务动作。</w:t>
+      </w:r>
+    </w:p>
+    <w:p>
+      <w:pPr>
+        <w:pStyle w:val="ListBullet"/>
+      </w:pPr>
+      <w:r>
+        <w:t>长按蓝框、触摸菜单和点击高亮的抑制必须限定到具体模块；禁止为了修一个页面而在全局设置 user-select:none。</w:t>
+      </w:r>
+    </w:p>
+    <w:p>
+      <w:pPr>
+        <w:pStyle w:val="ListBullet"/>
+      </w:pPr>
+      <w:r>
+        <w:t>移动交互至少验证：轻点一次只触发一次、拖动不误点、取消不误点、长按不选中文字、两个宠物都能切换与互动。</w:t>
+      </w:r>
+    </w:p>
+    <w:p>
+      <w:pPr>
+        <w:pStyle w:val="Heading2"/>
+      </w:pPr>
+      <w:r>
+        <w:t>可选择来电声的维护规则（2026-08-06）</w:t>
+      </w:r>
+    </w:p>
+    <w:p>
+      <w:pPr>
+        <w:pStyle w:val="ListBullet"/>
+      </w:pPr>
+      <w:r>
+        <w:t>来电声、主动拨号声、消息提示音必须保持三条独立链路；修改其中一个时不得复用或替换另外两个的资源和包络。</w:t>
+      </w:r>
+    </w:p>
+    <w:p>
+      <w:pPr>
+        <w:pStyle w:val="ListBullet"/>
+      </w:pPr>
+      <w:r>
+        <w:t>新增铃声必须进入固定白名单并随 Service Worker 离线缓存；禁止直接信任存档中的任意 URL，旧存档或非法值一律回退默认柔和铃声。</w:t>
+      </w:r>
+    </w:p>
+    <w:p>
+      <w:pPr>
+        <w:pStyle w:val="ListBullet"/>
+      </w:pPr>
+      <w:r>
+        <w:t>试听必须由用户手势触发、可主动停止、短时自动停止，并在真实来电或通话开始前清理；不得触发振动或写入通话记录。</w:t>
+      </w:r>
+    </w:p>
+    <w:p>
+      <w:pPr>
+        <w:pStyle w:val="ListBullet"/>
+      </w:pPr>
+      <w:r>
+        <w:t>连续来电素材应验证无长静音间隔、循环接缝、峰值与 RMS；禁止恢复交替双音、救护车式音型或一秒一响。</w:t>
       </w:r>
     </w:p>
     <w:sectPr>

</xml_diff>

<commit_message>
fix: make role app references precise in v818
</commit_message>
<xml_diff>
--- a/docs/maintenance/AI开发项目_Bug修改规范.docx
+++ b/docs/maintenance/AI开发项目_Bug修改规范.docx
@@ -1741,6 +1741,62 @@
       </w:pPr>
       <w:r>
         <w:t>连续来电素材应验证无长静音间隔、循环接缝、峰值与 RMS；禁止恢复交替双音、救护车式音型或一秒一响。</w:t>
+      </w:r>
+    </w:p>
+    <w:p>
+      <w:pPr>
+        <w:pStyle w:val="Heading2"/>
+      </w:pPr>
+      <w:r>
+        <w:t>v818 新增规范：自然集合指代不得退化为全量操作（2026-08-06）</w:t>
+      </w:r>
+    </w:p>
+    <w:p>
+      <w:pPr>
+        <w:pStyle w:val="ListBullet"/>
+      </w:pPr>
+      <w:r>
+        <w:t>“这几个、它们、这些、这四个、都锁、全锁”等集合指代必须绑定最近一轮明确列出的对象集合；不能仅凭“全/都”字样推导为全部已选对象。</w:t>
+      </w:r>
+    </w:p>
+    <w:p>
+      <w:pPr>
+        <w:pStyle w:val="ListBullet"/>
+      </w:pPr>
+      <w:r>
+        <w:t>只有用户或角色明确说出“全部已选 App、所有软件、全部软件”等全量对象时，才允许执行全量操作；全量入口必须与普通集合入口分开。</w:t>
+      </w:r>
+    </w:p>
+    <w:p>
+      <w:pPr>
+        <w:pStyle w:val="ListBullet"/>
+      </w:pPr>
+      <w:r>
+        <w:t>角色模型输出只提供意图候选，最终目标必须由确定性解析器按当前对话和稳定 ID 复核；模型不得从可用 App 清单自行扩写集合对象。</w:t>
+      </w:r>
+    </w:p>
+    <w:p>
+      <w:pPr>
+        <w:pStyle w:val="ListBullet"/>
+      </w:pPr>
+      <w:r>
+        <w:t>对象不明确、上下文超出窗口、名称不存在或数量无法核实时，必须失败关闭且不执行；禁止为了“看起来成功”而回退到全部对象。</w:t>
+      </w:r>
+    </w:p>
+    <w:p>
+      <w:pPr>
+        <w:pStyle w:val="ListBullet"/>
+      </w:pPr>
+      <w:r>
+        <w:t>存在重叠名称时必须最长名称优先，再按稳定 ID 去重；批量命令测试至少覆盖准确数量、准确 ID、显式全量和模糊失败四类。</w:t>
+      </w:r>
+    </w:p>
+    <w:p>
+      <w:pPr>
+        <w:pStyle w:val="ListBullet"/>
+      </w:pPr>
+      <w:r>
+        <w:t>角色可自然表达情绪和决定，执行说明必须通过隐藏动作协议传递并在展示前剥离；不得把系统提示词或控制标签显示在聊天正文。</w:t>
       </w:r>
     </w:p>
     <w:sectPr>

</xml_diff>

<commit_message>
fix: restore bound dual-end locks in v819
</commit_message>
<xml_diff>
--- a/docs/maintenance/AI开发项目_Bug修改规范.docx
+++ b/docs/maintenance/AI开发项目_Bug修改规范.docx
@@ -1797,6 +1797,62 @@
       </w:pPr>
       <w:r>
         <w:t>角色可自然表达情绪和决定，执行说明必须通过隐藏动作协议传递并在展示前剥离；不得把系统提示词或控制标签显示在聊天正文。</w:t>
+      </w:r>
+    </w:p>
+    <w:p>
+      <w:pPr>
+        <w:pStyle w:val="Heading2"/>
+      </w:pPr>
+      <w:r>
+        <w:t>v819 新增规范：目标精度与执行范围必须分离（2026-08-06）</w:t>
+      </w:r>
+    </w:p>
+    <w:p>
+      <w:pPr>
+        <w:pStyle w:val="ListBullet"/>
+      </w:pPr>
+      <w:r>
+        <w:t>指代解析只负责回答“是哪几个 App”，不得顺便把执行范围写死为 external、internal 或全部。</w:t>
+      </w:r>
+    </w:p>
+    <w:p>
+      <w:pPr>
+        <w:pStyle w:val="ListBullet"/>
+      </w:pPr>
+      <w:r>
+        <w:t>角色命令默认作用于稳定绑定的内外两端；只有角色明确说“仅内置”或“仅外置”时才能缩窄范围。页面手动范围不得暗中影响角色命令。</w:t>
+      </w:r>
+    </w:p>
+    <w:p>
+      <w:pPr>
+        <w:pStyle w:val="ListBullet"/>
+      </w:pPr>
+      <w:r>
+        <w:t>没有稳定绑定时可以控制明确命中的外置 App，但不得按同名、顺序或数量猜测内置绑定。</w:t>
+      </w:r>
+    </w:p>
+    <w:p>
+      <w:pPr>
+        <w:pStyle w:val="ListBullet"/>
+      </w:pPr>
+      <w:r>
+        <w:t>“这些/那四个/前面几个”必须从最近明确提到的集合解析；集合数量不一致时宁可不执行，也不能扩大为全部 App。</w:t>
+      </w:r>
+    </w:p>
+    <w:p>
+      <w:pPr>
+        <w:pStyle w:val="ListBullet"/>
+      </w:pPr>
+      <w:r>
+        <w:t>绑定、锁定、解锁、限额等局部动作禁止触发全页 render；应保存后只刷新所属分区，并保持滚动位置。</w:t>
+      </w:r>
+    </w:p>
+    <w:p>
+      <w:pPr>
+        <w:pStyle w:val="ListBullet"/>
+      </w:pPr>
+      <w:r>
+        <w:t>每次修改必须至少验证：精确集合边界、绑定双端、未绑定单端、显式范围、局部刷新和完整回归测试。</w:t>
       </w:r>
     </w:p>
     <w:sectPr>

</xml_diff>

<commit_message>
feat: retire built-in images and recover companion commands
</commit_message>
<xml_diff>
--- a/docs/maintenance/AI开发项目_Bug修改规范.docx
+++ b/docs/maintenance/AI开发项目_Bug修改规范.docx
@@ -1853,6 +1853,108 @@
       </w:pPr>
       <w:r>
         <w:t>每次修改必须至少验证：精确集合边界、绑定双端、未绑定单端、显式范围、局部刷新和完整回归测试。</w:t>
+      </w:r>
+    </w:p>
+    <w:p>
+      <w:r>
+        <w:rPr>
+          <w:b/>
+        </w:rPr>
+        <w:t>v822 新增规范：功能下线与正式发布必须双重验收（2026-08-06）</w:t>
+      </w:r>
+    </w:p>
+    <w:p>
+      <w:r>
+        <w:t>删除收费或后台功能时必须同时核对前端入口、默认状态、使用说明、能力返回、路由、价格、计费、退款和部署文档；不能只隐藏按钮。历史待结算数据需要保留明确的安全收尾路径。</w:t>
+      </w:r>
+    </w:p>
+    <w:p>
+      <w:r>
+        <w:t>内置图片与设置 → AI真图的外置接口是两条独立能力。下线内置后台时不得误删用户自行配置的外置角色真图和画室出图；测试必须同时证明内置入口/路由不存在且外置调用仍存在。</w:t>
+      </w:r>
+    </w:p>
+    <w:p>
+      <w:r>
+        <w:t>功能分支有提交、工作区无改动或 GitHub 显示已 published 都不代表正式版本上线。每次交付必须确认目标提交进入 origin/main，Service Worker 与入口缓存号一致，并核对线上 app.js 版本和关键功能标记。</w:t>
+      </w:r>
+    </w:p>
+    <w:p>
+      <w:r>
+        <w:br w:type="page"/>
+      </w:r>
+    </w:p>
+    <w:p>
+      <w:pPr>
+        <w:pStyle w:val="Heading1"/>
+      </w:pPr>
+      <w:r>
+        <w:t>新增规范：v822 · 伴生命令回执与前台恢复</w:t>
+      </w:r>
+    </w:p>
+    <w:p>
+      <w:r>
+        <w:rPr>
+          <w:b/>
+        </w:rPr>
+        <w:t>命令真值：</w:t>
+      </w:r>
+      <w:r>
+        <w:t>服务器接受命令不等于设备执行成功；只有 iPhone 回执且回执后的新快照一致，才能显示已锁或已解锁。</w:t>
+      </w:r>
+    </w:p>
+    <w:p>
+      <w:r>
+        <w:rPr>
+          <w:b/>
+        </w:rPr>
+        <w:t>期望状态：</w:t>
+      </w:r>
+      <w:r>
+        <w:t>同一稳定外置 ID 的 lock/unlock 必须互相覆盖，只保留最后一次用户或角色意图，不允许恢复前台后重放相反旧命令。</w:t>
+      </w:r>
+    </w:p>
+    <w:p>
+      <w:r>
+        <w:rPr>
+          <w:b/>
+        </w:rPr>
+        <w:t>时效规则：</w:t>
+      </w:r>
+      <w:r>
+        <w:t>pending 超过 15 分钟必须过期；设备快照超过 2 分钟必须标记陈旧，不能继续驱动红色锁定卡片。</w:t>
+      </w:r>
+    </w:p>
+    <w:p>
+      <w:r>
+        <w:rPr>
+          <w:b/>
+        </w:rPr>
+        <w:t>生命周期：</w:t>
+      </w:r>
+      <w:r>
+        <w:t>网页 pageshow/focus/恢复可见和 iOS scenePhase.active 都必须立即补拉；轮询等待应放在完成首次同步之后。</w:t>
+      </w:r>
+    </w:p>
+    <w:p>
+      <w:r>
+        <w:rPr>
+          <w:b/>
+        </w:rPr>
+        <w:t>后台边界：</w:t>
+      </w:r>
+      <w:r>
+        <w:t>iOS 完全挂起后的实时命令与关闭后的通知只能通过 APNs/服务器实现；不得宣称普通定时轮询能在完全关闭后运行。</w:t>
+      </w:r>
+    </w:p>
+    <w:p>
+      <w:r>
+        <w:rPr>
+          <w:b/>
+        </w:rPr>
+        <w:t>回归要求：</w:t>
+      </w:r>
+      <w:r>
+        <w:t>每次修改伴生锁定，至少覆盖同 App 锁→解锁覆盖、解锁→锁覆盖、15 分钟过期、陈旧快照不染红、恢复前台立即补拉五类测试。</w:t>
       </w:r>
     </w:p>
     <w:sectPr>

</xml_diff>

<commit_message>
fix: isolate WeChat account memories
</commit_message>
<xml_diff>
--- a/docs/maintenance/AI开发项目_Bug修改规范.docx
+++ b/docs/maintenance/AI开发项目_Bug修改规范.docx
@@ -1955,6 +1955,62 @@
       </w:r>
       <w:r>
         <w:t>每次修改伴生锁定，至少覆盖同 App 锁→解锁覆盖、解锁→锁覆盖、15 分钟过期、陈旧快照不染红、恢复前台立即补拉五类测试。</w:t>
+      </w:r>
+    </w:p>
+    <w:p>
+      <w:pPr>
+        <w:pStyle w:val="Heading1"/>
+      </w:pPr>
+      <w:r>
+        <w:t>v823 新增规范：多账号隔离必须贯穿消息、记忆与异步任务（2026-08-06）</w:t>
+      </w:r>
+    </w:p>
+    <w:p>
+      <w:pPr>
+        <w:pStyle w:val="ListBullet"/>
+      </w:pPr>
+      <w:r>
+        <w:t>多账号功能不能只隔离可见消息键。凡是由聊天衍生的长期记忆、自动总结、总结游标、情绪状态、待办状态、电话总结和检索缓存，都必须使用同一账号 ID 作用域。</w:t>
+      </w:r>
+    </w:p>
+    <w:p>
+      <w:pPr>
+        <w:pStyle w:val="ListBullet"/>
+      </w:pPr>
+      <w:r>
+        <w:t>异步任务必须在开始时捕获账号 ID，并把该 ID 显式传到读取、提示词、清洗、去重、写入和游标更新的最后一步；禁止在 await 返回后重新读取当前 actId 决定写入位置。</w:t>
+      </w:r>
+    </w:p>
+    <w:p>
+      <w:pPr>
+        <w:pStyle w:val="ListBullet"/>
+      </w:pPr>
+      <w:r>
+        <w:t>大号兼容旧字段时可以保留主仓库，但小号必须使用按账号 ID 分区的新仓库。删除小号和彻底清除角色记忆时，必须同步删除账号级总结、游标及元数据。</w:t>
+      </w:r>
+    </w:p>
+    <w:p>
+      <w:pPr>
+        <w:pStyle w:val="ListBullet"/>
+      </w:pPr>
+      <w:r>
+        <w:t>账号隔离回归至少覆盖：列表互不相见、长期提示词互不注入、任一账号推进游标不影响另一账号、生成期间切号不改写目标、电话总结不串号、小号不继承大号专属昵称。</w:t>
+      </w:r>
+    </w:p>
+    <w:p>
+      <w:pPr>
+        <w:pStyle w:val="ListBullet"/>
+      </w:pPr>
+      <w:r>
+        <w:t>历史数据没有可靠来源标记时禁止按姓名或文本内容猜测迁移归属；应保持兼容并阻止新增污染，必要时提供用户可见的当前账号编辑/删除入口。</w:t>
+      </w:r>
+    </w:p>
+    <w:p>
+      <w:pPr>
+        <w:pStyle w:val="ListBullet"/>
+      </w:pPr>
+      <w:r>
+        <w:t>软件锁、好友拉黑等已经按账号稳定隔离的核心链路不得因修复记忆串号而重构；先证明影响边界，再做最小范围修改。</w:t>
       </w:r>
     </w:p>
     <w:sectPr>

</xml_diff>

<commit_message>
feat: wake companion commands in background
</commit_message>
<xml_diff>
--- a/docs/maintenance/AI开发项目_Bug修改规范.docx
+++ b/docs/maintenance/AI开发项目_Bug修改规范.docx
@@ -1955,6 +1955,44 @@
       </w:r>
       <w:r>
         <w:t>每次修改伴生锁定，至少覆盖同 App 锁→解锁覆盖、解锁→锁覆盖、15 分钟过期、陈旧快照不染红、恢复前台立即补拉五类测试。</w:t>
+      </w:r>
+    </w:p>
+    <w:p>
+      <w:pPr>
+        <w:pStyle w:val="Heading1"/>
+      </w:pPr>
+      <w:r>
+        <w:t>v824 新增规范：推送唤醒、自然指代与回执真值</w:t>
+      </w:r>
+    </w:p>
+    <w:p>
+      <w:r>
+        <w:t>推送不等于成功：APNs/Web Push 只能作为唤醒或提醒信号。任何锁定、解锁、限额或同步动作，必须等待真实设备回执；需要状态确认时还必须有命令之后生成的新鲜快照。</w:t>
+      </w:r>
+    </w:p>
+    <w:p>
+      <w:r>
+        <w:t>自然指代必须收窄：允许角色自由使用“给你开了”“这个先用”等自然说法，但执行层只能继承最近上下文中唯一明确的外置 App。若存在多个候选，必须失败关闭或自然追问，绝不能自动扩大成全部 App。</w:t>
+      </w:r>
+    </w:p>
+    <w:p>
+      <w:r>
+        <w:t>别名必须唯一：GPT 可映射 ChatGPT 仅因为当前外置列表中映射唯一；别名冲突时不得猜测。所有实际命令继续传外置稳定 ID，显示名、内置绑定和统一限额不得替换真实目标。</w:t>
+      </w:r>
+    </w:p>
+    <w:p>
+      <w:r>
+        <w:t>后台边界必须如实显示：15 分钟表示过期上限；正常前台或成功后台唤醒应在数秒完成。普通退后台与用户强制划掉必须分开描述，不能承诺 iOS 强制退出后仍可后台执行。</w:t>
+      </w:r>
+    </w:p>
+    <w:p>
+      <w:r>
+        <w:t>密钥隔离：APNs 私钥只能保存在服务器 Secrets；客户端只注册 token，网页只携带现有 owner secret 请求服务器验证指定 pending 命令。推送失败不得修改命令状态。</w:t>
+      </w:r>
+    </w:p>
+    <w:p>
+      <w:r>
+        <w:t>回归至少覆盖：唯一别名、单一上下文暗示解锁、多 App 上下文拒绝扩大、推送请求不冒充回执、页面持续拉取、回前台立即补拉、15 分钟过期、陈旧快照不染红。</w:t>
       </w:r>
     </w:p>
     <w:sectPr>

</xml_diff>

<commit_message>
v825 replace incoming ringtones with distinct chimes
</commit_message>
<xml_diff>
--- a/docs/maintenance/AI开发项目_Bug修改规范.docx
+++ b/docs/maintenance/AI开发项目_Bug修改规范.docx
@@ -2049,6 +2049,39 @@
     <w:p>
       <w:r>
         <w:t>回归至少覆盖：唯一别名、单一上下文暗示解锁、多 App 上下文拒绝扩大、推送请求不冒充回执、页面持续拉取、回前台立即补拉、15 分钟过期、陈旧快照不染红。</w:t>
+      </w:r>
+    </w:p>
+    <w:p>
+      <w:pPr>
+        <w:pStyle w:val="Heading1"/>
+      </w:pPr>
+      <w:r>
+        <w:t>v825 新增规范：可选铃声必须声学可区分并验证循环接缝（2026-08-06）</w:t>
+      </w:r>
+    </w:p>
+    <w:p>
+      <w:r>
+        <w:t>多款铃声不能只改名称或轻微频率；至少应在音高走向、双响节奏、谐波音色或包络中有两项明确差异，并用两两相关度或同等指标验证。</w:t>
+      </w:r>
+    </w:p>
+    <w:p>
+      <w:r>
+        <w:t>用户要求提示音式时禁止加入持续和弦铺底、长旋律或背景音乐结构；短铃可连续重复，但不能退化为每隔一秒孤立响一次的警报纯音。</w:t>
+      </w:r>
+    </w:p>
+    <w:p>
+      <w:r>
+        <w:t>来电素材继续走独立 Audio/WAV 路线，不得为了复用消息提示音而改回 WebAudio 振荡器；消息提示、主动拨号、来电和通话媒体必须保持职责隔离。</w:t>
+      </w:r>
+    </w:p>
+    <w:p>
+      <w:r>
+        <w:t>循环音频必须验证格式、时长、峰值/RMS、最长静默段、首尾采样跳变、各款差异、离线清单和缓存版本。测试拦下的接缝或空档问题不得直接推送。</w:t>
+      </w:r>
+    </w:p>
+    <w:p>
+      <w:r>
+        <w:t>推送前必须先 fetch 并核对远端 main 版本；若远端已占用计划版本号，应保留其功能、文档和测试并顺延新版本，禁止强推覆盖。</w:t>
       </w:r>
     </w:p>
     <w:sectPr>

</xml_diff>

<commit_message>
v826 use WeChat message ding for incoming calls
</commit_message>
<xml_diff>
--- a/docs/maintenance/AI开发项目_Bug修改规范.docx
+++ b/docs/maintenance/AI开发项目_Bug修改规范.docx
@@ -2082,6 +2082,34 @@
     <w:p>
       <w:r>
         <w:t>推送前必须先 fetch 并核对远端 main 版本；若远端已占用计划版本号，应保留其功能、文档和测试并顺延新版本，禁止强推覆盖。</w:t>
+      </w:r>
+    </w:p>
+    <w:p>
+      <w:pPr>
+        <w:pStyle w:val="Heading1"/>
+      </w:pPr>
+      <w:r>
+        <w:t>v826 新增规范：同提示音需求必须匹配波形且保持播放器隔离（2026-08-06）</w:t>
+      </w:r>
+    </w:p>
+    <w:p>
+      <w:r>
+        <w:t>用户要求‘和某提示音一样’时，不能只做风格相似的另一段声音；必须核对原提示音的频率、时长、起音、衰减和音量关系，并用波形相关度或等效测试验证。</w:t>
+      </w:r>
+    </w:p>
+    <w:p>
+      <w:r>
+        <w:t>相同音色不等于共用同一个 Audio 元素。消息提示、来电循环、拨号等待和通话媒体必须继续使用各自的播放职责，避免一个提示音暂停音乐或抢占电话音频。</w:t>
+      </w:r>
+    </w:p>
+    <w:p>
+      <w:r>
+        <w:t>把一次性短提示音改为来电铃时，只允许改变重复编排，不得拉长单声、增加旋律或改变原衰减；同时继续限制一秒静默脉冲和循环接缝爆音。</w:t>
+      </w:r>
+    </w:p>
+    <w:p>
+      <w:r>
+        <w:t>替换已发布音频时优先使用新文件名并升级 Service Worker，不能只覆盖原 URL 后假定所有手机都会刷新。</w:t>
       </w:r>
     </w:p>
     <w:sectPr>

</xml_diff>

<commit_message>
feat: add scheduled role message push
</commit_message>
<xml_diff>
--- a/docs/maintenance/AI开发项目_Bug修改规范.docx
+++ b/docs/maintenance/AI开发项目_Bug修改规范.docx
@@ -2110,6 +2110,39 @@
     <w:p>
       <w:r>
         <w:t>替换已发布音频时优先使用新文件名并升级 Service Worker，不能只覆盖原 URL 后假定所有手机都会刷新。</w:t>
+      </w:r>
+    </w:p>
+    <w:p>
+      <w:r>
+        <w:rPr>
+          <w:b/>
+        </w:rPr>
+        <w:t>v827 · 服务器定时触发与角色消息推送（2026-08-06）</w:t>
+      </w:r>
+    </w:p>
+    <w:p>
+      <w:r>
+        <w:t>推送成功必须分四层验证：签名与 token 登记、服务器定时器到期、APNs 投递、outbox 消息进入正确角色聊天并确认。任何一层成功都不能代替后续层；界面不得用“已登记”冒充“消息已送达”。</w:t>
+      </w:r>
+    </w:p>
+    <w:p>
+      <w:r>
+        <w:t>角色主动消息必须先持久化 outbox，再尝试 APNs。APNs 只负责提醒与唤醒；失败、延迟、App 被系统挂起或用户强制划掉时，重新打开仍必须能拉回消息。客户端按稳定 outbox ID 去重并确认，禁止重复插入同一条角色消息。</w:t>
+      </w:r>
+    </w:p>
+    <w:p>
+      <w:r>
+        <w:t>服务器定时任务必须有角色级开关、允许时段、时区、每日上限和下一次执行时间，避免无限轮询或消息轰炸。删除角色时应尽力停用其计划；用户关闭主动联系后服务器不得继续生成。</w:t>
+      </w:r>
+    </w:p>
+    <w:p>
+      <w:r>
+        <w:t>隐私最小化：定时触发只上传生成自然消息所需的简短角色摘要，不上传完整聊天、健康、位置、屏幕使用明细或设备密钥。APNs 私钥和服务角色密钥只能保存在服务器 Secrets，不能进入网页、Swift、Git 或分享压缩包。</w:t>
+      </w:r>
+    </w:p>
+    <w:p>
+      <w:r>
+        <w:t>新增服务器主动消息不得改写锁定、解锁、限额或健康核心链路。回归至少覆盖：计划表 RLS、到期领取、outbox 先于 APNs、正确角色路由、重复消息去重、确认回执、前台周期补拉、回前台立即补拉、关闭开关停止生成。</w:t>
       </w:r>
     </w:p>
     <w:sectPr>

</xml_diff>

<commit_message>
v828 lower the second WeChat ringtone note
</commit_message>
<xml_diff>
--- a/docs/maintenance/AI开发项目_Bug修改规范.docx
+++ b/docs/maintenance/AI开发项目_Bug修改规范.docx
@@ -2143,6 +2143,34 @@
     <w:p>
       <w:r>
         <w:t>新增服务器主动消息不得改写锁定、解锁、限额或健康核心链路。回归至少覆盖：计划表 RLS、到期领取、outbox 先于 APNs、正确角色路由、重复消息去重、确认回执、前台周期补拉、回前台立即补拉、关闭开关停止生成。</w:t>
+      </w:r>
+    </w:p>
+    <w:p>
+      <w:pPr>
+        <w:pStyle w:val="Heading1"/>
+      </w:pPr>
+      <w:r>
+        <w:t>v828 新增规范：指定保留的音节必须逐段验证（2026-08-06）</w:t>
+      </w:r>
+    </w:p>
+    <w:p>
+      <w:r>
+        <w:t>用户明确说某一音节不改时，必须把音频拆成独立时间段验证；不能只检查整段文件的总体频谱或听感。</w:t>
+      </w:r>
+    </w:p>
+    <w:p>
+      <w:r>
+        <w:t>高低音调整只允许改变指定音节的基频，未指定的时长、包络、音量、间距与播放器路径保持不变。</w:t>
+      </w:r>
+    </w:p>
+    <w:p>
+      <w:r>
+        <w:t>每次替换已发布音频继续使用新文件名和新 Service Worker 版本，避免浏览器缓存掩盖真实修改。</w:t>
+      </w:r>
+    </w:p>
+    <w:p>
+      <w:r>
+        <w:t>版本发布前必须先核对远端 main；若远端已发布新功能，铃声改动必须在其上顺延版本并完整回归，禁止覆盖服务器推送或软件锁链路。</w:t>
       </w:r>
     </w:p>
     <w:sectPr>

</xml_diff>

<commit_message>
v832 add premium home theme
</commit_message>
<xml_diff>
--- a/docs/maintenance/AI开发项目_Bug修改规范.docx
+++ b/docs/maintenance/AI开发项目_Bug修改规范.docx
@@ -2171,6 +2171,35 @@
     <w:p>
       <w:r>
         <w:t>版本发布前必须先核对远端 main；若远端已发布新功能，铃声改动必须在其上顺延版本并完整回归，禁止覆盖服务器推送或软件锁链路。</w:t>
+      </w:r>
+    </w:p>
+    <w:p>
+      <w:r>
+        <w:rPr>
+          <w:b/>
+          <w:sz w:val="28"/>
+        </w:rPr>
+        <w:t>v832 新增规则：主题预览不得替代正式功能图标（2026-08-07）</w:t>
+      </w:r>
+    </w:p>
+    <w:p>
+      <w:r>
+        <w:t>1. 主题预览必须复用正式图标语义和路径：动态用 thought、语音用 mic、微信底栏用 chat/user/camera/smile。</w:t>
+      </w:r>
+    </w:p>
+    <w:p>
+      <w:r>
+        <w:t>2. 只改主题颜色和框架时，不得重写朋友圈、聊天气泡、字体、输入栏、底部导航或角色动态结构。</w:t>
+      </w:r>
+    </w:p>
+    <w:p>
+      <w:r>
+        <w:t>3. 主屏主题必须保留时间戳、情侣双头像、软件锁遮罩与锁定判断；主题 CSS 不得覆盖锁定状态。</w:t>
+      </w:r>
+    </w:p>
+    <w:p>
+      <w:r>
+        <w:t>4. 发布前再次 fetch 远端 main；若版本已前进，必须基于新版本顺延编号，禁止覆盖刚发布的功能。</w:t>
       </w:r>
     </w:p>
     <w:sectPr>

</xml_diff>

<commit_message>
v833 restore natural inner thoughts and expand pets
</commit_message>
<xml_diff>
--- a/docs/maintenance/AI开发项目_Bug修改规范.docx
+++ b/docs/maintenance/AI开发项目_Bug修改规范.docx
@@ -2200,6 +2200,85 @@
     <w:p>
       <w:r>
         <w:t>4. 发布前再次 fetch 远端 main；若版本已前进，必须基于新版本顺延编号，禁止覆盖刚发布的功能。</w:t>
+      </w:r>
+    </w:p>
+    <w:p>
+      <w:pPr>
+        <w:pStyle w:val="Heading1"/>
+        <w:spacing w:before="200" w:after="80"/>
+      </w:pPr>
+      <w:r>
+        <w:t>2026-08-07｜v833 · 自然内心想法与电子宠物扩展 新增规则</w:t>
+      </w:r>
+    </w:p>
+    <w:p>
+      <w:pPr>
+        <w:spacing w:after="60"/>
+      </w:pPr>
+      <w:r>
+        <w:rPr>
+          <w:b/>
+        </w:rPr>
+        <w:t>展示状态与控制状态必须分层：</w:t>
+      </w:r>
+      <w:r>
+        <w:t>“内心文字/顶部标签”等展示数据不得复用 moodVal、亲密度或行为控制字段。需要恢复展示时，应新增只读/只存文本通道，不能解除自然模式对数值控制器的禁用。</w:t>
+      </w:r>
+    </w:p>
+    <w:p>
+      <w:pPr>
+        <w:spacing w:after="60"/>
+      </w:pPr>
+      <w:r>
+        <w:rPr>
+          <w:b/>
+        </w:rPr>
+        <w:t>自然模式标签规则：</w:t>
+      </w:r>
+      <w:r>
+        <w:t>[内心|…] 只能由角色输出，用于显示；解析后必须从可见消息中消费。禁止由该标签触发加减心情、强制动作、来电、回拨、久未回复判断或关系变化。稳定模式原 [心情] 行为保持不变。</w:t>
+      </w:r>
+    </w:p>
+    <w:p>
+      <w:pPr>
+        <w:spacing w:after="60"/>
+      </w:pPr>
+      <w:r>
+        <w:rPr>
+          <w:b/>
+        </w:rPr>
+        <w:t>新增枚举类型不得沿用二选一归一化：</w:t>
+      </w:r>
+      <w:r>
+        <w:t>当业务从 cat/dog 扩展到 hamster/rabbit 时，所有 normalize、lookup、默认值、领养入口、换装入口、声音与拖动边界都要按完整枚举核对；否则新类型会在保存或重开后静默退回旧类型。</w:t>
+      </w:r>
+    </w:p>
+    <w:p>
+      <w:pPr>
+        <w:spacing w:after="60"/>
+      </w:pPr>
+      <w:r>
+        <w:rPr>
+          <w:b/>
+        </w:rPr>
+        <w:t>线稿扩展验证：</w:t>
+      </w:r>
+      <w:r>
+        <w:t>新增宠物不能只增加名称和颜色，必须检查醒着、睡眠、五阶段、圆润度、互动表情、装扮预览、首次领养、第二只领养及实际房间显示。</w:t>
+      </w:r>
+    </w:p>
+    <w:p>
+      <w:pPr>
+        <w:spacing w:after="60"/>
+      </w:pPr>
+      <w:r>
+        <w:rPr>
+          <w:b/>
+        </w:rPr>
+        <w:t>核心回归：</w:t>
+      </w:r>
+      <w:r>
+        <w:t>自然模式改动后必须同时验证：moodVal 不变、adjMood 仍早退、亲密度不变、久未回复链不强制、电话反应仍由角色决定、锁软件/控制标签仍可用。</w:t>
       </w:r>
     </w:p>
     <w:sectPr>

</xml_diff>

<commit_message>
v834 prevent repetitive proactive messages
</commit_message>
<xml_diff>
--- a/docs/maintenance/AI开发项目_Bug修改规范.docx
+++ b/docs/maintenance/AI开发项目_Bug修改规范.docx
@@ -2279,6 +2279,39 @@
       </w:r>
       <w:r>
         <w:t>自然模式改动后必须同时验证：moodVal 不变、adjMood 仍早退、亲密度不变、久未回复链不强制、电话反应仍由角色决定、锁软件/控制标签仍可用。</w:t>
+      </w:r>
+    </w:p>
+    <w:p>
+      <w:pPr>
+        <w:pStyle w:val="Heading1"/>
+      </w:pPr>
+      <w:r>
+        <w:t>2026-08-07｜v834 · 角色可见回复禁止固定兜底与主动消息防重复</w:t>
+      </w:r>
+    </w:p>
+    <w:p>
+      <w:r>
+        <w:t>角色可见文本规则：所有以角色本人身份展示给用户的主动消息或 AI 回复，禁止使用硬编码完整句子充当兜底台词。必须由角色模型结合人设、上下文和准确当地时间自主生成；模型未配置、请求失败、返回空内容或角色选择不联系时，本轮保持安静，禁止系统冒充角色补说固定话。</w:t>
+      </w:r>
+    </w:p>
+    <w:p>
+      <w:r>
+        <w:t>隐藏控制与角色台词必须分开：[保持安静] 只可作为内部控制标记，解析后不得进入聊天、通知或记忆。不得把旧固定句换成另一句固定句，也不得用早安、晚安、醒了吗、在忙什么等模板按时段强制角色开口。</w:t>
+      </w:r>
+    </w:p>
+    <w:p>
+      <w:r>
+        <w:t>主动消息去重不能只比较消息 ID 或完全相同字符串。每次发送前必须按角色读取近期主动消息和近期聊天，至少覆盖完全相同、包含关系、同一轮多气泡合并及高相似改写；命中后取消本轮发送，不生成替代兜底，不消耗当日发送次数。</w:t>
+      </w:r>
+    </w:p>
+    <w:p>
+      <w:r>
+        <w:t>时间语义必须使用角色时区的完整日期、小时和分钟。凌晨 00:00～05:59 不得因为 hour &lt; 10 被当作早上；系统只提供准确事实，是否问候、是否联系和说什么由角色自主决定。</w:t>
+      </w:r>
+    </w:p>
+    <w:p>
+      <w:r>
+        <w:t>回归要求：同时覆盖服务器 OPENAI_API_KEY 缺失/请求失败静默、角色主动选择静默、服务器近期消息语义重复、本地自然模式语义重复、不同话题仍可发送、outbox ID 幂等、软件锁与自然模式核心链不受影响。</w:t>
       </w:r>
     </w:p>
     <w:sectPr>

</xml_diff>

<commit_message>
v835 integrate role avatar communication notifications
</commit_message>
<xml_diff>
--- a/docs/maintenance/AI开发项目_Bug修改规范.docx
+++ b/docs/maintenance/AI开发项目_Bug修改规范.docx
@@ -2312,6 +2312,47 @@
     <w:p>
       <w:r>
         <w:t>回归要求：同时覆盖服务器 OPENAI_API_KEY 缺失/请求失败静默、角色主动选择静默、服务器近期消息语义重复、本地自然模式语义重复、不同话题仍可发送、outbox ID 幂等、软件锁与自然模式核心链不受影响。</w:t>
+      </w:r>
+    </w:p>
+    <w:p/>
+    <w:p>
+      <w:r>
+        <w:rPr>
+          <w:b/>
+        </w:rPr>
+        <w:t>v835 新增规范：角色头像通知跨层接入与发布验收（2026-08-07）</w:t>
+      </w:r>
+    </w:p>
+    <w:p>
+      <w:r>
+        <w:rPr>
+          <w:b w:val="0"/>
+        </w:rPr>
+        <w:t>角色头像通知属于跨层功能，验收必须同时覆盖：网页角色资料与头像同步、数据库增量迁移、Edge Function 的临时头像 GET 端点、APNs mutable-content 与 rolePush 字段、iOS Notification Service Extension/Communication Notifications、远端 main 和线上版本号。GitHub Pages 成功只证明网页层发布，不能替代 Supabase 数据库与函数部署。</w:t>
+      </w:r>
+    </w:p>
+    <w:p>
+      <w:r>
+        <w:rPr>
+          <w:b w:val="0"/>
+        </w:rPr>
+        <w:t>接入旧分支功能时必须以最新 main 为底座定向移植，禁止整体覆盖。必须保留 v834 的角色自主沉默、分钟级真实时间和消息语义防重复，禁止重新加入硬编码兜底文案。</w:t>
+      </w:r>
+    </w:p>
+    <w:p>
+      <w:r>
+        <w:rPr>
+          <w:b w:val="0"/>
+        </w:rPr>
+        <w:t>头像下载、解析或通信意图构造失败时，必须调用普通通知作为降级结果；不得丢失正文、不得阻塞 outbox 消费，也不得把头像失败当作整条推送失败。</w:t>
+      </w:r>
+    </w:p>
+    <w:p>
+      <w:r>
+        <w:rPr>
+          <w:b w:val="0"/>
+        </w:rPr>
+        <w:t>发布验收顺序：先迁移数据库，再部署 Edge Function，再推送 main 并等待 Pages 成功，最后完全关闭并重新打开小手机同步头像，用一条新的服务器主动消息做真机验收。</w:t>
       </w:r>
     </w:p>
     <w:sectPr>

</xml_diff>

<commit_message>
v836 integrate approved premium home layout
</commit_message>
<xml_diff>
--- a/docs/maintenance/AI开发项目_Bug修改规范.docx
+++ b/docs/maintenance/AI开发项目_Bug修改规范.docx
@@ -2353,6 +2353,59 @@
           <w:b w:val="0"/>
         </w:rPr>
         <w:t>发布验收顺序：先迁移数据库，再部署 Edge Function，再推送 main 并等待 Pages 成功，最后完全关闭并重新打开小手机同步头像，用一条新的服务器主动消息做真机验收。</w:t>
+      </w:r>
+    </w:p>
+    <w:p>
+      <w:r>
+        <w:br w:type="page"/>
+      </w:r>
+    </w:p>
+    <w:p>
+      <w:pPr>
+        <w:pStyle w:val="Heading1"/>
+      </w:pPr>
+      <w:r>
+        <w:t>v836 新增规则：预览接入必须同时核对结构与样式（2026-08-07）</w:t>
+      </w:r>
+    </w:p>
+    <w:p>
+      <w:pPr>
+        <w:pStyle w:val="ListNumber"/>
+      </w:pPr>
+      <w:r>
+        <w:t>用户确认某张预览图后，正式接入必须建立“预览元素—正式渲染函数—正式数据源—正式交互”的逐项映射；只复制颜色、圆角或局部组件，不算完成接入。</w:t>
+      </w:r>
+    </w:p>
+    <w:p>
+      <w:pPr>
+        <w:pStyle w:val="ListNumber"/>
+      </w:pPr>
+      <w:r>
+        <w:t>主题改动必须优先复用正式 App 图标、onclick、软件锁遮罩、组件数据和用户自定义状态。预览替代图、假数据和静态按钮不得进入正式功能层。</w:t>
+      </w:r>
+    </w:p>
+    <w:p>
+      <w:pPr>
+        <w:pStyle w:val="ListNumber"/>
+      </w:pPr>
+      <w:r>
+        <w:t>默认布局迁移只能命中精确的历史默认顺序，并用一次性迁移标记保护。用户已经移动、增删或自定义的组件不得被版本升级强制重排。</w:t>
+      </w:r>
+    </w:p>
+    <w:p>
+      <w:pPr>
+        <w:pStyle w:val="ListNumber"/>
+      </w:pPr>
+      <w:r>
+        <w:t>主屏问候、欢迎语等文字若不是用户数据或真实功能，不得硬编码姓名和固定时段文案。用户要求删除后，必须同时检查正式渲染、预览、CSS 占位和测试，不能只隐藏。</w:t>
+      </w:r>
+    </w:p>
+    <w:p>
+      <w:pPr>
+        <w:pStyle w:val="ListNumber"/>
+      </w:pPr>
+      <w:r>
+        <w:t>发布前至少验证暗黑、淡粉、白色三套主题；同时跑软件锁、微信正式图标、主动消息防重复、电子宠物和缓存版本回归，避免主题覆盖核心逻辑。</w:t>
       </w:r>
     </w:p>
     <w:sectPr>

</xml_diff>

<commit_message>
v838 fix gift fullscreen transition flash
</commit_message>
<xml_diff>
--- a/docs/maintenance/AI开发项目_Bug修改规范.docx
+++ b/docs/maintenance/AI开发项目_Bug修改规范.docx
@@ -2406,6 +2406,32 @@
       </w:pPr>
       <w:r>
         <w:t>发布前至少验证暗黑、淡粉、白色三套主题；同时跑软件锁、微信正式图标、主动消息防重复、电子宠物和缓存版本回归，避免主题覆盖核心逻辑。</w:t>
+      </w:r>
+    </w:p>
+    <w:p>
+      <w:pPr>
+        <w:pStyle w:val="Heading1"/>
+      </w:pPr>
+      <w:r>
+        <w:t>2026-08-07｜v838 · 连续全屏遮罩切换防透底规则</w:t>
+      </w:r>
+    </w:p>
+    <w:p>
+      <w:pPr/>
+      <w:r>
+        <w:t>需要完全遮住聊天页或其他底层页面的全屏遮罩，背景必须从挂载后的第一个绘制帧起不透明。不得对整个遮罩使用 opacity:0 的入场动画；如需入场动效，只动画遮罩内部的图形、文字和按钮。</w:t>
+      </w:r>
+    </w:p>
+    <w:p>
+      <w:pPr/>
+      <w:r>
+        <w:t>两个连续全屏层交接时，必须先挂载并确认下一层具备不透明背景，再移除上一层。禁止“先卸载旧层、再异步创建新层”，否则即使间隔只有一帧也会在真机上闪出底层页面。</w:t>
+      </w:r>
+    </w:p>
+    <w:p>
+      <w:pPr/>
+      <w:r>
+        <w:t>回归测试至少检查：两层默认样式的 opacity、关闭态仍可淡出、打开回调的创建/移除顺序，以及卡片→礼盒→最终礼物的完整浏览器路径。</w:t>
       </w:r>
     </w:p>
     <w:sectPr>

</xml_diff>

<commit_message>
v841 add absence location and guaranteed contact
</commit_message>
<xml_diff>
--- a/docs/maintenance/AI开发项目_Bug修改规范.docx
+++ b/docs/maintenance/AI开发项目_Bug修改规范.docx
@@ -2544,6 +2544,39 @@
       </w:pPr>
       <w:r>
         <w:t>回归至少覆盖：直接赠礼仍进入礼物包裹但不进入订单、代付订单显示付款人、自购订单保持原样、历史直接赠礼迁移清理，以及花束包装在手机尺寸下完整显示。</w:t>
+      </w:r>
+    </w:p>
+    <w:p>
+      <w:pPr>
+        <w:pStyle w:val="Heading1"/>
+      </w:pPr>
+      <w:r>
+        <w:t>v841 新增规范：失联检查必须闭环为可见联系（2026-08-07）</w:t>
+      </w:r>
+    </w:p>
+    <w:p>
+      <w:r>
+        <w:t>显式的失联主动查看任务不能把读取电量或位置视为完成；读取后必须让用户看到角色消息或收到角色来电。</w:t>
+      </w:r>
+    </w:p>
+    <w:p>
+      <w:r>
+        <w:t>定位必须来自用户授权的真实设备数据，必须带有时间和精度，且仅在 30 分钟内视为新鲜。无数据或过期时必须标记不可用，禁止推测或伪造。</w:t>
+      </w:r>
+    </w:p>
+    <w:p>
+      <w:r>
+        <w:t>失联任务禁止以“保持安静”结束。消息生成或入队失败时，前台必须降级为来电；普通后台定时联系仍可按角色意愿保持安静，两类场景不可混淆。</w:t>
+      </w:r>
+    </w:p>
+    <w:p>
+      <w:r>
+        <w:t>服务端生成链路应支持提供方故障转移，但不得用硬编码通用话术伪装成角色生成结果。</w:t>
+      </w:r>
+    </w:p>
+    <w:p>
+      <w:r>
+        <w:t>远端 main 在发布期间前进时，必须以最新远端版本为底定向合并并顺延版本号，禁止强推覆盖新功能。</w:t>
       </w:r>
     </w:p>
     <w:sectPr>

</xml_diff>

<commit_message>
docs: record v839 layout integration rules
</commit_message>
<xml_diff>
--- a/docs/maintenance/AI开发项目_Bug修改规范.docx
+++ b/docs/maintenance/AI开发项目_Bug修改规范.docx
@@ -2432,6 +2432,70 @@
       <w:pPr/>
       <w:r>
         <w:t>回归测试至少检查：两层默认样式的 opacity、关闭态仍可淡出、打开回调的创建/移除顺序，以及卡片→礼盒→最终礼物的完整浏览器路径。</w:t>
+      </w:r>
+    </w:p>
+    <w:p>
+      <w:pPr>
+        <w:pStyle w:val="Heading1"/>
+      </w:pPr>
+      <w:r>
+        <w:t>v839 新增规则：可拖动主屏必须只有一个布局真源（2026-08-07）</w:t>
+      </w:r>
+    </w:p>
+    <w:p>
+      <w:pPr>
+        <w:pStyle w:val="ListNumber"/>
+      </w:pPr>
+      <w:r>
+        <w:t>同一主屏内可互相穿插的应用、组件和 Dock 内容必须由一份权威布局状态驱动。不得同时维护彼此独立的组件顺序、应用顺序和硬编码 Dock；兼容旧字段时只能由权威状态单向同步。</w:t>
+      </w:r>
+    </w:p>
+    <w:p>
+      <w:pPr>
+        <w:pStyle w:val="ListNumber"/>
+      </w:pPr>
+      <w:r>
+        <w:t>“Dock 固定”只表示 Dock 容器固定在屏幕底部，不代表其中四个应用不可移动。用户把主屏项目拖到 Dock 时应实时交换，始终保持 Dock 四个位置和软件锁判断。</w:t>
+      </w:r>
+    </w:p>
+    <w:p>
+      <w:pPr>
+        <w:pStyle w:val="ListNumber"/>
+      </w:pPr>
+      <w:r>
+        <w:t>拖动排序必须在移动经过目标时实时让位，松手只负责最终持久化；移动端必须抑制主屏文字选择、图片拖拽和长按菜单，同时回归点击启动、横向翻页、取消拖动与软件锁。</w:t>
+      </w:r>
+    </w:p>
+    <w:p>
+      <w:pPr>
+        <w:pStyle w:val="ListNumber"/>
+      </w:pPr>
+      <w:r>
+        <w:t>预览转正式必须逐项检查渲染入口、真实数据、交互保存、设置页编辑入口、导入导出、旧数据迁移和 Service Worker 缓存。预览文件里存在不等于正式版已接入。</w:t>
+      </w:r>
+    </w:p>
+    <w:p>
+      <w:pPr>
+        <w:pStyle w:val="ListNumber"/>
+      </w:pPr>
+      <w:r>
+        <w:t>紧凑天气组件不得塞入与天气无关的微型图片上传控件；移除 UI 时保留旧数据做非破坏兼容，除非用户明确要求清除。</w:t>
+      </w:r>
+    </w:p>
+    <w:p>
+      <w:pPr>
+        <w:pStyle w:val="ListNumber"/>
+      </w:pPr>
+      <w:r>
+        <w:t>微信视觉接入若用户要求保留原线条、气泡、字体、话筒和角色内心想法，只能修改明确批准的外层框架和主标签容器，不得重写聊天详情内部结构。</w:t>
+      </w:r>
+    </w:p>
+    <w:p>
+      <w:pPr>
+        <w:pStyle w:val="ListNumber"/>
+      </w:pPr>
+      <w:r>
+        <w:t>发布时必须同时更新 APP_VER、页面壳 build、入口查询参数、repair 链接、Service Worker BUILD/SHELL_CACHE 和测试断言；浏览器实页必须确认新 build，而不能只以源码或预览页判断。</w:t>
       </w:r>
     </w:p>
     <w:sectPr>

</xml_diff>

<commit_message>
v840 fix bouquet wrapping and gift order ownership
</commit_message>
<xml_diff>
--- a/docs/maintenance/AI开发项目_Bug修改规范.docx
+++ b/docs/maintenance/AI开发项目_Bug修改规范.docx
@@ -2496,6 +2496,54 @@
       </w:pPr>
       <w:r>
         <w:t>发布时必须同时更新 APP_VER、页面壳 build、入口查询参数、repair 链接、Service Worker BUILD/SHELL_CACHE 和测试断言；浏览器实页必须确认新 build，而不能只以源码或预览页判断。</w:t>
+      </w:r>
+    </w:p>
+    <w:p>
+      <w:pPr>
+        <w:pStyle w:val="Heading1"/>
+      </w:pPr>
+      <w:r>
+        <w:t>2026-08-07｜v840 · 礼物包装完整性与购物订单归属规则</w:t>
+      </w:r>
+    </w:p>
+    <w:p>
+      <w:pPr>
+        <w:pStyle w:val="ListNumber"/>
+      </w:pPr>
+      <w:r>
+        <w:t>粒子花束的包装必须是完整结构：左右后层包装纸、前层包装纸、收口线与绑带都要从花束腰部延伸至下半段，不能只在花头下方画一片浅三角。调整花束位置后必须用 390×844 手机视口复核，确认包装没有被文字或屏幕边界裁掉。</w:t>
+      </w:r>
+    </w:p>
+    <w:p>
+      <w:pPr>
+        <w:pStyle w:val="ListNumber"/>
+      </w:pPr>
+      <w:r>
+        <w:t>“角色直接赠礼”和“购物订单”必须使用不同的数据归属。角色主动送出的鲜花、玩偶、戒指等只进入礼物包裹/礼物事实，不得写入 S.shop.orders；只有用户自购和用户明确发起的“让TA代付”才能进入我的订单。</w:t>
+      </w:r>
+    </w:p>
+    <w:p>
+      <w:pPr>
+        <w:pStyle w:val="ListNumber"/>
+      </w:pPr>
+      <w:r>
+        <w:t>代付订单必须持久化付款角色 cid 与 payerName，并在订单列表、手机查看快照和角色可读购物事实中显示“某某代付”。禁止只显示“代付”而丢失付款人，也禁止根据当前绑定角色临时猜测历史付款人。</w:t>
+      </w:r>
+    </w:p>
+    <w:p>
+      <w:pPr>
+        <w:pStyle w:val="ListNumber"/>
+      </w:pPr>
+      <w:r>
+        <w:t>修复订单归属时不能只在界面隐藏错误行。启动迁移、订单角标、订单列表和角色查手机的购物快照必须统一过滤历史直接赠礼；退款、删除和客服操作仍只处理真实可见订单。</w:t>
+      </w:r>
+    </w:p>
+    <w:p>
+      <w:pPr>
+        <w:pStyle w:val="ListNumber"/>
+      </w:pPr>
+      <w:r>
+        <w:t>回归至少覆盖：直接赠礼仍进入礼物包裹但不进入订单、代付订单显示付款人、自购订单保持原样、历史直接赠礼迁移清理，以及花束包装在手机尺寸下完整显示。</w:t>
       </w:r>
     </w:p>
     <w:sectPr>

</xml_diff>

<commit_message>
v842 integrate Moments and fix lock and call errors
</commit_message>
<xml_diff>
--- a/docs/maintenance/AI开发项目_Bug修改规范.docx
+++ b/docs/maintenance/AI开发项目_Bug修改规范.docx
@@ -2577,6 +2577,63 @@
     <w:p>
       <w:r>
         <w:t>远端 main 在发布期间前进时，必须以最新远端版本为底定向合并并顺延版本号，禁止强推覆盖新功能。</w:t>
+      </w:r>
+    </w:p>
+    <w:p/>
+    <w:p>
+      <w:pPr>
+        <w:pStyle w:val="Heading1"/>
+      </w:pPr>
+      <w:r>
+        <w:t>v842 新增规则：页面接入、屏保生命周期与真实错误归因（2026-08-07）</w:t>
+      </w:r>
+    </w:p>
+    <w:p>
+      <w:pPr>
+        <w:pStyle w:val="ListNumber"/>
+      </w:pPr>
+      <w:r>
+        <w:t>预览或外框接入不能代表功能页面已经接入。涉及微信主标签时，必须逐页核对正式渲染入口、真实数据、操作事件、明暗主题和缓存；朋友圈至少核对封面、动态、图片、日期、点赞、评论和手动删除。</w:t>
+      </w:r>
+    </w:p>
+    <w:p>
+      <w:pPr>
+        <w:pStyle w:val="ListNumber"/>
+      </w:pPr>
+      <w:r>
+        <w:t>屏保只能由明确的冷启动或真正关闭后再次进入触发。visibilitychange、pagehide、短暂切后台和系统应用切换只能做存档/音频等生命周期处理，不得用固定秒数阈值强制改变 S.me.locked。</w:t>
+      </w:r>
+    </w:p>
+    <w:p>
+      <w:pPr>
+        <w:pStyle w:val="ListNumber"/>
+      </w:pPr>
+      <w:r>
+        <w:t>跨层错误必须保留 status、data、raw 和 source。用户提示要先识别错误正文中的余额、限流、模型、超时、网络等真实语义，再结合来源和 HTTP 状态；只有 source 为 ai-core 时才能把问题归到 AI 账户。</w:t>
+      </w:r>
+    </w:p>
+    <w:p>
+      <w:pPr>
+        <w:pStyle w:val="ListNumber"/>
+      </w:pPr>
+      <w:r>
+        <w:t>修复电话报错时不得改动通话音频、话筒、角色回复或路由选择；修复朋友圈时不得重写真实数据和互动逻辑；修复屏保时不得删除冷启动锁屏。</w:t>
+      </w:r>
+    </w:p>
+    <w:p>
+      <w:pPr>
+        <w:pStyle w:val="ListNumber"/>
+      </w:pPr>
+      <w:r>
+        <w:t>若发布前远端 main 已前进，不得强推或覆盖。应从最新 main 建立新工作树/分支，重新应用最小修复、顺延版本号并重跑完整回归，尤其保留远端新增的礼物、伴生设备和服务端功能。</w:t>
+      </w:r>
+    </w:p>
+    <w:p>
+      <w:pPr>
+        <w:pStyle w:val="ListNumber"/>
+      </w:pPr>
+      <w:r>
+        <w:t>发布前至少回归：朋友圈暗黑/白色主题与真实互动、普通后台返回、真正关闭后的冷启动、外部余额不足/401/429/网络/超时、内置 AI 点数不足、软件锁、礼物、失联联系与缓存版本。</w:t>
       </w:r>
     </w:p>
     <w:sectPr>

</xml_diff>

<commit_message>
v843 make WeChat and Moments full bleed
</commit_message>
<xml_diff>
--- a/docs/maintenance/AI开发项目_Bug修改规范.docx
+++ b/docs/maintenance/AI开发项目_Bug修改规范.docx
@@ -2634,6 +2634,46 @@
       </w:pPr>
       <w:r>
         <w:t>发布前至少回归：朋友圈暗黑/白色主题与真实互动、普通后台返回、真正关闭后的冷启动、外部余额不足/401/429/网络/超时、内置 AI 点数不足、软件锁、礼物、失联联系与缓存版本。</w:t>
+      </w:r>
+    </w:p>
+    <w:p>
+      <w:pPr>
+        <w:pStyle w:val="Heading1"/>
+      </w:pPr>
+      <w:r>
+        <w:t>新增规则：全屏页面的无缝边界规范（v843）</w:t>
+      </w:r>
+    </w:p>
+    <w:p>
+      <w:pPr>
+        <w:pStyle w:val="ListBullet"/>
+      </w:pPr>
+      <w:r>
+        <w:t>用户明确要求全屏或无缝时，页面根容器不得保留会露出底色的 padding、gap、外边框、圆角或投影。</w:t>
+      </w:r>
+    </w:p>
+    <w:p>
+      <w:pPr>
+        <w:pStyle w:val="ListBullet"/>
+      </w:pPr>
+      <w:r>
+        <w:t>连续信息流（例如朋友圈）不得为每条内容增加外部 margin 形成缝隙；需要区分内容时优先使用细分界线。</w:t>
+      </w:r>
+    </w:p>
+    <w:p>
+      <w:pPr>
+        <w:pStyle w:val="ListBullet"/>
+      </w:pPr>
+      <w:r>
+        <w:t>视觉层修改必须与业务逻辑隔离，不得顺带改动头像、字体、图标、按钮、数据筛选、评论点赞、删除或软件锁。</w:t>
+      </w:r>
+    </w:p>
+    <w:p>
+      <w:pPr>
+        <w:pStyle w:val="ListBullet"/>
+      </w:pPr>
+      <w:r>
+        <w:t>同时检查深色与浅色主题，避免浅色主题通过白色 border 或 shadow 重新产生白边。</w:t>
       </w:r>
     </w:p>
     <w:sectPr>

</xml_diff>

<commit_message>
v844 unify Moments dark background
</commit_message>
<xml_diff>
--- a/docs/maintenance/AI开发项目_Bug修改规范.docx
+++ b/docs/maintenance/AI开发项目_Bug修改规范.docx
@@ -2674,6 +2674,38 @@
       </w:pPr>
       <w:r>
         <w:t>同时检查深色与浅色主题，避免浅色主题通过白色 border 或 shadow 重新产生白边。</w:t>
+      </w:r>
+    </w:p>
+    <w:p>
+      <w:pPr>
+        <w:pStyle w:val="Heading1"/>
+      </w:pPr>
+      <w:r>
+        <w:t>新增规则：同色背景禁止半透明层叠（v844）</w:t>
+      </w:r>
+    </w:p>
+    <w:p>
+      <w:pPr>
+        <w:pStyle w:val="ListBullet"/>
+      </w:pPr>
+      <w:r>
+        <w:t>用户要求同一区域颜色完全一致时，不能让多个 rgba 半透明背景叠加不同父背景；必须使用同一个明确的不透明色值。</w:t>
+      </w:r>
+    </w:p>
+    <w:p>
+      <w:pPr>
+        <w:pStyle w:val="ListBullet"/>
+      </w:pPr>
+      <w:r>
+        <w:t>统一深色主题时必须使用 :not(.wxlight) 或等价主题隔离，禁止覆盖浅色主题。</w:t>
+      </w:r>
+    </w:p>
+    <w:p>
+      <w:pPr>
+        <w:pStyle w:val="ListBullet"/>
+      </w:pPr>
+      <w:r>
+        <w:t>只改颜色时不得顺带调整封面、字体、图标、分界线、内容结构或交互逻辑。</w:t>
       </w:r>
     </w:p>
     <w:sectPr>

</xml_diff>

<commit_message>
v846 prevent repetitive proactive messages
</commit_message>
<xml_diff>
--- a/docs/maintenance/AI开发项目_Bug修改规范.docx
+++ b/docs/maintenance/AI开发项目_Bug修改规范.docx
@@ -2706,6 +2706,39 @@
       </w:pPr>
       <w:r>
         <w:t>只改颜色时不得顺带调整封面、字体、图标、分界线、内容结构或交互逻辑。</w:t>
+      </w:r>
+    </w:p>
+    <w:p>
+      <w:pPr>
+        <w:pStyle w:val="Heading1"/>
+      </w:pPr>
+      <w:r>
+        <w:t>v846 新增规范：主动消息短句防重复不得使用固定替代文案（2026-08-07）</w:t>
+      </w:r>
+    </w:p>
+    <w:p>
+      <w:r>
+        <w:t>1. 主动消息正文必须由已绑定角色模型生成，禁止以硬编码 fallback 或预设替代句冒充角色自主表达。</w:t>
+      </w:r>
+    </w:p>
+    <w:p>
+      <w:r>
+        <w:t>2. 短消息也必须参与近期消息相似度检查；不得只按长文本阈值判断，从而放过仅替换一两个字的同义重复。</w:t>
+      </w:r>
+    </w:p>
+    <w:p>
+      <w:r>
+        <w:t>3. 首次候选重复时，应将重复事实反馈给同一角色模型，让角色选择真正不同的话题/句式或保持安静；不得由程序替角色编一句话。</w:t>
+      </w:r>
+    </w:p>
+    <w:p>
+      <w:r>
+        <w:t>4. 去重失败时宁可不发送，也不得发送轻微改写的重复内容。</w:t>
+      </w:r>
+    </w:p>
+    <w:p>
+      <w:r>
+        <w:t>5. 修复必须以真实 outbox 消息为证据，并同时验证近似短句被拦截、不同话题不被误拦截。</w:t>
       </w:r>
     </w:p>
     <w:sectPr>

</xml_diff>

<commit_message>
v847 add stencil clock typography
</commit_message>
<xml_diff>
--- a/docs/maintenance/AI开发项目_Bug修改规范.docx
+++ b/docs/maintenance/AI开发项目_Bug修改规范.docx
@@ -2739,6 +2739,46 @@
     <w:p>
       <w:r>
         <w:t>5. 修复必须以真实 outbox 消息为证据，并同时验证近似短句被拦截、不同话题不被误拦截。</w:t>
+      </w:r>
+    </w:p>
+    <w:p>
+      <w:pPr>
+        <w:pStyle w:val="Heading1"/>
+      </w:pPr>
+      <w:r>
+        <w:t>v847 新增规范：自定义数字时钟字体必须离线、限域且不改生命周期（2026-08-07）</w:t>
+      </w:r>
+    </w:p>
+    <w:p>
+      <w:pPr>
+        <w:pStyle w:val="ListNumber"/>
+      </w:pPr>
+      <w:r>
+        <w:t>屏保或主屏使用自定义字体时必须随项目本地提供或内嵌，禁止依赖运行时在线字体 CDN；同时保留对应字体授权文件。</w:t>
+      </w:r>
+    </w:p>
+    <w:p>
+      <w:pPr>
+        <w:pStyle w:val="ListNumber"/>
+      </w:pPr>
+      <w:r>
+        <w:t>纯数字时钟字形应通过 unicode-range 或专用选择器限制到数字和冒号，禁止顺带替换日期、天气、聊天、按钮或正文。</w:t>
+      </w:r>
+    </w:p>
+    <w:p>
+      <w:pPr>
+        <w:pStyle w:val="ListNumber"/>
+      </w:pPr>
+      <w:r>
+        <w:t>屏保视觉修改不得改动屏保触发条件、visibilitychange/pageshow 处理、普通后台返回行为或软件锁逻辑。</w:t>
+      </w:r>
+    </w:p>
+    <w:p>
+      <w:pPr>
+        <w:pStyle w:val="ListNumber"/>
+      </w:pPr>
+      <w:r>
+        <w:t>同一种时间样式必须由共享字体变量管理，但屏保与主屏可使用适合各自容器的独立字号；发布前必须在窄屏与短屏检查溢出。</w:t>
       </w:r>
     </w:p>
     <w:sectPr>

</xml_diff>

<commit_message>
v848 fix offline dedupe summaries and PWA safe area
</commit_message>
<xml_diff>
--- a/docs/maintenance/AI开发项目_Bug修改规范.docx
+++ b/docs/maintenance/AI开发项目_Bug修改规范.docx
@@ -2779,6 +2779,62 @@
       </w:pPr>
       <w:r>
         <w:t>同一种时间样式必须由共享字体变量管理，但屏保与主屏可使用适合各自容器的独立字号；发布前必须在窄屏与短屏检查溢出。</w:t>
+      </w:r>
+    </w:p>
+    <w:p>
+      <w:pPr>
+        <w:pStyle w:val="Heading1"/>
+      </w:pPr>
+      <w:r>
+        <w:t>v848 新增规范：幂等数据迁移、权限手势与可见接入（2026-08-07）</w:t>
+      </w:r>
+    </w:p>
+    <w:p>
+      <w:pPr>
+        <w:spacing w:after="120"/>
+      </w:pPr>
+      <w:r>
+        <w:t>任何会在启动、保存、裁剪或迁移时重复执行的名称/文本规范化都必须幂等：同一输入执行一次和执行多次结果一致。禁止让替换源继续命中替换结果；发布前必须用包含关系账号名和百万级历史异常样本测试。</w:t>
+      </w:r>
+    </w:p>
+    <w:p>
+      <w:pPr>
+        <w:spacing w:after="120"/>
+      </w:pPr>
+      <w:r>
+        <w:t>历史异常数据不能只阻止继续增长。必须在启动或打开对应页面时修复已有记录、设置明确安全上限并可靠持久化；裁切优先保留完整句，找不到句末时要以省略号明确表示，不得静默截成半句。</w:t>
+      </w:r>
+    </w:p>
+    <w:p>
+      <w:pPr>
+        <w:spacing w:after="120"/>
+      </w:pPr>
+      <w:r>
+        <w:t>DeviceMotion、相机、麦克风、定位等需要用户手势的权限，只能由用户明确点击相关开关或操作时请求。页面启动、恢复、切后台返回和自动重连不得再次弹系统授权；恢复时只能在已记录授权的前提下静默附加监听。</w:t>
+      </w:r>
+    </w:p>
+    <w:p>
+      <w:pPr>
+        <w:spacing w:after="120"/>
+      </w:pPr>
+      <w:r>
+        <w:t>去重、格式清洗或安全过滤得到空结果后，禁止追加固定可见角色台词、旁白或剧情。允许让同一角色模型带着失败原因动态重试一次；仍失败则保持安静或显示非角色 UI 错误，不得由程序替角色表演。</w:t>
+      </w:r>
+    </w:p>
+    <w:p>
+      <w:pPr>
+        <w:spacing w:after="120"/>
+      </w:pPr>
+      <w:r>
+        <w:t>PWA 全屏安全区修改必须同时核对 viewport-fit=cover、apple-mobile-web-app-status-bar-style、meta theme-color、动态 manifest theme_color/background_color、页面根容器高度和实际壁纸起点。不能只改其中一处。</w:t>
+      </w:r>
+    </w:p>
+    <w:p>
+      <w:pPr>
+        <w:spacing w:after="120"/>
+      </w:pPr>
+      <w:r>
+        <w:t>上传或设置背景图后，必须确认数据保存、当前可见页面消费、其他目标页面消费、返回路径和手机视口视觉差异。保存成功但页面未读取，或读取后被过度模糊/遮罩到不可辨认，都视为未完成接入。</w:t>
       </w:r>
     </w:p>
     <w:sectPr>

</xml_diff>

<commit_message>
v849 sync proactive memory and context
</commit_message>
<xml_diff>
--- a/docs/maintenance/AI开发项目_Bug修改规范.docx
+++ b/docs/maintenance/AI开发项目_Bug修改规范.docx
@@ -2835,6 +2835,62 @@
       </w:pPr>
       <w:r>
         <w:t>上传或设置背景图后，必须确认数据保存、当前可见页面消费、其他目标页面消费、返回路径和手机视口视觉差异。保存成功但页面未读取，或读取后被过度模糊/遮罩到不可辨认，都视为未完成接入。</w:t>
+      </w:r>
+    </w:p>
+    <w:p>
+      <w:pPr>
+        <w:pStyle w:val="Heading1"/>
+      </w:pPr>
+      <w:r>
+        <w:t>v849 新增规范：服务器主动消息必须同步记忆、上下文并按用户消息重置（2026-08-08）</w:t>
+      </w:r>
+    </w:p>
+    <w:p>
+      <w:pPr>
+        <w:spacing w:after="120"/>
+      </w:pPr>
+      <w:r>
+        <w:t>服务器主动消息不得只读取角色人设摘要。启用该功能时，必须同时提供该角色的长期记忆/总结/适用世界设定，以及最近真实聊天上下文；两类资料都不可省略。</w:t>
+      </w:r>
+    </w:p>
+    <w:p>
+      <w:pPr>
+        <w:spacing w:after="120"/>
+      </w:pPr>
+      <w:r>
+        <w:t>用户发送任意可见聊天消息后，必须先落地本地聊天，再以该消息时间原子更新服务器 last_user_at 与 next_due_at。next_due_at 必须等于最新用户消息时间加配置的空闲分钟数；旧的乱序请求不得把计时倒退。</w:t>
+      </w:r>
+    </w:p>
+    <w:p>
+      <w:pPr>
+        <w:spacing w:after="120"/>
+      </w:pPr>
+      <w:r>
+        <w:t>定时任务认领资料后，必须在模型生成前和生成后再次检查 enabled 与 next_due_at。生成期间若用户重新活跃，必须取消本次发送并释放认领，禁止拿旧上下文插话。</w:t>
+      </w:r>
+    </w:p>
+    <w:p>
+      <w:pPr>
+        <w:spacing w:after="120"/>
+      </w:pPr>
+      <w:r>
+        <w:t>主动联系必须像关系中的自然私聊，可接续上下文，也可表达想念、关心、报备或分享普通日常。禁止脱离资料编造对用户身体、位置、动作、梦境或设备监测结果，禁止诗化悬空文案和反复使用破折号/横杠。</w:t>
+      </w:r>
+    </w:p>
+    <w:p>
+      <w:pPr>
+        <w:spacing w:after="120"/>
+      </w:pPr>
+      <w:r>
+        <w:t>重复或风格不合格时，只允许让同一角色模型携带失败原因重试；仍不合格则保持安静。禁止程序拼接、替换或硬编码任何可见角色兜底台词。</w:t>
+      </w:r>
+    </w:p>
+    <w:p>
+      <w:pPr>
+        <w:spacing w:after="120"/>
+      </w:pPr>
+      <w:r>
+        <w:t>同步字段必须有长度上限、owner secret 校验、角色隔离与设置页公开说明。不得上传健康数据、其他角色聊天或与主动联系无关的完整手机资料。</w:t>
       </w:r>
     </w:p>
     <w:sectPr>

</xml_diff>

<commit_message>
release: merge device checks and thought cards in v852
</commit_message>
<xml_diff>
--- a/docs/maintenance/AI开发项目_Bug修改规范.docx
+++ b/docs/maintenance/AI开发项目_Bug修改规范.docx
@@ -2936,6 +2936,24 @@
       <w:pPr/>
       <w:r>
         <w:t>每日必查不能被通用主动消息时段或普通 20 分钟冷却永久漏掉；其他主动提醒仍应遵守原有防刷屏、通话占用、线下占用和隐私约束。浏览器页面关闭时不得宣称具备系统常驻后台能力。</w:t>
+      </w:r>
+    </w:p>
+    <w:p>
+      <w:pPr>
+        <w:pStyle w:val="Heading1"/>
+      </w:pPr>
+      <w:r>
+        <w:t>v852 新增规范：发布前处理远端并行版本（2026-08-08）</w:t>
+      </w:r>
+    </w:p>
+    <w:p>
+      <w:r>
+        <w:t>发布前必须核对远端 main 的最新提交及其父提交。若本地与远端从同一基线分叉，不得强推或覆盖远端；先合并双方功能、提升版本号并重新跑全量测试。</w:t>
+      </w:r>
+    </w:p>
+    <w:p>
+      <w:r>
+        <w:t>首次 git push 因权限或网络失败后必须停止重试，保留可推送的本地提交，并明确告知用户在已登录的 GitHub Desktop 中完成一次手动推送。</w:t>
       </w:r>
     </w:p>
     <w:sectPr>

</xml_diff>

<commit_message>
feat: add daily companion check windows
</commit_message>
<xml_diff>
--- a/docs/maintenance/AI开发项目_Bug修改规范.docx
+++ b/docs/maintenance/AI开发项目_Bug修改规范.docx
@@ -2891,6 +2891,51 @@
       </w:pPr>
       <w:r>
         <w:t>同步字段必须有长度上限、owner secret 校验、角色隔离与设置页公开说明。不得上传健康数据、其他角色聊天或与主动联系无关的完整手机资料。</w:t>
+      </w:r>
+    </w:p>
+    <w:p>
+      <w:pPr>
+        <w:pStyle w:val="Heading1"/>
+        <w:keepNext/>
+      </w:pPr>
+      <w:r>
+        <w:t>v850 新增规范：设备每日必查、可编辑时段与读取次数（2026-08-08）</w:t>
+      </w:r>
+    </w:p>
+    <w:p>
+      <w:pPr/>
+      <w:r>
+        <w:t>睡眠记录与应用使用记录必须使用两套彼此独立、用户可编辑并持久化的开始/结束时间。禁止在候选逻辑、提示词或界面说明中重新写死分钟常量；时间范围必须支持跨午夜，并对跨午夜的凌晨部分使用前一晚的逻辑日期。</w:t>
+      </w:r>
+    </w:p>
+    <w:p>
+      <w:pPr/>
+      <w:r>
+        <w:t>每日必查项目在授权开启后必须按逻辑日期幂等执行一次。成功生成可见回复后才写入完成记录；生成失败、权限缺失、快照过期或没有真实数据时不得假记完成，也不得用固定角色台词补齐。</w:t>
+      </w:r>
+    </w:p>
+    <w:p>
+      <w:pPr/>
+      <w:r>
+        <w:t>应用使用检查必须同时提供真实 iPhone 今日总时长和同步列表中的全部逐 App 记录。禁止只传 Top N、把各 App 时长相加冒充总时长，或混入小手机内置 App 计时。</w:t>
+      </w:r>
+    </w:p>
+    <w:p>
+      <w:pPr/>
+      <w:r>
+        <w:t>用户发送“早安/早上好”等明确晨间问候时，可提前触发当天睡眠查看，但必须复用同一 daily run key，确保同一天不会因自动时段再次查看。该轮属于对用户当前消息的正常回复，提示词不得错误宣称对方没有发新话。</w:t>
+      </w:r>
+    </w:p>
+    <w:p>
+      <w:pPr/>
+      <w:r>
+        <w:t>心率、电量与位置的按需读取次数不得错误绑定到睡眠或应用的每日一次配额；三者可在独立授权和快照新鲜的前提下全天按需查看。健康权限必须继续默认关闭，任何读取都不得越过角色访问总开关与分项权限。</w:t>
+      </w:r>
+    </w:p>
+    <w:p>
+      <w:pPr/>
+      <w:r>
+        <w:t>每日必查不能被通用主动消息时段或普通 20 分钟冷却永久漏掉；其他主动提醒仍应遵守原有防刷屏、通话占用、线下占用和隐私约束。浏览器页面关闭时不得宣称具备系统常驻后台能力。</w:t>
       </w:r>
     </w:p>
     <w:sectPr>

</xml_diff>

<commit_message>
v852 fix offline format friend sync and call recognition
</commit_message>
<xml_diff>
--- a/docs/maintenance/AI开发项目_Bug修改规范.docx
+++ b/docs/maintenance/AI开发项目_Bug修改规范.docx
@@ -2891,6 +2891,50 @@
       </w:pPr>
       <w:r>
         <w:t>同步字段必须有长度上限、owner secret 校验、角色隔离与设置页公开说明。不得上传健康数据、其他角色聊天或与主动联系无关的完整手机资料。</w:t>
+      </w:r>
+    </w:p>
+    <w:p>
+      <w:pPr>
+        <w:pStyle w:val="Heading1"/>
+      </w:pPr>
+      <w:r>
+        <w:t>v852 新增规范：混合格式校验、前台同步与连续识别去重（2026-08-08）</w:t>
+      </w:r>
+    </w:p>
+    <w:p>
+      <w:pPr/>
+      <w:r>
+        <w:t>1. 要求【旁白】/台词分离的结构化回复必须逐段校验，不能因为整轮出现过一个合法标签就放过其他未标记动作段。</w:t>
+      </w:r>
+    </w:p>
+    <w:p>
+      <w:pPr/>
+      <w:r>
+        <w:t>2. 普通生成、修复生成和最后重试必须经过同一格式校验。仍不合格的内容不得进入角色气泡、聊天历史或记忆；只能保持安静或显示非角色 UI 错误，禁止程序补写角色台词或剧情。</w:t>
+      </w:r>
+    </w:p>
+    <w:p>
+      <w:pPr/>
+      <w:r>
+        <w:t>3. 语义兜底必须保守并配套正反例：应识别高置信度第三人称动作，同时保留“他是谁？”“他不爱我。”“过来。”等自然台词。</w:t>
+      </w:r>
+    </w:p>
+    <w:p>
+      <w:pPr/>
+      <w:r>
+        <w:t>4. 前台实时同步的调度间隔必须与内部节流一致；因输入、编辑或动画暂缓渲染时，必须记录待刷新并在安全时机补刷。页面隐藏时停止高频轮询。</w:t>
+      </w:r>
+    </w:p>
+    <w:p>
+      <w:pPr/>
+      <w:r>
+        <w:t>5. 连续语音识别必须记录已消费 final 并处理自动重启重复上报；只有观察到新的 interim 或新会话边界后，才可把相同文本视为用户真实复述。开始、停止和切换通话时清空会话去重状态。</w:t>
+      </w:r>
+    </w:p>
+    <w:p>
+      <w:pPr/>
+      <w:r>
+        <w:t>6. 去掉角色聊天心情系统词不得误删角色模型自己写出的内心想法；只移除程序解释、数值心情和控制性提示，不恢复任何替角色作决定的心情机制。</w:t>
       </w:r>
     </w:p>
     <w:sectPr>

</xml_diff>

<commit_message>
release: v854 restore natural proactive messaging
</commit_message>
<xml_diff>
--- a/docs/maintenance/AI开发项目_Bug修改规范.docx
+++ b/docs/maintenance/AI开发项目_Bug修改规范.docx
@@ -2971,6 +2971,49 @@
     <w:p>
       <w:r>
         <w:t>普通 Git 下载不可用时，可用 GitHub API读取提交元数据和 Blob；只有全部 Blob、Tree 与 Commit SHA 校验一致后，才可把重建对象用于合并。首次 push 失败后仍不得重试。</w:t>
+      </w:r>
+    </w:p>
+    <w:p>
+      <w:r>
+        <w:br w:type="page"/>
+      </w:r>
+    </w:p>
+    <w:p>
+      <w:pPr>
+        <w:pStyle w:val="Heading1"/>
+      </w:pPr>
+      <w:r>
+        <w:t>新增强制规范｜新改动不得碰坏旧功能（v854 起）</w:t>
+      </w:r>
+    </w:p>
+    <w:p>
+      <w:r>
+        <w:t>本条为严重回归事故后的强制规范。修改消息解析、控制标签、统一清洗、状态保存、版本缓存、服务器定时器等公共链路前，必须先列出该链路已经承载的旧能力；不能只验证新需求。</w:t>
+      </w:r>
+    </w:p>
+    <w:p>
+      <w:r>
+        <w:t>凡模型口头承诺会产生真实状态变化的功能（例如修改密码、锁软件、发位置、打电话、记账、删除或保存记忆），必须验证“角色说了”和“数据真的变了”一致。禁止只改展示文本而不执行动作。</w:t>
+      </w:r>
+    </w:p>
+    <w:p>
+      <w:r>
+        <w:t>新增能力不得删除、改名或绕过已有控制标签、字段、副作用和存储路径。必须保留向后兼容入口；若确需迁移，要同时提供数据迁移和旧数据读取兜底。</w:t>
+      </w:r>
+    </w:p>
+    <w:p>
+      <w:r>
+        <w:t>每个修复至少新增一个能复现原故障的回归测试。涉及公共链路时，除专项测试外必须运行全项目测试；有任何旧测试失败，不得发布。</w:t>
+      </w:r>
+    </w:p>
+    <w:p>
+      <w:r>
+        <w:t>发布前必须检查：版本号与 Service Worker 缓存一致；数据库迁移、Edge Function 与前端字段一致；通话、远程控制等既有互斥状态不会被后台任务绕过；历史数据可导入、可显示、可删除。</w:t>
+      </w:r>
+    </w:p>
+    <w:p>
+      <w:r>
+        <w:t>本次基线为 367 项测试全部通过。后续版本若测试总数减少，必须说明删除原因；不得通过删测试或放宽断言掩盖旧功能损坏。</w:t>
       </w:r>
     </w:p>
     <w:sectPr>

</xml_diff>

<commit_message>
fix: preserve chat drafts during incoming messages
</commit_message>
<xml_diff>
--- a/docs/maintenance/AI开发项目_Bug修改规范.docx
+++ b/docs/maintenance/AI开发项目_Bug修改规范.docx
@@ -3014,6 +3014,82 @@
     <w:p>
       <w:r>
         <w:t>本次基线为 367 项测试全部通过。后续版本若测试总数减少，必须说明删除原因；不得通过删测试或放宽断言掩盖旧功能损坏。</w:t>
+      </w:r>
+    </w:p>
+    <w:p>
+      <w:r>
+        <w:br w:type="page"/>
+      </w:r>
+    </w:p>
+    <w:p>
+      <w:pPr>
+        <w:pStyle w:val="Heading1"/>
+      </w:pPr>
+      <w:r>
+        <w:t>新增强制规范｜异步来信不得替换编辑器（v855 起）</w:t>
+      </w:r>
+    </w:p>
+    <w:p>
+      <w:r>
+        <w:t>任何角色消息、服务器轮询、通知回填、后台同步、识图完成、语音完成或生成状态变化，只要用户正在 INPUT、TEXTAREA 或 contenteditable 中编辑，就不得通过整页 innerHTML 替换来刷新状态。</w:t>
+      </w:r>
+    </w:p>
+    <w:p>
+      <w:r>
+        <w:t>聊天来信必须优先更新消息容器本身。若消息类型需要重新生成卡片，应重绘消息列表容器，不得连带重建输入栏；生成中、排队中等按钮状态必须原位更新。</w:t>
+      </w:r>
+    </w:p>
+    <w:p>
+      <w:r>
+        <w:t>确需整页刷新时，必须按页面身份键保存并恢复草稿、选区、焦点、输入框尺寸和滚动位置；恢复前要确认刷新后仍是同一页面、同一角色，禁止把草稿带到其他会话。</w:t>
+      </w:r>
+    </w:p>
+    <w:p>
+      <w:r>
+        <w:t>涉及输入、消息投递或后台同步的修改，必须同时覆盖普通文字、语音、图片、表情、位置、卡片、主动消息、服务器推送、查岗和日程提醒，并运行专项测试与全量测试。不得只验证一种消息格式。</w:t>
+      </w:r>
+    </w:p>
+    <w:p>
+      <w:r>
+        <w:t>发布门槛更新为至少 368 项测试全部通过；若总数减少，必须记录删除原因，禁止通过删除断言或放宽断言规避输入中断回归。</w:t>
+      </w:r>
+    </w:p>
+    <w:p>
+      <w:r>
+        <w:br w:type="page"/>
+      </w:r>
+    </w:p>
+    <w:p>
+      <w:pPr>
+        <w:pStyle w:val="Heading1"/>
+      </w:pPr>
+      <w:r>
+        <w:t>新增强制规范｜异步来信不得替换编辑器（v856 起）</w:t>
+      </w:r>
+    </w:p>
+    <w:p>
+      <w:r>
+        <w:t>任何角色消息、服务器轮询、通知回填、后台同步、识图完成、语音完成或生成状态变化，只要用户正在 INPUT、TEXTAREA 或 contenteditable 中编辑，就不得通过整页 innerHTML 替换来刷新状态。</w:t>
+      </w:r>
+    </w:p>
+    <w:p>
+      <w:r>
+        <w:t>聊天来信必须优先更新消息容器本身。若消息类型需要重新生成卡片，应重绘消息列表容器，不得连带重建输入栏；生成中、排队中等按钮状态必须原位更新。</w:t>
+      </w:r>
+    </w:p>
+    <w:p>
+      <w:r>
+        <w:t>确需整页刷新时，必须按页面身份键保存并恢复草稿、选区、焦点、输入框尺寸和滚动位置；恢复前要确认刷新后仍是同一页面、同一角色，禁止把草稿带到其他会话。</w:t>
+      </w:r>
+    </w:p>
+    <w:p>
+      <w:r>
+        <w:t>涉及输入、消息投递或后台同步的修改，必须同时覆盖普通文字、语音、图片、表情、位置、卡片、主动消息、服务器推送、查岗和日程提醒，并运行专项测试与全量测试。不得只验证一种消息格式。</w:t>
+      </w:r>
+    </w:p>
+    <w:p>
+      <w:r>
+        <w:t>发布门槛更新为至少 375 项测试全部通过；若总数减少，必须记录删除原因，禁止通过删除断言或放宽断言规避输入中断回归。</w:t>
       </w:r>
     </w:p>
     <w:sectPr>

</xml_diff>

<commit_message>
fix: prioritize companion background commands
</commit_message>
<xml_diff>
--- a/docs/maintenance/AI开发项目_Bug修改规范.docx
+++ b/docs/maintenance/AI开发项目_Bug修改规范.docx
@@ -3090,6 +3090,54 @@
     <w:p>
       <w:r>
         <w:t>发布门槛更新为至少 375 项测试全部通过；若总数减少，必须记录删除原因，禁止通过删除断言或放宽断言规避输入中断回归。</w:t>
+      </w:r>
+    </w:p>
+    <w:p>
+      <w:r>
+        <w:br w:type="page"/>
+      </w:r>
+    </w:p>
+    <w:p>
+      <w:pPr>
+        <w:pStyle w:val="Heading1"/>
+      </w:pPr>
+      <w:r>
+        <w:t>新增强制规范｜伴生命令与动态快照必须分层（v857 起）</w:t>
+      </w:r>
+    </w:p>
+    <w:p>
+      <w:r>
+        <w:t>后台通知的第一优先级是完成可逆、幂等的设备命令并回执。不得在命令之前等待 DeviceActivity 报告、HealthKit 查询、反向地理编码、图片处理或其他可延后的动态数据任务。</w:t>
+      </w:r>
+    </w:p>
+    <w:p>
+      <w:r>
+        <w:t>前台完整同步与后台命令同步必须使用独立的并发边界，并对拉取、执行、回执命令段做进程内串行化，防止同一 pending 命令被两个同步任务重复执行。</w:t>
+      </w:r>
+    </w:p>
+    <w:p>
+      <w:r>
+        <w:t>控制快照必须显式标记 controlOnly。消费者只能用它更新锁定、解锁、限额等控制字段；不得用缺失或默认的 0 覆盖上一次真实使用时长、位置、足迹或健康数据。</w:t>
+      </w:r>
+    </w:p>
+    <w:p>
+      <w:r>
+        <w:t>命令确认与动态数据新鲜度不得共用一个过期结论。只有回执后的设备快照与命令一致时才能确认；确认后可永久保留为上一次已验证状态，同时把时长、位置等动态数据单独标注为较早。</w:t>
+      </w:r>
+    </w:p>
+    <w:p>
+      <w:r>
+        <w:t>APNs 只是唤醒提示，不是设备回执。网页必须读取并记录推送接口结果，但 pushed 不得把命令标为 completed；无令牌、节流、超时或函数不可用时必须保留服务器队列并给出可理解的降级说明。</w:t>
+      </w:r>
+    </w:p>
+    <w:p>
+      <w:r>
+        <w:t>iOS 被用户从多任务界面强制划掉后，后台通知通常不能唤醒 App。产品提示必须如实说明这一系统限制，不得承诺永久后台运行或绝对即时。</w:t>
+      </w:r>
+    </w:p>
+    <w:p>
+      <w:r>
+        <w:t>发布伴生改动必须至少验证：推送函数是否真实存在、RPC 是否存在、后台命令快车道、并发去重、controlOnly 合并、回执后快照确认、确认跨新鲜度阈值保持、完整测试套件和 Mac 真机编译。</w:t>
       </w:r>
     </w:p>
     <w:sectPr>

</xml_diff>

<commit_message>
fix: prevent proactive message replays
</commit_message>
<xml_diff>
--- a/docs/maintenance/AI开发项目_Bug修改规范.docx
+++ b/docs/maintenance/AI开发项目_Bug修改规范.docx
@@ -3090,6 +3090,49 @@
     <w:p>
       <w:r>
         <w:t>发布门槛更新为至少 375 项测试全部通过；若总数减少，必须记录删除原因，禁止通过删除断言或放宽断言规避输入中断回归。</w:t>
+      </w:r>
+    </w:p>
+    <w:p>
+      <w:r>
+        <w:br w:type="page"/>
+      </w:r>
+    </w:p>
+    <w:p>
+      <w:pPr>
+        <w:pStyle w:val="Heading1"/>
+      </w:pPr>
+      <w:r>
+        <w:t>新增强制规范｜主动联系必须是独立事件且极短文本不得豁免（v857 起）</w:t>
+      </w:r>
+    </w:p>
+    <w:p>
+      <w:r>
+        <w:t>主动联系、服务器主动推送和伴生自动关怀都必须被提示为与上一轮分开的独立新事件。最近聊天只能作为已经发生的事实、关系与用户交代的背景，不得被解释为等待角色继续回答的当前回合。</w:t>
+      </w:r>
+    </w:p>
+    <w:p>
+      <w:r>
+        <w:t>主动消息防重复不得按固定最小长度整体豁免。所有非空文本必须参与完全匹配；2—7 个规范化字符必须参与包含或相似度判断，并采用与长度相符的一字差阈值，避免极短原句和只改一个字的复读。</w:t>
+      </w:r>
+    </w:p>
+    <w:p>
+      <w:r>
+        <w:t>判重范围必须跨投递路径统一：客户端比较普通角色回复、本地主动消息与服务器回填消息；服务器在 outbox/APNs 前比较最近主动 outbox 与 recent_context 中的普通角色回复。用户消息不得进入角色回复候选，普通用户触发的回复也不得被主动消息静默规则误拦截。</w:t>
+      </w:r>
+    </w:p>
+    <w:p>
+      <w:r>
+        <w:t>重复候选不得通过固定话术、随机句库或硬编码台词替换。允许模型按同一人格约束重试；仍无法生成真实新事件时，应保持安静。服务器必须在发送 APNs 之前完成判重，不能先通知后再由客户端丢弃。</w:t>
+      </w:r>
+    </w:p>
+    <w:p>
+      <w:r>
+        <w:t>相关修改必须至少覆盖：极短完全重复、一字改写、不同主题不误伤、用户文字不误伤、普通回复到本地主动消息、普通回复到服务器主动推送、最近聊天已结束边界，以及原有消息数量范围和输入不中断保护。</w:t>
+      </w:r>
+    </w:p>
+    <w:p>
+      <w:r>
+        <w:t>测试计数说明：v856 文档历史段落记录 375 项，但当前 origin/main 4797aca 实际枚举为 373 项；v857 新增 1 项服务器测试后为 374 项。本次没有删除或放宽任何测试。后续以仓库实际枚举结果为准，任何减少仍必须说明具体提交与原因。</w:t>
       </w:r>
     </w:p>
     <w:sectPr>

</xml_diff>

<commit_message>
docs: migrate companion deployment record to v860
</commit_message>
<xml_diff>
--- a/docs/maintenance/AI开发项目_Bug修改规范.docx
+++ b/docs/maintenance/AI开发项目_Bug修改规范.docx
@@ -3186,6 +3186,49 @@
     <w:p>
       <w:r>
         <w:t>每次发布必须先 fetch 最新 main、解决并验证并行改动、统一唯一版本号、运行高风险专项和完整测试，再推送 HEAD:main。发布后记录远端提交号、线上版本和 Edge Function 部署状态。</w:t>
+      </w:r>
+    </w:p>
+    <w:p>
+      <w:r>
+        <w:br w:type="page"/>
+      </w:r>
+    </w:p>
+    <w:p>
+      <w:pPr>
+        <w:pStyle w:val="Heading1"/>
+      </w:pPr>
+      <w:r>
+        <w:t>新增强制规范｜固定仓库单一 main 发布（v860 起）</w:t>
+      </w:r>
+    </w:p>
+    <w:p>
+      <w:r>
+        <w:t>唯一允许修改和发布的仓库是 C:\Users\pc\Documents\小手机\phone-work，唯一分支是 main，唯一远端目标是 origin/main。禁止创建新分支、禁止创建 worktree，禁止使用 phone-release-web*、voice-test、Documents\GitHub\phone 等旧目录。</w:t>
+      </w:r>
+    </w:p>
+    <w:p>
+      <w:r>
+        <w:t>GitHub Desktop 只用于查看，不需要也不得要求用户在其中手动合并或发布。一次只能有一个聊天修改和发布；发现另一个聊天正在推送时必须等待。</w:t>
+      </w:r>
+    </w:p>
+    <w:p>
+      <w:r>
+        <w:t>开工前必须确认固定仓库没有未提交内容、当前分支为 main，然后 fetch origin/main 并仅以 fast-forward 对齐。发现未提交内容、分支不一致或无法快进时立即停止，不得 reset、覆盖、强推或绕到旧目录。</w:t>
+      </w:r>
+    </w:p>
+    <w:p>
+      <w:r>
+        <w:t>修改完成后必须运行相关测试，把当前线上版本号加 1，直接提交到 main，再普通推送 origin/main。推送前或推送时发现远端新增提交，必须安全纳入远端改动并重新测试，禁止 force push。</w:t>
+      </w:r>
+    </w:p>
+    <w:p>
+      <w:r>
+        <w:t>发布后必须报告新版本号、origin/main 完整提交号，并实际核验线上页面是否读取到新版本。未读取到时只能报告等待部署或缓存状态，不得把本地/远端版本当作线上已生效。</w:t>
+      </w:r>
+    </w:p>
+    <w:p>
+      <w:r>
+        <w:t>涉及 Supabase Edge Function 时，必须分别记录源码是否进入 GitHub main、函数是否实际部署到 Supabase。只有独立部署记录或线上函数探测可以证明 Supabase 已部署。</w:t>
       </w:r>
     </w:p>
     <w:sectPr>

</xml_diff>

<commit_message>
release: v861 sync role phone passwords and home clock
</commit_message>
<xml_diff>
--- a/docs/maintenance/AI开发项目_Bug修改规范.docx
+++ b/docs/maintenance/AI开发项目_Bug修改规范.docx
@@ -3229,6 +3229,44 @@
     <w:p>
       <w:r>
         <w:t>涉及 Supabase Edge Function 时，必须分别记录源码是否进入 GitHub main、函数是否实际部署到 Supabase。只有独立部署记录或线上函数探测可以证明 Supabase 已部署。</w:t>
+      </w:r>
+    </w:p>
+    <w:p>
+      <w:r>
+        <w:br w:type="page"/>
+      </w:r>
+    </w:p>
+    <w:p>
+      <w:pPr>
+        <w:pStyle w:val="Heading1"/>
+      </w:pPr>
+      <w:r>
+        <w:t>新增强制规范｜AI 口头状态必须与真实状态一致（v861 起）</w:t>
+      </w:r>
+    </w:p>
+    <w:p>
+      <w:r>
+        <w:t>角色在可见回复中宣告已经完成某项状态修改时，真实持久化状态必须在同一条处理链中完成；不得只让角色口头声称成功，也不得让隐藏标签使用与可见文本不同的参数。</w:t>
+      </w:r>
+    </w:p>
+    <w:p>
+      <w:r>
+        <w:t>涉及密码、金额、时间、数量、设备目标等精确值时，应先归一化输入，再让自然语言解析、控制标签、状态写入和读取校验共用同一数据源。禁止为同一事实建立互不联动的第二份状态。</w:t>
+      </w:r>
+    </w:p>
+    <w:p>
+      <w:r>
+        <w:t>回归测试不得只覆盖一个理想句式或孤立的解析函数。至少覆盖常见自然说法、格式变体、否定或无关语句，并执行“模型回复→命令处理→持久化→实际消费者读取”的端到端链路。</w:t>
+      </w:r>
+    </w:p>
+    <w:p>
+      <w:r>
+        <w:t>新增界面开关必须明确默认值、影响范围、持久化行为和恢复路径。关闭某个视觉元素时，只隐藏约定范围，不得连带破坏其他页面、组件或数据。</w:t>
+      </w:r>
+    </w:p>
+    <w:p>
+      <w:r>
+        <w:t>继续执行固定发布路线：唯一仓库 C:\Users\pc\Documents\小手机\phone-work，唯一分支 main，唯一远端 origin/main；一次只允许一个聊天修改和发布，不创建分支或 worktree，不强推。</w:t>
       </w:r>
     </w:p>
     <w:sectPr>

</xml_diff>

<commit_message>
release: v863 companion atomic silent lock
</commit_message>
<xml_diff>
--- a/docs/maintenance/AI开发项目_Bug修改规范.docx
+++ b/docs/maintenance/AI开发项目_Bug修改规范.docx
@@ -3267,6 +3267,49 @@
     <w:p>
       <w:r>
         <w:t>继续执行固定发布路线：唯一仓库 C:\Users\pc\Documents\小手机\phone-work，唯一分支 main，唯一远端 origin/main；一次只允许一个聊天修改和发布，不创建分支或 worktree，不强推。</w:t>
+      </w:r>
+    </w:p>
+    <w:p>
+      <w:r>
+        <w:br w:type="page"/>
+      </w:r>
+    </w:p>
+    <w:p>
+      <w:pPr>
+        <w:pStyle w:val="Heading1"/>
+      </w:pPr>
+      <w:r>
+        <w:t>新增强制规范｜伴生命令必须以系统读回和原子快照为准（v863 起）</w:t>
+      </w:r>
+    </w:p>
+    <w:p>
+      <w:r>
+        <w:t>APNs、网页排队成功、Edge Function 返回 pushed=true 都只能证明“已请求唤醒”，不得在界面或维护记录中表述为设备执行成功。静默后台唤醒不得夹带 alert、sound 或 badge 来制造成功感。</w:t>
+      </w:r>
+    </w:p>
+    <w:p>
+      <w:r>
+        <w:t>锁定或解锁 ManagedSettings 后必须从同一个 ManagedSettingsStore 读回目标 token。只有读回状态与命令目标一致，才能把命令标为 completed；授权缺失、token 不存在、读回不一致或网络提交失败都不得生成成功回执。</w:t>
+      </w:r>
+    </w:p>
+    <w:p>
+      <w:r>
+        <w:t>成功命令的 completed 状态、acknowledged_at、post-command snapshot 和 last_sync_at 必须在同一数据库事务中提交。禁止先成功回执、再异步补快照；禁止用网页收到命令或本地 UserDefaults 镜像代替系统状态。</w:t>
+      </w:r>
+    </w:p>
+    <w:p>
+      <w:r>
+        <w:t>所有设备快照必须携带单调 snapshotSequence。服务端不得允许旧序号覆盖新序号。完整同步、前台同步和 APNs 快车道必须共享串行命令通道；若通道仍忙，应等待或明确失败，禁止假装没有命令并上传过时控制快照。</w:t>
+      </w:r>
+    </w:p>
+    <w:p>
+      <w:r>
+        <w:t>产品文案必须区分三种状态：pending 超时才叫“命令过期”；动态数据较早叫“快照较早”；completed 回执与设备状态矛盾叫“锁定/解锁未生效”。使用时长百分比不得伪造最小 2%，0 使用应显示 0%。</w:t>
+      </w:r>
+    </w:p>
+    <w:p>
+      <w:r>
+        <w:t>伴生修复至少验证：静默 APNs 头和 payload、命令先于重型数据刷新、并发命令不上传旧快照、ManagedSettings 读回、原子 RPC、单调序号、冲突文案、旧客户端过渡，以及完整项目回归。Windows 静态测试不能替代 Mac Xcode 编译和真实 iPhone 验收。</w:t>
       </w:r>
     </w:p>
     <w:sectPr>

</xml_diff>

<commit_message>
release: v865 preserve home layout when clock is hidden
</commit_message>
<xml_diff>
--- a/docs/maintenance/AI开发项目_Bug修改规范.docx
+++ b/docs/maintenance/AI开发项目_Bug修改规范.docx
@@ -3387,6 +3387,34 @@
           <w:sz w:val="21"/>
         </w:rPr>
         <w:t>发布前必须同时验证角色模型路线、开关开闭两种上下文、可见格式隔离、跨日和离开时长、微信到家到共同生活真实消息的完整链路，以及一次性约会旧回归。静态预览、源码断言和测试总数不得替代正式代码链路验证。</w:t>
+      </w:r>
+    </w:p>
+    <w:p>
+      <w:r>
+        <w:br w:type="page"/>
+      </w:r>
+    </w:p>
+    <w:p>
+      <w:pPr>
+        <w:pStyle w:val="Heading1"/>
+      </w:pPr>
+      <w:r>
+        <w:t>新增强制规范｜视觉开关不得意外删除布局槽位（v865 起）</w:t>
+      </w:r>
+    </w:p>
+    <w:p>
+      <w:r>
+        <w:t>当需求明确为“隐藏元素但页面其他部分不能移动”时，禁止通过条件模板、display:none 或删除 DOM 节点实现。必须保留原布局槽位，只隐藏约定的可见内容，并同时处理点击、焦点和无障碍状态。</w:t>
+      </w:r>
+    </w:p>
+    <w:p>
+      <w:r>
+        <w:t>在 flex、grid、绝对定位与安全区混合的主屏中，元素是否存在会改变剩余空间分配。修改视觉开关时必须检查常规高度和所有紧凑高度断点，至少比较被隐藏元素高度、下一内容区起点、Dock 位置与页面底部背景。</w:t>
+      </w:r>
+    </w:p>
+    <w:p>
+      <w:r>
+        <w:t>视觉回归测试不能只检查文字是否消失。必须同时断言隐藏方式不会触发布局回流，并保留原主题、组件、图标、分页点、底栏和安全区行为；全量回归通过后才可发布。</w:t>
       </w:r>
     </w:p>
     <w:sectPr>

</xml_diff>

<commit_message>
release: v866 cohabitation memory and iOS viewport
</commit_message>
<xml_diff>
--- a/docs/maintenance/AI开发项目_Bug修改规范.docx
+++ b/docs/maintenance/AI开发项目_Bug修改规范.docx
@@ -3415,6 +3415,39 @@
     <w:p>
       <w:r>
         <w:t>视觉回归测试不能只检查文字是否消失。必须同时断言隐藏方式不会触发布局回流，并保留原主题、组件、图标、分页点、底栏和安全区行为；全量回归通过后才可发布。</w:t>
+      </w:r>
+    </w:p>
+    <w:p>
+      <w:r>
+        <w:br w:type="page"/>
+      </w:r>
+    </w:p>
+    <w:p>
+      <w:pPr>
+        <w:pStyle w:val="Heading1"/>
+      </w:pPr>
+      <w:r>
+        <w:t>新增强制规范｜长期场景设置、独立记忆库与设备定向视口修复（v866 起）</w:t>
+      </w:r>
+    </w:p>
+    <w:p>
+      <w:r>
+        <w:t>长期场景的上下文条数、总结轮数、总结引用量、总结方式和模型路线不得写死，也不得只能到全局设置修改。应在当前长期场景聊天页提供可折叠、可持久化的原地设置；设置按角色/场景隔离，控件变更不得整页重渲染或破坏正在输入的内容。</w:t>
+      </w:r>
+    </w:p>
+    <w:p>
+      <w:r>
+        <w:t>共同生活、单次线下约会和微信必须使用不同的可见记录与总结存储。共同生活总结只允许写入该共同生活 home 的 summaries；禁止复制进微信长期记忆、角色 summaries、S.messages 或 S.offline。跨线上线下需要互通时，只能在同步开关开启后从共同生活唯一存储按话题临时检索，禁止做第二份持久副本。</w:t>
+      </w:r>
+    </w:p>
+    <w:p>
+      <w:r>
+        <w:t>长期记忆总结必须支持用户主动触发，并允许整段或分段。分段不得为了达到条数而重复或编造；内容不足时允许单条。无论哪种方式，都必须以角色第一人称保存，排除普通动作流水账、环境和第三人称旁白，只保留有长期价值的事实、话语、约定、情绪与关系变化。</w:t>
+      </w:r>
+    </w:p>
+    <w:p>
+      <w:r>
+        <w:t>只在少数设备出现的视口问题必须优先采用能力检测、显示模式和方向共同限定的 CSS 修复。禁止在没有跨设备证据时修改所有设备的根高度，也禁止恢复全局 visualViewport/resize 高度写入。至少验证正常手机尺寸下 html、body、phone、screen 同底、无横向溢出、键盘与滚动回归不退化；问题设备必须保留上线后的安装态复核项。</w:t>
       </w:r>
     </w:p>
     <w:sectPr>

</xml_diff>

<commit_message>
release: v867 cohabitation phone inspection and narration toggle
</commit_message>
<xml_diff>
--- a/docs/maintenance/AI开发项目_Bug修改规范.docx
+++ b/docs/maintenance/AI开发项目_Bug修改规范.docx
@@ -3448,6 +3448,49 @@
     <w:p>
       <w:r>
         <w:t>只在少数设备出现的视口问题必须优先采用能力检测、显示模式和方向共同限定的 CSS 修复。禁止在没有跨设备证据时修改所有设备的根高度，也禁止恢复全局 visualViewport/resize 高度写入。至少验证正常手机尺寸下 html、body、phone、screen 同底、无横向溢出、键盘与滚动回归不退化；问题设备必须保留上线后的安装态复核项。</w:t>
+      </w:r>
+    </w:p>
+    <w:p>
+      <w:r>
+        <w:br w:type="page"/>
+      </w:r>
+    </w:p>
+    <w:p>
+      <w:pPr>
+        <w:pStyle w:val="Heading1"/>
+      </w:pPr>
+      <w:r>
+        <w:t>v867 新增长期规则｜跨通道真实查看与输入模式</w:t>
+      </w:r>
+    </w:p>
+    <w:p>
+      <w:pPr/>
+      <w:r>
+        <w:t>1. 任何角色手机查看、微信登录和真实设备控制必须先经过同一执行占用；线上与共同生活禁止同时查看或同时回话。</w:t>
+      </w:r>
+    </w:p>
+    <w:p>
+      <w:pPr/>
+      <w:r>
+        <w:t>2. 查看结果必须来自当前真实数据读取函数；发言只能进入发起通道。不得把排队、推送或处理中状态写成已锁定、已完成。</w:t>
+      </w:r>
+    </w:p>
+    <w:p>
+      <w:pPr/>
+      <w:r>
+        <w:t>3. 线上与线下必须共享按查看项目生成的事实指纹。允许不限次数重新查看，但内容未变化时不得重复提醒；只有真实内容变化后才允许再次反应。</w:t>
+      </w:r>
+    </w:p>
+    <w:p>
+      <w:pPr/>
+      <w:r>
+        <w:t>4. 共同生活主动消息只能由一次实际查看完成触发，不能退化成线上日常分享；第三人称动作与自然台词格式保持不变。</w:t>
+      </w:r>
+    </w:p>
+    <w:p>
+      <w:pPr/>
+      <w:r>
+        <w:t>5. 旁白等输入模式应复用原输入框并显式显示当前状态；切换不得打开额外弹窗、不得清空未发送草稿、不得在发送后意外复位。</w:t>
       </w:r>
     </w:p>
     <w:sectPr>

</xml_diff>

<commit_message>
release: v868 sync cohabitation time, schedule, and location
</commit_message>
<xml_diff>
--- a/docs/maintenance/AI开发项目_Bug修改规范.docx
+++ b/docs/maintenance/AI开发项目_Bug修改规范.docx
@@ -3491,6 +3491,44 @@
       <w:pPr/>
       <w:r>
         <w:t>5. 旁白等输入模式应复用原输入框并显式显示当前状态；切换不得打开额外弹窗、不得清空未发送草稿、不得在发送后意外复位。</w:t>
+      </w:r>
+    </w:p>
+    <w:p>
+      <w:r>
+        <w:br w:type="page"/>
+      </w:r>
+    </w:p>
+    <w:p>
+      <w:pPr>
+        <w:pStyle w:val="Heading1"/>
+      </w:pPr>
+      <w:r>
+        <w:t>新增强制规范｜共同生活阶段、同场关系与位置必须分离（v868 起）</w:t>
+      </w:r>
+    </w:p>
+    <w:p>
+      <w:r>
+        <w:t>共同生活状态不得再用一个自由文本字段同时表示阶段、是否同场和位置。阶段负责在家/单独上班/单独外出/回家路上/一起外出；同场关系决定能否继续面对面；位置只记录已真实抵达的卧室、书房、客厅或外出地点。界面、模型提示和输入权限必须读取同一份持久化状态。</w:t>
+      </w:r>
+    </w:p>
+    <w:p>
+      <w:r>
+        <w:t>地点更新必须以已经发生的动作或结构化状态标签为准。禁止仅因回答中出现地点名就移动；询问、建议、未来计划、想象、条件句和否定句都不能改变位置。兼容自然语言推断只能作为窄兜底，并必须配套未移动反例测试。</w:t>
+      </w:r>
+    </w:p>
+    <w:p>
+      <w:r>
+        <w:t>双方一起外出仍属于同一面对面现场，不得自动转微信；双方一起回家不得生成角色单独到家的横幅或重复进门回复。只有角色与用户不在同一空间时，才显示微信入口；只有从单独离家阶段真正到家时，才生成线上到线下承接。</w:t>
+      </w:r>
+    </w:p>
+    <w:p>
+      <w:r>
+        <w:t>任何共同生活改动都不得改变一次性旧约会的第三人称旁白、普通台词、逐字速度和可见记录格式。验收必须执行正式代码链路测试、共同生活专项测试和完整回归，不能以静态页面、测试按钮或单元片段代替端到端边界核对。</w:t>
+      </w:r>
+    </w:p>
+    <w:p>
+      <w:r>
+        <w:t>日期、星期和相对日期必须从同一个真实时间戳计算，禁止让模型自行猜测“明天星期几”。线上与共同生活必须复用角色同一份可编辑作息数据，不得复制第二套固定配置。作息到点是角色必须执行生活动作的约束，不是界面直接切换线上状态的触发器；只有实际离开同一空间并持久化上班/外出状态后，才显示微信入口。</w:t>
       </w:r>
     </w:p>
     <w:sectPr>

</xml_diff>

<commit_message>
release: v869 cohabitation phone controls and daily checks
</commit_message>
<xml_diff>
--- a/docs/maintenance/AI开发项目_Bug修改规范.docx
+++ b/docs/maintenance/AI开发项目_Bug修改规范.docx
@@ -3529,6 +3529,49 @@
     <w:p>
       <w:r>
         <w:t>日期、星期和相对日期必须从同一个真实时间戳计算，禁止让模型自行猜测“明天星期几”。线上与共同生活必须复用角色同一份可编辑作息数据，不得复制第二套固定配置。作息到点是角色必须执行生活动作的约束，不是界面直接切换线上状态的触发器；只有实际离开同一空间并持久化上班/外出状态后，才显示微信入口。</w:t>
+      </w:r>
+    </w:p>
+    <w:p>
+      <w:r>
+        <w:br w:type="page"/>
+      </w:r>
+    </w:p>
+    <w:p>
+      <w:pPr>
+        <w:pStyle w:val="Heading1"/>
+      </w:pPr>
+      <w:r>
+        <w:t>新增强制规范｜跨通道每日必查必须显式交接（v869 起）</w:t>
+      </w:r>
+    </w:p>
+    <w:p>
+      <w:r>
+        <w:t>当线上通道因共同生活、通话、影院或其他占用而静默时，任何标记为 requiredDaily 的任务都必须明确交给当前唯一可见通道，或保留为未完成等待后续执行。禁止只加静默条件而没有接管逻辑，否则会把防重复变成漏执行。</w:t>
+      </w:r>
+    </w:p>
+    <w:p>
+      <w:r>
+        <w:t>线上与共同生活必须共用同一份每日完成标记；只有真实数据已读取且来源通道实际生成有效回复后才能落标。执行失败不得提前完成，重试必须有退避。任何时刻继续使用同一个查看/登录/远控占用，禁止两边同时查看或各发一次。</w:t>
+      </w:r>
+    </w:p>
+    <w:p>
+      <w:r>
+        <w:t>每日健康必查的当前范围固定为一次读取睡眠与步数。心率、电量和位置是可选自主查看，不得作为睡眠必查的附带 extras。屏幕必查必须包含总屏幕时长和全部逐 App 时长；没有真实逐 App 新鲜快照时保持未完成，不得用 0、旧内置数据或推测补齐。</w:t>
+      </w:r>
+    </w:p>
+    <w:p>
+      <w:r>
+        <w:t>跨日去重必须同时保存事实哈希和逻辑日：同一天相同事实不重复发言，下一天即使数值未变化也允许完成当天一次必查；完成后当天的普通重复查看仍应被同一事实签名拦截。相关健康子项合并查看时必须使用同一去重键，避免拆项造成重复反应。</w:t>
+      </w:r>
+    </w:p>
+    <w:p>
+      <w:r>
+        <w:t>共同生活限额必须复用已验证的双端统一限额函数，只允许已关联且两端均授权的 App，分钟数限定 1到720。不得新建仅线下限额存储、不得把未绑定外置 App 设成独立限额，也不得把入队或 APNs 唤醒描述成设备已经执行成功。</w:t>
+      </w:r>
+    </w:p>
+    <w:p>
+      <w:r>
+        <w:t>模型路由规范确认：共同生活必须尊重用户选择的回复线路。选择主模型时允许在本次主请求失败或空回复后调用副模型重写一次，但回退不得持久化、不得修改角色或共同生活模型设置；下一次独立请求仍必须先尝试主模型。模型切换提示只能在实际路线与上一轮不同后显示三秒，首次建立基线和连续同路线不得提示，提示状态不得当作模型设置保存。</w:t>
       </w:r>
     </w:p>
     <w:sectPr>

</xml_diff>

<commit_message>
release: v870 unify main and auxiliary api routes
</commit_message>
<xml_diff>
--- a/docs/maintenance/AI开发项目_Bug修改规范.docx
+++ b/docs/maintenance/AI开发项目_Bug修改规范.docx
@@ -3572,6 +3572,44 @@
     <w:p>
       <w:r>
         <w:t>模型路由规范确认：共同生活必须尊重用户选择的回复线路。选择主模型时允许在本次主请求失败或空回复后调用副模型重写一次，但回退不得持久化、不得修改角色或共同生活模型设置；下一次独立请求仍必须先尝试主模型。模型切换提示只能在实际路线与上一轮不同后显示三秒，首次建立基线和连续同路线不得提示，提示状态不得当作模型设置保存。</w:t>
+      </w:r>
+    </w:p>
+    <w:p>
+      <w:r>
+        <w:br w:type="page"/>
+      </w:r>
+    </w:p>
+    <w:p>
+      <w:pPr>
+        <w:pStyle w:val="Heading1"/>
+      </w:pPr>
+      <w:r>
+        <w:t>新增强制规范｜一条 API 路线必须原子保存主辅模型（v870 起）</w:t>
+      </w:r>
+    </w:p>
+    <w:p>
+      <w:r>
+        <w:t>当产品把主聊天模型与辅助模型定义为同一条 API 路线时，保存、切换、快速切换、表单回填和当前路线摘要必须使用同一个路线对象，不能只切主模型而继续沿用另一条路线的辅助模型。</w:t>
+      </w:r>
+    </w:p>
+    <w:p>
+      <w:r>
+        <w:t>路线结构升级必须区分“历史字段缺失”和“用户明确留空”。历史路线没有 aux 属性时应从升级前真实全局辅助配置迁移；已经显式保存 aux:{base:'',key:'',model:''} 时必须保留为空，不能用全局值反向覆盖。迁移必须幂等。</w:t>
+      </w:r>
+    </w:p>
+    <w:p>
+      <w:r>
+        <w:t>主模型仍可保持旧扁平字段以兼容现有调用者，但应用路线时必须分别写入 S.settings.chat 与 S.settings.aux；禁止把 aux 混进主模型请求参数，禁止改变辅助地址/Key 留空时复用当前主路线的既有规则。</w:t>
+      </w:r>
+    </w:p>
+    <w:p>
+      <w:r>
+        <w:t>新增就近保存按钮时，按钮必须保存用户理解中的完整配置单元，并与底部总保存使用同一数据语义。不得让两个位置保存出不同内容；切换前必须先捕获当前两组输入，避免未保存编辑被目标路线覆盖。</w:t>
+      </w:r>
+    </w:p>
+    <w:p>
+      <w:r>
+        <w:t>API 路线回归至少覆盖：旧路线无损迁移、显式空辅助不被覆盖、当前路线主辅共同保存、目标路线主辅共同回填、快速切换、点击当前路线保持正在编辑的值、保存按钮数量和底部总保存兼容。任何测试或文档中不得写入真实 API Key。</w:t>
       </w:r>
     </w:p>
     <w:sectPr>

</xml_diff>

<commit_message>
v871 separate co-living models and api routes
</commit_message>
<xml_diff>
--- a/docs/maintenance/AI开发项目_Bug修改规范.docx
+++ b/docs/maintenance/AI开发项目_Bug修改规范.docx
@@ -3610,6 +3610,72 @@
     <w:p>
       <w:r>
         <w:t>API 路线回归至少覆盖：旧路线无损迁移、显式空辅助不被覆盖、当前路线主辅共同保存、目标路线主辅共同回填、快速切换、点击当前路线保持正在编辑的值、保存按钮数量和底部总保存兼容。任何测试或文档中不得写入真实 API Key。</w:t>
+      </w:r>
+    </w:p>
+    <w:p>
+      <w:r>
+        <w:br w:type="page"/>
+      </w:r>
+    </w:p>
+    <w:p>
+      <w:pPr>
+        <w:pStyle w:val="Heading1"/>
+      </w:pPr>
+      <w:r>
+        <w:t>新增强制规范｜模型选择与 API 路线必须正交（v871 起）</w:t>
+      </w:r>
+    </w:p>
+    <w:p>
+      <w:r>
+        <w:t>产品文案必须明确区分模型和 API 路线：主模型／副模型表示同一条路线内使用哪组模型配置；路线一至路线四表示请求所使用的接口、Key 与模型配置集合。禁止把主模型写成主线路、把副模型写成备用线路。</w:t>
+      </w:r>
+    </w:p>
+    <w:p>
+      <w:r>
+        <w:t>子系统若允许固定 API 路线，必须通过请求级 routeIndex 或等价局部参数完成。禁止为了发送一次共同生活请求而修改 S.settings.chatRouteActive、调用 chatRouteApply 或永久切换微信当前路线。</w:t>
+      </w:r>
+    </w:p>
+    <w:p>
+      <w:r>
+        <w:t>模型回退必须保持路由稳定：指定路线的副模型不可用时，只能退回指定路线的主模型；不得悄悄改用微信当前路线。总结模型与总结路线也必须分别配置和分别解析。</w:t>
+      </w:r>
+    </w:p>
+    <w:p>
+      <w:r>
+        <w:t>旧字段迁移必须幂等且无损：仅当新字段缺失时读取旧字段，保存后以后以新字段为准。测试至少覆盖跟随角色、主副模型、跟随微信、固定路线、总结跟随、回退同路由和全局路线不变。</w:t>
+      </w:r>
+    </w:p>
+    <w:p>
+      <w:r>
+        <w:t>任何测试、文档、日志与截图不得写入真实 API Key。涉及路线的回归必须同时验证用户可见标签和实际请求配置，不能只检查下拉框文字。</w:t>
+      </w:r>
+    </w:p>
+    <w:p>
+      <w:r>
+        <w:br w:type="page"/>
+      </w:r>
+    </w:p>
+    <w:p>
+      <w:pPr>
+        <w:pStyle w:val="Heading1"/>
+      </w:pPr>
+      <w:r>
+        <w:t>新增强制规范｜异步查看动作必须单回合交付（v871 起）</w:t>
+      </w:r>
+    </w:p>
+    <w:p>
+      <w:r>
+        <w:t>模型回复若包含“先执行真实查看，再依据结果发言”的隐藏动作标签，动作前回合与结果回合只能有一个成为用户可见回复。默认由拿到真实事实的结果回合负责交付。</w:t>
+      </w:r>
+    </w:p>
+    <w:p>
+      <w:r>
+        <w:t>禁止一边 setTimeout 启动后台动作，一边把原始模型正文照常落库。调用方必须明确拥有该动作、等待其完成，并用显式 inspection／deferred 标记跳过普通空回复提示、重复总结和重复通知。</w:t>
+      </w:r>
+    </w:p>
+    <w:p>
+      <w:r>
+        <w:t>事实未变化导致结果回合静默时，不得回放动作前台词来填空；更不得编造一条新记录。线上微信、旧约会和远控链路不得因为共同生活去重修复而改变。</w:t>
       </w:r>
     </w:p>
     <w:sectPr>

</xml_diff>

<commit_message>
v876 add North App Store support pages
</commit_message>
<xml_diff>
--- a/docs/maintenance/AI开发项目_Bug修改规范.docx
+++ b/docs/maintenance/AI开发项目_Bug修改规范.docx
@@ -3676,6 +3676,39 @@
     <w:p>
       <w:r>
         <w:t>事实未变化导致结果回合静默时，不得回放动作前台词来填空；更不得编造一条新记录。线上微信、旧约会和远控链路不得因为共同生活去重修复而改变。</w:t>
+      </w:r>
+    </w:p>
+    <w:p>
+      <w:r>
+        <w:br w:type="page"/>
+      </w:r>
+    </w:p>
+    <w:p>
+      <w:pPr>
+        <w:pStyle w:val="Heading1"/>
+      </w:pPr>
+      <w:r>
+        <w:t>新增强制规范｜公开审核文档必须绕开应用外壳导航回退（v876 起）</w:t>
+      </w:r>
+    </w:p>
+    <w:p>
+      <w:r>
+        <w:t>在 PWA 根作用域新增支持页、隐私政策、审核说明、删除账户说明或法律文档时，不能只验证文件存在和直连 200。必须检查已注册 Service Worker 对 navigate 的处理，确保公开文档不会被缓存的应用 Shell 替换。</w:t>
+      </w:r>
+    </w:p>
+    <w:p>
+      <w:r>
+        <w:t>排除规则应使用固定文件名或明确白名单，并位于通用 navigate fallback 之前。禁止为了公开文档直接关闭整个 Service Worker、扩大为任意路径绕过缓存，或破坏小手机已有离线启动与数据保护。</w:t>
+      </w:r>
+    </w:p>
+    <w:p>
+      <w:r>
+        <w:t>审核与隐私页面不得包含真实 API Key、service_role、owner secret、pair secret、JWT、推送令牌、精确位置或健康样本。公开反馈入口必须提醒用户不要提交敏感信息；涉及删除或隐私请求时应转入私密处理渠道。</w:t>
+      </w:r>
+    </w:p>
+    <w:p>
+      <w:r>
+        <w:t>回归至少覆盖：两份公开页面互链、必要披露、第三方 App 内容边界、秘密模式扫描、Service Worker 排除顺序、原有 app Shell 版本对齐和完整 Node 测试。</w:t>
       </w:r>
     </w:p>
     <w:sectPr>

</xml_diff>

<commit_message>
release: v877 restore fixed chat viewport
</commit_message>
<xml_diff>
--- a/docs/maintenance/AI开发项目_Bug修改规范.docx
+++ b/docs/maintenance/AI开发项目_Bug修改规范.docx
@@ -3709,6 +3709,39 @@
     <w:p>
       <w:r>
         <w:t>回归至少覆盖：两份公开页面互链、必要披露、第三方 App 内容边界、秘密模式扫描、Service Worker 排除顺序、原有 app Shell 版本对齐和完整 Node 测试。</w:t>
+      </w:r>
+    </w:p>
+    <w:p>
+      <w:r>
+        <w:br w:type="page"/>
+      </w:r>
+    </w:p>
+    <w:p>
+      <w:pPr>
+        <w:pStyle w:val="Heading1"/>
+      </w:pPr>
+      <w:r>
+        <w:t>新增强制规范｜全屏聊天只能内部滚动，根页面不得随消息增长（v877 起）</w:t>
+      </w:r>
+    </w:p>
+    <w:p>
+      <w:r>
+        <w:t>全屏应用的 html、body、phone、screen 必须以当前网页可用视口为上限并裁切溢出；任何功能页不得通过内容高度、物理屏幕高度或安全区猜测扩大根页面。</w:t>
+      </w:r>
+    </w:p>
+    <w:p>
+      <w:r>
+        <w:t>聊天页必须维持 app/page 为纵向 flex 容器，消息区具备 flex: 1、min-height: 0 和 overflow-y: auto，输入区具备 flex: 0 0 auto。新增顶部卡片、提示栏、礼物卡或模型状态条时，只能压缩消息区，不能把输入区推到视口外。</w:t>
+      </w:r>
+    </w:p>
+    <w:p>
+      <w:r>
+        <w:t>禁止用 screen.height 作为网页 shell 高度，也禁止重新加入全局 visualViewport、resize 或键盘监听来持续写根高度。若需要修复 iOS 安全区，只能使用明确的 WebKit/standalone 范围和不会改变内容布局高度的视觉覆盖方案，并同时做安卓独立主屏回归。</w:t>
+      </w:r>
+    </w:p>
+    <w:p>
+      <w:r>
+        <w:t>每次修改 PWA 高度、安全区、状态栏或主屏底部样式，回归至少覆盖：普通浏览器、安卓独立主屏、iOS 独立主屏、长聊天、输入框显示、软键盘打开/关闭、根页面无整体滚动，以及消息区仍可独立滚动。</w:t>
       </w:r>
     </w:p>
     <w:sectPr>

</xml_diff>

<commit_message>
fix: add opt-in iOS home-screen safe areas
</commit_message>
<xml_diff>
--- a/docs/maintenance/AI开发项目_Bug修改规范.docx
+++ b/docs/maintenance/AI开发项目_Bug修改规范.docx
@@ -3742,6 +3742,39 @@
     <w:p>
       <w:r>
         <w:t>每次修改 PWA 高度、安全区、状态栏或主屏底部样式，回归至少覆盖：普通浏览器、安卓独立主屏、iOS 独立主屏、长聊天、输入框显示、软键盘打开/关闭、根页面无整体滚动，以及消息区仍可独立滚动。</w:t>
+      </w:r>
+    </w:p>
+    <w:p>
+      <w:r>
+        <w:br w:type="page"/>
+      </w:r>
+    </w:p>
+    <w:p>
+      <w:pPr>
+        <w:pStyle w:val="Heading1"/>
+      </w:pPr>
+      <w:r>
+        <w:t>新增强制规范｜苹果安全区适配必须手动、独立且不影响安卓（v878 起）</w:t>
+      </w:r>
+    </w:p>
+    <w:p>
+      <w:r>
+        <w:t>涉及 iOS 主屏幕安全区的修复必须同时满足 Apple 设备、standalone 主屏幕模式和用户显式开启三项条件；普通 Safari、安卓浏览器与安卓 PWA 必须沿用原布局。</w:t>
+      </w:r>
+    </w:p>
+    <w:p>
+      <w:r>
+        <w:t>允许使用 100dvh 和 env(safe-area-inset-*)；禁止使用 screen.height、物理屏幕与 innerHeight 差值、全局 visualViewport/resize 写高、-webkit-fill-available 或触摸设备泛化判断。</w:t>
+      </w:r>
+    </w:p>
+    <w:p>
+      <w:r>
+        <w:t>适配开关必须持久化，关闭后立即移除 north-ios-home-safe；新增顶部或底部补偿时要同时检查主屏、普通导航页和聊天输入栏，且不得破坏 v877 的一屏外壳与内部滚动契约。</w:t>
+      </w:r>
+    </w:p>
+    <w:p>
+      <w:r>
+        <w:t>每次发布至少自动验证 iPhone standalone、iPhone Safari、Android standalone、iPad 桌面 UA 四种判定，以及版本缓存对齐和完整回归。</w:t>
       </w:r>
     </w:p>
     <w:sectPr>

</xml_diff>

<commit_message>
fix: unify cohab context and safe areas
</commit_message>
<xml_diff>
--- a/docs/maintenance/AI开发项目_Bug修改规范.docx
+++ b/docs/maintenance/AI开发项目_Bug修改规范.docx
@@ -3775,6 +3775,44 @@
     <w:p>
       <w:r>
         <w:t>每次发布至少自动验证 iPhone standalone、iPhone Safari、Android standalone、iPad 桌面 UA 四种判定，以及版本缓存对齐和完整回归。</w:t>
+      </w:r>
+    </w:p>
+    <w:p>
+      <w:r>
+        <w:br w:type="page"/>
+      </w:r>
+    </w:p>
+    <w:p>
+      <w:pPr>
+        <w:pStyle w:val="Heading1"/>
+      </w:pPr>
+      <w:r>
+        <w:t>新增强制规范｜共同生活、线下和微信必须以实时状态统一判定（v879 起）</w:t>
+      </w:r>
+    </w:p>
+    <w:p>
+      <w:r>
+        <w:t>任何涉及共同生活、单次线下约会、微信或服务器主动消息的改动，都必须先判断当前实时状态。共同生活开启且未暂停时默认持续同居；在家和一起外出都是面对面同处一处；上班、单独外出、回家路上只是同居中的短暂分开，不能写成恢复异地或分居。</w:t>
+      </w:r>
+    </w:p>
+    <w:p>
+      <w:r>
+        <w:t>普通一次性线下约会进行中，角色不得主动发线上微信；共同生活面对面状态下也不得主动发微信。用户主动打开微信发消息时，角色可以回复，但必须理解为当前面对面/约会间隙拿起手机，不代表分开、久未联系或回到旧话题。</w:t>
+      </w:r>
+    </w:p>
+    <w:p>
+      <w:r>
+        <w:t>旧记忆、旧总结、旧微信、旧票务和旧线下约会只能作为过去背景，不能覆盖当前实时状态。出现“最近一次见面是某天”“还在异国恋/分居”“等你落地/改签机票”等与当前同居或正在见面冲突的说法，必须视为回归失败。</w:t>
+      </w:r>
+    </w:p>
+    <w:p>
+      <w:r>
+        <w:t>共同生活自动总结必须保留手动删除路径。删除或清空共同生活 summaries 不得删除原聊天、微信、单次线下约会或角色资料；后续新增总结功能时也要遵守同样的最小删除范围。</w:t>
+      </w:r>
+    </w:p>
+    <w:p>
+      <w:r>
+        <w:t>苹果主屏幕安全区适配继续遵守 v878 规范：只能由 Apple standalone + 用户手动开关命中；只能用 CSS safe-area/100dvh 和控件级补偿；不得使用 screen.height、全局 visualViewport 写高、所有 standalone 统一补偿或会影响安卓的全局高度策略。</w:t>
       </w:r>
     </w:p>
     <w:sectPr>

</xml_diff>

<commit_message>
v880: harden companion sync and cross-channel state
</commit_message>
<xml_diff>
--- a/docs/maintenance/AI开发项目_Bug修改规范.docx
+++ b/docs/maintenance/AI开发项目_Bug修改规范.docx
@@ -3813,6 +3813,54 @@
     <w:p>
       <w:r>
         <w:t>苹果主屏幕安全区适配继续遵守 v878 规范：只能由 Apple standalone + 用户手动开关命中；只能用 CSS safe-area/100dvh 和控件级补偿；不得使用 screen.height、全局 visualViewport 写高、所有 standalone 统一补偿或会影响安卓的全局高度策略。</w:t>
+      </w:r>
+    </w:p>
+    <w:p>
+      <w:r>
+        <w:br w:type="page"/>
+      </w:r>
+    </w:p>
+    <w:p>
+      <w:pPr>
+        <w:pStyle w:val="Heading1"/>
+      </w:pPr>
+      <w:r>
+        <w:t>新增强制规范｜锁定意图与使用量快照必须分层（v880 起）</w:t>
+      </w:r>
+    </w:p>
+    <w:p>
+      <w:r>
+        <w:t>锁定意图是授权状态，设备快照是观察状态。desiredLocked 只能由明确锁定或明确解锁动作修改；reportedLocked 只能表示设备最近回报。刷新、重连、控制回执、跨日、限额重建、旧快照和报告不可用都不得清除锁定意图，也不得制造 manualUnlock 事件。</w:t>
+      </w:r>
+    </w:p>
+    <w:p>
+      <w:r>
+        <w:t>原生有效锁定集合必须至少合并手动锁、每日限额锁和持久锁账本。新增任何监控重建或恢复路径时，不得清空仍有效的 shield/Token。显式解锁若涉及多个 store，必须先保存旧值、一次性移除并持久化、读回验证，任一失败恢复全部旧值。</w:t>
+      </w:r>
+    </w:p>
+    <w:p>
+      <w:r>
+        <w:t>使用量 payload 必须包含 iPhone 本地 usageDay、timeZone、generatedAt 和单调 revision/sequence。网页只接受当前日且比已确认版本新的 payload；同一天不得用较小旧值静默覆盖较大已确认值。跨日可以开始新的当天统计，但绝不能重置 lockIntents。控制命令快照与使用量快照必须使用不同的新鲜度字段。</w:t>
+      </w:r>
+    </w:p>
+    <w:p>
+      <w:r>
+        <w:t>涉及 Family Controls、ManagedSettings 或 DeviceActivity 的修改，Windows 静态测试不能代替 Mac/Xcode 和真机验证。复制仓库 Swift 前必须比较 Mac 实际工程文件；必须核对 Monitor Extension 对 limit.lockedTokens 的编码协议，并记录编译结果、授权状态、连续刷新、前后台、重启、跨日、限额阈值和真实回执。</w:t>
+      </w:r>
+    </w:p>
+    <w:p>
+      <w:r>
+        <w:t>发布必须先有针对不变量的红灯测试，再实现修复，最后运行相关测试与全量测试。UI 和角色提示必须分别陈述期望锁定、设备回报和使用量数据新鲜度，不能把三者混成一个“锁定/不一致”结论。</w:t>
+      </w:r>
+    </w:p>
+    <w:p>
+      <w:r>
+        <w:t>跨渠道消息强制规范：消息落库必须先保存真实 time，再按时间合并微信、电话、线下等渠道；上下文必须分别锚定当前输入前最新用户消息与最新角色消息，不能用隐藏 system 背景或单独主消息链推断“上一句话”。</w:t>
+      </w:r>
+    </w:p>
+    <w:p>
+      <w:r>
+        <w:t>独立 App 安全区强制规范：每个独立 App 必须具有页面级安全区类名和逐页回归测试；返回键、顶栏、标签栏、滚动容器即使使用行内样式，也必须由专项选择器和断言覆盖，不能靠通用选择器推断。</w:t>
       </w:r>
     </w:p>
     <w:sectPr>

</xml_diff>

<commit_message>
fix: harden companion sync and lock status v881
</commit_message>
<xml_diff>
--- a/docs/maintenance/AI开发项目_Bug修改规范.docx
+++ b/docs/maintenance/AI开发项目_Bug修改规范.docx
@@ -3861,6 +3861,49 @@
     <w:p>
       <w:r>
         <w:t>独立 App 安全区强制规范：每个独立 App 必须具有页面级安全区类名和逐页回归测试；返回键、顶栏、标签栏、滚动容器即使使用行内样式，也必须由专项选择器和断言覆盖，不能靠通用选择器推断。</w:t>
+      </w:r>
+    </w:p>
+    <w:p>
+      <w:r>
+        <w:br w:type="page"/>
+      </w:r>
+    </w:p>
+    <w:p>
+      <w:pPr>
+        <w:pStyle w:val="Heading1"/>
+      </w:pPr>
+      <w:r>
+        <w:t>新增强制规范｜真机读取必须有上限，配置不得冒充执行（v881 起）</w:t>
+      </w:r>
+    </w:p>
+    <w:p>
+      <w:r>
+        <w:t>任何 FamilyActivityData、DeviceActivityData、HealthKit、定位或反向地理编码读取都不得无限等待并独占完整同步。重型读取必须有明确时间上限、取消路径和降级结果；锁定命令与基础快照必须先行或能在读取失败后继续上传。高频轮询不得自动启动重型使用量直读。</w:t>
+      </w:r>
+    </w:p>
+    <w:p>
+      <w:r>
+        <w:t>Family Controls 权限必须在 App 回到前台和执行控制命令时复检。场景切换只能刷新状态，不得未经用户操作自动请求授权；重新授权必须由可见按钮触发，并在失败时给出明确恢复说明。</w:t>
+      </w:r>
+    </w:p>
+    <w:p>
+      <w:r>
+        <w:t>ManagedSettingsStore、持久账本和快照中的 token 都属于“配置/设备回报”，不是实际执行证明。UI、日志、角色提示和服务器回执禁止使用“系统确认锁定”“新快照确认锁定”等表述。唯一有效的锁定验收是打开目标 App 后出现系统屏蔽页；解锁验收是目标 App 可正常打开。</w:t>
+      </w:r>
+    </w:p>
+    <w:p>
+      <w:r>
+        <w:t>收到 iOS .ips 时必须先区分 watchdog、普通异常和 Jetsam。0x8BADF00D 要沿主线程与生命周期栈定位阻塞；不能因为现象发生在同步页面就归因于网络。无源码命中的框架栈必须先取得实际 Xcode 工程并比较，禁止在仓库中添加猜测性替代代码。</w:t>
+      </w:r>
+    </w:p>
+    <w:p>
+      <w:r>
+        <w:t>Windows 静态测试不能替代 Swift 编译。涉及 @MainActor、TaskGroup、Sendable、Family Controls 或 iOS 新 API 的修改，在发布真机包前必须在目标 Mac 工程编译，并记录 Xcode/iOS 版本、entitlements、App Group、Extension target 与签名状态。</w:t>
+      </w:r>
+    </w:p>
+    <w:p>
+      <w:r>
+        <w:t>把网页嵌入原生 App 只能改变界面承载方式，不能绕过 Screen Time 权限和扩展。若推进私人整合 App，必须单独规划原生桥接与 Extension，并与公开 North 的 Bundle ID、审核用途、数据和权限边界隔离。</w:t>
       </w:r>
     </w:p>
     <w:sectPr>

</xml_diff>

<commit_message>
feat: start private small phone app foundation
</commit_message>
<xml_diff>
--- a/docs/maintenance/AI开发项目_Bug修改规范.docx
+++ b/docs/maintenance/AI开发项目_Bug修改规范.docx
@@ -3904,6 +3904,44 @@
     <w:p>
       <w:r>
         <w:t>把网页嵌入原生 App 只能改变界面承载方式，不能绕过 Screen Time 权限和扩展。若推进私人整合 App，必须单独规划原生桥接与 Extension，并与公开 North 的 Bundle ID、审核用途、数据和权限边界隔离。</w:t>
+      </w:r>
+    </w:p>
+    <w:p>
+      <w:r>
+        <w:br w:type="page"/>
+      </w:r>
+    </w:p>
+    <w:p>
+      <w:pPr>
+        <w:pStyle w:val="Heading1"/>
+      </w:pPr>
+      <w:r>
+        <w:t>新增强制规范｜私人 App 单一总纲与单设备单控制器（2026-08-11 起）</w:t>
+      </w:r>
+    </w:p>
+    <w:p>
+      <w:r>
+        <w:t>私人版固定名为「小手机」，必须是本地打包业务核心并接入原生 Screen Time 能力的真实 iOS App。禁止把网页链接、PWA、远程首页或只改图标名称的 Web 壳标记为私人 App 完成。</w:t>
+      </w:r>
+    </w:p>
+    <w:p>
+      <w:r>
+        <w:t>公开 North 与私人「小手机」禁止同时控制同一台设备。服务端控制命令必须校验控制器类型、实例、租约版本和幂等键；客户端界面隐藏、设备名称不同或使用不同 Bundle ID 都不能替代服务端互斥。控制权迁移必须有废止旧凭据和重新授权的真机步骤。</w:t>
+      </w:r>
+    </w:p>
+    <w:p>
+      <w:r>
+        <w:t>网页核心只维护一份。iOS 构建可以把共享文件复制到生成目录，但生成目录必须可重建且不得人工编辑。原生桥必须版本化、白名单化，未知 action 默认拒绝；网页不得自行假装原生执行成功。</w:t>
+      </w:r>
+    </w:p>
+    <w:p>
+      <w:r>
+        <w:t>Bundle ID、App Group、Apple Team、entitlements、扩展 ID 和签名配置必须从真实 Xcode 工程与开发者账号读取，禁止猜写。没有 Mac 完整工程和对应源码时，静态测试不得替代 Swift 编译，也不得猜修日志中命中的 MapKit/VectorKit 生命周期。</w:t>
+      </w:r>
+    </w:p>
+    <w:p>
+      <w:r>
+        <w:t>新需求与旧交接冲突时，必须先更新唯一总纲并明确哪些旧表述失效。后续接手者先读 docs/maintenance/私人小手机App_唯一总纲.md，再读历史记录；不得把历史阶段顺序当成用户当前决定。</w:t>
       </w:r>
     </w:p>
     <w:sectPr>

</xml_diff>

<commit_message>
feat: import private small phone xcode project
</commit_message>
<xml_diff>
--- a/docs/maintenance/AI开发项目_Bug修改规范.docx
+++ b/docs/maintenance/AI开发项目_Bug修改规范.docx
@@ -3942,6 +3942,39 @@
     <w:p>
       <w:r>
         <w:t>新需求与旧交接冲突时，必须先更新唯一总纲并明确哪些旧表述失效。后续接手者先读 docs/maintenance/私人小手机App_唯一总纲.md，再读历史记录；不得把历史阶段顺序当成用户当前决定。</w:t>
+      </w:r>
+    </w:p>
+    <w:p>
+      <w:r>
+        <w:br w:type="page"/>
+      </w:r>
+    </w:p>
+    <w:p>
+      <w:pPr>
+        <w:pStyle w:val="Heading1"/>
+      </w:pPr>
+      <w:r>
+        <w:t>新增强制规范｜超时必须真实返回，重型 UI 必须随 scene 释放（2026-08-11 起）</w:t>
+      </w:r>
+    </w:p>
+    <w:p>
+      <w:r>
+        <w:t>异步超时测试不能只搜索 Task.sleep、timeout 常量或 group.cancelAll。若使用 withTaskGroup，必须证明作用域退出不会继续等待不响应取消的子任务；对于可能卡住的系统异步序列，应使用能返回首个结果且不等待输家的边界，并阻止被取消任务晚到写状态。</w:t>
+      </w:r>
+    </w:p>
+    <w:p>
+      <w:r>
+        <w:t>MapKit、相机、视频、实时渲染等重型 UI 不得在 scene inactive/background 时无条件常驻。收到真实 watchdog 日志后，应沿主线程栈命中的资源建立 scenePhase 生命周期；释放 UI 资源不能顺带停止仍被产品要求保留的独立数据采集。</w:t>
+      </w:r>
+    </w:p>
+    <w:p>
+      <w:r>
+        <w:t>从用户 Mac 导入工程时必须保留未提交工作树内容，过滤 .git、xcuserdata、旧压缩包和系统元数据；不得用初始 Git commit 覆盖 Xcode 中标记 A/M 的当前文件。导入后记录 Target、Team、Bundle ID、App Group 和 entitlements 的真实值。</w:t>
+      </w:r>
+    </w:p>
+    <w:p>
+      <w:r>
+        <w:t>Windows 静态测试不替代 Xcode 编译。涉及 AsyncStream、MainActor、DeviceActivity、MapKit 或同步目录资源包的修改，交付前必须在目标 Mac 编译所有 Target，并在真机验证后台切换和超时退出。</w:t>
       </w:r>
     </w:p>
     <w:sectPr>

</xml_diff>

<commit_message>
fix: load private phone web inside sandbox
</commit_message>
<xml_diff>
--- a/docs/maintenance/AI开发项目_Bug修改规范.docx
+++ b/docs/maintenance/AI开发项目_Bug修改规范.docx
@@ -3975,6 +3975,39 @@
     <w:p>
       <w:r>
         <w:t>Windows 静态测试不替代 Xcode 编译。涉及 AsyncStream、MainActor、DeviceActivity、MapKit 或同步目录资源包的修改，交付前必须在目标 Mac 编译所有 Target，并在真机验证后台切换和超时退出。</w:t>
+      </w:r>
+    </w:p>
+    <w:p>
+      <w:r>
+        <w:br w:type="page"/>
+      </w:r>
+    </w:p>
+    <w:p>
+      <w:pPr>
+        <w:pStyle w:val="Heading1"/>
+      </w:pPr>
+      <w:r>
+        <w:t>新增强制规范｜WKWebView 本地资源与沙盒读取范围（2026-08-11 起）</w:t>
+      </w:r>
+    </w:p>
+    <w:p>
+      <w:r>
+        <w:t>WKWebView 加载安装包本地文件时，main file URL 与 allowingReadAccessTo 目录必须从同一个标准化文件 URL 推导；禁止分别通过不同 Bundle、字符串拼接或未经标准化的路径独立计算两者。读取范围只授予资源文件的必要父目录，不得扩大到用户目录或任意外部路径。</w:t>
+      </w:r>
+    </w:p>
+    <w:p>
+      <w:r>
+        <w:t>打包入口统一使用 ASCII 文件名 index.html。中文业务源文件仍是小手机.html，构建时复制生成入口，禁止人工维护两份网页源码。打包测试必须确认 index.html、脚本、样式、图片和 vendor 文件同时存在。</w:t>
+      </w:r>
+    </w:p>
+    <w:p>
+      <w:r>
+        <w:t>所有本地网页容器必须实现 didFail 和 didFailProvisionalNavigation，并显示不会删除数据的可见诊断页；导航白名单必须允许自身 file URL 与 about 错误页。任何白屏都必须先取得 Xcode/WebKit 原始日志，不能按网络问题盲改。</w:t>
+      </w:r>
+    </w:p>
+    <w:p>
+      <w:r>
+        <w:t>Windows 静态测试只能验证路径契约和打包内容。每次修改本地资源加载方式后必须在真实 iPhone 重新安装，检查控制台没有 outside the sandbox、首页立即可见、相对资源完整、原生管理入口可用，再开始备份导入。</w:t>
       </w:r>
     </w:p>
     <w:sectPr>

</xml_diff>

<commit_message>
fix private app native input and badge lifecycle
</commit_message>
<xml_diff>
--- a/docs/maintenance/AI开发项目_Bug修改规范.docx
+++ b/docs/maintenance/AI开发项目_Bug修改规范.docx
@@ -4008,6 +4008,83 @@
     <w:p>
       <w:r>
         <w:t>Windows 静态测试只能验证路径契约和打包内容。每次修改本地资源加载方式后必须在真实 iPhone 重新安装，检查控制台没有 outside the sandbox、首页立即可见、相对资源完整、原生管理入口可用，再开始备份导入。</w:t>
+      </w:r>
+    </w:p>
+    <w:p>
+      <w:r>
+        <w:br w:type="page"/>
+      </w:r>
+    </w:p>
+    <w:p>
+      <w:pPr>
+        <w:pStyle w:val="Heading1"/>
+      </w:pPr>
+      <w:r>
+        <w:rPr>
+          <w:rFonts w:ascii="等线" w:hAnsi="等线" w:eastAsia="等线"/>
+          <w:sz w:val="32"/>
+        </w:rPr>
+        <w:t>新增强制规范｜网页能力迁入私人 App 必须逐项原生化验收（私人 1.0.5 起）</w:t>
+      </w:r>
+    </w:p>
+    <w:p>
+      <w:pPr>
+        <w:spacing w:after="120" w:line="300" w:lineRule="auto"/>
+      </w:pPr>
+      <w:r>
+        <w:rPr>
+          <w:rFonts w:ascii="等线" w:hAnsi="等线" w:eastAsia="等线"/>
+          <w:sz w:val="21"/>
+        </w:rPr>
+        <w:t>WKWebView 不是 Safari。凡是麦克风、语音识别、键盘、通知角标、文件、长期存储和后台能力，必须建立原生权限、原生桥、失败状态和真机回归；禁止因为网页版可用就推断私人 App 可用。</w:t>
+      </w:r>
+    </w:p>
+    <w:p>
+      <w:pPr>
+        <w:spacing w:after="120" w:line="300" w:lineRule="auto"/>
+      </w:pPr>
+      <w:r>
+        <w:rPr>
+          <w:rFonts w:ascii="等线" w:hAnsi="等线" w:eastAsia="等线"/>
+          <w:sz w:val="21"/>
+        </w:rPr>
+        <w:t>键盘避让不得把原生键盘高度和 visualViewport 已经缩小的高度重复相加。原生端提供键盘遮挡量，网页端先扣除浏览器已经覆盖的可视区域，只补足缺口；通话输入栏和音乐聊天栏必须逐页真机验证。</w:t>
+      </w:r>
+    </w:p>
+    <w:p>
+      <w:pPr>
+        <w:spacing w:after="120" w:line="300" w:lineRule="auto"/>
+      </w:pPr>
+      <w:r>
+        <w:rPr>
+          <w:rFonts w:ascii="等线" w:hAnsi="等线" w:eastAsia="等线"/>
+          <w:sz w:val="21"/>
+        </w:rPr>
+        <w:t>推送 payload 中的固定 badge=1 不是未读计数。私人 App 在没有真实未读账本前必须由通知扩展丢弃该占位角标，并在启动、回到前台和前台收通知时清零，不能让假红点永久存在。</w:t>
+      </w:r>
+    </w:p>
+    <w:p>
+      <w:pPr>
+        <w:spacing w:after="120" w:line="300" w:lineRule="auto"/>
+      </w:pPr>
+      <w:r>
+        <w:rPr>
+          <w:rFonts w:ascii="等线" w:hAnsi="等线" w:eastAsia="等线"/>
+          <w:sz w:val="21"/>
+        </w:rPr>
+        <w:t>设备管理入口属于私人 App 原生能力，只能放在设置页固定位置；禁止作为覆盖所有网页页面的悬浮层，以免遮挡通话、音乐、购物等独立 App。</w:t>
+      </w:r>
+    </w:p>
+    <w:p>
+      <w:pPr>
+        <w:spacing w:after="120" w:line="300" w:lineRule="auto"/>
+      </w:pPr>
+      <w:r>
+        <w:rPr>
+          <w:rFonts w:ascii="等线" w:hAnsi="等线" w:eastAsia="等线"/>
+          <w:sz w:val="21"/>
+        </w:rPr>
+        <w:t>Windows 源码断言只能证明桥接和权限配置存在，不能证明 iOS 录音、转写、键盘位置或角标已真实生效。每次安装候选包都必须在真机重新授权并逐项验收后才能写成完成。</w:t>
       </w:r>
     </w:p>
     <w:sectPr>

</xml_diff>

<commit_message>
fix private speech delivery and Apple safe areas
</commit_message>
<xml_diff>
--- a/docs/maintenance/AI开发项目_Bug修改规范.docx
+++ b/docs/maintenance/AI开发项目_Bug修改规范.docx
@@ -4085,6 +4085,83 @@
           <w:sz w:val="21"/>
         </w:rPr>
         <w:t>Windows 源码断言只能证明桥接和权限配置存在，不能证明 iOS 录音、转写、键盘位置或角标已真实生效。每次安装候选包都必须在真机重新授权并逐项验收后才能写成完成。</w:t>
+      </w:r>
+    </w:p>
+    <w:p>
+      <w:r>
+        <w:br w:type="page"/>
+      </w:r>
+    </w:p>
+    <w:p>
+      <w:pPr>
+        <w:pStyle w:val="Heading1"/>
+      </w:pPr>
+      <w:r>
+        <w:rPr>
+          <w:rFonts w:ascii="等线" w:hAnsi="等线" w:eastAsia="等线"/>
+          <w:sz w:val="32"/>
+        </w:rPr>
+        <w:t>新增强制规范｜原生语音提交、键盘避让与安全区不得只验表象（v882／私人 1.0.6 起）</w:t>
+      </w:r>
+    </w:p>
+    <w:p>
+      <w:pPr>
+        <w:spacing w:after="120" w:line="300" w:lineRule="auto"/>
+      </w:pPr>
+      <w:r>
+        <w:rPr>
+          <w:rFonts w:ascii="等线" w:hAnsi="等线" w:eastAsia="等线"/>
+          <w:sz w:val="21"/>
+        </w:rPr>
+        <w:t>语音识别显示临时字幕不等于消息已经发送。原生桥必须提供可结束的 final 事件，网页必须验证 final 会进入用户消息、持久化记录和角色回复链；测试不得只断言字幕或权限存在。连续识别若系统长期不返回 final，必须以明确的静默窗口提交当前完整转写，并防止同一句重复提交。</w:t>
+      </w:r>
+    </w:p>
+    <w:p>
+      <w:pPr>
+        <w:spacing w:after="120" w:line="300" w:lineRule="auto"/>
+      </w:pPr>
+      <w:r>
+        <w:rPr>
+          <w:rFonts w:ascii="等线" w:hAnsi="等线" w:eastAsia="等线"/>
+          <w:sz w:val="21"/>
+        </w:rPr>
+        <w:t>WKWebView 的键盘避让只允许一个权威来源。禁止同时叠加原生键盘 frame、visualViewport 差值、强制 window.scrollTo 和 CSS fixed 位移；出现输入框过高或消失时，先撤掉重复补偿并恢复 iOS/WKWebView 自带避让，再做逐页真机验证。</w:t>
+      </w:r>
+    </w:p>
+    <w:p>
+      <w:pPr>
+        <w:spacing w:after="120" w:line="300" w:lineRule="auto"/>
+      </w:pPr>
+      <w:r>
+        <w:rPr>
+          <w:rFonts w:ascii="等线" w:hAnsi="等线" w:eastAsia="等线"/>
+          <w:sz w:val="21"/>
+        </w:rPr>
+        <w:t>Apple 主屏幕安全区测试必须验证计算结果有非零兜底，不能只检查选择器里出现 safe-area-inset。已安装网页可能返回 0；顶部返回键、独立 App 顶栏和底部输入区必须分别有页面级类、明确 fallback 和回归断言。</w:t>
+      </w:r>
+    </w:p>
+    <w:p>
+      <w:pPr>
+        <w:spacing w:after="120" w:line="300" w:lineRule="auto"/>
+      </w:pPr>
+      <w:r>
+        <w:rPr>
+          <w:rFonts w:ascii="等线" w:hAnsi="等线" w:eastAsia="等线"/>
+          <w:sz w:val="21"/>
+        </w:rPr>
+        <w:t>全屏外壳只能维护一套高度模型。已经验证稳定的 100% shell 不得被可选适配开关改写为 100dvh，否则容易同时产生上方挤压和底部黑块。适配开关只能增加安全区内边距，不能替换根视口高度。</w:t>
+      </w:r>
+    </w:p>
+    <w:p>
+      <w:pPr>
+        <w:spacing w:after="120" w:line="300" w:lineRule="auto"/>
+      </w:pPr>
+      <w:r>
+        <w:rPr>
+          <w:rFonts w:ascii="等线" w:hAnsi="等线" w:eastAsia="等线"/>
+          <w:sz w:val="21"/>
+        </w:rPr>
+        <w:t>每个安装候选必须同时记录共享网页版本和私人原生版本。Windows 测试通过只能证明静态链路与网页回归，Mac 编译、权限弹窗、键盘、语音入库和真机安全区仍须单独验收。</w:t>
       </w:r>
     </w:p>
     <w:sectPr>

</xml_diff>

<commit_message>
fix: keep private speech recognition continuous
</commit_message>
<xml_diff>
--- a/docs/maintenance/AI开发项目_Bug修改规范.docx
+++ b/docs/maintenance/AI开发项目_Bug修改规范.docx
@@ -4162,6 +4162,71 @@
           <w:sz w:val="21"/>
         </w:rPr>
         <w:t>每个安装候选必须同时记录共享网页版本和私人原生版本。Windows 测试通过只能证明静态链路与网页回归，Mac 编译、权限弹窗、键盘、语音入库和真机安全区仍须单独验收。</w:t>
+      </w:r>
+    </w:p>
+    <w:p>
+      <w:r>
+        <w:br w:type="page"/>
+      </w:r>
+    </w:p>
+    <w:p>
+      <w:pPr>
+        <w:pStyle w:val="Heading1"/>
+      </w:pPr>
+      <w:r>
+        <w:rPr>
+          <w:rFonts w:ascii="等线" w:hAnsi="等线" w:eastAsia="等线"/>
+          <w:sz w:val="32"/>
+        </w:rPr>
+        <w:t>新增强制规范｜连续原生语音必须由原生层管理任务生命周期（v883／私人 1.0.7 起）</w:t>
+      </w:r>
+    </w:p>
+    <w:p>
+      <w:pPr>
+        <w:spacing w:after="120" w:line="300" w:lineRule="auto"/>
+      </w:pPr>
+      <w:r>
+        <w:rPr>
+          <w:rFonts w:ascii="等线" w:hAnsi="等线" w:eastAsia="等线"/>
+          <w:sz w:val="21"/>
+        </w:rPr>
+        <w:t>SFSpeechRecognizer 显示并提交第一句，不等于连续语音已经可用。真机必须连续说至少三句，并确认每句都进入通话记录和角色上下文；退出后台再回来只能作为故障证据，不能作为恢复方案。</w:t>
+      </w:r>
+    </w:p>
+    <w:p>
+      <w:pPr>
+        <w:spacing w:after="120" w:line="300" w:lineRule="auto"/>
+      </w:pPr>
+      <w:r>
+        <w:rPr>
+          <w:rFonts w:ascii="等线" w:hAnsi="等线" w:eastAsia="等线"/>
+          <w:sz w:val="21"/>
+        </w:rPr>
+        <w:t>普通一句话结束时，原生层不得结束整个 JS 会话并依赖网页重新 start。必须在原生层清理旧 recognitionTask、移除 input tap、endAudio、audioEngine.reset、停用再激活 AVAudioSession，然后创建下一代任务；旧代回调必须用 generation 标记丢弃。只有用户明确关闭话筒或真正的终止错误才发送 end。</w:t>
+      </w:r>
+    </w:p>
+    <w:p>
+      <w:pPr>
+        <w:spacing w:after="120" w:line="300" w:lineRule="auto"/>
+      </w:pPr>
+      <w:r>
+        <w:rPr>
+          <w:rFonts w:ascii="等线" w:hAnsi="等线" w:eastAsia="等线"/>
+          <w:sz w:val="21"/>
+        </w:rPr>
+        <w:t>WKWebView 键盘弹出后已经缩小可见区域。原生专用输入框只能贴新的可见底边，禁止保留网页时代的固定 150px 底距，也禁止重新引入 keyboard frame 与 visualViewport 双重补偿。缩小通话卡必须显式 bottom:auto 和最大高度，不能只写 inset:auto 后假设所有 WebKit 版本都会清掉旧边。</w:t>
+      </w:r>
+    </w:p>
+    <w:p>
+      <w:pPr>
+        <w:spacing w:after="120" w:line="300" w:lineRule="auto"/>
+      </w:pPr>
+      <w:r>
+        <w:rPr>
+          <w:rFonts w:ascii="等线" w:hAnsi="等线" w:eastAsia="等线"/>
+          <w:sz w:val="21"/>
+        </w:rPr>
+        <w:t>页面安全区断言必须命中最终运行时 DOM。若后加载的 presentation layer 覆盖 renderShop、renderFood 或 renderDouyin，测试和 CSS 必须检查最终 commerce-top、dy-topbar、dynav 等选择器；只验证 app.js 中已被覆盖的占位类属于误检。底部 fallback 不得强制制造 34px 黑块，优先使用系统真实 env 值。</w:t>
       </w:r>
     </w:p>
     <w:sectPr>

</xml_diff>

<commit_message>
fix: rebuild native call audio handoff
</commit_message>
<xml_diff>
--- a/docs/maintenance/AI开发项目_Bug修改规范.docx
+++ b/docs/maintenance/AI开发项目_Bug修改规范.docx
@@ -4227,6 +4227,71 @@
           <w:sz w:val="21"/>
         </w:rPr>
         <w:t>页面安全区断言必须命中最终运行时 DOM。若后加载的 presentation layer 覆盖 renderShop、renderFood 或 renderDouyin，测试和 CSS 必须检查最终 commerce-top、dy-topbar、dynav 等选择器；只验证 app.js 中已被覆盖的占位类属于误检。底部 fallback 不得强制制造 34px 黑块，优先使用系统真实 env 值。</w:t>
+      </w:r>
+    </w:p>
+    <w:p>
+      <w:r>
+        <w:br w:type="page"/>
+      </w:r>
+    </w:p>
+    <w:p>
+      <w:pPr>
+        <w:pStyle w:val="Heading1"/>
+      </w:pPr>
+      <w:r>
+        <w:rPr>
+          <w:rFonts w:ascii="等线" w:hAnsi="等线" w:eastAsia="等线"/>
+          <w:sz w:val="32"/>
+        </w:rPr>
+        <w:t>新增强制规范｜播放与录音必须显式交接音频会话（v884／私人 1.0.8 起）</w:t>
+      </w:r>
+    </w:p>
+    <w:p>
+      <w:pPr>
+        <w:spacing w:after="120" w:line="300" w:lineRule="auto"/>
+      </w:pPr>
+      <w:r>
+        <w:rPr>
+          <w:rFonts w:ascii="等线" w:hAnsi="等线" w:eastAsia="等线"/>
+          <w:sz w:val="21"/>
+        </w:rPr>
+        <w:t>原生连续语音不能只在每句结束后轮换 recognitionTask。只要角色语音播放与用户录音共用 AVAudioSession，就必须建立明确的播放/录音状态机：角色播放前 pause 并释放录音会话，全部播放结束后 resume；网页层不得仅凭 active 标志猜测原生麦克风仍可用。</w:t>
+      </w:r>
+    </w:p>
+    <w:p>
+      <w:pPr>
+        <w:spacing w:after="120" w:line="300" w:lineRule="auto"/>
+      </w:pPr>
+      <w:r>
+        <w:rPr>
+          <w:rFonts w:ascii="等线" w:hAnsi="等线" w:eastAsia="等线"/>
+          <w:sz w:val="21"/>
+        </w:rPr>
+        <w:t>iOS 出现“黄色录音点还在但只有退后台才恢复”时，必须把后台恢复视为音频引擎被系统重建的证据。下一版应真正新建 AVAudioEngine，不得继续把同一个 engine.reset 当成等价替代。恢复失败必须保留 paused 状态并有限重试，不能让 JS active 与原生实际状态分叉。</w:t>
+      </w:r>
+    </w:p>
+    <w:p>
+      <w:pPr>
+        <w:spacing w:after="120" w:line="300" w:lineRule="auto"/>
+      </w:pPr>
+      <w:r>
+        <w:rPr>
+          <w:rFonts w:ascii="等线" w:hAnsi="等线" w:eastAsia="等线"/>
+          <w:sz w:val="21"/>
+        </w:rPr>
+        <w:t>WKWebView 键盘适配禁止用 focus 前后切换两个绝对 bottom 值。输入条必须从未聚焦到聚焦始终锚定同一可见底边，相关按钮在同一坐标系中重新排布；出现一次上下弹跳即判定失败。</w:t>
+      </w:r>
+    </w:p>
+    <w:p>
+      <w:pPr>
+        <w:spacing w:after="120" w:line="300" w:lineRule="auto"/>
+      </w:pPr>
+      <w:r>
+        <w:rPr>
+          <w:rFonts w:ascii="等线" w:hAnsi="等线" w:eastAsia="等线"/>
+          <w:sz w:val="21"/>
+        </w:rPr>
+        <w:t>带 !important 的页面级顶栏必须用同等或更高优先级补入安全区。共同生活微信顶栏与迷你通话属于独立验收对象：分别检查返回键、标题、状态胶囊、头像和卡片高度，不能用通用 nav/callscreen 断言推断覆盖。</w:t>
       </w:r>
     </w:p>
     <w:sectPr>

</xml_diff>

<commit_message>
fix: stabilize native call input and speech
</commit_message>
<xml_diff>
--- a/docs/maintenance/AI开发项目_Bug修改规范.docx
+++ b/docs/maintenance/AI开发项目_Bug修改规范.docx
@@ -4292,6 +4292,34 @@
           <w:sz w:val="21"/>
         </w:rPr>
         <w:t>带 !important 的页面级顶栏必须用同等或更高优先级补入安全区。共同生活微信顶栏与迷你通话属于独立验收对象：分别检查返回键、标题、状态胶囊、头像和卡片高度，不能用通用 nav/callscreen 断言推断覆盖。</w:t>
+      </w:r>
+    </w:p>
+    <w:p>
+      <w:pPr>
+        <w:pStyle w:val="Heading1"/>
+      </w:pPr>
+      <w:r>
+        <w:t>新增强制规范｜原生键盘滚动与播放后录音必须在原生层重建（v885／私人 1.0.9 起）</w:t>
+      </w:r>
+    </w:p>
+    <w:p>
+      <w:r>
+        <w:t>私人 WKWebView 的电话输入框必须采用明确的收起、编辑、发送三态交互：默认只显示话筒和“打字说…”，打开后显示真实输入框、发送和收起按钮；发送后先收起键盘再提交消息。不得再让 focus 前后切换两组 CSS bottom，也不得用 window.scrollTo 掩盖页面跳动。</w:t>
+      </w:r>
+    </w:p>
+    <w:p>
+      <w:r>
+        <w:t>键盘弹出导致整页上下跳时，根因应按 WKWebView 外层 UIScrollView 自动滚动处理。只在电话输入框聚焦期间由原生层观察并锁定外层 contentOffset，失焦立即解除；网页/PWA 不得套用该原生规则。</w:t>
+      </w:r>
+    </w:p>
+    <w:p>
+      <w:r>
+        <w:t>角色语音播放后的连续录音必须假设 WebKit 播放完成回调早于 AVAudioSession 路由完全释放。恢复流程必须先等待短暂稳定窗口，再无条件清理旧 recognitionTask、request、input tap 和 audio session，建立新的 AVAudioEngine 与识别任务；即使 pause 调用失败，也不得跳过重建。</w:t>
+      </w:r>
+    </w:p>
+    <w:p>
+      <w:r>
+        <w:t>自动化测试只能验证桥契约、状态机和回归选择器。最终验收必须在真实 iPhone 不退后台连续完成至少三轮“用户说一句—角色语音回复—用户再说一句”，并同时确认字幕、后台通话记录和角色上下文均收到每句话。</w:t>
       </w:r>
     </w:p>
     <w:sectPr>

</xml_diff>

<commit_message>
fix: reuse web keyboard flow in private calls
</commit_message>
<xml_diff>
--- a/docs/maintenance/AI开发项目_Bug修改规范.docx
+++ b/docs/maintenance/AI开发项目_Bug修改规范.docx
@@ -4320,6 +4320,51 @@
     <w:p>
       <w:r>
         <w:t>自动化测试只能验证桥契约、状态机和回归选择器。最终验收必须在真实 iPhone 不退后台连续完成至少三轮“用户说一句—角色语音回复—用户再说一句”，并同时确认字幕、后台通话记录和角色上下文均收到每句话。</w:t>
+      </w:r>
+    </w:p>
+    <w:p>
+      <w:r>
+        <w:br w:type="page"/>
+      </w:r>
+    </w:p>
+    <w:p>
+      <w:pPr>
+        <w:pStyle w:val="Heading1"/>
+      </w:pPr>
+      <w:r>
+        <w:t>v886 私人 App 通话键盘修复强制规范（2026-08-11）</w:t>
+      </w:r>
+    </w:p>
+    <w:p>
+      <w:pPr>
+        <w:pStyle w:val="ListBullet"/>
+      </w:pPr>
+      <w:r>
+        <w:t>已确认根因：v885 同时让 WKWebView／系统键盘移动页面，又在原生层固定电话输入框、监听 contentOffset 并强制回写滚动位置，形成两套布局权威，导致输入框打开或收起时上下闪跳。</w:t>
+      </w:r>
+    </w:p>
+    <w:p>
+      <w:pPr>
+        <w:pStyle w:val="ListBullet"/>
+      </w:pPr>
+      <w:r>
+        <w:t>强制处理：私人 App 电话页必须直接复用已在网页版真机验证正常的 callinput 与 callbtns 结构、位置和系统键盘位移；不得为 north-native-app 单独覆盖这两个组件，不得用 KVO 锁定或回写 WKWebView 外层滚动位置，也不得维护另一套原生两态输入框。</w:t>
+      </w:r>
+    </w:p>
+    <w:p>
+      <w:pPr>
+        <w:pStyle w:val="ListBullet"/>
+      </w:pPr>
+      <w:r>
+        <w:t>不可回退：v885 已验证有效的原生语音完整重建必须保留。角色音频结束后要等待音频路由释放，再重建 AVAudioEngine、识别请求与任务；不得退回仅调用 resume 或只相信 JS active 状态。</w:t>
+      </w:r>
+    </w:p>
+    <w:p>
+      <w:pPr>
+        <w:pStyle w:val="ListBullet"/>
+      </w:pPr>
+      <w:r>
+        <w:t>验收：自动化 447/447 只是回归门槛。真机必须连续多次完成打开键盘、发送、收起，确认整个页面像网页版一样平滑移动、挂断按钮固定在输入框下方；并连续完成至少三轮“用户说—角色说—用户再说”。</w:t>
       </w:r>
     </w:p>
     <w:sectPr>

</xml_diff>

<commit_message>
fix: keep private webview fixed across keyboard changes
</commit_message>
<xml_diff>
--- a/docs/maintenance/AI开发项目_Bug修改规范.docx
+++ b/docs/maintenance/AI开发项目_Bug修改规范.docx
@@ -4365,6 +4365,51 @@
       </w:pPr>
       <w:r>
         <w:t>验收：自动化 447/447 只是回归门槛。真机必须连续多次完成打开键盘、发送、收起，确认整个页面像网页版一样平滑移动、挂断按钮固定在输入框下方；并连续完成至少三轮“用户说—角色说—用户再说”。</w:t>
+      </w:r>
+    </w:p>
+    <w:p>
+      <w:r>
+        <w:br w:type="page"/>
+      </w:r>
+    </w:p>
+    <w:p>
+      <w:pPr>
+        <w:pStyle w:val="Heading1"/>
+      </w:pPr>
+      <w:r>
+        <w:t>私人 1.0.11 键盘外框固定规范（2026-08-11）</w:t>
+      </w:r>
+    </w:p>
+    <w:p>
+      <w:pPr>
+        <w:pStyle w:val="ListBullet"/>
+      </w:pPr>
+      <w:r>
+        <w:t>v886／私人 1.0.10 的真机结果否定了“只删除网页滚动锁即可解决”的判断：输入框聚焦仍会先下拉再上弹。</w:t>
+      </w:r>
+    </w:p>
+    <w:p>
+      <w:pPr>
+        <w:pStyle w:val="ListBullet"/>
+      </w:pPr>
+      <w:r>
+        <w:t>新根因是 SwiftUI 根视图只忽略 container 安全区，却仍响应 keyboard 安全区；键盘出现时先缩小整个 WKWebView 外框，WebKit 随后又处理聚焦输入框，造成双重动画。</w:t>
+      </w:r>
+    </w:p>
+    <w:p>
+      <w:pPr>
+        <w:pStyle w:val="ListBullet"/>
+      </w:pPr>
+      <w:r>
+        <w:t>强制修正是在 SmallPhonePrivateRootView 对底部增加 ignoresSafeArea(.keyboard)，固定 WKWebView 外框。不得再优先修改网页版 bottom、恢复 contentOffset KVO 或改动已经正常的原生语音重建。</w:t>
+      </w:r>
+    </w:p>
+    <w:p>
+      <w:pPr>
+        <w:pStyle w:val="ListBullet"/>
+      </w:pPr>
+      <w:r>
+        <w:t>真机验收必须连续多次打开与收起键盘，确认背景页面不再先下拉后上弹；自动化通过不能替代真机结论。</w:t>
       </w:r>
     </w:p>
     <w:sectPr>

</xml_diff>

<commit_message>
feat: add private phone password cloud login
</commit_message>
<xml_diff>
--- a/docs/maintenance/AI开发项目_Bug修改规范.docx
+++ b/docs/maintenance/AI开发项目_Bug修改规范.docx
@@ -4410,6 +4410,71 @@
       </w:pPr>
       <w:r>
         <w:t>真机验收必须连续多次打开与收起键盘，确认背景页面不再先下拉后上弹；自动化通过不能替代真机结论。</w:t>
+      </w:r>
+    </w:p>
+    <w:p>
+      <w:r>
+        <w:br w:type="page"/>
+      </w:r>
+    </w:p>
+    <w:p>
+      <w:pPr>
+        <w:pStyle w:val="Heading1"/>
+      </w:pPr>
+      <w:r>
+        <w:rPr>
+          <w:rFonts w:ascii="等线" w:hAnsi="等线" w:eastAsia="等线"/>
+          <w:sz w:val="32"/>
+        </w:rPr>
+        <w:t>新增强制规范｜私人手机号账号不得强依赖境外短信（v888／私人 1.0.13 起）</w:t>
+      </w:r>
+    </w:p>
+    <w:p>
+      <w:pPr>
+        <w:spacing w:after="120" w:line="300" w:lineRule="auto"/>
+      </w:pPr>
+      <w:r>
+        <w:rPr>
+          <w:rFonts w:ascii="等线" w:hAnsi="等线" w:eastAsia="等线"/>
+          <w:sz w:val="21"/>
+        </w:rPr>
+        <w:t>中国大陆私人单用户 App 在没有已验证短信供应商、发送资质和真机到达率证据时，不得把 Supabase Phone OTP 当成可交付登录方案。手机号仍可作为用户可见账号，但底层认证方式应选择实际可用且可恢复的路径。</w:t>
+      </w:r>
+    </w:p>
+    <w:p>
+      <w:pPr>
+        <w:spacing w:after="120" w:line="300" w:lineRule="auto"/>
+      </w:pPr>
+      <w:r>
+        <w:rPr>
+          <w:rFonts w:ascii="等线" w:hAnsi="等线" w:eastAsia="等线"/>
+          <w:sz w:val="21"/>
+        </w:rPr>
+        <w:t>本项目固定使用“手机号 + 密码”：原生桥把规范化的 +86 号码确定性映射为仅供 Supabase Auth 使用的内部邮箱，界面、公开 North 和网页版不显示该邮箱，也不持有私人登录态。Phone Provider、Twilio 和公共自助注册保持关闭。</w:t>
+      </w:r>
+    </w:p>
+    <w:p>
+      <w:pPr>
+        <w:spacing w:after="120" w:line="300" w:lineRule="auto"/>
+      </w:pPr>
+      <w:r>
+        <w:rPr>
+          <w:rFonts w:ascii="等线" w:hAnsi="等线" w:eastAsia="等线"/>
+          <w:sz w:val="21"/>
+        </w:rPr>
+        <w:t>密码只能存在于当前登录请求内，不得写入网页状态、日志、UserDefaults、本地文件或 Keychain；Keychain 只保存访问令牌、刷新令牌、到期时间、用户 ID 和遮罩手机号。云数据继续按 auth.uid() 开启 RLS。</w:t>
+      </w:r>
+    </w:p>
+    <w:p>
+      <w:pPr>
+        <w:spacing w:after="120" w:line="300" w:lineRule="auto"/>
+      </w:pPr>
+      <w:r>
+        <w:rPr>
+          <w:rFonts w:ascii="等线" w:hAnsi="等线" w:eastAsia="等线"/>
+          <w:sz w:val="21"/>
+        </w:rPr>
+        <w:t>账号回归必须断言：不存在 /auth/v1/otp、account.otp.send、account.otp.verify；密码 grant 使用确定性内部邮箱；旧采集时间不能覆盖新备份；首次登录在云端已有数据时必须由用户明确选择保留本机或恢复云端。</w:t>
       </w:r>
     </w:p>
     <w:sectPr>

</xml_diff>

<commit_message>
feat: add resilient native storage for private app
</commit_message>
<xml_diff>
--- a/docs/maintenance/AI开发项目_Bug修改规范.docx
+++ b/docs/maintenance/AI开发项目_Bug修改规范.docx
@@ -4475,6 +4475,40 @@
           <w:sz w:val="21"/>
         </w:rPr>
         <w:t>账号回归必须断言：不存在 /auth/v1/otp、account.otp.send、account.otp.verify；密码 grant 使用确定性内部邮箱；旧采集时间不能覆盖新备份；首次登录在云端已有数据时必须由用户明确选择保留本机或恢复云端。</w:t>
+      </w:r>
+    </w:p>
+    <w:p/>
+    <w:p>
+      <w:pPr>
+        <w:pStyle w:val="Heading1"/>
+      </w:pPr>
+      <w:r>
+        <w:t>新增强制规范｜私人 App 原生核心存档（v889／私人 1.0.14 起）</w:t>
+      </w:r>
+    </w:p>
+    <w:p>
+      <w:r>
+        <w:t>私人小手机运行在原生 App 时，核心状态无论大小都必须写入 Application Support，不能等超过浏览器 3.5 MB 阈值才迁移，也不能把 localStorage 或 WKWebView 网站配额描述成 App 的真实容量。网页与安卓仍保持现有浏览器存储路径。</w:t>
+      </w:r>
+    </w:p>
+    <w:p>
+      <w:r>
+        <w:t>每个核心存档必须先验证版本、采集时间和可解析的完整状态，再使用原子写入。写新主文件前保存上一份有效主文件作为独立保护副本；主文件缺失或损坏时自动读取保护副本并修复主文件。删除存档时主文件与保护副本必须一起删除。</w:t>
+      </w:r>
+    </w:p>
+    <w:p>
+      <w:r>
+        <w:t>所有写入必须比较 savedAt：旧采集时间不得覆盖新存档。容量页面必须读取 iOS 对本 App 当前可安全使用的剩余设备容量，并分别显示原生主存档、原生保护副本、恢复存档和恢复保护副本。</w:t>
+      </w:r>
+    </w:p>
+    <w:p>
+      <w:r>
+        <w:t>本阶段只把设置、角色、聊天、记忆、总结、锁定意图及业务索引等核心状态固定为原生双副本。音乐、视频、图片等大媒体仍在 App 私有 WebKit 数据库；后续迁移媒体时必须逐类迁移、校验和回滚，禁止一次性替换造成旧数据丢失。</w:t>
+      </w:r>
+    </w:p>
+    <w:p>
+      <w:r>
+        <w:t>原生存储改动不得顺带调整已稳定的电话话筒、键盘固定、网页安全区、永久锁定、共同生活和公开 North。验收必须同时覆盖小数据首次迁移、大数据保存、旧写入拦截、损坏回退、真实容量显示及网页兼容。</w:t>
       </w:r>
     </w:p>
     <w:sectPr>

</xml_diff>

<commit_message>
fix: restore real inspections and proactive phone behavior
</commit_message>
<xml_diff>
--- a/docs/maintenance/AI开发项目_Bug修改规范.docx
+++ b/docs/maintenance/AI开发项目_Bug修改规范.docx
@@ -4593,6 +4593,256 @@
       </w:pPr>
       <w:r>
         <w:t>回归时必须同时检查：单项查看、全部查看、顶部进度、外置新快照版本推进、拒绝旧缓存、定位桥接、Family Controls 只请求一次、前后台恢复，以及既有共同生活/模型/旁白/键盘/话筒/安全区功能。</w:t>
+      </w:r>
+    </w:p>
+    <w:p>
+      <w:r>
+        <w:br w:type="page"/>
+      </w:r>
+    </w:p>
+    <w:p>
+      <w:pPr>
+        <w:pStyle w:val="Heading1"/>
+      </w:pPr>
+      <w:r>
+        <w:t>2026-08-11 v892／私人 1.0.17</w:t>
+      </w:r>
+    </w:p>
+    <w:p>
+      <w:pPr>
+        <w:pStyle w:val="Heading2"/>
+      </w:pPr>
+      <w:r>
+        <w:t>新增强制修改规范</w:t>
+      </w:r>
+    </w:p>
+    <w:p>
+      <w:pPr>
+        <w:pStyle w:val="ListBullet"/>
+      </w:pPr>
+      <w:r>
+        <w:t>同一 App 内已有本机原生能力时，必须优先接本机桥，不得为了复用旧云链路再次制造“内置/外置”双模式。云端只作远程设备与后台任务链路。</w:t>
+      </w:r>
+    </w:p>
+    <w:p>
+      <w:pPr>
+        <w:pStyle w:val="ListBullet"/>
+      </w:pPr>
+      <w:r>
+        <w:t>任何设备控制都必须区分 queued、sent、received、executed、failed；没有 executed 真回执不得写成功。锁定账本的安全优先级不得被刷新、旧快照、跨日或网络失败降低。</w:t>
+      </w:r>
+    </w:p>
+    <w:p>
+      <w:pPr>
+        <w:pStyle w:val="ListBullet"/>
+      </w:pPr>
+      <w:r>
+        <w:t>主动联系只有一套最终调度。会话后随机 30–60 分钟静默、固定联系间隔、每日上限是三个独立约束：间隔为 0 时不启用固定间隔；正数时禁用随机条数计时器，只保留每日上限。</w:t>
+      </w:r>
+    </w:p>
+    <w:p>
+      <w:pPr>
+        <w:pStyle w:val="ListBullet"/>
+      </w:pPr>
+      <w:r>
+        <w:t>主动内容生成前必须判断正在聊天/通话/线下场景和忙碌/睡眠语境。睡眠安静期是硬禁止；忙碌只能自然询问进展或分享日常；消息和电话均不得回答或复述上一条用户消息。</w:t>
+      </w:r>
+    </w:p>
+    <w:p>
+      <w:pPr>
+        <w:pStyle w:val="ListBullet"/>
+      </w:pPr>
+      <w:r>
+        <w:t>后台消息必须逐条发送并带声音；头像使用通信通知扩展实现。不得承诺替换 iOS 顶层 App 图标，也不得用普通 APNs 假装 CallKit/VoIP 持续来电。</w:t>
+      </w:r>
+    </w:p>
+    <w:p>
+      <w:pPr>
+        <w:pStyle w:val="ListBullet"/>
+      </w:pPr>
+      <w:r>
+        <w:t>每次改私人 iOS 候选版，必须同步网页版本、Service Worker 缓存、所有入口 cache 参数、桥契约、Xcode marketing/build version、唯一 PhoneWeb.bundle、测试和四份维护文档。</w:t>
+      </w:r>
+    </w:p>
+    <w:p>
+      <w:pPr>
+        <w:pStyle w:val="ListBullet"/>
+      </w:pPr>
+      <w:r>
+        <w:t>完成声明必须以 Mac 编译和真机测试为界。Windows 的 458/458 只证明静态契约与网页回归，不得改写为真机已通过。</w:t>
+      </w:r>
+    </w:p>
+    <w:p>
+      <w:r>
+        <w:br w:type="page"/>
+      </w:r>
+    </w:p>
+    <w:p>
+      <w:pPr>
+        <w:pStyle w:val="Heading1"/>
+      </w:pPr>
+      <w:r>
+        <w:t>2026-08-11 v893／私人 1.0.18</w:t>
+      </w:r>
+    </w:p>
+    <w:p>
+      <w:pPr>
+        <w:pStyle w:val="Heading2"/>
+      </w:pPr>
+      <w:r>
+        <w:t>新增真实读取与后台开关强制规范</w:t>
+      </w:r>
+    </w:p>
+    <w:p>
+      <w:pPr>
+        <w:pStyle w:val="ListBullet"/>
+      </w:pPr>
+      <w:r>
+        <w:t>角色查看真实 iPhone 时必须建立独立 readSessionId，只允许消费本次快照。展示限额、旧缓存、虚拟位置或其他数据源会造成模型误读，必须在进入模型前隔离，而不是只靠提示词。</w:t>
+      </w:r>
+    </w:p>
+    <w:p>
+      <w:pPr>
+        <w:pStyle w:val="ListBullet"/>
+      </w:pPr>
+      <w:r>
+        <w:t>真实读取必须有有界超时并显示当前字段。不得让反向地理编码、HealthKit 或原生桥 Promise 无限挂起；部分权限失败时，一键读取应返回其余真实项目并明确列出不可用项。</w:t>
+      </w:r>
+    </w:p>
+    <w:p>
+      <w:pPr>
+        <w:pStyle w:val="ListBullet"/>
+      </w:pPr>
+      <w:r>
+        <w:t>对可核验数字必须在生成后做一致性校验。模型回答中出现原始事实没有的数字或把限额当用量时，直接替换为确定性真实摘要。</w:t>
+      </w:r>
+    </w:p>
+    <w:p>
+      <w:pPr>
+        <w:pStyle w:val="ListBullet"/>
+      </w:pPr>
+      <w:r>
+        <w:t>解锁提醒不得由普通 locked→unlocked 快照差异推断。只有原生管理操作或 owner-command 的 executed 回执可生成 explicit manualUnlock；角色命令、旧快照和系统不明变化必须排除。</w:t>
+      </w:r>
+    </w:p>
+    <w:p>
+      <w:pPr>
+        <w:pStyle w:val="ListBullet"/>
+      </w:pPr>
+      <w:r>
+        <w:t>界面开关必须有端到端状态。后台主动联系至少核验控制器认领、APNs 令牌、角色 profile、cron 和最近推送状态；保存失败应回滚开关并显示原因，不能只点亮 UI。</w:t>
+      </w:r>
+    </w:p>
+    <w:p>
+      <w:pPr>
+        <w:pStyle w:val="ListBullet"/>
+      </w:pPr>
+      <w:r>
+        <w:t>统一 App 自登记后台能力必须使用已认证手机号账号、Keychain 设备密钥和服务端 cloudId 归属校验；不得把 owner/device secret、APNs token 或服务端密钥写入仓库。</w:t>
+      </w:r>
+    </w:p>
+    <w:p>
+      <w:pPr>
+        <w:pStyle w:val="ListBullet"/>
+      </w:pPr>
+      <w:r>
+        <w:t>完成声明继续以 Mac 编译和真机为界。Windows 的 463/463 不能代替 Xcode、HealthKit、Screen Time、通知扩展和强退 APNs 验收。</w:t>
+      </w:r>
+    </w:p>
+    <w:p>
+      <w:pPr>
+        <w:pStyle w:val="ListBullet"/>
+      </w:pPr>
+      <w:r>
+        <w:t>任何独立自动查看开关开启后，不得再被无关的主动消息总开关二次拦截。需要接住当前用户消息的规则（如难过时心率）必须进入该次正常回复，而不是等待另一个主动调度窗口。</w:t>
+      </w:r>
+    </w:p>
+    <w:p>
+      <w:pPr>
+        <w:pStyle w:val="Heading1"/>
+      </w:pPr>
+      <w:r>
+        <w:t>2026-08-11 v893／私人 1.0.18 Xcode 编译修正 1</w:t>
+      </w:r>
+    </w:p>
+    <w:p>
+      <w:pPr>
+        <w:pStyle w:val="ListBullet"/>
+      </w:pPr>
+      <w:r>
+        <w:t>Swift 方法若需要被同一 Target 的其他源文件调用，不得使用 fileprivate；fileprivate 只允许当前文件访问。跨文件内部能力应使用默认 internal，并通过测试同时检查声明端和调用端。</w:t>
+      </w:r>
+    </w:p>
+    <w:p>
+      <w:pPr>
+        <w:pStyle w:val="ListBullet"/>
+      </w:pPr>
+      <w:r>
+        <w:t>收到 Xcode 截图时必须先区分红色编译错误和黄色警告。先最小化修复阻塞项，不得把仅有 Windows 静态测试写成 Xcode 已编译通过。</w:t>
+      </w:r>
+    </w:p>
+    <w:p>
+      <w:pPr>
+        <w:pStyle w:val="Heading1"/>
+      </w:pPr>
+      <w:r>
+        <w:t>2026-08-11 v893／私人 1.0.18 Xcode 编译修正 2</w:t>
+      </w:r>
+    </w:p>
+    <w:p>
+      <w:pPr>
+        <w:pStyle w:val="ListBullet"/>
+      </w:pPr>
+      <w:r>
+        <w:t>同名 Xcode 工程连续覆盖可能保留旧源码路径或形成嵌套目录。若修正后的源码仍报完全相同的旧错误，应交付全新外层目录并要求直接打开其中的 xcodeproj，不得继续盲目覆盖。</w:t>
+      </w:r>
+    </w:p>
+    <w:p>
+      <w:pPr>
+        <w:pStyle w:val="ListBullet"/>
+      </w:pPr>
+      <w:r>
+        <w:t>通知服务扩展使用 Intents 与 UserNotifications 时，工程校验必须确认两个系统 Framework 同时出现在该扩展的 Frameworks build phase；所有 PBX 对象引用、plist 和 entitlements 需在打包前静态校验。</w:t>
+      </w:r>
+    </w:p>
+    <w:p>
+      <w:pPr>
+        <w:pStyle w:val="Heading1"/>
+      </w:pPr>
+      <w:r>
+        <w:t>2026-08-11 v894／私人 1.0.19 真实查看触发、网页横幅与滚动恢复快照</w:t>
+      </w:r>
+    </w:p>
+    <w:p>
+      <w:pPr>
+        <w:pStyle w:val="ListBullet"/>
+      </w:pPr>
+      <w:r>
+        <w:t>同一个关键词可同时属于虚拟网页能力和真实设备能力时，不能只按文本路由；必须要求明确的结构化 intent/来源标记。默认流程不得因‘查岗、手机、概览’等泛词误入外置设备分支。</w:t>
+      </w:r>
+    </w:p>
+    <w:p>
+      <w:pPr>
+        <w:pStyle w:val="ListBullet"/>
+      </w:pPr>
+      <w:r>
+        <w:t>可见进度必须跟真实执行同生同灭。若读取分支提前失败，不能让另一个应执行的本地流程无声消失；测试应同时断言入口门槛、进度 DOM、逐项步骤和最终核心函数调用。</w:t>
+      </w:r>
+    </w:p>
+    <w:p>
+      <w:pPr>
+        <w:pStyle w:val="ListBullet"/>
+      </w:pPr>
+      <w:r>
+        <w:t>安全恢复既要保留较完整旧副本，也要反映当前保存时间。不得用完整度分数永久冻结滚动快照；采用‘当前滚动副本 + 历史完整副本’，候选默认按时间最新优先，只有时间相同时再比较完整度。</w:t>
+      </w:r>
+    </w:p>
+    <w:p>
+      <w:pPr>
+        <w:pStyle w:val="ListBullet"/>
+      </w:pPr>
+      <w:r>
+        <w:t>恢复写入必须拒绝 savedAt 倒退的乱序任务；页面启动完成后的完整 hydration 必须重新排队当前快照，确保版本更新后旧冻结状态能自行修复。</w:t>
       </w:r>
     </w:p>
     <w:sectPr>

</xml_diff>

<commit_message>
fix: restore real reads proactive push and memory wipe
</commit_message>
<xml_diff>
--- a/docs/maintenance/AI开发项目_Bug修改规范.docx
+++ b/docs/maintenance/AI开发项目_Bug修改规范.docx
@@ -4843,6 +4843,54 @@
       </w:pPr>
       <w:r>
         <w:t>恢复写入必须拒绝 savedAt 倒退的乱序任务；页面启动完成后的完整 hydration 必须重新排队当前快照，确保版本更新后旧冻结状态能自行修复。</w:t>
+      </w:r>
+    </w:p>
+    <w:p>
+      <w:pPr>
+        <w:pStyle w:val="Heading1"/>
+      </w:pPr>
+      <w:r>
+        <w:t>2026-08-11 v895／私人 1.0.20 全量读取、后台链路与彻底清空</w:t>
+      </w:r>
+    </w:p>
+    <w:p>
+      <w:pPr>
+        <w:pStyle w:val="ListBullet"/>
+      </w:pPr>
+      <w:r>
+        <w:t>不要把电量、位置、HealthKit、Screen Time 视为同一权限或同一数据源。必须逐类确认框架、授权状态、数据产生条件、地区限制和本次读取凭证。一个类别成功不能推导其他类别已接通。</w:t>
+      </w:r>
+    </w:p>
+    <w:p>
+      <w:pPr>
+        <w:pStyle w:val="ListBullet"/>
+      </w:pPr>
+      <w:r>
+        <w:t>数据库迁移文件存在于仓库不等于远端已应用。遇到 PostgREST schema cache / function not found，必须直接核验远端函数签名、迁移历史、cron 和 Edge Function；重载函数内部应使用完整具名参数，避免默认参数造成歧义。</w:t>
+      </w:r>
+    </w:p>
+    <w:p>
+      <w:pPr>
+        <w:pStyle w:val="ListBullet"/>
+      </w:pPr>
+      <w:r>
+        <w:t>DeviceActivityReport 回传必须携带本次请求编号与生成时间。主 App 不得消费请求前的旧共享快照，也不得在报告未执行时编造零值。地区受限的直接 API 必须有符合官方能力边界的替代路径。</w:t>
+      </w:r>
+    </w:p>
+    <w:p>
+      <w:pPr>
+        <w:pStyle w:val="ListBullet"/>
+      </w:pPr>
+      <w:r>
+        <w:t>彻底清空是跨存储事务：当前对象、大聊天归档、恢复快照、共同生活上下文、服务端记忆和待发送队列必须全部纳入。完成提示必须等待所有承诺范围成功；失败时保留待重试标记并阻止旧上下文再次同步。</w:t>
+      </w:r>
+    </w:p>
+    <w:p>
+      <w:pPr>
+        <w:pStyle w:val="ListBullet"/>
+      </w:pPr>
+      <w:r>
+        <w:t>共享 app.js 中的 App 专属行为必须用原生桥能力硬门槛隔离，不能只依靠文案或调用者约定。网页发布前要用测试证明普通网页路径不会进入 HealthKit、Screen Time、锁定或 APNs 分支。</w:t>
       </w:r>
     </w:p>
     <w:sectPr>

</xml_diff>

<commit_message>
fix: wait for complete native reads and repair push controller
</commit_message>
<xml_diff>
--- a/docs/maintenance/AI开发项目_Bug修改规范.docx
+++ b/docs/maintenance/AI开发项目_Bug修改规范.docx
@@ -4891,6 +4891,46 @@
       </w:pPr>
       <w:r>
         <w:t>共享 app.js 中的 App 专属行为必须用原生桥能力硬门槛隔离，不能只依靠文案或调用者约定。网页发布前要用测试证明普通网页路径不会进入 HealthKit、Screen Time、锁定或 APNs 分支。</w:t>
+      </w:r>
+    </w:p>
+    <w:p>
+      <w:pPr>
+        <w:pStyle w:val="Heading1"/>
+      </w:pPr>
+      <w:r>
+        <w:t>2026-08-12 v896／私人 1.0.21 全量读取完成回执与后台表结构修复</w:t>
+      </w:r>
+    </w:p>
+    <w:p>
+      <w:pPr>
+        <w:pStyle w:val="ListBullet"/>
+      </w:pPr>
+      <w:r>
+        <w:t>用户请求的读取范围必须在调用原生桥之前确定并贯穿同一 readSessionId。不得从角色模型生成的回复反推或缩小范围；模型输出只能在真实读取完成后负责语气，不能决定读取了哪些项目。</w:t>
+      </w:r>
+    </w:p>
+    <w:p>
+      <w:pPr>
+        <w:pStyle w:val="ListBullet"/>
+      </w:pPr>
+      <w:r>
+        <w:t>异步全量读取的成功条件必须是显式完成回执，而不是请求已发出、capturedAt 更新、任一字段有值或进度横幅走完。完成回执只能在每个请求项已有成功／不可用／超时终态后写入，消费者必须核对 requestedFocus、readSessionId、readFinishedAt 和 readComplete。</w:t>
+      </w:r>
+    </w:p>
+    <w:p>
+      <w:pPr>
+        <w:pStyle w:val="ListBullet"/>
+      </w:pPr>
+      <w:r>
+        <w:t>数据库函数存在不等于依赖表结构完整。部署或修复 RPC 时必须按迁移依赖顺序核对：先查 migration history，再查被引用表的真实列，最后执行带认证上下文的函数。不得只因后续函数已创建就把前置迁移视为已完成。</w:t>
+      </w:r>
+    </w:p>
+    <w:p>
+      <w:pPr>
+        <w:pStyle w:val="ListBullet"/>
+      </w:pPr>
+      <w:r>
+        <w:t>全量读取验收应一次触发后检查九类逐项结果；不能要求用户逐个项目反复测试来掩盖调度错误。未产生数据、未授权和超时必须作为各自的真实结果保留，不能把缺失项静默省略。</w:t>
       </w:r>
     </w:p>
     <w:sectPr>

</xml_diff>

<commit_message>
fix: keep native read replies natural and single
</commit_message>
<xml_diff>
--- a/docs/maintenance/AI开发项目_Bug修改规范.docx
+++ b/docs/maintenance/AI开发项目_Bug修改规范.docx
@@ -4931,6 +4931,46 @@
       </w:pPr>
       <w:r>
         <w:t>全量读取验收应一次触发后检查九类逐项结果；不能要求用户逐个项目反复测试来掩盖调度错误。未产生数据、未授权和超时必须作为各自的真实结果保留，不能把缺失项静默省略。</w:t>
+      </w:r>
+    </w:p>
+    <w:p>
+      <w:pPr>
+        <w:pStyle w:val="Heading1"/>
+      </w:pPr>
+      <w:r>
+        <w:t>2026-08-12 v897／私人 1.0.22 读取完成后只自然回复一次</w:t>
+      </w:r>
+    </w:p>
+    <w:p>
+      <w:pPr>
+        <w:pStyle w:val="ListBullet"/>
+      </w:pPr>
+      <w:r>
+        <w:t>任何需要等待外部／原生异步数据的用户请求，都必须在普通模型调用前取得回复权。不得先让模型生成，再依靠删除气泡、覆盖文本或 alreadySaid 参数补救；那会保留费用、上下文污染和重复出口。</w:t>
+      </w:r>
+    </w:p>
+    <w:p>
+      <w:pPr>
+        <w:pStyle w:val="ListBullet"/>
+      </w:pPr>
+      <w:r>
+        <w:t>内部验收报告与角色可见回复必须分层。readOutcomes、权限、超时、缺字段和系统诊断只能用于守卫、日志和开发界面；角色气泡只能接收成功事实和符合人设的自然表达。</w:t>
+      </w:r>
+    </w:p>
+    <w:p>
+      <w:pPr>
+        <w:pStyle w:val="ListBullet"/>
+      </w:pPr>
+      <w:r>
+        <w:t>禁止用硬编码逐项报告覆盖已通过事实校验的自然模型输出。确定性兜底只用于模型编造数值、遗漏已成功类别或泄漏技术提示时，且兜底本身必须是单段自然口吻。</w:t>
+      </w:r>
+    </w:p>
+    <w:p>
+      <w:pPr>
+        <w:pStyle w:val="ListBullet"/>
+      </w:pPr>
+      <w:r>
+        <w:t>同一用户事件只能存在一个异步回复出口。需要用稳定事件键记录 pending，并在成功、失败和异常的 finally 路径中清理；聊天、通话和共同生活都必须遵守。</w:t>
       </w:r>
     </w:p>
     <w:sectPr>

</xml_diff>

<commit_message>
fix: gate all role replies during phone inspection
</commit_message>
<xml_diff>
--- a/docs/maintenance/AI开发项目_Bug修改规范.docx
+++ b/docs/maintenance/AI开发项目_Bug修改规范.docx
@@ -4971,6 +4971,54 @@
       </w:pPr>
       <w:r>
         <w:t>同一用户事件只能存在一个异步回复出口。需要用稳定事件键记录 pending，并在成功、失败和异常的 finally 路径中清理；聊天、通话和共同生活都必须遵守。</w:t>
+      </w:r>
+    </w:p>
+    <w:p>
+      <w:pPr>
+        <w:pStyle w:val="Heading1"/>
+      </w:pPr>
+      <w:r>
+        <w:t>2026-08-12 v898／私人 1.0.23 全渠道读取完成后才回复</w:t>
+      </w:r>
+    </w:p>
+    <w:p>
+      <w:pPr>
+        <w:pStyle w:val="ListBullet"/>
+      </w:pPr>
+      <w:r>
+        <w:t>等待原生异步读取的功能必须使用状态门禁，而不能只依赖提示词或在模型生成后删除文字。排队、执行、完成回复三个阶段需要明确，普通回复只能在无读取任务时运行。</w:t>
+      </w:r>
+    </w:p>
+    <w:p>
+      <w:pPr>
+        <w:pStyle w:val="ListBullet"/>
+      </w:pPr>
+      <w:r>
+        <w:t>任何可能跨越异步边界的可见输出都必须携带生成代次，并在模型返回后和最终发送前复核。只要期间启动过读取，旧代次输出必须永久丢弃，不能在读取释放后补发。</w:t>
+      </w:r>
+    </w:p>
+    <w:p>
+      <w:pPr>
+        <w:pStyle w:val="ListBullet"/>
+      </w:pPr>
+      <w:r>
+        <w:t>后置事实守卫只能作为安全兜底：发现未经本轮读取凭证支持的电量、位置、健康或屏幕数据时，应排队一次真实读取并返回空输出，不得一边读取一边发送剩余句子。</w:t>
+      </w:r>
+    </w:p>
+    <w:p>
+      <w:pPr>
+        <w:pStyle w:val="ListBullet"/>
+      </w:pPr>
+      <w:r>
+        <w:t>读取完成回复必须是唯一例外且显式标记。它只能接收同一 readSessionId 的完成事实，不得包含 readErrors、missing、权限、超时或系统逐项清单。</w:t>
+      </w:r>
+    </w:p>
+    <w:p>
+      <w:pPr>
+        <w:pStyle w:val="ListBullet"/>
+      </w:pPr>
+      <w:r>
+        <w:t>微信聊天、电话、共同生活新增或修改入口时必须共享同一锁与代次，不得复制出各自独立的 pending 逻辑。</w:t>
       </w:r>
     </w:p>
     <w:sectPr>

</xml_diff>

<commit_message>
fix: keep inspection replies model generated
</commit_message>
<xml_diff>
--- a/docs/maintenance/AI开发项目_Bug修改规范.docx
+++ b/docs/maintenance/AI开发项目_Bug修改规范.docx
@@ -5019,6 +5019,46 @@
       </w:pPr>
       <w:r>
         <w:t>微信聊天、电话、共同生活新增或修改入口时必须共享同一锁与代次，不得复制出各自独立的 pending 逻辑。</w:t>
+      </w:r>
+    </w:p>
+    <w:p>
+      <w:pPr>
+        <w:pStyle w:val="Heading1"/>
+      </w:pPr>
+      <w:r>
+        <w:t>2026-08-12 v899／私人 1.0.24：角色自定读取回复与线下错误诊断</w:t>
+      </w:r>
+    </w:p>
+    <w:p>
+      <w:pPr>
+        <w:pStyle w:val="ListBullet"/>
+      </w:pPr>
+      <w:r>
+        <w:t>异步门禁主动取消输出时，外层重试器必须区分“正常接管”与“模型空输出”。应使用任务代次、取消令牌或明确状态，不能仅依据是否新增可见气泡自动重试。</w:t>
+      </w:r>
+    </w:p>
+    <w:p>
+      <w:pPr>
+        <w:pStyle w:val="ListBullet"/>
+      </w:pPr>
+      <w:r>
+        <w:t>角色查看真实数据后的可见回复必须由角色模型生成。程序可提供事实、安全校验和有限重试，但不得用固定清单或固定人格话术替换模型输出。</w:t>
+      </w:r>
+    </w:p>
+    <w:p>
+      <w:pPr>
+        <w:pStyle w:val="ListBullet"/>
+      </w:pPr>
+      <w:r>
+        <w:t>错误提示必须保留可行动的原始类别。余额／配额、鉴权、权限、限流、接口或模型配置、网络超时、连接失败、空内容不得全部压缩成同一句“暂时没有生成”。</w:t>
+      </w:r>
+    </w:p>
+    <w:p>
+      <w:pPr>
+        <w:pStyle w:val="ListBullet"/>
+      </w:pPr>
+      <w:r>
+        <w:t>任何失败提示都不得修改、删除或伪造原对话；未知错误可显示经过净化的接口原因，但不能泄露密钥。</w:t>
       </w:r>
     </w:p>
     <w:sectPr>

</xml_diff>

<commit_message>
fix: prevent TTS models from using chat routes
</commit_message>
<xml_diff>
--- a/docs/maintenance/AI开发项目_Bug修改规范.docx
+++ b/docs/maintenance/AI开发项目_Bug修改规范.docx
@@ -5059,6 +5059,46 @@
       </w:pPr>
       <w:r>
         <w:t>任何失败提示都不得修改、删除或伪造原对话；未知错误可显示经过净化的接口原因，但不能泄露密钥。</w:t>
+      </w:r>
+    </w:p>
+    <w:p>
+      <w:pPr>
+        <w:pStyle w:val="Heading1"/>
+      </w:pPr>
+      <w:r>
+        <w:t>2026-08-12 v900：语音模型防误配</w:t>
+      </w:r>
+    </w:p>
+    <w:p>
+      <w:pPr>
+        <w:pStyle w:val="ListBullet"/>
+      </w:pPr>
+      <w:r>
+        <w:t>模型用途必须在客户端和服务端双层校验。可自由填写模型名的界面不能只检查非空；至少在保存、测试和最终请求前确认该模型适用于当前接口。</w:t>
+      </w:r>
+    </w:p>
+    <w:p>
+      <w:pPr>
+        <w:pStyle w:val="ListBullet"/>
+      </w:pPr>
+      <w:r>
+        <w:t>聊天与 TTS 必须保持类型分离。speech-*、tts-* 或明确带独立 tts 标记的语音合成模型不得进入 /chat/completions；语音模型只能进入 TTS 专用配置和接口。</w:t>
+      </w:r>
+    </w:p>
+    <w:p>
+      <w:pPr>
+        <w:pStyle w:val="ListBullet"/>
+      </w:pPr>
+      <w:r>
+        <w:t>不能因为上游接口接受了错误模型就认定调用正确。中转服务可能兼容路由并计费；客户端必须在联网前阻止已知用途冲突，避免无效费用和 Prompt 被送往错误能力。</w:t>
+      </w:r>
+    </w:p>
+    <w:p>
+      <w:pPr>
+        <w:pStyle w:val="ListBullet"/>
+      </w:pPr>
+      <w:r>
+        <w:t>发现旧存档误配时应阻止启用和调用并给出可行动提示，不得静默删除、替换或猜测用户想用的聊天模型。测试必须同时覆盖新保存、旧路线、主模型、辅助模型和最后请求门。</w:t>
       </w:r>
     </w:p>
     <w:sectPr>

</xml_diff>

<commit_message>
fix: ground video vision replies
</commit_message>
<xml_diff>
--- a/docs/maintenance/AI开发项目_Bug修改规范.docx
+++ b/docs/maintenance/AI开发项目_Bug修改规范.docx
@@ -5099,6 +5099,59 @@
       </w:pPr>
       <w:r>
         <w:t>发现旧存档误配时应阻止启用和调用并给出可行动提示，不得静默删除、替换或猜测用户想用的聊天模型。测试必须同时覆盖新保存、旧路线、主模型、辅助模型和最后请求门。</w:t>
+      </w:r>
+    </w:p>
+    <w:p>
+      <w:r>
+        <w:br w:type="page"/>
+      </w:r>
+    </w:p>
+    <w:p>
+      <w:pPr>
+        <w:pStyle w:val="Heading1"/>
+      </w:pPr>
+      <w:r>
+        <w:rPr>
+          <w:rFonts w:ascii="等线" w:hAnsi="等线" w:eastAsia="等线"/>
+          <w:sz w:val="32"/>
+        </w:rPr>
+        <w:t>新增强制规范｜视频通话画面事件必须与旧对话隔离（v902／私人 1.0.26 起）</w:t>
+      </w:r>
+    </w:p>
+    <w:p>
+      <w:pPr>
+        <w:spacing w:after="120" w:line="300" w:lineRule="auto"/>
+      </w:pPr>
+      <w:r>
+        <w:rPr>
+          <w:rFonts w:ascii="等线" w:hAnsi="等线" w:eastAsia="等线"/>
+          <w:sz w:val="21"/>
+        </w:rPr>
+        <w:t>视频通话取得新摄像头画面后，该帧是独立的新事件。角色生成时不得继续携带旧用户话语作为本轮对话，不得复读或补答上一句话；第一句可听台词必须点明画面描述中的具体人、物、文字、颜色、动作或环境细节。</w:t>
+      </w:r>
+    </w:p>
+    <w:p>
+      <w:pPr>
+        <w:spacing w:after="120" w:line="300" w:lineRule="auto"/>
+      </w:pPr>
+      <w:r>
+        <w:rPr>
+          <w:rFonts w:ascii="等线" w:hAnsi="等线" w:eastAsia="等线"/>
+          <w:sz w:val="21"/>
+        </w:rPr>
+        <w:t>定时自动识别受分钟间隔和单次视频自动次数上限约束；用户口头说“你看一下”“看看这个”等主动要求时，必须重新截取当下画面且不受自动次数上限限制。主动请求若遇到正在识别，应排队执行而不是丢弃。</w:t>
+      </w:r>
+    </w:p>
+    <w:p>
+      <w:pPr>
+        <w:spacing w:after="120" w:line="300" w:lineRule="auto"/>
+      </w:pPr>
+      <w:r>
+        <w:rPr>
+          <w:rFonts w:ascii="等线" w:hAnsi="等线" w:eastAsia="等线"/>
+          <w:sz w:val="21"/>
+        </w:rPr>
+        <w:t>识别过程不得占用通话中央字幕或显示技术系统提示。右下角只允许显示无文字旋转圆圈；成功后消失，失败时短暂显示“失败”。原始画面不得写入聊天或长期存档。</w:t>
       </w:r>
     </w:p>
     <w:sectPr>

</xml_diff>

<commit_message>
fix: restore automatic video vision and require biometrics
</commit_message>
<xml_diff>
--- a/docs/maintenance/AI开发项目_Bug修改规范.docx
+++ b/docs/maintenance/AI开发项目_Bug修改规范.docx
@@ -5152,6 +5152,88 @@
           <w:sz w:val="21"/>
         </w:rPr>
         <w:t>识别过程不得占用通话中央字幕或显示技术系统提示。右下角只允许显示无文字旋转圆圈；成功后消失，失败时短暂显示“失败”。原始画面不得写入聊天或长期存档。</w:t>
+      </w:r>
+    </w:p>
+    <w:p>
+      <w:r>
+        <w:br w:type="page"/>
+      </w:r>
+    </w:p>
+    <w:p>
+      <w:pPr>
+        <w:pStyle w:val="Heading1"/>
+      </w:pPr>
+      <w:r>
+        <w:rPr>
+          <w:rFonts w:ascii="等线" w:hAnsi="等线" w:eastAsia="等线"/>
+          <w:sz w:val="32"/>
+        </w:rPr>
+        <w:t>新增强制规范｜隔离历史不得删除当前 user 事件（v903 起）</w:t>
+      </w:r>
+    </w:p>
+    <w:p>
+      <w:pPr>
+        <w:spacing w:after="120" w:line="300" w:lineRule="auto"/>
+      </w:pPr>
+      <w:r>
+        <w:rPr>
+          <w:rFonts w:ascii="等线" w:hAnsi="等线" w:eastAsia="等线"/>
+          <w:sz w:val="21"/>
+        </w:rPr>
+        <w:t>定时自动识图为防复读而隔离聊天历史时，必须保留一个明确的当前 user 画面事件。不得向兼容聊天接口发送纯 system 请求，也不得以 system 消息作为需要生成回答的最终消息。已经真机验证正常的口头识图链路不得随自动链路一起重构。</w:t>
+      </w:r>
+    </w:p>
+    <w:p>
+      <w:pPr>
+        <w:spacing w:after="120" w:line="300" w:lineRule="auto"/>
+      </w:pPr>
+      <w:r>
+        <w:rPr>
+          <w:rFonts w:ascii="等线" w:hAnsi="等线" w:eastAsia="等线"/>
+          <w:sz w:val="21"/>
+        </w:rPr>
+        <w:t>视觉识别成功与角色回答成功必须分开诊断。视觉接口正常、聊天接口异常时不得误报成识图失败；修复消息封装不得顺手改动普通聊天、相机采集或视觉路由。</w:t>
+      </w:r>
+    </w:p>
+    <w:p>
+      <w:r>
+        <w:br w:type="page"/>
+      </w:r>
+    </w:p>
+    <w:p>
+      <w:pPr>
+        <w:pStyle w:val="Heading1"/>
+      </w:pPr>
+      <w:r>
+        <w:rPr>
+          <w:rFonts w:ascii="等线" w:hAnsi="等线" w:eastAsia="等线"/>
+          <w:sz w:val="32"/>
+        </w:rPr>
+        <w:t>新增强制规范｜设备恢复只允许生物验证（v903 起）</w:t>
+      </w:r>
+    </w:p>
+    <w:p>
+      <w:pPr>
+        <w:spacing w:after="120" w:line="300" w:lineRule="auto"/>
+      </w:pPr>
+      <w:r>
+        <w:rPr>
+          <w:rFonts w:ascii="等线" w:hAnsi="等线" w:eastAsia="等线"/>
+          <w:sz w:val="21"/>
+        </w:rPr>
+        <w:t>设备恢复和跨浏览器授权合并只允许本人扫脸或验证指纹。不得重新增加迁移码、备用恢复码、管理员恢复码或依靠本机保存身份绕过生物验证的入口。</w:t>
+      </w:r>
+    </w:p>
+    <w:p>
+      <w:pPr>
+        <w:spacing w:after="120" w:line="300" w:lineRule="auto"/>
+      </w:pPr>
+      <w:r>
+        <w:rPr>
+          <w:rFonts w:ascii="等线" w:hAnsi="等线" w:eastAsia="等线"/>
+          <w:sz w:val="21"/>
+        </w:rPr>
+        <w:t>停用授权能力必须同时处理 UI、客户端导出和云端动作，不能只隐藏按钮；第一次正常邀请码属于首次授权入口，必须与恢复码区分，不得误删。</w:t>
       </w:r>
     </w:p>
     <w:sectPr>

</xml_diff>

<commit_message>
fix: honor disabled video vision and restore push cards
</commit_message>
<xml_diff>
--- a/docs/maintenance/AI开发项目_Bug修改规范.docx
+++ b/docs/maintenance/AI开发项目_Bug修改规范.docx
@@ -5234,6 +5234,47 @@
           <w:sz w:val="21"/>
         </w:rPr>
         <w:t>停用授权能力必须同时处理 UI、客户端导出和云端动作，不能只隐藏按钮；第一次正常邀请码属于首次授权入口，必须与恢复码区分，不得误删。</w:t>
+      </w:r>
+    </w:p>
+    <w:p>
+      <w:r>
+        <w:br w:type="page"/>
+      </w:r>
+    </w:p>
+    <w:p>
+      <w:pPr>
+        <w:pStyle w:val="Heading1"/>
+      </w:pPr>
+      <w:r>
+        <w:rPr>
+          <w:rFonts w:ascii="等线" w:hAnsi="等线" w:eastAsia="等线"/>
+          <w:sz w:val="32"/>
+        </w:rPr>
+        <w:t>新增强制规范｜关闭定时能力必须撤销存量任务并在执行边界复核（v904 起）</w:t>
+      </w:r>
+    </w:p>
+    <w:p>
+      <w:pPr>
+        <w:spacing w:after="120" w:line="300" w:lineRule="auto"/>
+      </w:pPr>
+      <w:r>
+        <w:rPr>
+          <w:rFonts w:ascii="等线" w:hAnsi="等线" w:eastAsia="等线"/>
+          <w:sz w:val="21"/>
+        </w:rPr>
+        <w:t>任何以 0 表示关闭的定时功能，不得只在创建定时器前判断。设置保存后必须立即撤销或重新布置已存在的任务，定时回调和最终副作用入口还要再次复核当前开关，防止已经排队的旧回调越权执行。手动触发和自动触发必须保留独立语义，关闭自动不得误伤用户主动操作。</w:t>
+      </w:r>
+    </w:p>
+    <w:p>
+      <w:pPr>
+        <w:spacing w:after="120" w:line="300" w:lineRule="auto"/>
+      </w:pPr>
+      <w:r>
+        <w:rPr>
+          <w:rFonts w:ascii="等线" w:hAnsi="等线" w:eastAsia="等线"/>
+          <w:sz w:val="21"/>
+        </w:rPr>
+        <w:t>iOS 通知分组由 threadIdentifier 控制。产品要求每句话独立显示时，不得复用角色级 threadIdentifier；通信通知头像必须在上传前等待本地大容量图片读取，不能在缓存暂未命中时静默上传首字占位图。系统强制的圆形裁剪和 App 来源图标不得承诺可自定义。</w:t>
       </w:r>
     </w:p>
     <w:sectPr>

</xml_diff>

<commit_message>
feat: keep role automations running in background
</commit_message>
<xml_diff>
--- a/docs/maintenance/AI开发项目_Bug修改规范.docx
+++ b/docs/maintenance/AI开发项目_Bug修改规范.docx
@@ -5275,6 +5275,59 @@
           <w:sz w:val="21"/>
         </w:rPr>
         <w:t>iOS 通知分组由 threadIdentifier 控制。产品要求每句话独立显示时，不得复用角色级 threadIdentifier；通信通知头像必须在上传前等待本地大容量图片读取，不能在缓存暂未命中时静默上传首字占位图。系统强制的圆形裁剪和 App 来源图标不得承诺可自定义。</w:t>
+      </w:r>
+    </w:p>
+    <w:p>
+      <w:r>
+        <w:br w:type="page"/>
+      </w:r>
+    </w:p>
+    <w:p>
+      <w:pPr>
+        <w:pStyle w:val="Heading1"/>
+      </w:pPr>
+      <w:r>
+        <w:rPr>
+          <w:rFonts w:ascii="等线" w:hAnsi="等线" w:eastAsia="等线"/>
+          <w:sz w:val="32"/>
+        </w:rPr>
+        <w:t>新增强制规范｜iOS后台长任务必须服务端持久接管（v905起）</w:t>
+      </w:r>
+    </w:p>
+    <w:p>
+      <w:pPr>
+        <w:spacing w:after="120" w:line="300" w:lineRule="auto"/>
+      </w:pPr>
+      <w:r>
+        <w:rPr>
+          <w:rFonts w:ascii="等线" w:hAnsi="等线" w:eastAsia="等线"/>
+          <w:sz w:val="21"/>
+        </w:rPr>
+        <w:t>WKWebView、JavaScript定时器和前台fetch都不能作为iOS后台可靠执行器。任何要求退出页面后继续完成的生成、读取、延迟或通知，必须在退出前写入服务端持久任务；任务要有基线用户消息、幂等去重、超时重领、用户新回复取消和APNs最终送达。</w:t>
+      </w:r>
+    </w:p>
+    <w:p>
+      <w:pPr>
+        <w:spacing w:after="120" w:line="300" w:lineRule="auto"/>
+      </w:pPr>
+      <w:r>
+        <w:rPr>
+          <w:rFonts w:ascii="等线" w:hAnsi="等线" w:eastAsia="等线"/>
+          <w:sz w:val="21"/>
+        </w:rPr>
+        <w:t>主动消息、App查看和后续锁定不得各自建独立随机定时器。它们必须共享同一到期认领和占用状态；查看和控制只准使用用户明确授权的稳定App ID，系统关键App与未授权App一律不进入候选。旧快照不得冒充当前数据。</w:t>
+      </w:r>
+    </w:p>
+    <w:p>
+      <w:pPr>
+        <w:spacing w:after="120" w:line="300" w:lineRule="auto"/>
+      </w:pPr>
+      <w:r>
+        <w:rPr>
+          <w:rFonts w:ascii="等线" w:hAnsi="等线" w:eastAsia="等线"/>
+          <w:sz w:val="21"/>
+        </w:rPr>
+        <w:t>全局时间感知关闭必须在所有提示入口和服务端入口同时处理：不注入当前日期时间、星期、时段、持续时长或消息间隔，并清除事件上下文中的机器时间戳；开关变化要同步所有服务器角色资料。</w:t>
       </w:r>
     </w:p>
     <w:sectPr>

</xml_diff>

<commit_message>
feat: add background diagnostics and pet health
</commit_message>
<xml_diff>
--- a/docs/maintenance/AI开发项目_Bug修改规范.docx
+++ b/docs/maintenance/AI开发项目_Bug修改规范.docx
@@ -5328,6 +5328,59 @@
           <w:sz w:val="21"/>
         </w:rPr>
         <w:t>全局时间感知关闭必须在所有提示入口和服务端入口同时处理：不注入当前日期时间、星期、时段、持续时长或消息间隔，并清除事件上下文中的机器时间戳；开关变化要同步所有服务器角色资料。</w:t>
+      </w:r>
+    </w:p>
+    <w:p>
+      <w:r>
+        <w:br w:type="page"/>
+      </w:r>
+    </w:p>
+    <w:p>
+      <w:pPr>
+        <w:pStyle w:val="Heading1"/>
+      </w:pPr>
+      <w:r>
+        <w:rPr>
+          <w:rFonts w:ascii="等线" w:hAnsi="等线" w:eastAsia="等线"/>
+          <w:sz w:val="32"/>
+        </w:rPr>
+        <w:t>新增强制规范｜后台测试必须有可观察回执（v906起）</w:t>
+      </w:r>
+    </w:p>
+    <w:p>
+      <w:pPr>
+        <w:spacing w:after="120" w:line="300" w:lineRule="auto"/>
+      </w:pPr>
+      <w:r>
+        <w:rPr>
+          <w:rFonts w:ascii="等线" w:hAnsi="等线" w:eastAsia="等线"/>
+          <w:sz w:val="21"/>
+        </w:rPr>
+        <w:t>任何面向用户的后台、通知或设备测试按钮都必须在开始前校验所有硬前提，并在界面中显示成功任务编号或逐项失败原因。不得只发短 toast 后静默返回，也不得把设置值已保存当成任务已入库。</w:t>
+      </w:r>
+    </w:p>
+    <w:p>
+      <w:pPr>
+        <w:spacing w:after="120" w:line="300" w:lineRule="auto"/>
+      </w:pPr>
+      <w:r>
+        <w:rPr>
+          <w:rFonts w:ascii="等线" w:hAnsi="等线" w:eastAsia="等线"/>
+          <w:sz w:val="21"/>
+        </w:rPr>
+        <w:t>iOS 页面隐藏事件只能作为加速信号，不能作为唯一持久化时机。需要后台续跑的任务必须在前台操作发生时先写入一个保守兜底到期时间，隐藏时再 best-effort 提前；前台正常完成必须取消，避免双回复。</w:t>
+      </w:r>
+    </w:p>
+    <w:p>
+      <w:pPr>
+        <w:spacing w:after="120" w:line="300" w:lineRule="auto"/>
+      </w:pPr>
+      <w:r>
+        <w:rPr>
+          <w:rFonts w:ascii="等线" w:hAnsi="等线" w:eastAsia="等线"/>
+          <w:sz w:val="21"/>
+        </w:rPr>
+        <w:t>实时标题、心情和状态栏若要求随消息变化，局部消息追加路径必须同步更新对应节点；不能依赖整页 render、重新进入页面或用户点击触发刷新。</w:t>
       </w:r>
     </w:p>
     <w:sectPr>

</xml_diff>

<commit_message>
release v907 background reliability and pet updates
</commit_message>
<xml_diff>
--- a/docs/maintenance/AI开发项目_Bug修改规范.docx
+++ b/docs/maintenance/AI开发项目_Bug修改规范.docx
@@ -5381,6 +5381,59 @@
           <w:sz w:val="21"/>
         </w:rPr>
         <w:t>实时标题、心情和状态栏若要求随消息变化，局部消息追加路径必须同步更新对应节点；不能依赖整页 render、重新进入页面或用户点击触发刷新。</w:t>
+      </w:r>
+    </w:p>
+    <w:p>
+      <w:r>
+        <w:br w:type="page"/>
+      </w:r>
+    </w:p>
+    <w:p>
+      <w:pPr>
+        <w:pStyle w:val="Heading1"/>
+      </w:pPr>
+      <w:r>
+        <w:rPr>
+          <w:rFonts w:ascii="等线" w:hAnsi="等线" w:eastAsia="等线"/>
+          <w:sz w:val="32"/>
+        </w:rPr>
+        <w:t>新增强制规范｜显式后台任务、离线升级与发布（v907起）</w:t>
+      </w:r>
+    </w:p>
+    <w:p>
+      <w:pPr>
+        <w:spacing w:after="120" w:line="300" w:lineRule="auto"/>
+      </w:pPr>
+      <w:r>
+        <w:rPr>
+          <w:rFonts w:ascii="等线" w:hAnsi="等线" w:eastAsia="等线"/>
+          <w:sz w:val="21"/>
+        </w:rPr>
+        <w:t>用户点击的一分钟测试、立即App查看、正在回复接力和正在设备读取接力属于显式任务。不得用页面离开后可能瞬变的普通主动消息enabled状态取消；不同任务种类不得互相覆盖。只有同种旧任务或已确认持久化成功的本地结果可以取消对应兜底。</w:t>
+      </w:r>
+    </w:p>
+    <w:p>
+      <w:pPr>
+        <w:spacing w:after="120" w:line="300" w:lineRule="auto"/>
+      </w:pPr>
+      <w:r>
+        <w:rPr>
+          <w:rFonts w:ascii="等线" w:hAnsi="等线" w:eastAsia="等线"/>
+          <w:sz w:val="21"/>
+        </w:rPr>
+        <w:t>任何本地回复完成路径必须遵守：写恢复尾与聊天持久存储成功在前，取消服务器接力在后。页面隐藏或上划冻结发生在任意一步时，至少保留一个可恢复来源。</w:t>
+      </w:r>
+    </w:p>
+    <w:p>
+      <w:pPr>
+        <w:spacing w:after="120" w:line="300" w:lineRule="auto"/>
+      </w:pPr>
+      <w:r>
+        <w:rPr>
+          <w:rFonts w:ascii="等线" w:hAnsi="等线" w:eastAsia="等线"/>
+          <w:sz w:val="21"/>
+        </w:rPr>
+        <w:t>删除授权能力后必须同步修改Service Worker完整性校验，并增加一条‘当前授权文件能通过安装检查’测试。只改版本号而不验证新Service Worker可安装，视为未完成发布。</w:t>
       </w:r>
     </w:p>
     <w:sectPr>

</xml_diff>

<commit_message>
fix: make background handoff observable in v908
</commit_message>
<xml_diff>
--- a/docs/maintenance/AI开发项目_Bug修改规范.docx
+++ b/docs/maintenance/AI开发项目_Bug修改规范.docx
@@ -5434,6 +5434,71 @@
           <w:sz w:val="21"/>
         </w:rPr>
         <w:t>删除授权能力后必须同步修改Service Worker完整性校验，并增加一条‘当前授权文件能通过安装检查’测试。只改版本号而不验证新Service Worker可安装，视为未完成发布。</w:t>
+      </w:r>
+    </w:p>
+    <w:p>
+      <w:r>
+        <w:br w:type="page"/>
+      </w:r>
+    </w:p>
+    <w:p>
+      <w:pPr>
+        <w:pStyle w:val="Heading1"/>
+      </w:pPr>
+      <w:r>
+        <w:rPr>
+          <w:rFonts w:ascii="等线" w:hAnsi="等线" w:eastAsia="等线"/>
+          <w:sz w:val="32"/>
+        </w:rPr>
+        <w:t>新增强制规范｜后台入口、显式任务与 APNs 可观测性（v908 起）</w:t>
+      </w:r>
+    </w:p>
+    <w:p>
+      <w:pPr>
+        <w:spacing w:after="120" w:line="300" w:lineRule="auto"/>
+      </w:pPr>
+      <w:r>
+        <w:rPr>
+          <w:rFonts w:ascii="等线" w:hAnsi="等线" w:eastAsia="等线"/>
+          <w:sz w:val="21"/>
+        </w:rPr>
+        <w:t>依赖静默推送的后台处理器必须在 UIApplication 启动阶段注册，禁止只放在某个可选页面、弹窗或 SwiftUI View.task 中。处理器应在系统允许的后台时间内完成必要工作并准确回报成功或失败。</w:t>
+      </w:r>
+    </w:p>
+    <w:p>
+      <w:pPr>
+        <w:spacing w:after="120" w:line="300" w:lineRule="auto"/>
+      </w:pPr>
+      <w:r>
+        <w:rPr>
+          <w:rFonts w:ascii="等线" w:hAnsi="等线" w:eastAsia="等线"/>
+          <w:sz w:val="21"/>
+        </w:rPr>
+        <w:t>用户点击测试、正在回复接力、正在读取设备接力均为显式任务，不得复用允许“保持安静”的自主消息决策。显式任务要么生成并持久化角色回复，要么保留可重试失败状态；不得以 canceled 冒充成功。</w:t>
+      </w:r>
+    </w:p>
+    <w:p>
+      <w:pPr>
+        <w:spacing w:after="120" w:line="300" w:lineRule="auto"/>
+      </w:pPr>
+      <w:r>
+        <w:rPr>
+          <w:rFonts w:ascii="等线" w:hAnsi="等线" w:eastAsia="等线"/>
+          <w:sz w:val="21"/>
+        </w:rPr>
+        <w:t>每次 APNs 请求必须保留 HTTP 状态、apns-id 或真实错误；设备回执只能与原唤醒诊断合并，禁止整段覆盖。排查通知时先区分任务生成、APNs 接受、设备唤醒、设备执行和可见通知五个阶段。</w:t>
+      </w:r>
+    </w:p>
+    <w:p>
+      <w:pPr>
+        <w:spacing w:after="120" w:line="300" w:lineRule="auto"/>
+      </w:pPr>
+      <w:r>
+        <w:rPr>
+          <w:rFonts w:ascii="等线" w:hAnsi="等线" w:eastAsia="等线"/>
+          <w:sz w:val="21"/>
+        </w:rPr>
+        <w:t>带背景定位的宠物、人物或装饰改动必须用实际页面截图验收。CSS top 增大表示向下，坐标不得只凭源码猜测；多对象布局必须覆盖最大数量。</w:t>
       </w:r>
     </w:p>
     <w:sectPr>

</xml_diff>

<commit_message>
fix: persist background messages and add AlarmKit in v909
</commit_message>
<xml_diff>
--- a/docs/maintenance/AI开发项目_Bug修改规范.docx
+++ b/docs/maintenance/AI开发项目_Bug修改规范.docx
@@ -5499,6 +5499,71 @@
           <w:sz w:val="21"/>
         </w:rPr>
         <w:t>带背景定位的宠物、人物或装饰改动必须用实际页面截图验收。CSS top 增大表示向下，坐标不得只凭源码猜测；多对象布局必须覆盖最大数量。</w:t>
+      </w:r>
+    </w:p>
+    <w:p>
+      <w:r>
+        <w:br w:type="page"/>
+      </w:r>
+    </w:p>
+    <w:p>
+      <w:pPr>
+        <w:pStyle w:val="Heading1"/>
+      </w:pPr>
+      <w:r>
+        <w:rPr>
+          <w:rFonts w:ascii="等线" w:hAnsi="等线" w:eastAsia="等线"/>
+          <w:sz w:val="32"/>
+        </w:rPr>
+        <w:t>新增强制规范｜子快照时间、消息确认顺序与版本原子发布（v909 起）</w:t>
+      </w:r>
+    </w:p>
+    <w:p>
+      <w:pPr>
+        <w:spacing w:after="120" w:line="300" w:lineRule="auto"/>
+      </w:pPr>
+      <w:r>
+        <w:rPr>
+          <w:rFonts w:ascii="等线" w:hAnsi="等线" w:eastAsia="等线"/>
+          <w:sz w:val="21"/>
+        </w:rPr>
+        <w:t>设备快照如果包含 screenTime、wellness、location 等子快照，必须使用对应子快照自己的 generatedAt／capturedAt 判断新鲜度；外层时间只能作为兜底，禁止因外层为空否定已有真实数据。</w:t>
+      </w:r>
+    </w:p>
+    <w:p>
+      <w:pPr>
+        <w:spacing w:after="120" w:line="300" w:lineRule="auto"/>
+      </w:pPr>
+      <w:r>
+        <w:rPr>
+          <w:rFonts w:ascii="等线" w:hAnsi="等线" w:eastAsia="等线"/>
+          <w:sz w:val="21"/>
+        </w:rPr>
+        <w:t>服务端消息队列必须遵守先本地持久化、后服务端确认。save 调用不等于 IndexedDB 已完成；只有持久化 Promise 成功后才能 ACK。失败、角色临时不可用或页面中断时必须让服务端行保持可重试。</w:t>
+      </w:r>
+    </w:p>
+    <w:p>
+      <w:pPr>
+        <w:spacing w:after="120" w:line="300" w:lineRule="auto"/>
+      </w:pPr>
+      <w:r>
+        <w:rPr>
+          <w:rFonts w:ascii="等线" w:hAnsi="等线" w:eastAsia="等线"/>
+          <w:sz w:val="21"/>
+        </w:rPr>
+        <w:t>网页发布号必须原子更新 APP_VER、HTML shell build、脚本 build guard、Service Worker BUILD 与缓存仓、注册 URL、index／repair 入口及私人内置资源；全量 cache-version 测试不通过时禁止发布。</w:t>
+      </w:r>
+    </w:p>
+    <w:p>
+      <w:pPr>
+        <w:spacing w:after="120" w:line="300" w:lineRule="auto"/>
+      </w:pPr>
+      <w:r>
+        <w:rPr>
+          <w:rFonts w:ascii="等线" w:hAnsi="等线" w:eastAsia="等线"/>
+          <w:sz w:val="21"/>
+        </w:rPr>
+        <w:t>系统后台能力必须使用平台正式 API。iOS 26 闹钟使用 AlarmKit 并声明 NSAlarmKitUsageDescription；网页和 Android 保留原前台实现。没有 Mac 编译与真机证据时必须明确标为待验收，不得把源码完成写成实机通过。</w:t>
       </w:r>
     </w:p>
     <w:sectPr>

</xml_diff>

<commit_message>
feat: add video call screen sharing in v910
</commit_message>
<xml_diff>
--- a/docs/maintenance/AI开发项目_Bug修改规范.docx
+++ b/docs/maintenance/AI开发项目_Bug修改规范.docx
@@ -5564,6 +5564,83 @@
           <w:sz w:val="21"/>
         </w:rPr>
         <w:t>系统后台能力必须使用平台正式 API。iOS 26 闹钟使用 AlarmKit 并声明 NSAlarmKitUsageDescription；网页和 Android 保留原前台实现。没有 Mac 编译与真机证据时必须明确标为待验收，不得把源码完成写成实机通过。</w:t>
+      </w:r>
+    </w:p>
+    <w:p>
+      <w:r>
+        <w:br w:type="page"/>
+      </w:r>
+    </w:p>
+    <w:p>
+      <w:pPr>
+        <w:pStyle w:val="Heading1"/>
+      </w:pPr>
+      <w:r>
+        <w:rPr>
+          <w:rFonts w:ascii="等线" w:hAnsi="等线" w:eastAsia="等线"/>
+          <w:sz w:val="32"/>
+        </w:rPr>
+        <w:t>新增强制规范｜屏幕共享授权、新鲜快照与通话后台连续性（v910 起）</w:t>
+      </w:r>
+    </w:p>
+    <w:p>
+      <w:pPr>
+        <w:spacing w:after="120" w:line="300" w:lineRule="auto"/>
+      </w:pPr>
+      <w:r>
+        <w:rPr>
+          <w:rFonts w:ascii="等线" w:hAnsi="等线" w:eastAsia="等线"/>
+          <w:sz w:val="21"/>
+        </w:rPr>
+        <w:t>屏幕共享属于高敏感权限。角色可以提出请求，但不得直接开启；每次必须先显示清楚的角色请求弹框，再由用户主动同意，并继续遵守 iOS／浏览器的系统级共享确认。拒绝、取消或超时不得伪装成已共享，模型也不得声称看到了尚未取得的画面。</w:t>
+      </w:r>
+    </w:p>
+    <w:p>
+      <w:pPr>
+        <w:spacing w:after="120" w:line="300" w:lineRule="auto"/>
+      </w:pPr>
+      <w:r>
+        <w:rPr>
+          <w:rFonts w:ascii="等线" w:hAnsi="等线" w:eastAsia="等线"/>
+          <w:sz w:val="21"/>
+        </w:rPr>
+        <w:t>ReplayKit 扩展只能保留本次共享需要的最新一帧，使用原子覆盖写入 App Group；共享结束必须删除临时帧并清空 active 状态。不得后台常驻录屏，不得绕过系统红色共享指示，也不得把屏幕帧混入普通聊天或遥测上传。</w:t>
+      </w:r>
+    </w:p>
+    <w:p>
+      <w:pPr>
+        <w:spacing w:after="120" w:line="300" w:lineRule="auto"/>
+      </w:pPr>
+      <w:r>
+        <w:rPr>
+          <w:rFonts w:ascii="等线" w:hAnsi="等线" w:eastAsia="等线"/>
+          <w:sz w:val="21"/>
+        </w:rPr>
+        <w:t>设备 App 查看必须记录 requestedAt，并只接受采集时间大于等于 requestedAt 的 Screen Time 子快照。旧快照、没有可识别名称或没有新增使用量时必须报告等待／无增量并重试，禁止把旧数据写成当前事实。基线要兼容旧数值格式和新 {used,name} 格式。</w:t>
+      </w:r>
+    </w:p>
+    <w:p>
+      <w:pPr>
+        <w:spacing w:after="120" w:line="300" w:lineRule="auto"/>
+      </w:pPr>
+      <w:r>
+        <w:rPr>
+          <w:rFonts w:ascii="等线" w:hAnsi="等线" w:eastAsia="等线"/>
+          <w:sz w:val="21"/>
+        </w:rPr>
+        <w:t>摄像头与共享屏幕必须是两个独立媒体源；识别入口统一但取帧时共享屏幕优先。自动识别严格遵守分钟间隔、0 关闭和每通次数；用户口头明确要求看画面时不受自动次数限制。每次识别必须使用当次新帧，不能复用上一句用户话语生成回答。</w:t>
+      </w:r>
+    </w:p>
+    <w:p>
+      <w:pPr>
+        <w:spacing w:after="120" w:line="300" w:lineRule="auto"/>
+      </w:pPr>
+      <w:r>
+        <w:rPr>
+          <w:rFonts w:ascii="等线" w:hAnsi="等线" w:eastAsia="等线"/>
+          <w:sz w:val="21"/>
+        </w:rPr>
+        <w:t>通话退后台需要使用平台正式能力：iOS 视频通话 PiP 承载角色名、原文字幕和翻译，AVAudioSession 保持通话音频。网页只能使用 getDisplayMedia 且每次由浏览器授权；移动网页不能承诺跨 App 共享。无 Mac 编译与真机证据时必须标注待验收。</w:t>
       </w:r>
     </w:p>
     <w:sectPr>

</xml_diff>

<commit_message>
fix: stabilize background screen sharing in v911
</commit_message>
<xml_diff>
--- a/docs/maintenance/AI开发项目_Bug修改规范.docx
+++ b/docs/maintenance/AI开发项目_Bug修改规范.docx
@@ -5641,6 +5641,25 @@
           <w:sz w:val="21"/>
         </w:rPr>
         <w:t>通话退后台需要使用平台正式能力：iOS 视频通话 PiP 承载角色名、原文字幕和翻译，AVAudioSession 保持通话音频。网页只能使用 getDisplayMedia 且每次由浏览器授权；移动网页不能承诺跨 App 共享。无 Mac 编译与真机证据时必须标注待验收。</w:t>
+      </w:r>
+    </w:p>
+    <w:p>
+      <w:pPr>
+        <w:pStyle w:val="Heading2"/>
+      </w:pPr>
+      <w:r>
+        <w:rPr>
+          <w:b/>
+        </w:rPr>
+        <w:t>v911 新增规则：后台产生事实必须绑定产生时刻</w:t>
+      </w:r>
+    </w:p>
+    <w:p>
+      <w:r>
+        <w:rPr>
+          <w:sz w:val="21"/>
+        </w:rPr>
+        <w:t>当 WebView、页面或模型消费链可能在后台暂停时，摄像头、屏幕共享、定位、语音等事实不得在恢复后重新读取“最新值”冒充原时刻；必须在原生事件产生时冻结数据或稳定引用，并把令牌与同一事件绑定。后台原生最终事件必须有补投或持久化机制，不能假设后台 evaluateJavaScript 必然即时执行。远程 view/read 命令不得只更新外层 snapshot 时间戳后回传内存旧子快照；必须刷新目标数据源，并以目标子载荷自己的 generatedAt、requestID 或 revision 验证新鲜度。每日累计限额若允许当日中途创建或重建，必须显式声明是否计入监控开始前用量并为当前产品语义设置 includesPastActivity=true。界面层级测试必须覆盖通话、全屏和 PiP 场景，不能只在普通页面验证弹窗。</w:t>
       </w:r>
     </w:p>
     <w:sectPr>

</xml_diff>

<commit_message>
fix: restore call subtitles and add alarm companionship in v912
</commit_message>
<xml_diff>
--- a/docs/maintenance/AI开发项目_Bug修改规范.docx
+++ b/docs/maintenance/AI开发项目_Bug修改规范.docx
@@ -5660,6 +5660,54 @@
           <w:sz w:val="21"/>
         </w:rPr>
         <w:t>当 WebView、页面或模型消费链可能在后台暂停时，摄像头、屏幕共享、定位、语音等事实不得在恢复后重新读取“最新值”冒充原时刻；必须在原生事件产生时冻结数据或稳定引用，并把令牌与同一事件绑定。后台原生最终事件必须有补投或持久化机制，不能假设后台 evaluateJavaScript 必然即时执行。远程 view/read 命令不得只更新外层 snapshot 时间戳后回传内存旧子快照；必须刷新目标数据源，并以目标子载荷自己的 generatedAt、requestID 或 revision 验证新鲜度。每日累计限额若允许当日中途创建或重建，必须显式声明是否计入监控开始前用量并为当前产品语义设置 includesPastActivity=true。界面层级测试必须覆盖通话、全屏和 PiP 场景，不能只在普通页面验证弹窗。</w:t>
+      </w:r>
+    </w:p>
+    <w:p>
+      <w:pPr>
+        <w:pStyle w:val="Heading1"/>
+      </w:pPr>
+      <w:r>
+        <w:t>v912 新增维护规则</w:t>
+      </w:r>
+    </w:p>
+    <w:p>
+      <w:pPr>
+        <w:spacing w:after="120"/>
+      </w:pPr>
+      <w:r>
+        <w:t>1. 处理后台链路时必须区分“数据已冻结／事件已排队”和“工作实际获得后台执行时间”；前者不能作为后者成功的证据。</w:t>
+      </w:r>
+    </w:p>
+    <w:p>
+      <w:pPr>
+        <w:spacing w:after="120"/>
+      </w:pPr>
+      <w:r>
+        <w:t>2. 每个 beginBackgroundTask 必须以业务令牌追踪，并在成功、失败、无需处理和 expiration 路径成对 end；不得把后台任务留给超时自动回收。</w:t>
+      </w:r>
+    </w:p>
+    <w:p>
+      <w:pPr>
+        <w:spacing w:after="120"/>
+      </w:pPr>
+      <w:r>
+        <w:t>3. 修复屏幕共享识图不得改变无 frameToken 的摄像头识图时序；摄像头仍按既有快速路径工作。</w:t>
+      </w:r>
+    </w:p>
+    <w:p>
+      <w:pPr>
+        <w:spacing w:after="120"/>
+      </w:pPr>
+      <w:r>
+        <w:t>4. 用户要求恢复旧动画时必须复用旧参数和关键帧，不得用模糊、缩放、新时长等近似新设计替代；主界面与原生悬浮界面必须保持一致。</w:t>
+      </w:r>
+    </w:p>
+    <w:p>
+      <w:pPr>
+        <w:spacing w:after="120"/>
+      </w:pPr>
+      <w:r>
+        <w:t>5. 系统闹钟的核心响铃与陪伴消息必须解耦：角色话术生成或本地通知失败不得破坏 AlarmKit；到点消息补入聊天必须有稳定去重键。</w:t>
       </w:r>
     </w:p>
     <w:sectPr>

</xml_diff>

<commit_message>
feat: add realtime screen share understanding in v913
</commit_message>
<xml_diff>
--- a/docs/maintenance/AI开发项目_Bug修改规范.docx
+++ b/docs/maintenance/AI开发项目_Bug修改规范.docx
@@ -5708,6 +5708,71 @@
       </w:pPr>
       <w:r>
         <w:t>5. 系统闹钟的核心响铃与陪伴消息必须解耦：角色话术生成或本地通知失败不得破坏 AlarmKit；到点消息补入聊天必须有稳定去重键。</w:t>
+      </w:r>
+    </w:p>
+    <w:p>
+      <w:r>
+        <w:br w:type="page"/>
+      </w:r>
+    </w:p>
+    <w:p>
+      <w:pPr>
+        <w:pStyle w:val="Heading1"/>
+      </w:pPr>
+      <w:r>
+        <w:rPr>
+          <w:rFonts w:ascii="等线" w:hAnsi="等线" w:eastAsia="等线"/>
+          <w:sz w:val="32"/>
+        </w:rPr>
+        <w:t>新增强制规范｜共享状态事件与准实时画面理解（v913 起）</w:t>
+      </w:r>
+    </w:p>
+    <w:p>
+      <w:pPr>
+        <w:spacing w:after="120" w:line="300" w:lineRule="auto"/>
+      </w:pPr>
+      <w:r>
+        <w:rPr>
+          <w:rFonts w:ascii="等线" w:hAnsi="等线" w:eastAsia="等线"/>
+          <w:sz w:val="21"/>
+        </w:rPr>
+        <w:t>通话中的媒体状态改变必须使用独立队列和生成代次，禁止与普通用户话语共用覆盖式 pending 槽。新共享状态到达后，旧生成、旧字幕和旧音频不得继续播放；状态事件不得携带上一轮普通聊天历史。</w:t>
+      </w:r>
+    </w:p>
+    <w:p>
+      <w:pPr>
+        <w:spacing w:after="120" w:line="300" w:lineRule="auto"/>
+      </w:pPr>
+      <w:r>
+        <w:rPr>
+          <w:rFonts w:ascii="等线" w:hAnsi="等线" w:eastAsia="等线"/>
+          <w:sz w:val="21"/>
+        </w:rPr>
+        <w:t>共享开始只证明 ReplayKit 已处于活动状态，不证明模型已经理解某个具体画面。没有当轮真实画面描述时，角色只能确认共享已开始；不得编造软件、文字、物品或动作。</w:t>
+      </w:r>
+    </w:p>
+    <w:p>
+      <w:pPr>
+        <w:spacing w:after="120" w:line="300" w:lineRule="auto"/>
+      </w:pPr>
+      <w:r>
+        <w:rPr>
+          <w:rFonts w:ascii="等线" w:hAnsi="等线" w:eastAsia="等线"/>
+          <w:sz w:val="21"/>
+        </w:rPr>
+        <w:t>准实时理解必须默认关闭、可随时关闭，并在关闭后恢复原分钟定时与口头识图链路。变化检测应在本地低分辨率完成，静止画面不得重复计费；自动调用严格遵守每次视频上限，口头明确要求查看不受该上限影响。</w:t>
+      </w:r>
+    </w:p>
+    <w:p>
+      <w:pPr>
+        <w:spacing w:after="120" w:line="300" w:lineRule="auto"/>
+      </w:pPr>
+      <w:r>
+        <w:rPr>
+          <w:rFonts w:ascii="等线" w:hAnsi="等线" w:eastAsia="等线"/>
+          <w:sz w:val="21"/>
+        </w:rPr>
+        <w:t>iOS WKWebView 定时器在后台不可靠。任何承诺切其他 App 后继续的共享功能必须由 ReplayKit 原生帧序列提供触发，并对每轮网络识别申请有限后台任务、完成或失败时成对释放。仍不得承诺无限后台执行或逐帧视频模型效果。</w:t>
       </w:r>
     </w:p>
     <w:sectPr>

</xml_diff>

<commit_message>
feat: add public music and fix floating call UI in v914
</commit_message>
<xml_diff>
--- a/docs/maintenance/AI开发项目_Bug修改规范.docx
+++ b/docs/maintenance/AI开发项目_Bug修改规范.docx
@@ -5773,6 +5773,71 @@
           <w:sz w:val="21"/>
         </w:rPr>
         <w:t>iOS WKWebView 定时器在后台不可靠。任何承诺切其他 App 后继续的共享功能必须由 ReplayKit 原生帧序列提供触发，并对每轮网络识别申请有限后台任务、完成或失败时成对释放。仍不得承诺无限后台执行或逐帧视频模型效果。</w:t>
+      </w:r>
+    </w:p>
+    <w:p>
+      <w:r>
+        <w:br w:type="page"/>
+      </w:r>
+    </w:p>
+    <w:p>
+      <w:pPr>
+        <w:pStyle w:val="Heading1"/>
+      </w:pPr>
+      <w:r>
+        <w:rPr>
+          <w:rFonts w:ascii="等线" w:hAnsi="等线" w:eastAsia="等线"/>
+          <w:sz w:val="32"/>
+        </w:rPr>
+        <w:t>新增强制规范｜区分 App 内通话层与系统悬浮 PiP（v914 起）</w:t>
+      </w:r>
+    </w:p>
+    <w:p>
+      <w:pPr>
+        <w:spacing w:after="120" w:line="300" w:lineRule="auto"/>
+      </w:pPr>
+      <w:r>
+        <w:rPr>
+          <w:rFonts w:ascii="等线" w:hAnsi="等线" w:eastAsia="等线"/>
+          <w:sz w:val="21"/>
+        </w:rPr>
+        <w:t>收到“通话框透明、透视后台”需求时，必须先明确目标是 App 内网页通话页、App 内缩小浮层，还是退出 App 后由 iOS 管理的系统 PiP。不得用网页背景透明冒充主屏幕透视，也不得把一个对象的样式要求误施加到另一个对象。</w:t>
+      </w:r>
+    </w:p>
+    <w:p>
+      <w:pPr>
+        <w:spacing w:after="120" w:line="300" w:lineRule="auto"/>
+      </w:pPr>
+      <w:r>
+        <w:rPr>
+          <w:rFonts w:ascii="等线" w:hAnsi="等线" w:eastAsia="等线"/>
+          <w:sz w:val="21"/>
+        </w:rPr>
+        <w:t>任何开关若在不重绘当前页面的分支中修改状态，必须同步修改触发元素的视觉类、aria-checked 和必要的禁用状态；不能只弹“已开启”提示。原生系统面板已打开、用户已确认、扩展已 active 是三个不同阶段，按钮必须显示 pending，只有真实 active 事件才能显示开启。</w:t>
+      </w:r>
+    </w:p>
+    <w:p>
+      <w:pPr>
+        <w:spacing w:after="120" w:line="300" w:lineRule="auto"/>
+      </w:pPr>
+      <w:r>
+        <w:rPr>
+          <w:rFonts w:ascii="等线" w:hAnsi="等线" w:eastAsia="等线"/>
+          <w:sz w:val="21"/>
+        </w:rPr>
+        <w:t>空字幕容器不得保留背景、边框或最小高度造成黑条。字幕动画可复用，但无文本时必须隐藏。PiP 透明属于系统合成能力，代码可以设置非不透明根视图和 alpha，但发布说明必须保留真机验证边界，禁止承诺系统一定透出其他 App。</w:t>
+      </w:r>
+    </w:p>
+    <w:p>
+      <w:pPr>
+        <w:spacing w:after="120" w:line="300" w:lineRule="auto"/>
+      </w:pPr>
+      <w:r>
+        <w:rPr>
+          <w:rFonts w:ascii="等线" w:hAnsi="等线" w:eastAsia="等线"/>
+          <w:sz w:val="21"/>
+        </w:rPr>
+        <w:t>在线音乐只能接入合法公开曲库或用户自己的合法来源；不得抓取受保护商业平台或绕过登录、DRM。在线目录故障不能破坏本地音乐、导入歌单或一起听核心链路。</w:t>
       </w:r>
     </w:p>
     <w:sectPr>

</xml_diff>

<commit_message>
feat: add autonomous screen observation in v915
</commit_message>
<xml_diff>
--- a/docs/maintenance/AI开发项目_Bug修改规范.docx
+++ b/docs/maintenance/AI开发项目_Bug修改规范.docx
@@ -5838,6 +5838,59 @@
           <w:sz w:val="21"/>
         </w:rPr>
         <w:t>在线音乐只能接入合法公开曲库或用户自己的合法来源；不得抓取受保护商业平台或绕过登录、DRM。在线目录故障不能破坏本地音乐、导入歌单或一起听核心链路。</w:t>
+      </w:r>
+    </w:p>
+    <w:p>
+      <w:r>
+        <w:br w:type="page"/>
+      </w:r>
+    </w:p>
+    <w:p>
+      <w:pPr>
+        <w:pStyle w:val="Heading1"/>
+      </w:pPr>
+      <w:r>
+        <w:rPr>
+          <w:rFonts w:ascii="等线" w:hAnsi="等线" w:eastAsia="等线"/>
+          <w:sz w:val="32"/>
+        </w:rPr>
+        <w:t>新增强制规范｜实时共享自主观察与后台帧归属（v915 起）</w:t>
+      </w:r>
+    </w:p>
+    <w:p>
+      <w:pPr>
+        <w:spacing w:after="120" w:line="300" w:lineRule="auto"/>
+      </w:pPr>
+      <w:r>
+        <w:rPr>
+          <w:rFonts w:ascii="等线" w:hAnsi="等线" w:eastAsia="等线"/>
+          <w:sz w:val="21"/>
+        </w:rPr>
+        <w:t>ReplayKit 共享外部 App 画面时，宿主前台帧与后台外部 App 帧必须分槽保存；不得用单个 latest 文件判断画面归属。后台帧只能一次性冻结、消费并回执删除，避免下一轮重复描述旧画面，同时不得破坏普通共享帧和手动识图链路。</w:t>
+      </w:r>
+    </w:p>
+    <w:p>
+      <w:pPr>
+        <w:spacing w:after="120" w:line="300" w:lineRule="auto"/>
+      </w:pPr>
+      <w:r>
+        <w:rPr>
+          <w:rFonts w:ascii="等线" w:hAnsi="等线" w:eastAsia="等线"/>
+          <w:sz w:val="21"/>
+        </w:rPr>
+        <w:t>角色实时观察不能把每一帧都变成台词。必须显式维护继续静默、暂停提问、等待用户回答、结束本轮四类状态；等待期间不得继续取帧，收到用户回答后只能继续或结束，不能立刻连问第二个问题。口头‘看一下’属于用户主动请求，仍不限次数且优先于自主等待拦截。</w:t>
+      </w:r>
+    </w:p>
+    <w:p>
+      <w:pPr>
+        <w:spacing w:after="120" w:line="300" w:lineRule="auto"/>
+      </w:pPr>
+      <w:r>
+        <w:rPr>
+          <w:rFonts w:ascii="等线" w:hAnsi="等线" w:eastAsia="等线"/>
+          <w:sz w:val="21"/>
+        </w:rPr>
+        <w:t>任何自主查看都必须同时满足：用户已在 iOS 系统面板授权共享、当前共享真实 active、实时共享理解开关开启、本次视频仍在自动识别上限内。角色不得自行启动系统录屏，也不得用提示词伪装已经看到未提供的画面。</w:t>
       </w:r>
     </w:p>
     <w:sectPr>

</xml_diff>

<commit_message>
release: v916 role-paced screen sharing
</commit_message>
<xml_diff>
--- a/docs/maintenance/AI开发项目_Bug修改规范.docx
+++ b/docs/maintenance/AI开发项目_Bug修改规范.docx
@@ -5891,6 +5891,59 @@
           <w:sz w:val="21"/>
         </w:rPr>
         <w:t>任何自主查看都必须同时满足：用户已在 iOS 系统面板授权共享、当前共享真实 active、实时共享理解开关开启、本次视频仍在自动识别上限内。角色不得自行启动系统录屏，也不得用提示词伪装已经看到未提供的画面。</w:t>
+      </w:r>
+    </w:p>
+    <w:p>
+      <w:r>
+        <w:br w:type="page"/>
+      </w:r>
+    </w:p>
+    <w:p>
+      <w:pPr>
+        <w:pStyle w:val="Heading1"/>
+      </w:pPr>
+      <w:r>
+        <w:rPr>
+          <w:rFonts w:ascii="等线" w:hAnsi="等线" w:eastAsia="等线"/>
+          <w:sz w:val="32"/>
+        </w:rPr>
+        <w:t>新增强制规范｜角色驱动共享观察与确定性状态推进（v916 起）</w:t>
+      </w:r>
+    </w:p>
+    <w:p>
+      <w:pPr>
+        <w:spacing w:after="120" w:line="300" w:lineRule="auto"/>
+      </w:pPr>
+      <w:r>
+        <w:rPr>
+          <w:rFonts w:ascii="等线" w:hAnsi="等线" w:eastAsia="等线"/>
+          <w:sz w:val="21"/>
+        </w:rPr>
+        <w:t>实时共享理解不得由固定四秒、八秒或其他默认循环持续扫描。第一次画面只供角色做决定；只有角色明确选择‘继续’并给出下一次时间才可调度。模型没有输出合法决定时必须停止，不能兜底继续；选择提问或等待切换后必须停止取帧。</w:t>
+      </w:r>
+    </w:p>
+    <w:p>
+      <w:pPr>
+        <w:spacing w:after="120" w:line="300" w:lineRule="auto"/>
+      </w:pPr>
+      <w:r>
+        <w:rPr>
+          <w:rFonts w:ascii="等线" w:hAnsi="等线" w:eastAsia="等线"/>
+          <w:sz w:val="21"/>
+        </w:rPr>
+        <w:t>用户在角色要求切页后说‘打开了／切好了／给你看’，必须优先消费该次语音最终结果绑定的 ReplayKit 冻结帧，不能等用户回到小手机后再抓前台自身画面。视觉提示必须忽略小手机自己的悬浮通话框，不能把角色自己的名字、字幕和头像认成第三方内容。</w:t>
+      </w:r>
+    </w:p>
+    <w:p>
+      <w:pPr>
+        <w:spacing w:after="120" w:line="300" w:lineRule="auto"/>
+      </w:pPr>
+      <w:r>
+        <w:rPr>
+          <w:rFonts w:ascii="等线" w:hAnsi="等线" w:eastAsia="等线"/>
+          <w:sz w:val="21"/>
+        </w:rPr>
+        <w:t>时间感知开启且作息开关开启时，共同生活状态必须由真实钟点确定性推进；不能只把作息写进模型提示词。用户手动状态在当前作息槽内优先，直到下一时段边界才由作息接管。时间感知关闭后不得自动推进。宠物自然成长阶段只能单调增加，任何饥饿、患病和旧字段迁移都不得让体型或成长阶段自动倒退。</w:t>
       </w:r>
     </w:p>
     <w:sectPr>

</xml_diff>

<commit_message>
Release v917 call audio and group fixes
</commit_message>
<xml_diff>
--- a/docs/maintenance/AI开发项目_Bug修改规范.docx
+++ b/docs/maintenance/AI开发项目_Bug修改规范.docx
@@ -5944,6 +5944,59 @@
           <w:sz w:val="21"/>
         </w:rPr>
         <w:t>时间感知开启且作息开关开启时，共同生活状态必须由真实钟点确定性推进；不能只把作息写进模型提示词。用户手动状态在当前作息槽内优先，直到下一时段边界才由作息接管。时间感知关闭后不得自动推进。宠物自然成长阶段只能单调增加，任何饥饿、患病和旧字段迁移都不得让体型或成长阶段自动倒退。</w:t>
+      </w:r>
+    </w:p>
+    <w:p>
+      <w:r>
+        <w:br w:type="page"/>
+      </w:r>
+    </w:p>
+    <w:p>
+      <w:pPr>
+        <w:pStyle w:val="Heading1"/>
+      </w:pPr>
+      <w:r>
+        <w:rPr>
+          <w:rFonts w:ascii="等线" w:hAnsi="等线" w:eastAsia="等线"/>
+          <w:sz w:val="32"/>
+        </w:rPr>
+        <w:t>新增强制规范｜通话同声、线上代发与群聊权限（v917 起）</w:t>
+      </w:r>
+    </w:p>
+    <w:p>
+      <w:pPr>
+        <w:spacing w:after="120" w:line="300" w:lineRule="auto"/>
+      </w:pPr>
+      <w:r>
+        <w:rPr>
+          <w:rFonts w:ascii="等线" w:hAnsi="等线" w:eastAsia="等线"/>
+          <w:sz w:val="21"/>
+        </w:rPr>
+        <w:t>网页大通话和原生 PiP 字幕必须读取同一份协议参数。正文、说话人、逐字时长、逐字间隔、最大延迟、整行动画时长、位移、缩放和动画曲线任一改变时，必须同时更新协议与双端回归测试；字幕更新不得重新启动 PiP 或重置全局音频会话。</w:t>
+      </w:r>
+    </w:p>
+    <w:p>
+      <w:pPr>
+        <w:spacing w:after="120" w:line="300" w:lineRule="auto"/>
+      </w:pPr>
+      <w:r>
+        <w:rPr>
+          <w:rFonts w:ascii="等线" w:hAnsi="等线" w:eastAsia="等线"/>
+          <w:sz w:val="21"/>
+        </w:rPr>
+        <w:t>连续通话不得为了播放角色声音而停止用户话筒。用户在角色播音期间产生的最终识别结果必须保留并按序处理；原生应使用 voice processing 降低外放回声，但不得宣称能强制覆盖第三方 App 的暂停、DRM 或系统策略。</w:t>
+      </w:r>
+    </w:p>
+    <w:p>
+      <w:pPr>
+        <w:spacing w:after="120" w:line="300" w:lineRule="auto"/>
+      </w:pPr>
+      <w:r>
+        <w:rPr>
+          <w:rFonts w:ascii="等线" w:hAnsi="等线" w:eastAsia="等线"/>
+          <w:sz w:val="21"/>
+        </w:rPr>
+        <w:t>共同生活角色只能以角色身份写入该角色的微信或其实际参加的 AI 群。目标群不唯一时必须先追问，绝不能随机投递；不得冒充用户向真人小手机好友或真人群发言。AI 群的 AI 发言不得出现编辑入口。真人群解散必须客户端仅群主展示、客户端再次校验，并由服务端验证密钥与 owner_id 后原子级联删除。</w:t>
       </w:r>
     </w:p>
     <w:sectPr>

</xml_diff>

<commit_message>
Release v918 call subtitles noise gate and pet bed
</commit_message>
<xml_diff>
--- a/docs/maintenance/AI开发项目_Bug修改规范.docx
+++ b/docs/maintenance/AI开发项目_Bug修改规范.docx
@@ -5997,6 +5997,71 @@
           <w:sz w:val="21"/>
         </w:rPr>
         <w:t>共同生活角色只能以角色身份写入该角色的微信或其实际参加的 AI 群。目标群不唯一时必须先追问，绝不能随机投递；不得冒充用户向真人小手机好友或真人群发言。AI 群的 AI 发言不得出现编辑入口。真人群解散必须客户端仅群主展示、客户端再次校验，并由服务端验证密钥与 owner_id 后原子级联删除。</w:t>
+      </w:r>
+    </w:p>
+    <w:p>
+      <w:r>
+        <w:br w:type="page"/>
+      </w:r>
+    </w:p>
+    <w:p>
+      <w:pPr>
+        <w:pStyle w:val="Heading1"/>
+      </w:pPr>
+      <w:r>
+        <w:rPr>
+          <w:rFonts w:ascii="等线" w:hAnsi="等线" w:eastAsia="等线"/>
+          <w:sz w:val="32"/>
+        </w:rPr>
+        <w:t>新增强制规范｜通话字幕基准、杂音门禁与外部媒体边界（v918 起）</w:t>
+      </w:r>
+    </w:p>
+    <w:p>
+      <w:pPr>
+        <w:spacing w:after="120" w:line="300" w:lineRule="auto"/>
+      </w:pPr>
+      <w:r>
+        <w:rPr>
+          <w:rFonts w:ascii="等线" w:hAnsi="等线" w:eastAsia="等线"/>
+          <w:sz w:val="21"/>
+        </w:rPr>
+        <w:t>通话字幕的已确认视觉基准为 v700：每次文本更新以整句话整体从透明到实心并上浮，不得拆成逐字符动画。用户识别、角色原文、翻译、网页大通话和原生 PiP 必须遵守同一运动语义；长文本必须优先缩小并换行，禁止横向裁掉。改字幕前必须先对照历史正确版本和双端回归测试，不能为了新增协议破坏既有小框动画。</w:t>
+      </w:r>
+    </w:p>
+    <w:p>
+      <w:pPr>
+        <w:spacing w:after="120" w:line="300" w:lineRule="auto"/>
+      </w:pPr>
+      <w:r>
+        <w:rPr>
+          <w:rFonts w:ascii="等线" w:hAnsi="等线" w:eastAsia="等线"/>
+          <w:sz w:val="21"/>
+        </w:rPr>
+        <w:t>角色播音期间允许真实用户插话，不等于保留所有识别结果。进入待处理队列前必须结合真人声活动、中间识别、置信度、近期角色文本回声和重复结果；静音、低置信度单字、角色外放复述不得发送。不得通过暂停识音来消除回声，也不得删除角色 AVAudioPlayer 或既有 TTS 发声链路。</w:t>
+      </w:r>
+    </w:p>
+    <w:p>
+      <w:pPr>
+        <w:spacing w:after="120" w:line="300" w:lineRule="auto"/>
+      </w:pPr>
+      <w:r>
+        <w:rPr>
+          <w:rFonts w:ascii="等线" w:hAnsi="等线" w:eastAsia="等线"/>
+          <w:sz w:val="21"/>
+        </w:rPr>
+        <w:t>连续通话只在开始时配置 playAndRecord/voiceChat/mixWithOthers 音频会话，不得为每句角色语音重新激活全局会话。语音与视频电话都必须提供用户确认后的 ReplayKit 共享入口。不得承诺强制第三方 App 混音或捕获受保护内容；真机验收应分别记录本 App 行为与第三方媒体自身策略。</w:t>
+      </w:r>
+    </w:p>
+    <w:p>
+      <w:pPr>
+        <w:spacing w:after="120" w:line="300" w:lineRule="auto"/>
+      </w:pPr>
+      <w:r>
+        <w:rPr>
+          <w:rFonts w:ascii="等线" w:hAnsi="等线" w:eastAsia="等线"/>
+          <w:sz w:val="21"/>
+        </w:rPr>
+        <w:t>宠物睡眠坐标必须以背景图左侧粉色窝的实际内垫为边界；所有物种共用槽位算法，同时睡觉时按数量和物种缩放且不得重叠。新增功能不得改坏角色发声、用户话筒、电话挂断、摄像头、既有宠物成长与其他已稳定链路。</w:t>
       </w:r>
     </w:p>
     <w:sectPr>

</xml_diff>

<commit_message>
Release v919 call audio and composer regression fixes
</commit_message>
<xml_diff>
--- a/docs/maintenance/AI开发项目_Bug修改规范.docx
+++ b/docs/maintenance/AI开发项目_Bug修改规范.docx
@@ -6062,6 +6062,71 @@
           <w:sz w:val="21"/>
         </w:rPr>
         <w:t>宠物睡眠坐标必须以背景图左侧粉色窝的实际内垫为边界；所有物种共用槽位算法，同时睡觉时按数量和物种缩放且不得重叠。新增功能不得改坏角色发声、用户话筒、电话挂断、摄像头、既有宠物成长与其他已稳定链路。</w:t>
+      </w:r>
+    </w:p>
+    <w:p>
+      <w:r>
+        <w:br w:type="page"/>
+      </w:r>
+    </w:p>
+    <w:p>
+      <w:pPr>
+        <w:pStyle w:val="Heading1"/>
+      </w:pPr>
+      <w:r>
+        <w:rPr>
+          <w:rFonts w:ascii="等线" w:hAnsi="等线" w:eastAsia="等线"/>
+          <w:sz w:val="32"/>
+        </w:rPr>
+        <w:t>新增强制规范｜改动前影响面与已验证回退优先（v919 起）</w:t>
+      </w:r>
+    </w:p>
+    <w:p>
+      <w:pPr>
+        <w:spacing w:after="120" w:line="300" w:lineRule="auto"/>
+      </w:pPr>
+      <w:r>
+        <w:rPr>
+          <w:rFonts w:ascii="等线" w:hAnsi="等线" w:eastAsia="等线"/>
+          <w:sz w:val="21"/>
+        </w:rPr>
+        <w:t>每次代码改动前必须先明确四项：会影响哪些已经正常的旧功能；是否存在用户确认正常的历史版本；能否只改一处或一条链路；需要新增哪些回归测试。没有完成这四项时不得为了新需求顺手重构相邻功能。</w:t>
+      </w:r>
+    </w:p>
+    <w:p>
+      <w:pPr>
+        <w:spacing w:after="120" w:line="300" w:lineRule="auto"/>
+      </w:pPr>
+      <w:r>
+        <w:rPr>
+          <w:rFonts w:ascii="等线" w:hAnsi="等线" w:eastAsia="等线"/>
+          <w:sz w:val="21"/>
+        </w:rPr>
+        <w:t>遇到新改动破坏旧功能时，优先逐行对比最后正常提交和首个异常提交。若能定位唯一被删除或替换的保障，应先恢复历史已验证实现，不得同时调整字幕、提示词、共享、识别、TTS 或其他无关模块。普通通话角色出声的硬约束是每段原生 AVAudioPlayer 播放前确认 playAndRecord/voiceChat/mixWithOthers 会话已激活。</w:t>
+      </w:r>
+    </w:p>
+    <w:p>
+      <w:pPr>
+        <w:spacing w:after="120" w:line="300" w:lineRule="auto"/>
+      </w:pPr>
+      <w:r>
+        <w:rPr>
+          <w:rFonts w:ascii="等线" w:hAnsi="等线" w:eastAsia="等线"/>
+          <w:sz w:val="21"/>
+        </w:rPr>
+        <w:t>语音降噪或回声门禁若造成真人最终结果被丢弃，应先回退到用户确认正常的上一版处理，再以独立实验和真机证据迭代。不能因中间字幕能显示就认定最终消息已送达角色。字幕动画有独立基准，音频和识别修复不得触碰其 DOM、CSS、PiP UILabel 或运动参数。</w:t>
+      </w:r>
+    </w:p>
+    <w:p>
+      <w:pPr>
+        <w:spacing w:after="120" w:line="300" w:lineRule="auto"/>
+      </w:pPr>
+      <w:r>
+        <w:rPr>
+          <w:rFonts w:ascii="等线" w:hAnsi="等线" w:eastAsia="等线"/>
+          <w:sz w:val="21"/>
+        </w:rPr>
+        <w:t>iPhone 聊天输入控件不得使用小于 16px 的字号，避免 WebKit 焦点缩放和光标错位；可展开面板必须位于输入栏之后且先收起软键盘，不能覆盖或挤走发送区。界面修复必须与通话核心修复分文件、分测试验证。</w:t>
       </w:r>
     </w:p>
     <w:sectPr>

</xml_diff>

<commit_message>
fix: restore stable call role audio path for v920
</commit_message>
<xml_diff>
--- a/docs/maintenance/AI开发项目_Bug修改规范.docx
+++ b/docs/maintenance/AI开发项目_Bug修改规范.docx
@@ -6127,6 +6127,71 @@
           <w:sz w:val="21"/>
         </w:rPr>
         <w:t>iPhone 聊天输入控件不得使用小于 16px 的字号，避免 WebKit 焦点缩放和光标错位；可展开面板必须位于输入栏之后且先收起软键盘，不能覆盖或挤走发送区。界面修复必须与通话核心修复分文件、分测试验证。</w:t>
+      </w:r>
+    </w:p>
+    <w:p>
+      <w:r>
+        <w:br w:type="page"/>
+      </w:r>
+    </w:p>
+    <w:p>
+      <w:pPr>
+        <w:pStyle w:val="Heading1"/>
+      </w:pPr>
+      <w:r>
+        <w:rPr>
+          <w:rFonts w:ascii="等线" w:hAnsi="等线" w:eastAsia="等线"/>
+          <w:sz w:val="32"/>
+        </w:rPr>
+        <w:t>新增强制规范｜旧版三点证据与前后台音频分流（v920 起）</w:t>
+      </w:r>
+    </w:p>
+    <w:p>
+      <w:pPr>
+        <w:spacing w:after="120" w:line="300" w:lineRule="auto"/>
+      </w:pPr>
+      <w:r>
+        <w:rPr>
+          <w:rFonts w:ascii="等线" w:hAnsi="等线" w:eastAsia="等线"/>
+          <w:sz w:val="21"/>
+        </w:rPr>
+        <w:t>用户指出历史正常版本时，必须至少核对：最后正常版本的输入条件、核心执行链和收尾恢复三个位置。不能只搜索同名函数，也不能把用户的猜测直接当作根因；结论必须能够指出旧版与当前版的实际代码差异。</w:t>
+      </w:r>
+    </w:p>
+    <w:p>
+      <w:pPr>
+        <w:spacing w:after="120" w:line="300" w:lineRule="auto"/>
+      </w:pPr>
+      <w:r>
+        <w:rPr>
+          <w:rFonts w:ascii="等线" w:hAnsi="等线" w:eastAsia="等线"/>
+          <w:sz w:val="21"/>
+        </w:rPr>
+        <w:t>涉及通话声音时，普通前台通话、后台、画中画、屏幕共享必须分别列为不同场景。为后台续播加入的原生播放器不得自动取代普通前台已经验证的网页播放器；需要共存时必须用明确的可测试条件分流。</w:t>
+      </w:r>
+    </w:p>
+    <w:p>
+      <w:pPr>
+        <w:spacing w:after="120" w:line="300" w:lineRule="auto"/>
+      </w:pPr>
+      <w:r>
+        <w:rPr>
+          <w:rFonts w:ascii="等线" w:hAnsi="等线" w:eastAsia="等线"/>
+          <w:sz w:val="21"/>
+        </w:rPr>
+        <w:t>涉及语音识别和降噪时，先恢复用户确认正常版本的忙碌期隔离、尾音窗口、暂停和重建顺序，再做独立实验。不得在没有真机证据时叠加 RMS、置信度、文字相似度等猜测阈值，也不得把角色播音期间的识别结果排队后自动发送。</w:t>
+      </w:r>
+    </w:p>
+    <w:p>
+      <w:pPr>
+        <w:spacing w:after="120" w:line="300" w:lineRule="auto"/>
+      </w:pPr>
+      <w:r>
+        <w:rPr>
+          <w:rFonts w:ascii="等线" w:hAnsi="等线" w:eastAsia="等线"/>
+          <w:sz w:val="21"/>
+        </w:rPr>
+        <w:t>声音修复不得顺带修改字幕动画。必须用回归测试锁定字幕关键帧、完整短句显现方式、PiP 字号和翻译布局；只有用户重新明确要求时才能单独修改。自动测试通过必须表述为代码检查通过，不得写成真机已修复。</w:t>
       </w:r>
     </w:p>
     <w:sectPr>

</xml_diff>

<commit_message>
fix: restore v850 main call subtitle layout
</commit_message>
<xml_diff>
--- a/docs/maintenance/AI开发项目_Bug修改规范.docx
+++ b/docs/maintenance/AI开发项目_Bug修改规范.docx
@@ -6192,6 +6192,59 @@
           <w:sz w:val="21"/>
         </w:rPr>
         <w:t>声音修复不得顺带修改字幕动画。必须用回归测试锁定字幕关键帧、完整短句显现方式、PiP 字号和翻译布局；只有用户重新明确要求时才能单独修改。自动测试通过必须表述为代码检查通过，不得写成真机已修复。</w:t>
+      </w:r>
+    </w:p>
+    <w:p>
+      <w:r>
+        <w:br w:type="page"/>
+      </w:r>
+    </w:p>
+    <w:p>
+      <w:pPr>
+        <w:pStyle w:val="Heading1"/>
+      </w:pPr>
+      <w:r>
+        <w:rPr>
+          <w:rFonts w:ascii="等线" w:hAnsi="等线" w:eastAsia="等线"/>
+          <w:sz w:val="32"/>
+        </w:rPr>
+        <w:t>新增强制规范｜主屏幕字幕与共享小框独立维护（v921 起）</w:t>
+      </w:r>
+    </w:p>
+    <w:p>
+      <w:pPr>
+        <w:spacing w:after="120" w:line="300" w:lineRule="auto"/>
+      </w:pPr>
+      <w:r>
+        <w:rPr>
+          <w:rFonts w:ascii="等线" w:hAnsi="等线" w:eastAsia="等线"/>
+          <w:sz w:val="21"/>
+        </w:rPr>
+        <w:t>主屏幕通话字幕和共享／PiP 小框字幕是两个不同展示面。修改字号、位置、换行或长文本适配前必须明确目标展示面；不得把小框为容纳长文本采用的缩小规则套到主屏幕。</w:t>
+      </w:r>
+    </w:p>
+    <w:p>
+      <w:pPr>
+        <w:spacing w:after="120" w:line="300" w:lineRule="auto"/>
+      </w:pPr>
+      <w:r>
+        <w:rPr>
+          <w:rFonts w:ascii="等线" w:hAnsi="等线" w:eastAsia="等线"/>
+          <w:sz w:val="21"/>
+        </w:rPr>
+        <w:t>恢复历史样式时必须逐项对照字号、行高、容器 bottom、垂直对齐和动画，不得只看其中一个属性。若用户要求恢复字号和位置但保留当前动画，应只改布局属性，不能顺带回退动画关键帧。</w:t>
+      </w:r>
+    </w:p>
+    <w:p>
+      <w:pPr>
+        <w:spacing w:after="120" w:line="300" w:lineRule="auto"/>
+      </w:pPr>
+      <w:r>
+        <w:rPr>
+          <w:rFonts w:ascii="等线" w:hAnsi="等线" w:eastAsia="等线"/>
+          <w:sz w:val="21"/>
+        </w:rPr>
+        <w:t>回归测试必须同时证明：主屏幕保持固定 18px 和垂直居中；共享／PiP 小框仍能按长文字独立缩放。任何一侧变化都必须由用户明确授权。</w:t>
       </w:r>
     </w:p>
     <w:sectPr>

</xml_diff>

<commit_message>
feat: ship v923 glass home fixes
</commit_message>
<xml_diff>
--- a/docs/maintenance/AI开发项目_Bug修改规范.docx
+++ b/docs/maintenance/AI开发项目_Bug修改规范.docx
@@ -6245,6 +6245,235 @@
           <w:sz w:val="21"/>
         </w:rPr>
         <w:t>回归测试必须同时证明：主屏幕保持固定 18px 和垂直居中；共享／PiP 小框仍能按长文字独立缩放。任何一侧变化都必须由用户明确授权。</w:t>
+      </w:r>
+    </w:p>
+    <w:p>
+      <w:pPr>
+        <w:pStyle w:val="Heading2"/>
+      </w:pPr>
+      <w:r>
+        <w:t>新增强制规范｜本地预览与正式 Service Worker 隔离（v921 起）</w:t>
+      </w:r>
+    </w:p>
+    <w:p>
+      <w:r>
+        <w:t>任何独立预览页都不得落入正式 App Shell 的导航兜底。Service Worker 必须明确排除预览外页和显式预览参数导航，并使用网络直取；预览模式不得再次注册正式 Service Worker。</w:t>
+      </w:r>
+    </w:p>
+    <w:p>
+      <w:r>
+        <w:t>本地预览因旧缓存显示正式登录或邀请码时，先核验实际响应文档、受控 Service Worker 和 iframe URL，禁止通过关闭正式授权验证来掩盖问题。缓存清理只能限定在专用本地预览源和 north-shell 缓存，不得删除 localStorage、IndexedDB 或用户真实存档。</w:t>
+      </w:r>
+    </w:p>
+    <w:p>
+      <w:pPr>
+        <w:pStyle w:val="Heading1"/>
+      </w:pPr>
+      <w:r>
+        <w:t>v921 私人主题打包新增规则</w:t>
+      </w:r>
+    </w:p>
+    <w:p>
+      <w:pPr>
+        <w:spacing w:after="120"/>
+      </w:pPr>
+      <w:r>
+        <w:t>1. 私人版只要求少量主题资源时，资源清单必须使用精确白名单，不得为了方便直接包含整个 assets、预览或生成目录。</w:t>
+      </w:r>
+    </w:p>
+    <w:p>
+      <w:pPr>
+        <w:spacing w:after="120"/>
+      </w:pPr>
+      <w:r>
+        <w:t>2. 发布 ZIP 必须从新的独立暂存目录选择性构建；不得把历史 ZIP、历史安装说明、整张图标板、预览页、测试输出或临时目录复制进去。</w:t>
+      </w:r>
+    </w:p>
+    <w:p>
+      <w:pPr>
+        <w:spacing w:after="120"/>
+      </w:pPr>
+      <w:r>
+        <w:t>3. 浅色玻璃主题的色块和进度环可以带主题色，但必须保持低饱和、半透明；修改主题细节不得顺带改动黑色主题、通话、角色语音、字幕、识别或共享屏幕链路。</w:t>
+      </w:r>
+    </w:p>
+    <w:p>
+      <w:pPr>
+        <w:spacing w:after="120"/>
+      </w:pPr>
+      <w:r>
+        <w:t>4. 打包完成后必须同时检查主题目录集合、每套拆分图标数量、嵌套压缩包、说明文件数量和压缩完整性，再向用户提供唯一的新包。</w:t>
+      </w:r>
+    </w:p>
+    <w:p>
+      <w:r>
+        <w:br w:type="page"/>
+      </w:r>
+    </w:p>
+    <w:p>
+      <w:pPr>
+        <w:pStyle w:val="Heading1"/>
+      </w:pPr>
+      <w:r>
+        <w:rPr>
+          <w:rFonts w:ascii="等线" w:hAnsi="等线" w:eastAsia="等线"/>
+          <w:sz w:val="32"/>
+        </w:rPr>
+        <w:t>新增强制规范｜主屏组件、播放器唱片与壁纸效果隔离（v921 起）</w:t>
+      </w:r>
+    </w:p>
+    <w:p>
+      <w:pPr>
+        <w:spacing w:after="120" w:line="300" w:lineRule="auto"/>
+      </w:pPr>
+      <w:r>
+        <w:rPr>
+          <w:rFonts w:ascii="等线" w:hAnsi="等线" w:eastAsia="等线"/>
+          <w:sz w:val="21"/>
+        </w:rPr>
+        <w:t>主屏唱片组件与音乐播放器唱片可以共用材质和转速，但不得共用尺寸规则。修改主屏 .vinyl-cover 时必须限定在 .home-vinyl-card 下，禁止改变 .music-vinyl-cover。</w:t>
+      </w:r>
+    </w:p>
+    <w:p>
+      <w:pPr>
+        <w:spacing w:after="120" w:line="300" w:lineRule="auto"/>
+      </w:pPr>
+      <w:r>
+        <w:rPr>
+          <w:rFonts w:ascii="等线" w:hAnsi="等线" w:eastAsia="等线"/>
+          <w:sz w:val="21"/>
+        </w:rPr>
+        <w:t>组件内可点击上传区必须阻止冒泡和长按拖动。照片、双人头像等上传入口需要独立 pointer/click/keyboard 处理，不能落到组件编辑或相邻按钮。</w:t>
+      </w:r>
+    </w:p>
+    <w:p>
+      <w:pPr>
+        <w:spacing w:after="120" w:line="300" w:lineRule="auto"/>
+      </w:pPr>
+      <w:r>
+        <w:rPr>
+          <w:rFonts w:ascii="等线" w:hAnsi="等线" w:eastAsia="等线"/>
+          <w:sz w:val="21"/>
+        </w:rPr>
+        <w:t>整体 App 放大是扩大外层图标容器，不是放大内部图案；内部资源保持 contain、居中和透明边角。四套主题使用同一网格坐标，禁止为单一主题缩放或偏移整张图标。</w:t>
+      </w:r>
+    </w:p>
+    <w:p>
+      <w:pPr>
+        <w:spacing w:after="120" w:line="300" w:lineRule="auto"/>
+      </w:pPr>
+      <w:r>
+        <w:rPr>
+          <w:rFonts w:ascii="等线" w:hAnsi="等线" w:eastAsia="等线"/>
+          <w:sz w:val="21"/>
+        </w:rPr>
+        <w:t>自定义壁纸不得继续叠加旧版 home:before／home:after 晕染；只关闭背景装饰伪元素，不能关闭组件 backdrop-filter。</w:t>
+      </w:r>
+    </w:p>
+    <w:p>
+      <w:pPr>
+        <w:spacing w:after="120" w:line="300" w:lineRule="auto"/>
+      </w:pPr>
+      <w:r>
+        <w:rPr>
+          <w:rFonts w:ascii="等线" w:hAnsi="等线" w:eastAsia="等线"/>
+          <w:sz w:val="21"/>
+        </w:rPr>
+        <w:t>每次打包必须从 manifest 重建 PhoneWeb.bundle，并确认只有四个切分图标目录，没有预览板、预览网页、临时截图或旧 ZIP。</w:t>
+      </w:r>
+    </w:p>
+    <w:p>
+      <w:r>
+        <w:br w:type="page"/>
+      </w:r>
+    </w:p>
+    <w:p>
+      <w:pPr>
+        <w:pStyle w:val="Heading1"/>
+      </w:pPr>
+      <w:r>
+        <w:rPr>
+          <w:rFonts w:ascii="等线" w:hAnsi="等线" w:eastAsia="等线"/>
+          <w:sz w:val="32"/>
+        </w:rPr>
+        <w:t>v921／私人版 1.0.47 补充｜屏保入口恢复（2026-08-14）</w:t>
+      </w:r>
+    </w:p>
+    <w:p>
+      <w:pPr>
+        <w:spacing w:after="120" w:line="300" w:lineRule="auto"/>
+      </w:pPr>
+      <w:r>
+        <w:rPr>
+          <w:rFonts w:ascii="等线" w:hAnsi="等线" w:eastAsia="等线"/>
+          <w:sz w:val="21"/>
+        </w:rPr>
+        <w:t>屏保入口规范：不得以清理主屏组件为由隐藏全局 .lockpull。主屏布局需要避开屏保箭头时，应预留顶部安全距离，并叠加 --north-native-safe-top，而不是删除入口。</w:t>
+      </w:r>
+    </w:p>
+    <w:p>
+      <w:r>
+        <w:br w:type="page"/>
+      </w:r>
+    </w:p>
+    <w:p>
+      <w:pPr>
+        <w:pStyle w:val="Heading1"/>
+      </w:pPr>
+      <w:r>
+        <w:rPr>
+          <w:rFonts w:ascii="等线" w:hAnsi="等线" w:eastAsia="等线"/>
+          <w:sz w:val="32"/>
+        </w:rPr>
+        <w:t>v923／私人版 1.0.49｜玻璃主屏拖动与 AI 账户图标修复（2026-08-14）</w:t>
+      </w:r>
+    </w:p>
+    <w:p>
+      <w:pPr>
+        <w:spacing w:after="120" w:line="300" w:lineRule="auto"/>
+      </w:pPr>
+      <w:r>
+        <w:rPr>
+          <w:rFonts w:ascii="等线" w:hAnsi="等线" w:eastAsia="等线"/>
+          <w:sz w:val="21"/>
+        </w:rPr>
+        <w:t>玻璃主屏拖动规则：iOS 长按拖动必须同时控制 touch-action、pointerdown 默认行为和 pointer capture。只保留长按计时而不阻止浏览器接管，会在真机上收到 pointercancel；修复时不得改动桌面布局数据结构、点击启动、跨页交换或组件内部上传按钮。</w:t>
+      </w:r>
+    </w:p>
+    <w:p>
+      <w:pPr>
+        <w:spacing w:after="120" w:line="300" w:lineRule="auto"/>
+      </w:pPr>
+      <w:r>
+        <w:rPr>
+          <w:rFonts w:ascii="等线" w:hAnsi="等线" w:eastAsia="等线"/>
+          <w:sz w:val="21"/>
+        </w:rPr>
+        <w:t>图标资源规则：生成板切分后必须逐主题核对语义图块、256×256 画布和透明可见边界；不能仅凭文件名判断图标正确。网页资源与私人 PhoneWeb.bundle 必须逐文件哈希一致。</w:t>
+      </w:r>
+    </w:p>
+    <w:p>
+      <w:pPr>
+        <w:spacing w:after="120" w:line="300" w:lineRule="auto"/>
+      </w:pPr>
+      <w:r>
+        <w:rPr>
+          <w:rFonts w:ascii="等线" w:hAnsi="等线" w:eastAsia="等线"/>
+          <w:sz w:val="21"/>
+        </w:rPr>
+        <w:t>唱片隔离规则：主屏组件使用 .home-vinyl-card .vinyl-record，音乐软件播放页使用 .music-vinyl。两者可以共享动画状态，但材质选择器不得合并覆盖；用户只要求修改其中一处时，必须用作用域选择器锁定。</w:t>
+      </w:r>
+    </w:p>
+    <w:p>
+      <w:pPr>
+        <w:spacing w:after="120" w:line="300" w:lineRule="auto"/>
+      </w:pPr>
+      <w:r>
+        <w:rPr>
+          <w:rFonts w:ascii="等线" w:hAnsi="等线" w:eastAsia="等线"/>
+          <w:sz w:val="21"/>
+        </w:rPr>
+        <w:t>打包规则：交付 ZIP 必须从全新的临时目录构建，只包含本次 XcodeProject 和一份本次安装说明；不得夹带旧 ZIP、旧安装说明、预览网页、截图、临时文件或其他历史安装包。</w:t>
       </w:r>
     </w:p>
     <w:sectPr>

</xml_diff>

<commit_message>
fix: stabilize home interactions and cohabitation navigation
</commit_message>
<xml_diff>
--- a/docs/maintenance/AI开发项目_Bug修改规范.docx
+++ b/docs/maintenance/AI开发项目_Bug修改规范.docx
@@ -6474,6 +6474,201 @@
           <w:sz w:val="21"/>
         </w:rPr>
         <w:t>打包规则：交付 ZIP 必须从全新的临时目录构建，只包含本次 XcodeProject 和一份本次安装说明；不得夹带旧 ZIP、旧安装说明、预览网页、截图、临时文件或其他历史安装包。</w:t>
+      </w:r>
+    </w:p>
+    <w:p>
+      <w:r>
+        <w:br w:type="page"/>
+      </w:r>
+    </w:p>
+    <w:p>
+      <w:pPr>
+        <w:pStyle w:val="Heading1"/>
+      </w:pPr>
+      <w:r>
+        <w:rPr>
+          <w:rFonts w:ascii="等线" w:hAnsi="等线" w:eastAsia="等线"/>
+          <w:sz w:val="32"/>
+        </w:rPr>
+        <w:t>新增强制规范｜主屏窄屏响应、触控回退与玻璃性能（v924 起）</w:t>
+      </w:r>
+    </w:p>
+    <w:p>
+      <w:pPr>
+        <w:spacing w:after="120" w:line="300" w:lineRule="auto"/>
+      </w:pPr>
+      <w:r>
+        <w:rPr>
+          <w:rFonts w:ascii="等线" w:hAnsi="等线" w:eastAsia="等线"/>
+          <w:sz w:val="21"/>
+        </w:rPr>
+        <w:t>主屏固定布局必须同时覆盖 390px 与常见 360px CSS 视口。不得只以开发者自己的 iPhone 截图判断；右侧组件和图标列必须用可推导的百分比／calc 坐标，并用测试证明 390px 基准不变。</w:t>
+      </w:r>
+    </w:p>
+    <w:p>
+      <w:pPr>
+        <w:spacing w:after="120" w:line="300" w:lineRule="auto"/>
+      </w:pPr>
+      <w:r>
+        <w:rPr>
+          <w:rFonts w:ascii="等线" w:hAnsi="等线" w:eastAsia="等线"/>
+          <w:sz w:val="21"/>
+        </w:rPr>
+        <w:t>普通点击阶段不得无条件 preventDefault 或 setPointerCapture。只有达到长按阈值并正式进入拖动态后才允许捕获指针和关闭 touch-action；必须保留原生 click 回退。</w:t>
+      </w:r>
+    </w:p>
+    <w:p>
+      <w:pPr>
+        <w:spacing w:after="120" w:line="300" w:lineRule="auto"/>
+      </w:pPr>
+      <w:r>
+        <w:rPr>
+          <w:rFonts w:ascii="等线" w:hAnsi="等线" w:eastAsia="等线"/>
+          <w:sz w:val="21"/>
+        </w:rPr>
+        <w:t>使用固定位置类的主屏在 DOM 换位后必须同步刷新位置类，不能只保存数组顺序；第一页、其他页面和 Dock 的拖动回归必须分别覆盖。</w:t>
+      </w:r>
+    </w:p>
+    <w:p>
+      <w:pPr>
+        <w:spacing w:after="120" w:line="300" w:lineRule="auto"/>
+      </w:pPr>
+      <w:r>
+        <w:rPr>
+          <w:rFonts w:ascii="等线" w:hAnsi="等线" w:eastAsia="等线"/>
+          <w:sz w:val="21"/>
+        </w:rPr>
+        <w:t>玻璃材质优先保留大容器一层 backdrop-filter。内层小色块默认用透明渐变、边框和高光表达层次，禁止无必要叠加多层实时模糊；离屏页面和主题位图必须延迟绘制、异步解码并版本化缓存。</w:t>
+      </w:r>
+    </w:p>
+    <w:p>
+      <w:r>
+        <w:br w:type="page"/>
+      </w:r>
+    </w:p>
+    <w:p>
+      <w:pPr>
+        <w:pStyle w:val="Heading1"/>
+      </w:pPr>
+      <w:r>
+        <w:rPr>
+          <w:rFonts w:ascii="等线" w:hAnsi="等线" w:eastAsia="等线"/>
+          <w:sz w:val="32"/>
+        </w:rPr>
+        <w:t>新增强制规范｜后台事件不得主动导航，持久场景必须由路由恢复（v924 起）</w:t>
+      </w:r>
+    </w:p>
+    <w:p>
+      <w:pPr>
+        <w:spacing w:after="120" w:line="300" w:lineRule="auto"/>
+      </w:pPr>
+      <w:r>
+        <w:rPr>
+          <w:rFonts w:ascii="等线" w:hAnsi="等线" w:eastAsia="等线"/>
+          <w:sz w:val="21"/>
+        </w:rPr>
+        <w:t>后台计时、久未打开、推送轮询、角色主动联系和原生桥事件只能写入状态、消息、通知或角标，不得调用 openChat、home、go 或替用户切换当前页面。进入聊天必须来自用户明确点击，或用户已授权且产品明确展示的导航操作。</w:t>
+      </w:r>
+    </w:p>
+    <w:p>
+      <w:pPr>
+        <w:spacing w:after="120" w:line="300" w:lineRule="auto"/>
+      </w:pPr>
+      <w:r>
+        <w:rPr>
+          <w:rFonts w:ascii="等线" w:hAnsi="等线" w:eastAsia="等线"/>
+          <w:sz w:val="21"/>
+        </w:rPr>
+        <w:t>持续场景不得只依赖 _off、_call 等内存临时对象判断页面类型。路由已经包含 mode／id 时，render 必须以路由为准，并能在临时对象丢失后重建必要的运行状态。</w:t>
+      </w:r>
+    </w:p>
+    <w:p>
+      <w:pPr>
+        <w:spacing w:after="120" w:line="300" w:lineRule="auto"/>
+      </w:pPr>
+      <w:r>
+        <w:rPr>
+          <w:rFonts w:ascii="等线" w:hAnsi="等线" w:eastAsia="等线"/>
+          <w:sz w:val="21"/>
+        </w:rPr>
+        <w:t>同一可点击入口不得同时绑定 touchend、pointerup 和 click。优先使用一次 click，并补 Enter／Space 键盘支持；若必须使用 Pointer Events，应有明确的单次触发和取消规则。</w:t>
+      </w:r>
+    </w:p>
+    <w:p>
+      <w:pPr>
+        <w:spacing w:after="120" w:line="300" w:lineRule="auto"/>
+      </w:pPr>
+      <w:r>
+        <w:rPr>
+          <w:rFonts w:ascii="等线" w:hAnsi="等线" w:eastAsia="等线"/>
+          <w:sz w:val="21"/>
+        </w:rPr>
+        <w:t>修复“莫名跳页”时必须搜索所有 openChat、home、go 和 stack 写入点，不能只调整动画或点击层；修复场景入口时必须覆盖首次进入、页面重绘、返回后再进和临时状态丢失四种回归。</w:t>
+      </w:r>
+    </w:p>
+    <w:p>
+      <w:r>
+        <w:br w:type="page"/>
+      </w:r>
+    </w:p>
+    <w:p>
+      <w:pPr>
+        <w:pStyle w:val="Heading1"/>
+      </w:pPr>
+      <w:r>
+        <w:rPr>
+          <w:rFonts w:ascii="等线" w:hAnsi="等线" w:eastAsia="等线"/>
+          <w:sz w:val="32"/>
+        </w:rPr>
+        <w:t>新增强制规范｜首屏滚动、空位拖放与后台导航（v925 起）</w:t>
+      </w:r>
+    </w:p>
+    <w:p>
+      <w:pPr>
+        <w:spacing w:after="120" w:line="300" w:lineRule="auto"/>
+      </w:pPr>
+      <w:r>
+        <w:rPr>
+          <w:rFonts w:ascii="等线" w:hAnsi="等线" w:eastAsia="等线"/>
+          <w:sz w:val="21"/>
+        </w:rPr>
+        <w:t>原生 scroll-snap 页面不得在用户手指仍移动时安排延迟 smooth scrollTo。滚动中只允许更新页码；吸附只能在 pointerup、pointercancel 或 scrollend 后执行，并且必须避免与长按拖动状态并发。</w:t>
+      </w:r>
+    </w:p>
+    <w:p>
+      <w:pPr>
+        <w:spacing w:after="120" w:line="300" w:lineRule="auto"/>
+      </w:pPr>
+      <w:r>
+        <w:rPr>
+          <w:rFonts w:ascii="等线" w:hAnsi="等线" w:eastAsia="等线"/>
+          <w:sz w:val="21"/>
+        </w:rPr>
+        <w:t>固定桌面网格必须持久保存槽位编号，不能只保存紧凑数组顺序。拖入空槽时原槽保持空白；只有目标槽已有 App 时才交换。重新渲染、刷新、导入导出和恢复默认都必须覆盖槽位数据。</w:t>
+      </w:r>
+    </w:p>
+    <w:p>
+      <w:pPr>
+        <w:spacing w:after="120" w:line="300" w:lineRule="auto"/>
+      </w:pPr>
+      <w:r>
+        <w:rPr>
+          <w:rFonts w:ascii="等线" w:hAnsi="等线" w:eastAsia="等线"/>
+          <w:sz w:val="21"/>
+        </w:rPr>
+        <w:t>普通滑动阶段保持 pan-x／pan-y；只有正式进入长按拖动后才能捕获指针并切换 touch-action:none，结束或取消后必须恢复。</w:t>
+      </w:r>
+    </w:p>
+    <w:p>
+      <w:pPr>
+        <w:spacing w:after="120" w:line="300" w:lineRule="auto"/>
+      </w:pPr>
+      <w:r>
+        <w:rPr>
+          <w:rFonts w:ascii="等线" w:hAnsi="等线" w:eastAsia="等线"/>
+          <w:sz w:val="21"/>
+        </w:rPr>
+        <w:t>后台计时、久未打开、通知轮询和角色主动联系只能写状态、消息、通知或角标，不得替用户改变当前页面。持续场景必须由路由恢复，不能只依赖内存临时对象。</w:t>
       </w:r>
     </w:p>
     <w:sectPr>

</xml_diff>

<commit_message>
fix: stabilize glass home and restore v910 screensaver
</commit_message>
<xml_diff>
--- a/docs/maintenance/AI开发项目_Bug修改规范.docx
+++ b/docs/maintenance/AI开发项目_Bug修改规范.docx
@@ -6669,6 +6669,83 @@
           <w:sz w:val="21"/>
         </w:rPr>
         <w:t>后台计时、久未打开、通知轮询和角色主动联系只能写状态、消息、通知或角标，不得替用户改变当前页面。持续场景必须由路由恢复，不能只依赖内存临时对象。</w:t>
+      </w:r>
+    </w:p>
+    <w:p>
+      <w:r>
+        <w:br w:type="page"/>
+      </w:r>
+    </w:p>
+    <w:p>
+      <w:pPr>
+        <w:pStyle w:val="Heading1"/>
+      </w:pPr>
+      <w:r>
+        <w:rPr>
+          <w:rFonts w:ascii="等线" w:hAnsi="等线" w:eastAsia="等线"/>
+          <w:sz w:val="32"/>
+        </w:rPr>
+        <w:t>新增强制规范｜固定槽位、持久通知路由与屏保版本隔离（v926 起）</w:t>
+      </w:r>
+    </w:p>
+    <w:p>
+      <w:pPr>
+        <w:spacing w:after="120" w:line="300" w:lineRule="auto"/>
+      </w:pPr>
+      <w:r>
+        <w:rPr>
+          <w:rFonts w:ascii="等线" w:hAnsi="等线" w:eastAsia="等线"/>
+          <w:sz w:val="21"/>
+        </w:rPr>
+        <w:t>绝对定位的主屏参考页必须先定义槽位容量。布局修复、数据迁移和新增应用不得把超过容量的项目继续写入第一页；溢出项必须进入下一页，任何没有坐标类的绝对定位应用都视为阻断点击的高风险缺陷。</w:t>
+      </w:r>
+    </w:p>
+    <w:p>
+      <w:pPr>
+        <w:spacing w:after="120" w:line="300" w:lineRule="auto"/>
+      </w:pPr>
+      <w:r>
+        <w:rPr>
+          <w:rFonts w:ascii="等线" w:hAnsi="等线" w:eastAsia="等线"/>
+          <w:sz w:val="21"/>
+        </w:rPr>
+        <w:t>原生持久化导航不得在普通页面加载完成时无条件执行。通知跳转必须同时验证真实点击来源、唯一 nonce、短时新鲜度和单次消费；后台消息生成只能写消息与通知，不能主动切换用户当前页面。</w:t>
+      </w:r>
+    </w:p>
+    <w:p>
+      <w:pPr>
+        <w:spacing w:after="120" w:line="300" w:lineRule="auto"/>
+      </w:pPr>
+      <w:r>
+        <w:rPr>
+          <w:rFonts w:ascii="等线" w:hAnsi="等线" w:eastAsia="等线"/>
+          <w:sz w:val="21"/>
+        </w:rPr>
+        <w:t>历史存档入口必须在关闭当前页面或弹层前完成数据形状校验。数组、布尔值和枚举字段需要在每次进入时兼容旧值，禁止先关闭界面再让渲染异常把用户留在主页。</w:t>
+      </w:r>
+    </w:p>
+    <w:p>
+      <w:pPr>
+        <w:spacing w:after="120" w:line="300" w:lineRule="auto"/>
+      </w:pPr>
+      <w:r>
+        <w:rPr>
+          <w:rFonts w:ascii="等线" w:hAnsi="等线" w:eastAsia="等线"/>
+          <w:sz w:val="21"/>
+        </w:rPr>
+        <w:t>应用槽位、图标容器、内部图片和名称行盒必须分层定尺寸。锁标、自定义图片和主题资源只能改变内容，不得改变外层宽高；自定义图片统一中心正方形裁切，图标在 flex 布局中禁止收缩。</w:t>
+      </w:r>
+    </w:p>
+    <w:p>
+      <w:pPr>
+        <w:spacing w:after="120" w:line="300" w:lineRule="auto"/>
+      </w:pPr>
+      <w:r>
+        <w:rPr>
+          <w:rFonts w:ascii="等线" w:hAnsi="等线" w:eastAsia="等线"/>
+          <w:sz w:val="21"/>
+        </w:rPr>
+        <w:t>屏保与解锁后主题必须版本隔离。恢复指定旧版屏保时，应删除新主题对全部 lock* 选择器的覆盖，而不是模拟外观；以后玻璃主题不得重新覆盖 v910 屏保布局。</w:t>
       </w:r>
     </w:p>
     <w:sectPr>

</xml_diff>

<commit_message>
fix: stabilize iOS PWA home layout
</commit_message>
<xml_diff>
--- a/docs/maintenance/AI开发项目_Bug修改规范.docx
+++ b/docs/maintenance/AI开发项目_Bug修改规范.docx
@@ -6746,6 +6746,112 @@
           <w:sz w:val="21"/>
         </w:rPr>
         <w:t>屏保与解锁后主题必须版本隔离。恢复指定旧版屏保时，应删除新主题对全部 lock* 选择器的覆盖，而不是模拟外观；以后玻璃主题不得重新覆盖 v910 屏保布局。</w:t>
+      </w:r>
+    </w:p>
+    <w:p>
+      <w:r>
+        <w:br w:type="page"/>
+      </w:r>
+    </w:p>
+    <w:p>
+      <w:pPr>
+        <w:pStyle w:val="Heading1"/>
+      </w:pPr>
+      <w:r>
+        <w:rPr>
+          <w:rFonts w:ascii="等线" w:hAnsi="等线" w:eastAsia="等线"/>
+          <w:sz w:val="32"/>
+        </w:rPr>
+        <w:t>新增强制规范｜WebKit 行盒、安全区与美化包设备字段隔离（v927 起）</w:t>
+      </w:r>
+    </w:p>
+    <w:p>
+      <w:pPr>
+        <w:spacing w:after="120" w:line="300" w:lineRule="auto"/>
+      </w:pPr>
+      <w:r>
+        <w:rPr>
+          <w:rFonts w:ascii="等线" w:hAnsi="等线" w:eastAsia="等线"/>
+          <w:sz w:val="21"/>
+        </w:rPr>
+        <w:t>绝对定位应用槽必须容纳图标、间距和完整名称行盒，名称行盒必须禁止 flex 收缩。不能以 overflow:visible 代替真实高度，因为 iOS WebKit 仍可能先压缩文字再溢出。</w:t>
+      </w:r>
+    </w:p>
+    <w:p>
+      <w:pPr>
+        <w:spacing w:after="120" w:line="300" w:lineRule="auto"/>
+      </w:pPr>
+      <w:r>
+        <w:rPr>
+          <w:rFonts w:ascii="等线" w:hAnsi="等线" w:eastAsia="等线"/>
+          <w:sz w:val="21"/>
+        </w:rPr>
+        <w:t>安全区修复必须按运行环境隔离。iPhone／iPad 添加主屏幕产生的外壳高度修复只能由 standalone 检测与苹果兼容开关共同启用；不得用全局 100vh／100dvh 规则改变安卓或私人 WKWebView。</w:t>
+      </w:r>
+    </w:p>
+    <w:p>
+      <w:pPr>
+        <w:spacing w:after="120" w:line="300" w:lineRule="auto"/>
+      </w:pPr>
+      <w:r>
+        <w:rPr>
+          <w:rFonts w:ascii="等线" w:hAnsi="等线" w:eastAsia="等线"/>
+          <w:sz w:val="21"/>
+        </w:rPr>
+        <w:t>美化包属于可移植外观数据，不得携带设备布局。widgets、appLayout、homeLayout、appDock、homeReferenceAppSlots 等字段既不能导出，也不能从旧美化包导入；完整备份仍保留全部布局数据。</w:t>
+      </w:r>
+    </w:p>
+    <w:p>
+      <w:r>
+        <w:br w:type="page"/>
+      </w:r>
+    </w:p>
+    <w:p>
+      <w:pPr>
+        <w:pStyle w:val="Heading1"/>
+      </w:pPr>
+      <w:r>
+        <w:rPr>
+          <w:rFonts w:ascii="等线" w:hAnsi="等线" w:eastAsia="等线"/>
+          <w:sz w:val="32"/>
+        </w:rPr>
+        <w:t>v927 补充｜玻璃首页长按拖动不再跳位</w:t>
+      </w:r>
+    </w:p>
+    <w:p>
+      <w:pPr>
+        <w:spacing w:after="120" w:line="300" w:lineRule="auto"/>
+      </w:pPr>
+      <w:r>
+        <w:rPr>
+          <w:rFonts w:ascii="等线" w:hAnsi="等线" w:eastAsia="等线"/>
+          <w:sz w:val="21"/>
+        </w:rPr>
+        <w:t>根因：玻璃首页常态保留 38px 顶部布局间距，但长按进入编辑状态时会命中旧规则，将该间距立即清为 0，导致整页上移 38px、手指与应用坐标错位，随后又回弹。</w:t>
+      </w:r>
+    </w:p>
+    <w:p>
+      <w:pPr>
+        <w:spacing w:after="120" w:line="300" w:lineRule="auto"/>
+      </w:pPr>
+      <w:r>
+        <w:rPr>
+          <w:rFonts w:ascii="等线" w:hAnsi="等线" w:eastAsia="等线"/>
+          <w:sz w:val="21"/>
+        </w:rPr>
+        <w:t>修复：玻璃主题在编辑状态继续保留 38px 间距；拖动幽灵不再额外缩放；补入 iOS touchmove/touchend 非被动处理，长按后可继续跟手移动并落到新槽位。</w:t>
+      </w:r>
+    </w:p>
+    <w:p>
+      <w:pPr>
+        <w:spacing w:after="120" w:line="300" w:lineRule="auto"/>
+      </w:pPr>
+      <w:r>
+        <w:rPr>
+          <w:rFonts w:ascii="等线" w:hAnsi="等线" w:eastAsia="等线"/>
+          <w:sz w:val="21"/>
+        </w:rPr>
+        <w:t>真实浏览器几何验证：390×844 iPhone 主屏幕模式下，首页 8 个名称均为完整 20px 行盒，底部外壳间隙为 0，长按前后拖动坐标差为 0，并成功改变槽位。安卓主屏幕环境不会启用苹果安全区类。</w:t>
       </w:r>
     </w:p>
     <w:sectPr>

</xml_diff>

<commit_message>
release: v945 home stability and account isolation
</commit_message>
<xml_diff>
--- a/docs/maintenance/AI开发项目_Bug修改规范.docx
+++ b/docs/maintenance/AI开发项目_Bug修改规范.docx
@@ -6852,6 +6852,83 @@
           <w:sz w:val="21"/>
         </w:rPr>
         <w:t>真实浏览器几何验证：390×844 iPhone 主屏幕模式下，首页 8 个名称均为完整 20px 行盒，底部外壳间隙为 0，长按前后拖动坐标差为 0，并成功改变槽位。安卓主屏幕环境不会启用苹果安全区类。</w:t>
+      </w:r>
+    </w:p>
+    <w:p>
+      <w:r>
+        <w:br w:type="page"/>
+      </w:r>
+    </w:p>
+    <w:p>
+      <w:pPr>
+        <w:pStyle w:val="Heading1"/>
+      </w:pPr>
+      <w:r>
+        <w:rPr>
+          <w:rFonts w:ascii="等线" w:hAnsi="等线" w:eastAsia="等线"/>
+          <w:sz w:val="32"/>
+        </w:rPr>
+        <w:t>新增强制规范｜宽屏隔离、消息删除与大小号边界（v945 起）</w:t>
+      </w:r>
+    </w:p>
+    <w:p>
+      <w:pPr>
+        <w:spacing w:after="120" w:line="300" w:lineRule="auto"/>
+      </w:pPr>
+      <w:r>
+        <w:rPr>
+          <w:rFonts w:ascii="等线" w:hAnsi="等线" w:eastAsia="等线"/>
+          <w:sz w:val="21"/>
+        </w:rPr>
+        <w:t>主页稀有设备修复必须使用窄范围媒体条件，并提供 360／390／393px 坐标未变化证据。401–649px 宽屏调整时要同时检查顶部仪表、唱片、双人组件、八个 App、页点、Dock 和第二页；不得只修用户截图里的一个组件。</w:t>
+      </w:r>
+    </w:p>
+    <w:p>
+      <w:pPr>
+        <w:spacing w:after="120" w:line="300" w:lineRule="auto"/>
+      </w:pPr>
+      <w:r>
+        <w:rPr>
+          <w:rFonts w:ascii="等线" w:hAnsi="等线" w:eastAsia="等线"/>
+          <w:sz w:val="21"/>
+        </w:rPr>
+        <w:t>主页手势必须保留 pointer 主路径，同时允许未被 pointer 接管的非被动 touchmove 作为回退；touchend、pointercancel、blur 和 visibilitychange 必须清理 pending pan、拖拽幽灵和占用状态。不得在 pointerdown 全局 preventDefault，也不得改变长按拖拽的稳定槽位与唯一性校验。</w:t>
+      </w:r>
+    </w:p>
+    <w:p>
+      <w:pPr>
+        <w:spacing w:after="120" w:line="300" w:lineRule="auto"/>
+      </w:pPr>
+      <w:r>
+        <w:rPr>
+          <w:rFonts w:ascii="等线" w:hAnsi="等线" w:eastAsia="等线"/>
+          <w:sz w:val="21"/>
+        </w:rPr>
+        <w:t>本人消息删除必须账号内持久化，只允许本人文字与图片；图片删除还要取消未完成识图的迟到回复并执行无引用媒体回收。不得把角色消息、撤回、引用或图片查看入口误改成删除。</w:t>
+      </w:r>
+    </w:p>
+    <w:p>
+      <w:pPr>
+        <w:spacing w:after="120" w:line="300" w:lineRule="auto"/>
+      </w:pPr>
+      <w:r>
+        <w:rPr>
+          <w:rFonts w:ascii="等线" w:hAnsi="等线" w:eastAsia="等线"/>
+          <w:sz w:val="21"/>
+        </w:rPr>
+        <w:t>小号必须是独立联系人：只读当前小号资料、聊天、摘要和小号记忆，不得读取大号称呼、关系、共同生活、好友来源、关系事件或主号记忆。允许的跨账号行为只有切回大号后的单向报备；同一段新增活动只报一次，小号有新聊天后才可再报，且提示必须禁止猜测两个账号是同一人。</w:t>
+      </w:r>
+    </w:p>
+    <w:p>
+      <w:pPr>
+        <w:spacing w:after="120" w:line="300" w:lineRule="auto"/>
+      </w:pPr>
+      <w:r>
+        <w:rPr>
+          <w:rFonts w:ascii="等线" w:hAnsi="等线" w:eastAsia="等线"/>
+          <w:sz w:val="21"/>
+        </w:rPr>
+        <w:t>私人 App 状态栏融合只能绘制系统安全区背景，不能把网页伸入状态栏。内置 AI 功能白名单固定为语音生成和影院字幕识别；普通聊天、聊天识图和聊天生图继续使用用户自己的外置配置。</w:t>
       </w:r>
     </w:p>
     <w:sectPr>

</xml_diff>

<commit_message>
release: retire built-in AI purchases
</commit_message>
<xml_diff>
--- a/docs/maintenance/AI开发项目_Bug修改规范.docx
+++ b/docs/maintenance/AI开发项目_Bug修改规范.docx
@@ -6929,6 +6929,59 @@
           <w:sz w:val="21"/>
         </w:rPr>
         <w:t>私人 App 状态栏融合只能绘制系统安全区背景，不能把网页伸入状态栏。内置 AI 功能白名单固定为语音生成和影院字幕识别；普通聊天、聊天识图和聊天生图继续使用用户自己的外置配置。</w:t>
+      </w:r>
+    </w:p>
+    <w:p>
+      <w:r>
+        <w:br w:type="page"/>
+      </w:r>
+    </w:p>
+    <w:p>
+      <w:pPr>
+        <w:pStyle w:val="Heading1"/>
+      </w:pPr>
+      <w:r>
+        <w:rPr>
+          <w:rFonts w:ascii="等线" w:hAnsi="等线" w:eastAsia="等线"/>
+          <w:sz w:val="32"/>
+        </w:rPr>
+        <w:t>新增强制规范｜收费入口下线必须前后端同时封口（v946 起）</w:t>
+      </w:r>
+    </w:p>
+    <w:p>
+      <w:pPr>
+        <w:spacing w:after="120" w:line="300" w:lineRule="auto"/>
+      </w:pPr>
+      <w:r>
+        <w:rPr>
+          <w:rFonts w:ascii="等线" w:hAnsi="等线" w:eastAsia="等线"/>
+          <w:sz w:val="21"/>
+        </w:rPr>
+        <w:t>关闭收费功能时，不得只隐藏套餐卡片。必须同时检查套餐数据、支付按钮、付款二维码或链接、新订单创建、凭证上传、联系方式、低余额引导、使用说明、Service Worker 缓存、安装包资源清单和服务端写入口。</w:t>
+      </w:r>
+    </w:p>
+    <w:p>
+      <w:pPr>
+        <w:spacing w:after="120" w:line="300" w:lineRule="auto"/>
+      </w:pPr>
+      <w:r>
+        <w:rPr>
+          <w:rFonts w:ascii="等线" w:hAnsi="等线" w:eastAsia="等线"/>
+          <w:sz w:val="21"/>
+        </w:rPr>
+        <w:t>服务端应在任何数据库写入、文件上传或付款处理前返回明确的已下线状态，避免旧客户端继续提交。账户响应不得再返回已下线套餐。历史余额、已有权益、流水、订单和退款核对数据必须保留只读收尾路径。</w:t>
+      </w:r>
+    </w:p>
+    <w:p>
+      <w:pPr>
+        <w:spacing w:after="120" w:line="300" w:lineRule="auto"/>
+      </w:pPr>
+      <w:r>
+        <w:rPr>
+          <w:rFonts w:ascii="等线" w:hAnsi="等线" w:eastAsia="等线"/>
+          <w:sz w:val="21"/>
+        </w:rPr>
+        <w:t>老用户使用与新购买必须分开验证：既要证明新订单／新凭证无法产生，也要证明既有余额可读取、内置语音仍可调用、已有专属音色仍能选择、历史订单和流水仍可查看。</w:t>
       </w:r>
     </w:p>
     <w:sectPr>

</xml_diff>

<commit_message>
fix: require verified alt-account reports
</commit_message>
<xml_diff>
--- a/docs/maintenance/AI开发项目_Bug修改规范.docx
+++ b/docs/maintenance/AI开发项目_Bug修改规范.docx
@@ -6982,6 +6982,71 @@
           <w:sz w:val="21"/>
         </w:rPr>
         <w:t>老用户使用与新购买必须分开验证：既要证明新订单／新凭证无法产生，也要证明既有余额可读取、内置语音仍可调用、已有专属音色仍能选择、历史订单和流水仍可查看。</w:t>
+      </w:r>
+    </w:p>
+    <w:p>
+      <w:r>
+        <w:br w:type="page"/>
+      </w:r>
+    </w:p>
+    <w:p>
+      <w:pPr>
+        <w:pStyle w:val="Heading1"/>
+      </w:pPr>
+      <w:r>
+        <w:rPr>
+          <w:rFonts w:ascii="等线" w:hAnsi="等线" w:eastAsia="等线"/>
+          <w:sz w:val="32"/>
+        </w:rPr>
+        <w:t>新增强制规范｜跨账号报备必须验证可见语义后再推进游标（v953 起）</w:t>
+      </w:r>
+    </w:p>
+    <w:p>
+      <w:pPr>
+        <w:spacing w:after="120" w:line="300" w:lineRule="auto"/>
+      </w:pPr>
+      <w:r>
+        <w:rPr>
+          <w:rFonts w:ascii="等线" w:hAnsi="等线" w:eastAsia="等线"/>
+          <w:sz w:val="21"/>
+        </w:rPr>
+        <w:t>报备队列的“接口调用成功”“生成了角色消息”与“报备交付成功”必须分开。不得因为本轮出现任意角色气泡就写入 reportedAt、_altReportAt 或 _altReportDeliveredAt；必须先验证最终可见内容确实说明了指定小号联系人及其联系行为。</w:t>
+      </w:r>
+    </w:p>
+    <w:p>
+      <w:pPr>
+        <w:spacing w:after="120" w:line="300" w:lineRule="auto"/>
+      </w:pPr>
+      <w:r>
+        <w:rPr>
+          <w:rFonts w:ascii="等线" w:hAnsi="等线" w:eastAsia="等线"/>
+          <w:sz w:val="21"/>
+        </w:rPr>
+        <w:t>每个待报备事件必须拥有稳定事件标记，并把标记写入最终可见的报备消息。恢复旧数据时只能以该标记或严格的具名报备语义作为证据；历史游标和 deliveredAt 不得自证成功。没有证据时必须恢复待处理状态并重新排队。</w:t>
+      </w:r>
+    </w:p>
+    <w:p>
+      <w:pPr>
+        <w:spacing w:after="120" w:line="300" w:lineRule="auto"/>
+      </w:pPr>
+      <w:r>
+        <w:rPr>
+          <w:rFonts w:ascii="等线" w:hAnsi="等线" w:eastAsia="等线"/>
+          <w:sz w:val="21"/>
+        </w:rPr>
+        <w:t>模型延续大号旧话题、否认联系、不记得、发服务型助手问候或只说泛泛的“有人联系我”，均视为报备失败。纠正请求必须隔离大号旧历史，只携带角色稳定设定和本次报备事件；纠正仍失败时允许使用事件快照生成简短事实型兜底，但不得编造事件之外的态度、关系或内容。</w:t>
+      </w:r>
+    </w:p>
+    <w:p>
+      <w:pPr>
+        <w:spacing w:after="120" w:line="300" w:lineRule="auto"/>
+      </w:pPr>
+      <w:r>
+        <w:rPr>
+          <w:rFonts w:ascii="等线" w:hAnsi="等线" w:eastAsia="等线"/>
+          <w:sz w:val="21"/>
+        </w:rPr>
+        <w:t>跨账号回归测试至少覆盖：旧话题续聊不得通过；不具名泛化不得通过；具名联系人加联系动作可以通过；失败不推进游标；成功只推进一次；新活动可再次报备；旧错误游标可修复；小号继续保持独立陌生人边界。</w:t>
       </w:r>
     </w:p>
     <w:sectPr>

</xml_diff>

<commit_message>
release: package private iOS 1.0.75
</commit_message>
<xml_diff>
--- a/docs/maintenance/AI开发项目_Bug修改规范.docx
+++ b/docs/maintenance/AI开发项目_Bug修改规范.docx
@@ -7047,6 +7047,59 @@
           <w:sz w:val="21"/>
         </w:rPr>
         <w:t>跨账号回归测试至少覆盖：旧话题续聊不得通过；不具名泛化不得通过；具名联系人加联系动作可以通过；失败不推进游标；成功只推进一次；新活动可再次报备；旧错误游标可修复；小号继续保持独立陌生人边界。</w:t>
+      </w:r>
+    </w:p>
+    <w:p>
+      <w:r>
+        <w:br w:type="page"/>
+      </w:r>
+    </w:p>
+    <w:p>
+      <w:pPr>
+        <w:pStyle w:val="Heading1"/>
+      </w:pPr>
+      <w:r>
+        <w:rPr>
+          <w:rFonts w:ascii="等线" w:hAnsi="等线" w:eastAsia="等线"/>
+          <w:sz w:val="32"/>
+        </w:rPr>
+        <w:t>发布补充规范｜共享网页修复进入私人 App 必须重建内置 Bundle（1.0.75 起）</w:t>
+      </w:r>
+    </w:p>
+    <w:p>
+      <w:pPr>
+        <w:spacing w:after="120" w:line="300" w:lineRule="auto"/>
+      </w:pPr>
+      <w:r>
+        <w:rPr>
+          <w:rFonts w:ascii="等线" w:hAnsi="等线" w:eastAsia="等线"/>
+          <w:sz w:val="21"/>
+        </w:rPr>
+        <w:t>网页核心修复只有经过清单重新生成 PhoneWeb.bundle 并升级私人构建号，才算进入私人 App。不得把网页已提交等同于私人安装包已更新，也不得从历史 ZIP 解压后只覆盖 app.js。</w:t>
+      </w:r>
+    </w:p>
+    <w:p>
+      <w:pPr>
+        <w:spacing w:after="120" w:line="300" w:lineRule="auto"/>
+      </w:pPr>
+      <w:r>
+        <w:rPr>
+          <w:rFonts w:ascii="等线" w:hAnsi="等线" w:eastAsia="等线"/>
+          <w:sz w:val="21"/>
+        </w:rPr>
+        <w:t>私人包发布前必须同时核对 MARKETING_VERSION、CURRENT_PROJECT_VERSION、__SMALL_PHONE_PRIVATE_BUILD__、设置页可见版本和安装说明；完整回归通过后再从全新暂存目录压缩。</w:t>
+      </w:r>
+    </w:p>
+    <w:p>
+      <w:pPr>
+        <w:spacing w:after="120" w:line="300" w:lineRule="auto"/>
+      </w:pPr>
+      <w:r>
+        <w:rPr>
+          <w:rFonts w:ascii="等线" w:hAnsi="等线" w:eastAsia="等线"/>
+          <w:sz w:val="21"/>
+        </w:rPr>
+        <w:t>交付目录只保留最新一个 ZIP；ZIP 内只允许完整 Xcode 工程、当前 Mac 编译说明和本次安装说明。历史说明、嵌套 ZIP、预览、缓存和受保护未提交现场一律不得进入。</w:t>
       </w:r>
     </w:p>
     <w:sectPr>

</xml_diff>

<commit_message>
fix: stabilize iOS music import and alt-account reports
</commit_message>
<xml_diff>
--- a/docs/maintenance/AI开发项目_Bug修改规范.docx
+++ b/docs/maintenance/AI开发项目_Bug修改规范.docx
@@ -7100,6 +7100,59 @@
           <w:sz w:val="21"/>
         </w:rPr>
         <w:t>交付目录只保留最新一个 ZIP；ZIP 内只允许完整 Xcode 工程、当前 Mac 编译说明和本次安装说明。历史说明、嵌套 ZIP、预览、缓存和受保护未提交现场一律不得进入。</w:t>
+      </w:r>
+    </w:p>
+    <w:p>
+      <w:r>
+        <w:br w:type="page"/>
+      </w:r>
+    </w:p>
+    <w:p>
+      <w:pPr>
+        <w:pStyle w:val="Heading1"/>
+      </w:pPr>
+      <w:r>
+        <w:rPr>
+          <w:rFonts w:ascii="等线" w:hAnsi="等线" w:eastAsia="等线"/>
+          <w:sz w:val="32"/>
+        </w:rPr>
+        <w:t>发布补充规范｜小号跨账号事件必须可交付、不可机械复述（1.0.76 起）</w:t>
+      </w:r>
+    </w:p>
+    <w:p>
+      <w:pPr>
+        <w:spacing w:after="120" w:line="300" w:lineRule="auto"/>
+      </w:pPr>
+      <w:r>
+        <w:rPr>
+          <w:rFonts w:ascii="等线" w:hAnsi="等线" w:eastAsia="等线"/>
+          <w:sz w:val="21"/>
+        </w:rPr>
+        <w:t>小号联系事件不得只依赖模型成功才标记完成。必须先持久化结构化事实，再生成角色口吻报备；模型失败时使用同一结构化事实自然交付，完成后才推进游标。</w:t>
+      </w:r>
+    </w:p>
+    <w:p>
+      <w:pPr>
+        <w:spacing w:after="120" w:line="300" w:lineRule="auto"/>
+      </w:pPr>
+      <w:r>
+        <w:rPr>
+          <w:rFonts w:ascii="等线" w:hAnsi="等线" w:eastAsia="等线"/>
+          <w:sz w:val="21"/>
+        </w:rPr>
+        <w:t>报备内容禁止输出“某某：……；我：……”式原始记录、逐句转录、接口错误或客服式问候。只说明谁联系、主要话题和角色如何处理，保持角色口吻和关系上下文。</w:t>
+      </w:r>
+    </w:p>
+    <w:p>
+      <w:pPr>
+        <w:spacing w:after="120" w:line="300" w:lineRule="auto"/>
+      </w:pPr>
+      <w:r>
+        <w:rPr>
+          <w:rFonts w:ascii="等线" w:hAnsi="等线" w:eastAsia="等线"/>
+          <w:sz w:val="21"/>
+        </w:rPr>
+        <w:t>涉及联系人、好友申请、刚才聊天等本地私人状态的问题，除非用户明确要求搜索互联网，否则不得触发联网。iOS 文件选择器必须按媒体类型拆分，避免混合 accept 造成系统文件灰显。</w:t>
       </w:r>
     </w:p>
     <w:sectPr>

</xml_diff>

<commit_message>
feat: add NetEase official player in v957
</commit_message>
<xml_diff>
--- a/docs/maintenance/AI开发项目_Bug修改规范.docx
+++ b/docs/maintenance/AI开发项目_Bug修改规范.docx
@@ -7153,6 +7153,45 @@
           <w:sz w:val="21"/>
         </w:rPr>
         <w:t>涉及联系人、好友申请、刚才聊天等本地私人状态的问题，除非用户明确要求搜索互联网，否则不得触发联网。iOS 文件选择器必须按媒体类型拆分，避免混合 accept 造成系统文件灰显。</w:t>
+      </w:r>
+    </w:p>
+    <w:p/>
+    <w:p>
+      <w:pPr>
+        <w:pStyle w:val="Heading1"/>
+      </w:pPr>
+      <w:r>
+        <w:rPr>
+          <w:rFonts w:ascii="Microsoft YaHei" w:hAnsi="Microsoft YaHei" w:eastAsia="微软雅黑"/>
+        </w:rPr>
+        <w:t>新增强制规范｜商业音乐平台外链播放器隔离（v957 起）</w:t>
+      </w:r>
+    </w:p>
+    <w:p>
+      <w:pPr/>
+      <w:r>
+        <w:rPr>
+          <w:rFonts w:ascii="Microsoft YaHei" w:hAnsi="Microsoft YaHei" w:eastAsia="微软雅黑"/>
+        </w:rPr>
+        <w:t>接入商业音乐平台时，只能使用平台明确提供的官方页面、正式授权接口或用户自己合法持有的本地文件。禁止抓取受保护音源、复制会员播放地址、绕过登录／地区／版权／DRM、接入已归档的非官方解灰接口，也不得把试听能力描述为完整会员曲库。</w:t>
+      </w:r>
+    </w:p>
+    <w:p>
+      <w:pPr/>
+      <w:r>
+        <w:rPr>
+          <w:rFonts w:ascii="Microsoft YaHei" w:hAnsi="Microsoft YaHei" w:eastAsia="微软雅黑"/>
+        </w:rPr>
+        <w:t>外链播放器必须同时进行输入和原生导航双重白名单校验：限制 HTTPS、精确主机、精确允许路径和子框架；不得因为一个播放器而整体允许 WKWebView 远程导航。无效链接、播放器失效、版权受限或第三方服务异常必须局部失败，不能阻塞或替换 Apple 预览、Audius、本地音乐、导入导出、歌曲保存和一起听。</w:t>
+      </w:r>
+    </w:p>
+    <w:p>
+      <w:pPr/>
+      <w:r>
+        <w:rPr>
+          <w:rFonts w:ascii="Microsoft YaHei" w:hAnsi="Microsoft YaHei" w:eastAsia="微软雅黑"/>
+        </w:rPr>
+        <w:t>回归测试至少覆盖允许的歌曲／专辑／歌单链接、拒绝非目标域名和异常路径、原生主框架不得留在 App、旧音乐提供方仍存在、无抓源或绕过代码，以及网页源与 PhoneWeb.bundle 一致。发布时仍需升级网页与私人构建号、重建 Bundle，并明确区分 Windows 自动测试、浏览器验证和真实 iPhone 验收。</w:t>
       </w:r>
     </w:p>
     <w:sectPr>

</xml_diff>

<commit_message>
fix proactive push boundaries and theme arrow
</commit_message>
<xml_diff>
--- a/docs/maintenance/AI开发项目_Bug修改规范.docx
+++ b/docs/maintenance/AI开发项目_Bug修改规范.docx
@@ -7192,6 +7192,100 @@
           <w:rFonts w:ascii="Microsoft YaHei" w:hAnsi="Microsoft YaHei" w:eastAsia="微软雅黑"/>
         </w:rPr>
         <w:t>回归测试至少覆盖允许的歌曲／专辑／歌单链接、拒绝非目标域名和异常路径、原生主框架不得留在 App、旧音乐提供方仍存在、无抓源或绕过代码，以及网页源与 PhoneWeb.bundle 一致。发布时仍需升级网页与私人构建号、重建 Bundle，并明确区分 Windows 自动测试、浏览器验证和真实 iPhone 验收。</w:t>
+      </w:r>
+    </w:p>
+    <w:p>
+      <w:r>
+        <w:br w:type="page"/>
+      </w:r>
+    </w:p>
+    <w:p>
+      <w:pPr>
+        <w:pStyle w:val="Heading1"/>
+      </w:pPr>
+      <w:r>
+        <w:rPr>
+          <w:rFonts w:ascii="等线" w:hAnsi="等线" w:eastAsia="等线"/>
+          <w:sz w:val="32"/>
+        </w:rPr>
+        <w:t>发布补充规范｜主动消息必须区分已结束回合与临时暂停（1.0.80 起）</w:t>
+      </w:r>
+    </w:p>
+    <w:p>
+      <w:pPr>
+        <w:spacing w:after="120" w:line="300" w:lineRule="auto"/>
+      </w:pPr>
+      <w:r>
+        <w:rPr>
+          <w:rFonts w:ascii="等线" w:hAnsi="等线" w:eastAsia="等线"/>
+          <w:sz w:val="21"/>
+        </w:rPr>
+        <w:t>随机主动消息不得仅凭最近用户文本生成。必须先判断该用户消息之后是否已有正常角色回复：已有回复代表回合结束，只能把历史当事实背景并从独立新事件开场；没有回复时，定时主动任务必须静默，交给正常回复或明确接力任务处理。输出去重不能替代回合边界判断。</w:t>
+      </w:r>
+    </w:p>
+    <w:p>
+      <w:pPr>
+        <w:spacing w:after="120" w:line="300" w:lineRule="auto"/>
+      </w:pPr>
+      <w:r>
+        <w:rPr>
+          <w:rFonts w:ascii="等线" w:hAnsi="等线" w:eastAsia="等线"/>
+          <w:sz w:val="21"/>
+        </w:rPr>
+        <w:t>后台主动联系的持久偏好与临时场景暂停必须使用不同字段。enabled 只能由用户的长期开关决定；线下约会、共同生活面对面、通话、睡眠等状态写入 suspended，并允许任务顺延。任何临时状态都不得把云端角色资料永久同步为 disabled。</w:t>
+      </w:r>
+    </w:p>
+    <w:p>
+      <w:pPr>
+        <w:spacing w:after="120" w:line="300" w:lineRule="auto"/>
+      </w:pPr>
+      <w:r>
+        <w:rPr>
+          <w:rFonts w:ascii="等线" w:hAnsi="等线" w:eastAsia="等线"/>
+          <w:sz w:val="21"/>
+        </w:rPr>
+        <w:t>修复后台推送时必须逐项核对明确任务：回复接力、设备接力、一分钟测试、App 查看测试；并核对普通任务的每日额度、睡眠、通话、随机静默、去重和通知头像。部署成功与 Windows 回归不能写成 Mac 编译或真实 iPhone 后台／强退推送通过。</w:t>
+      </w:r>
+    </w:p>
+    <w:p>
+      <w:r>
+        <w:br w:type="page"/>
+      </w:r>
+    </w:p>
+    <w:p>
+      <w:pPr>
+        <w:pStyle w:val="Heading1"/>
+      </w:pPr>
+      <w:r>
+        <w:rPr>
+          <w:rFonts w:ascii="等线" w:hAnsi="等线" w:eastAsia="等线"/>
+          <w:sz w:val="32"/>
+        </w:rPr>
+        <w:t>界面补充规范｜跨层固定控件必须跟随主题根类</w:t>
+      </w:r>
+    </w:p>
+    <w:p>
+      <w:pPr>
+        <w:spacing w:after="120" w:line="300" w:lineRule="auto"/>
+      </w:pPr>
+      <w:r>
+        <w:rPr>
+          <w:rFonts w:ascii="等线" w:hAnsi="等线" w:eastAsia="等线"/>
+          <w:sz w:val="21"/>
+        </w:rPr>
+        <w:t>主题相关控件若位于页面主题容器之外，不能依赖容器后代选择器。应使用已经由运行时维护的根节点主题类做最小覆盖，并逐个列出受支持主题。</w:t>
+      </w:r>
+    </w:p>
+    <w:p>
+      <w:pPr>
+        <w:spacing w:after="120" w:line="300" w:lineRule="auto"/>
+      </w:pPr>
+      <w:r>
+        <w:rPr>
+          <w:rFonts w:ascii="等线" w:hAnsi="等线" w:eastAsia="等线"/>
+          <w:sz w:val="21"/>
+        </w:rPr>
+        <w:t>为跨层控件补主题时不得顺带改动尺寸、定位、动画、点击函数、显示条件或其他同名前缀元素。要求保留原主题时，应以“不增加该主题覆盖”作为硬门槛并写入测试。</w:t>
       </w:r>
     </w:p>
     <w:sectPr>

</xml_diff>

<commit_message>
sync light theme shell colors
</commit_message>
<xml_diff>
--- a/docs/maintenance/AI开发项目_Bug修改规范.docx
+++ b/docs/maintenance/AI开发项目_Bug修改规范.docx
@@ -7286,6 +7286,64 @@
           <w:sz w:val="21"/>
         </w:rPr>
         <w:t>为跨层控件补主题时不得顺带改动尺寸、定位、动画、点击函数、显示条件或其他同名前缀元素。要求保留原主题时，应以“不增加该主题覆盖”作为硬门槛并写入测试。</w:t>
+      </w:r>
+    </w:p>
+    <w:p>
+      <w:r>
+        <w:br w:type="page"/>
+      </w:r>
+    </w:p>
+    <w:p>
+      <w:pPr>
+        <w:pStyle w:val="Heading1"/>
+      </w:pPr>
+      <w:r>
+        <w:rPr>
+          <w:rFonts w:ascii="等线" w:hAnsi="等线" w:eastAsia="等线"/>
+          <w:sz w:val="32"/>
+        </w:rPr>
+        <w:t>界面补充规范｜亮色主题卡片必须同时校验文字对比度</w:t>
+      </w:r>
+    </w:p>
+    <w:p>
+      <w:pPr>
+        <w:spacing w:after="120" w:line="300" w:lineRule="auto"/>
+      </w:pPr>
+      <w:r>
+        <w:rPr>
+          <w:rFonts w:ascii="等线" w:hAnsi="等线" w:eastAsia="等线"/>
+          <w:sz w:val="21"/>
+        </w:rPr>
+        <w:t>把暗色玻璃改为亮色主题时，必须同时指定可读的深色文字、边框和阴影，不能只提高背景透明度后继续使用白字。主题覆盖范围应限制到目标子卡片，纯黑主题要求保持时不得新增对应覆盖。</w:t>
+      </w:r>
+    </w:p>
+    <w:p>
+      <w:r>
+        <w:br w:type="page"/>
+      </w:r>
+    </w:p>
+    <w:p>
+      <w:pPr>
+        <w:pStyle w:val="Heading1"/>
+      </w:pPr>
+      <w:r>
+        <w:rPr>
+          <w:rFonts w:ascii="等线" w:hAnsi="等线" w:eastAsia="等线"/>
+          <w:sz w:val="32"/>
+        </w:rPr>
+        <w:t>原生外壳补充规范｜系统安全区换色不得移动网页边界</w:t>
+      </w:r>
+    </w:p>
+    <w:p>
+      <w:pPr>
+        <w:spacing w:after="120" w:line="300" w:lineRule="auto"/>
+      </w:pPr>
+      <w:r>
+        <w:rPr>
+          <w:rFonts w:ascii="等线" w:hAnsi="等线" w:eastAsia="等线"/>
+          <w:sz w:val="21"/>
+        </w:rPr>
+        <w:t>需要按网页主题重绘 iOS 系统安全区时，只允许改变原生安全区背景及状态栏内容明暗，不得让 WKWebView 延伸到顶部状态栏或重新加入底部动态颜色采样。主题消息必须限制为固定白名单并提供纯黑回退；浅色背景必须配深色系统图标，深色背景必须配浅色系统图标。</w:t>
       </w:r>
     </w:p>
     <w:sectPr>

</xml_diff>

<commit_message>
add independent music disc colors
</commit_message>
<xml_diff>
--- a/docs/maintenance/AI开发项目_Bug修改规范.docx
+++ b/docs/maintenance/AI开发项目_Bug修改规范.docx
@@ -7344,6 +7344,47 @@
           <w:sz w:val="21"/>
         </w:rPr>
         <w:t>需要按网页主题重绘 iOS 系统安全区时，只允许改变原生安全区背景及状态栏内容明暗，不得让 WKWebView 延伸到顶部状态栏或重新加入底部动态颜色采样。主题消息必须限制为固定白名单并提供纯黑回退；浅色背景必须配深色系统图标，深色背景必须配浅色系统图标。</w:t>
+      </w:r>
+    </w:p>
+    <w:p>
+      <w:r>
+        <w:br w:type="page"/>
+      </w:r>
+    </w:p>
+    <w:p>
+      <w:pPr>
+        <w:pStyle w:val="Heading1"/>
+      </w:pPr>
+      <w:r>
+        <w:rPr>
+          <w:rFonts w:ascii="等线" w:hAnsi="等线" w:eastAsia="等线"/>
+          <w:sz w:val="32"/>
+        </w:rPr>
+        <w:t>音乐界面补充规范｜应用内独立配色不得污染全局主题</w:t>
+      </w:r>
+    </w:p>
+    <w:p>
+      <w:pPr>
+        <w:spacing w:after="120" w:line="300" w:lineRule="auto"/>
+      </w:pPr>
+      <w:r>
+        <w:rPr>
+          <w:rFonts w:ascii="等线" w:hAnsi="等线" w:eastAsia="等线"/>
+          <w:sz w:val="21"/>
+        </w:rPr>
+        <w:t>音乐播放器内部的唱片配色必须由音乐自己的持久状态控制，不得复用主屏 north-pack-* 根类。选择器作用域必须同时包含音乐播放页根类和目标控件，禁止改写主屏唱片、全局强调色、进度条、发送按钮或其他同色控件。</w:t>
+      </w:r>
+    </w:p>
+    <w:p>
+      <w:pPr>
+        <w:spacing w:after="120" w:line="300" w:lineRule="auto"/>
+      </w:pPr>
+      <w:r>
+        <w:rPr>
+          <w:rFonts w:ascii="等线" w:hAnsi="等线" w:eastAsia="等线"/>
+          <w:sz w:val="21"/>
+        </w:rPr>
+        <w:t>浅色控件与相邻浅色装饰可能重叠时，必须单独提供深色边界与图标对比度。新增可选颜色必须同时验证默认值、非法值回退、保存恢复、整包／分首备份导入，以及四种颜色之间连续切换。</w:t>
       </w:r>
     </w:p>
     <w:sectPr>

</xml_diff>

<commit_message>
release v959 private build 81
</commit_message>
<xml_diff>
--- a/docs/maintenance/AI开发项目_Bug修改规范.docx
+++ b/docs/maintenance/AI开发项目_Bug修改规范.docx
@@ -7385,6 +7385,47 @@
           <w:sz w:val="21"/>
         </w:rPr>
         <w:t>浅色控件与相邻浅色装饰可能重叠时，必须单独提供深色边界与图标对比度。新增可选颜色必须同时验证默认值、非法值回退、保存恢复、整包／分首备份导入，以及四种颜色之间连续切换。</w:t>
+      </w:r>
+    </w:p>
+    <w:p>
+      <w:r>
+        <w:br w:type="page"/>
+      </w:r>
+    </w:p>
+    <w:p>
+      <w:pPr>
+        <w:pStyle w:val="Heading1"/>
+      </w:pPr>
+      <w:r>
+        <w:rPr>
+          <w:rFonts w:ascii="等线" w:hAnsi="等线" w:eastAsia="等线"/>
+          <w:sz w:val="32"/>
+        </w:rPr>
+        <w:t>发布补充规范｜用户可见入口与主题视觉必须按实际交付层复核</w:t>
+      </w:r>
+    </w:p>
+    <w:p>
+      <w:pPr>
+        <w:spacing w:after="120" w:line="300" w:lineRule="auto"/>
+      </w:pPr>
+      <w:r>
+        <w:rPr>
+          <w:rFonts w:ascii="等线" w:hAnsi="等线" w:eastAsia="等线"/>
+          <w:sz w:val="21"/>
+        </w:rPr>
+        <w:t>新增设置不能只在模板中出现，还要给用户一个文字明确、可直接点击、能显示当前值的入口，并验证网页、私人 PhoneWeb.bundle 和最终 ZIP 三层都包含它。主题安全区修改必须同时覆盖网页状态条、原生安全区、冷启动桥时序和主题切换重发；静态源码存在不等于真机已生效。</w:t>
+      </w:r>
+    </w:p>
+    <w:p>
+      <w:pPr>
+        <w:spacing w:after="120" w:line="300" w:lineRule="auto"/>
+      </w:pPr>
+      <w:r>
+        <w:rPr>
+          <w:rFonts w:ascii="等线" w:hAnsi="等线" w:eastAsia="等线"/>
+          <w:sz w:val="21"/>
+        </w:rPr>
+        <w:t>玻璃主题的亮色适配不得用接近不透明的浅色块代替玻璃。应同时验证背景可透出、文字对比度、边框和模糊强度，并覆盖图标包主题与线条配色两条状态路径。</w:t>
       </w:r>
     </w:p>
     <w:sectPr>

</xml_diff>

<commit_message>
release: v965 role autonomy and screen share stability
</commit_message>
<xml_diff>
--- a/docs/maintenance/AI开发项目_Bug修改规范.docx
+++ b/docs/maintenance/AI开发项目_Bug修改规范.docx
@@ -7426,6 +7426,71 @@
           <w:sz w:val="21"/>
         </w:rPr>
         <w:t>玻璃主题的亮色适配不得用接近不透明的浅色块代替玻璃。应同时验证背景可透出、文字对比度、边框和模糊强度，并覆盖图标包主题与线条配色两条状态路径。</w:t>
+      </w:r>
+    </w:p>
+    <w:p>
+      <w:r>
+        <w:br w:type="page"/>
+      </w:r>
+    </w:p>
+    <w:p>
+      <w:pPr>
+        <w:pStyle w:val="Heading1"/>
+      </w:pPr>
+      <w:r>
+        <w:rPr>
+          <w:rFonts w:ascii="等线" w:hAnsi="等线" w:eastAsia="等线"/>
+          <w:sz w:val="32"/>
+        </w:rPr>
+        <w:t>发布补充规范｜角色自主不能丢失事实，媒体会话与大型玻璃必须分层处理（1.0.87 起）</w:t>
+      </w:r>
+    </w:p>
+    <w:p>
+      <w:pPr>
+        <w:spacing w:after="120" w:line="300" w:lineRule="auto"/>
+      </w:pPr>
+      <w:r>
+        <w:rPr>
+          <w:rFonts w:ascii="等线" w:hAnsi="等线" w:eastAsia="等线"/>
+          <w:sz w:val="21"/>
+        </w:rPr>
+        <w:t>角色自然化不能等同于删除功能知识和事件事实。基础人设、世界书、当前真实事件与记忆必须先于功能提示；系统只说明角色拥有哪些能力和边界，不替角色决定情绪、关系姿态和使用时机。挂断、拒接、失联、通话、礼物、约会、共同观看等实际动作必须继续写入上下文，否则功能会变成角色不知道自己做过什么的空壳。</w:t>
+      </w:r>
+    </w:p>
+    <w:p>
+      <w:pPr>
+        <w:spacing w:after="120" w:line="300" w:lineRule="auto"/>
+      </w:pPr>
+      <w:r>
+        <w:rPr>
+          <w:rFonts w:ascii="等线" w:hAnsi="等线" w:eastAsia="等线"/>
+          <w:sz w:val="21"/>
+        </w:rPr>
+        <w:t>角色语音与外部媒体并存时，必须区分普通通话和 shared media。普通通话可在角色发声前暂停／重建识别；放映室或系统屏幕共享已承载外部媒体时，不得停用或重设当前 AVAudioSession。每次修改必须分别回归普通通话、放映室、微信外部屏幕共享和后台原生播放。</w:t>
+      </w:r>
+    </w:p>
+    <w:p>
+      <w:pPr>
+        <w:spacing w:after="120" w:line="300" w:lineRule="auto"/>
+      </w:pPr>
+      <w:r>
+        <w:rPr>
+          <w:rFonts w:ascii="等线" w:hAnsi="等线" w:eastAsia="等线"/>
+          <w:sz w:val="21"/>
+        </w:rPr>
+        <w:t>WKWebView 出现组件占位仍在但内容层消失、滑动后全页失去点击时，应先检查大面积 backdrop-filter 的合成层，而不是直接归因于手机发热或数据丢失。修复应优先限定到私人原生 App 和大型容器，保留主题、布局、图标与网页／Android 路径，并对拖动和点击命中做回归。</w:t>
+      </w:r>
+    </w:p>
+    <w:p>
+      <w:pPr>
+        <w:spacing w:after="120" w:line="300" w:lineRule="auto"/>
+      </w:pPr>
+      <w:r>
+        <w:rPr>
+          <w:rFonts w:ascii="等线" w:hAnsi="等线" w:eastAsia="等线"/>
+          <w:sz w:val="21"/>
+        </w:rPr>
+        <w:t>上班、下班等主动事件必须来自用户已配置的真实作息，并独立于随机当前活动。服务端要按账号时区、工作日、请假和每日幂等键判断；提示只提供真实事件，不编造未配置的同事、会议、加班或路线。Windows 测试与函数部署均不能写成真实 iPhone APNs 已验收。</w:t>
       </w:r>
     </w:p>
     <w:sectPr>

</xml_diff>

<commit_message>
fix: stabilize home taps and component rendering in v966
</commit_message>
<xml_diff>
--- a/docs/maintenance/AI开发项目_Bug修改规范.docx
+++ b/docs/maintenance/AI开发项目_Bug修改规范.docx
@@ -7491,6 +7491,59 @@
           <w:sz w:val="21"/>
         </w:rPr>
         <w:t>上班、下班等主动事件必须来自用户已配置的真实作息，并独立于随机当前活动。服务端要按账号时区、工作日、请假和每日幂等键判断；提示只提供真实事件，不编造未配置的同事、会议、加班或路线。Windows 测试与函数部署均不能写成真实 iPhone APNs 已验收。</w:t>
+      </w:r>
+    </w:p>
+    <w:p>
+      <w:r>
+        <w:br w:type="page"/>
+      </w:r>
+    </w:p>
+    <w:p>
+      <w:pPr>
+        <w:pStyle w:val="Heading1"/>
+      </w:pPr>
+      <w:r>
+        <w:rPr>
+          <w:rFonts w:ascii="等线" w:hAnsi="等线" w:eastAsia="等线"/>
+          <w:sz w:val="32"/>
+        </w:rPr>
+        <w:t>发布补充规范｜主屏点按与翻页不得同时由两套手势接管（1.0.88 起）</w:t>
+      </w:r>
+    </w:p>
+    <w:p>
+      <w:pPr>
+        <w:spacing w:after="120" w:line="300" w:lineRule="auto"/>
+      </w:pPr>
+      <w:r>
+        <w:rPr>
+          <w:rFonts w:ascii="等线" w:hAnsi="等线" w:eastAsia="等线"/>
+          <w:sz w:val="21"/>
+        </w:rPr>
+        <w:t>遇到“滑动顺畅但点击迟钝”时，应优先检查 touch-action、pointer/touch 监听、位移阈值、preventDefault、pointer capture 与 click 回退之间的竞争，不能继续只调合成层或把问题归因于发热。普通触摸应只有一个滚动所有者；长按成立前不得接管原生翻页。</w:t>
+      </w:r>
+    </w:p>
+    <w:p>
+      <w:pPr>
+        <w:spacing w:after="120" w:line="300" w:lineRule="auto"/>
+      </w:pPr>
+      <w:r>
+        <w:rPr>
+          <w:rFonts w:ascii="等线" w:hAnsi="等线" w:eastAsia="等线"/>
+          <w:sz w:val="21"/>
+        </w:rPr>
+        <w:t>绝对定位组件位于横向滚动页时，不得未经真机证据使用 content-visibility:auto 或类似屏外卸载优化。若出现背景仍在但组件内容消失，应同时核对 computed content-visibility、几何框、命中状态和拖拽遮罩清理；页面隐藏、失焦及 pointercancel 都必须恢复透明度、pointer-events 与编辑类名。</w:t>
+      </w:r>
+    </w:p>
+    <w:p>
+      <w:pPr>
+        <w:spacing w:after="120" w:line="300" w:lineRule="auto"/>
+      </w:pPr>
+      <w:r>
+        <w:rPr>
+          <w:rFonts w:ascii="等线" w:hAnsi="等线" w:eastAsia="等线"/>
+          <w:sz w:val="21"/>
+        </w:rPr>
+        <w:t>修复主屏交互时必须保留长按拖拽、主题、图标、布局和页面翻页，并对角色人设、世界书、记忆、主动功能、媒体会话和后台通知做全量回归。浏览器移动端模拟只证明 DOM、绘制与点按链路在该环境成立，不能替代 Mac 编译和真实 iPhone 的热压力、内存压力及连续使用验收。</w:t>
       </w:r>
     </w:p>
     <w:sectPr>

</xml_diff>

<commit_message>
fix: recover model replies and isolate device data in v967
</commit_message>
<xml_diff>
--- a/docs/maintenance/AI开发项目_Bug修改规范.docx
+++ b/docs/maintenance/AI开发项目_Bug修改规范.docx
@@ -7544,6 +7544,59 @@
           <w:sz w:val="21"/>
         </w:rPr>
         <w:t>修复主屏交互时必须保留长按拖拽、主题、图标、布局和页面翻页，并对角色人设、世界书、记忆、主动功能、媒体会话和后台通知做全量回归。浏览器移动端模拟只证明 DOM、绘制与点按链路在该环境成立，不能替代 Mac 编译和真实 iPhone 的热压力、内存压力及连续使用验收。</w:t>
+      </w:r>
+    </w:p>
+    <w:p>
+      <w:r>
+        <w:br w:type="page"/>
+      </w:r>
+    </w:p>
+    <w:p>
+      <w:pPr>
+        <w:pStyle w:val="Heading1"/>
+      </w:pPr>
+      <w:r>
+        <w:rPr>
+          <w:rFonts w:ascii="等线" w:hAnsi="等线" w:eastAsia="等线"/>
+          <w:sz w:val="32"/>
+        </w:rPr>
+        <w:t>发布补充规范｜模型可见正文、设备透明兼容与网页数据隔离（1.0.89 起）</w:t>
+      </w:r>
+    </w:p>
+    <w:p>
+      <w:pPr>
+        <w:spacing w:after="120" w:line="300" w:lineRule="auto"/>
+      </w:pPr>
+      <w:r>
+        <w:rPr>
+          <w:rFonts w:ascii="等线" w:hAnsi="等线" w:eastAsia="等线"/>
+          <w:sz w:val="21"/>
+        </w:rPr>
+        <w:t>接入兼容模型时，校验、格式修复、重复检查、气泡拆分、存储和无回复诊断必须消费同一份已解包的可见正文。常见 JSON／代码围栏可以兼容提取，但空对象、无可见字段或畸形 JSON 不得直接显示为角色台词。格式不合规与不安全拒绝／OOC 必须分流，不能用同一清空规则把可恢复正文丢掉。</w:t>
+      </w:r>
+    </w:p>
+    <w:p>
+      <w:pPr>
+        <w:spacing w:after="120" w:line="300" w:lineRule="auto"/>
+      </w:pPr>
+      <w:r>
+        <w:rPr>
+          <w:rFonts w:ascii="等线" w:hAnsi="等线" w:eastAsia="等线"/>
+          <w:sz w:val="21"/>
+        </w:rPr>
+        <w:t>玻璃卡片在部分设备透明时，必须先核对该设备是否走了禁用 backdrop-filter 的稳定分支、背景实际 alpha、文字底色和合成层，不能仅凭用户当前主题把根因写成黑色主题。兼容修复应覆盖实际受影响的所有色板，并限定在有证据的原生／设备分支，避免全局改变网页版或正常设备的视觉。</w:t>
+      </w:r>
+    </w:p>
+    <w:p>
+      <w:pPr>
+        <w:spacing w:after="120" w:line="300" w:lineRule="auto"/>
+      </w:pPr>
+      <w:r>
+        <w:rPr>
+          <w:rFonts w:ascii="等线" w:hAnsi="等线" w:eastAsia="等线"/>
+          <w:sz w:val="21"/>
+        </w:rPr>
+        <w:t>网页版与私人 App 共享源码时，应通过运行环境门禁隔离真实手机缓存、设备权限、原生控制提示和主动上下文；不得删除网页原有查岗应用、角色授权、内置锁定和每日限额等业务能力来实现隔离。导入旧状态后也必须保证公开网页不能把残留伴生快照当成实时 iPhone 数据。</w:t>
       </w:r>
     </w:p>
     <w:sectPr>

</xml_diff>

<commit_message>
release: v968 shared reactions voice diary
</commit_message>
<xml_diff>
--- a/docs/maintenance/AI开发项目_Bug修改规范.docx
+++ b/docs/maintenance/AI开发项目_Bug修改规范.docx
@@ -7597,6 +7597,59 @@
           <w:sz w:val="21"/>
         </w:rPr>
         <w:t>网页版与私人 App 共享源码时，应通过运行环境门禁隔离真实手机缓存、设备权限、原生控制提示和主动上下文；不得删除网页原有查岗应用、角色授权、内置锁定和每日限额等业务能力来实现隔离。导入旧状态后也必须保证公开网页不能把残留伴生快照当成实时 iPhone 数据。</w:t>
+      </w:r>
+    </w:p>
+    <w:p>
+      <w:r>
+        <w:br w:type="page"/>
+      </w:r>
+    </w:p>
+    <w:p>
+      <w:pPr>
+        <w:pStyle w:val="Heading1"/>
+      </w:pPr>
+      <w:r>
+        <w:rPr>
+          <w:rFonts w:ascii="等线" w:hAnsi="等线" w:eastAsia="等线"/>
+          <w:sz w:val="32"/>
+        </w:rPr>
+        <w:t>发布补充规范｜上下文事件、按需日记与宽松内容去重（1.0.90 起）</w:t>
+      </w:r>
+    </w:p>
+    <w:p>
+      <w:pPr>
+        <w:spacing w:after="120" w:line="300" w:lineRule="auto"/>
+      </w:pPr>
+      <w:r>
+        <w:rPr>
+          <w:rFonts w:ascii="等线" w:hAnsi="等线" w:eastAsia="等线"/>
+          <w:sz w:val="21"/>
+        </w:rPr>
+        <w:t>向角色注入屏幕共享开始、结束等状态事件时，必须同时提供本轮真实上下文，并要求角色表现自然反应；不能把“开始了／结束了”当作可直接展示的角色回复。外语通话仍须保持原文与逐句中文翻译。质量修复最多一次，且重试必须复用原上下文，不能把上下文替换成孤立状态词。</w:t>
+      </w:r>
+    </w:p>
+    <w:p>
+      <w:pPr>
+        <w:spacing w:after="120" w:line="300" w:lineRule="auto"/>
+      </w:pPr>
+      <w:r>
+        <w:rPr>
+          <w:rFonts w:ascii="等线" w:hAnsi="等线" w:eastAsia="等线"/>
+          <w:sz w:val="21"/>
+        </w:rPr>
+        <w:t>角色私密应用的密码域必须彼此独立。日记默认密码可由相遇日期 MMDD 派生，角色修改日记密码不得连带修改手机密码；第一次错误输入即形成可被角色发现的真实事件。日记只在用户打开应用时按需准备当天内容，不得在后台累计空白日期或自动补写多日；清理只删除明确带 expiresAt 且到期的未收藏条目，旧无期限数据必须保留。</w:t>
+      </w:r>
+    </w:p>
+    <w:p>
+      <w:pPr>
+        <w:spacing w:after="120" w:line="300" w:lineRule="auto"/>
+      </w:pPr>
+      <w:r>
+        <w:rPr>
+          <w:rFonts w:ascii="等线" w:hAnsi="等线" w:eastAsia="等线"/>
+          <w:sz w:val="21"/>
+        </w:rPr>
+        <w:t>生成日常推特时，必须结合角色设置和近期真实生活，但内容去重不能阻断正常表达。仅完全相同或近乎逐字重复可硬拦截；宽泛主题相似只允许触发一次改写提示，改写后只要没有达到硬重复就应放行。不得因为角色连续谈到同一生活主题而反复要求生成，造成无回复。</w:t>
       </w:r>
     </w:p>
     <w:sectPr>

</xml_diff>

<commit_message>
fix: execute full device locks and preserve call log state
</commit_message>
<xml_diff>
--- a/docs/maintenance/AI开发项目_Bug修改规范.docx
+++ b/docs/maintenance/AI开发项目_Bug修改规范.docx
@@ -7650,6 +7650,59 @@
           <w:sz w:val="21"/>
         </w:rPr>
         <w:t>生成日常推特时，必须结合角色设置和近期真实生活，但内容去重不能阻断正常表达。仅完全相同或近乎逐字重复可硬拦截；宽泛主题相似只允许触发一次改写提示，改写后只要没有达到硬重复就应放行。不得因为角色连续谈到同一生活主题而反复要求生成，造成无回复。</w:t>
+      </w:r>
+    </w:p>
+    <w:p>
+      <w:r>
+        <w:br w:type="page"/>
+      </w:r>
+    </w:p>
+    <w:p>
+      <w:pPr>
+        <w:pStyle w:val="Heading1"/>
+      </w:pPr>
+      <w:r>
+        <w:rPr>
+          <w:rFonts w:ascii="等线" w:hAnsi="等线" w:eastAsia="等线"/>
+          <w:sz w:val="32"/>
+        </w:rPr>
+        <w:t>发布补充规范｜全量控制依据、重绘状态与视觉偏好优先级（1.0.100 起）</w:t>
+      </w:r>
+    </w:p>
+    <w:p>
+      <w:pPr>
+        <w:spacing w:after="120" w:line="300" w:lineRule="auto"/>
+      </w:pPr>
+      <w:r>
+        <w:rPr>
+          <w:rFonts w:ascii="等线" w:hAnsi="等线" w:eastAsia="等线"/>
+          <w:sz w:val="21"/>
+        </w:rPr>
+        <w:t>全量锁定或解除的目标范围必须以当前真实用户请求与角色本轮执行决定共同确定，不能只看角色回复是否重复“全部”。只有当前用户语义为确定执行、角色给出同方向控制标签时，才能把错误的仅内置或仅外置标签升级为完整范围；拒绝、反方向、问句、否定和条件句必须保持不执行。不得读取更早的用户消息代替当前轮。</w:t>
+      </w:r>
+    </w:p>
+    <w:p>
+      <w:pPr>
+        <w:spacing w:after="120" w:line="300" w:lineRule="auto"/>
+      </w:pPr>
+      <w:r>
+        <w:rPr>
+          <w:rFonts w:ascii="等线" w:hAnsi="等线" w:eastAsia="等线"/>
+          <w:sz w:val="21"/>
+        </w:rPr>
+        <w:t>可展开长列表在删除、编辑等局部操作触发整页重绘前，必须用稳定业务键保存开合状态，并保存滚动位置或距底部距离；重绘后要等布局稳定再恢复。不能只给 details 写固定 open，也不能只在 render 返回后同步写一次 scrollTop。</w:t>
+      </w:r>
+    </w:p>
+    <w:p>
+      <w:pPr>
+        <w:spacing w:after="120" w:line="300" w:lineRule="auto"/>
+      </w:pPr>
+      <w:r>
+        <w:rPr>
+          <w:rFonts w:ascii="等线" w:hAnsi="等线" w:eastAsia="等线"/>
+          <w:sz w:val="21"/>
+        </w:rPr>
+        <w:t>用户可调颜色或透明度必须验证最终 CSS 层叠结果，而不只是检查值已保存或变量已生成。主题固定规则、设备兼容回退和自定义规则同时存在时，自定义规则只在用户主动设置后取得足够优先级；设备默认兼容底色仍须保留。原生低成本合成分支不得再用固定 alpha 覆盖用户透明度变量。</w:t>
       </w:r>
     </w:p>
     <w:sectPr>

</xml_diff>

<commit_message>
feat: add modern and Chinese wedding experiences
</commit_message>
<xml_diff>
--- a/docs/maintenance/AI开发项目_Bug修改规范.docx
+++ b/docs/maintenance/AI开发项目_Bug修改规范.docx
@@ -7703,6 +7703,249 @@
           <w:sz w:val="21"/>
         </w:rPr>
         <w:t>用户可调颜色或透明度必须验证最终 CSS 层叠结果，而不只是检查值已保存或变量已生成。主题固定规则、设备兼容回退和自定义规则同时存在时，自定义规则只在用户主动设置后取得足够优先级；设备默认兼容底色仍须保留。原生低成本合成分支不得再用固定 alpha 覆盖用户透明度变量。</w:t>
+      </w:r>
+    </w:p>
+    <w:p/>
+    <w:p>
+      <w:r>
+        <w:rPr>
+          <w:b/>
+        </w:rPr>
+        <w:t>现代婚礼互动演出规则（2026-08-18）</w:t>
+      </w:r>
+    </w:p>
+    <w:p>
+      <w:r>
+        <w:t>1. 第一人称新娘镜头中的亲吻动作必须明确为“亲吻手背”。提示词、旁白、交互文案和测试都要同时排除手腕、手臂、手心，禁止只写含糊的“亲吻她的手”。</w:t>
+      </w:r>
+    </w:p>
+    <w:p>
+      <w:r>
+        <w:t>2. 模型只生成结构化剧情文字，不允许按每句台词决定或请求一张新图片。运行时只能选择已经注册的场景 ID；重要接触动作使用少量关键 CG，普通情绪使用字幕、镜头推进、光效和可复用画面。</w:t>
+      </w:r>
+    </w:p>
+    <w:p>
+      <w:r>
+        <w:t>3. 旁白与角色台词必须是不同数据类型。旁白不得冒充角色说话，角色台词不得写成旁白；自动 TTS 只命中 role 类型，narrator 类型必须保持字幕。</w:t>
+      </w:r>
+    </w:p>
+    <w:p>
+      <w:r>
+        <w:t>4. 没有生图线路或没有角色视觉锚点时，不得宣称已经按人物设定生成专属外貌。预览样片必须明确标注为样片，正式专属 CG 只有在同一角色身份锚点建立并缓存后才能复用。</w:t>
+      </w:r>
+    </w:p>
+    <w:p>
+      <w:r>
+        <w:t>5. 婚礼预览属于独立追加模块。接入时不得覆盖当前 v978 的全锁、通话记录和透明度现场，也不得改动 iPhone 主屏底部系统区域；用户确认预览前不提升正式版本、不提交、不推送、不打包。</w:t>
+      </w:r>
+    </w:p>
+    <w:p/>
+    <w:p>
+      <w:pPr>
+        <w:keepNext/>
+      </w:pPr>
+      <w:r>
+        <w:rPr>
+          <w:b/>
+          <w:sz w:val="28"/>
+        </w:rPr>
+        <w:t>现代婚礼第二版稳定性补充（2026-08-18）</w:t>
+      </w:r>
+    </w:p>
+    <w:p>
+      <w:r>
+        <w:t>1. 视觉小说同一场景内推进台词时，禁止通过 innerHTML 重建整个舞台或背景节点。舞台、花瓣、顶部栏和双背景层必须常驻；只有 scene ID 改变时才能切换背景层并播放一次交叉淡化。</w:t>
+      </w:r>
+    </w:p>
+    <w:p>
+      <w:r>
+        <w:t>2. 婚书、证件、纪念册等正式署名区域必须区分角色原名和用户备注。正式姓名只允许读取 contact.name；remark 只用于聊天列表、剧情称呼等非证件界面。</w:t>
+      </w:r>
+    </w:p>
+    <w:p>
+      <w:r>
+        <w:t>3. 细小装饰符不得依赖字体中不稳定的 Unicode 花饰字符。若真机可能出现黑块、缺字或字体替换，必须改用 CSS 线条、边框和简单几何形状，并在网页与私人 WKWebView 分别复核。</w:t>
+      </w:r>
+    </w:p>
+    <w:p>
+      <w:r>
+        <w:t>4. 婚书动态装饰必须设置 pointer-events:none，控制数量、透明度与中心区域密度，不能遮挡正文、姓名、签名线和按钮；必须尊重 prefers-reduced-motion。</w:t>
+      </w:r>
+    </w:p>
+    <w:p>
+      <w:r>
+        <w:t>5. 预览资源更新要同步根网页与 PhoneWeb.bundle，并提升独立预览查询版本避免旧 CSS／JS 缓存。同步测试必须比较脚本、样式和所有婚礼 WebP 资源哈希。</w:t>
+      </w:r>
+    </w:p>
+    <w:p>
+      <w:r>
+        <w:t>6. 以上修改仍不得被记录成 Mac 编译或真机验收；未收到正式发布指令前，不提升正式版本、不提交、不推送、不打包。</w:t>
+      </w:r>
+    </w:p>
+    <w:p>
+      <w:pPr/>
+      <w:r>
+        <w:t>7. 誓词道具必须使用用户最终确认的画面版本，不能在后续生成时自动换回其他纸张形制。本轮最终选用用户附图中的正面双手持对折誓词纸画面；手机竖屏裁切必须保留双手和纸张的完整轮廓。</w:t>
+      </w:r>
+    </w:p>
+    <w:p>
+      <w:pPr/>
+      <w:r>
+        <w:t>8. 手写英文标题不能只用固定字号估算边界。必须在真实 DOM 中按容器可用宽度测量，字体加载后复测，并验收左右边界、标题中心与卡片中心；不能因设备字体度量差异超出纸张。</w:t>
+      </w:r>
+    </w:p>
+    <w:p>
+      <w:r>
+        <w:br w:type="page"/>
+      </w:r>
+    </w:p>
+    <w:p>
+      <w:pPr>
+        <w:pStyle w:val="Heading1"/>
+      </w:pPr>
+      <w:r>
+        <w:rPr>
+          <w:rFonts w:ascii="等线" w:hAnsi="等线" w:eastAsia="等线"/>
+          <w:sz w:val="32"/>
+        </w:rPr>
+        <w:t>现代婚礼第三版强制规范｜邀请时序、类型隔离与单份婚书（2026-08-18）</w:t>
+      </w:r>
+    </w:p>
+    <w:p>
+      <w:pPr>
+        <w:spacing w:after="120" w:line="300" w:lineRule="auto"/>
+      </w:pPr>
+      <w:r>
+        <w:rPr>
+          <w:rFonts w:ascii="等线" w:hAnsi="等线" w:eastAsia="等线"/>
+          <w:sz w:val="21"/>
+        </w:rPr>
+        <w:t>邀请必须使用明确 phase 状态机：style、preparing／scheduled、ready。用户选择婚礼类型后，等待卡必须显示距离婚礼的实时剩余时间；只有脚本和所有必需 CG 准备完成且到达 eventAt，才能先发送角色到时消息，再发送可进入卡。页面重开后必须恢复未完成筹备，禁止把生成请求卡死在永久等待状态。</w:t>
+      </w:r>
+    </w:p>
+    <w:p>
+      <w:pPr>
+        <w:spacing w:after="120" w:line="300" w:lineRule="auto"/>
+      </w:pPr>
+      <w:r>
+        <w:rPr>
+          <w:rFonts w:ascii="等线" w:hAnsi="等线" w:eastAsia="等线"/>
+          <w:sz w:val="21"/>
+        </w:rPr>
+        <w:t>婚礼类型必须作为稳定 style 写入邀请、准备数据、婚书、夫妻状态和重要记忆。现代与中式不得共用含糊的‘婚礼已完成’记忆；角色必须能判断真实进行的是现代婚礼还是中式婚礼。尚未实现的类型只能明确显示未开放，禁止偷换成另一类型执行。</w:t>
+      </w:r>
+    </w:p>
+    <w:p>
+      <w:pPr>
+        <w:spacing w:after="120" w:line="300" w:lineRule="auto"/>
+      </w:pPr>
+      <w:r>
+        <w:rPr>
+          <w:rFonts w:ascii="等线" w:hAnsi="等线" w:eastAsia="等线"/>
+          <w:sz w:val="21"/>
+        </w:rPr>
+        <w:t>婚书收藏以角色 ID 加婚礼 style 唯一。重复完成同一种婚礼只能更新或替换该 style 的稳定记录，不得每次新增一张；不同 style 可以各保存一份。重复仪式仍可生成新的婚后私聊消息，但重要婚礼记忆必须以稳定婚书 ID 去重。</w:t>
+      </w:r>
+    </w:p>
+    <w:p>
+      <w:pPr>
+        <w:spacing w:after="120" w:line="300" w:lineRule="auto"/>
+      </w:pPr>
+      <w:r>
+        <w:rPr>
+          <w:rFonts w:ascii="等线" w:hAnsi="等线" w:eastAsia="等线"/>
+          <w:sz w:val="21"/>
+        </w:rPr>
+        <w:t>现代婚礼禁止角色 TTS。音频只允许使用现代婚礼专属循环 BGM，并在退出、关闭或从情侣空间查看婚书时停止。角色日常穿搭不得进入婚礼 CG；全场固定同一套正式黑色或象牙白新郎礼服。每幕生图、视觉复核、台词校验和缓存键必须包含角色身份、scene 与 formalwear，确保不同角色不套脸、动作不串幕。</w:t>
+      </w:r>
+    </w:p>
+    <w:p>
+      <w:pPr>
+        <w:spacing w:after="120" w:line="300" w:lineRule="auto"/>
+      </w:pPr>
+      <w:r>
+        <w:rPr>
+          <w:rFonts w:ascii="等线" w:hAnsi="等线" w:eastAsia="等线"/>
+          <w:sz w:val="21"/>
+        </w:rPr>
+        <w:t>任何婚礼预览修改都必须同步共享网页与私人 PhoneWeb.bundle，并比较脚本、样式、HTML、CG 与 BGM 哈希。至少自动化跑通首次选择、倒计时、到时消息、入场、完成、重复完成、夫妻状态、单份婚书和收藏重开。未完成 Mac 编译与真机验收时必须明确保留该风险，用户确认前不得提交或推送。</w:t>
+      </w:r>
+    </w:p>
+    <w:p>
+      <w:r>
+        <w:br w:type="page"/>
+      </w:r>
+    </w:p>
+    <w:p>
+      <w:pPr>
+        <w:pStyle w:val="Heading1"/>
+      </w:pPr>
+      <w:r>
+        <w:rPr>
+          <w:rFonts w:ascii="等线" w:hAnsi="等线" w:eastAsia="等线"/>
+          <w:sz w:val="32"/>
+        </w:rPr>
+        <w:t>现代婚礼第四版强制规范｜模拟隔离、精确预约、唯一情侣权限（2026-08-18）</w:t>
+      </w:r>
+    </w:p>
+    <w:p>
+      <w:pPr>
+        <w:spacing w:after="120" w:line="300" w:lineRule="auto"/>
+      </w:pPr>
+      <w:r>
+        <w:rPr>
+          <w:rFonts w:ascii="等线" w:hAnsi="等线" w:eastAsia="等线"/>
+          <w:sz w:val="21"/>
+        </w:rPr>
+        <w:t>模拟模式必须使用显式 session.simulation 标志，并在 weddingFinish 的 weddingState、weddingMarkMarried、weddingSaveMemory、save 和 weddingAfterMessage 之前短路。不得通过“事后删除”模拟隔离；事后删除可能覆盖用户原有夫妻关系、记忆或婚书。模拟可以使用临时脚本、画面缓存与循环 BGM，但不得把会话结果写入 S。</w:t>
+      </w:r>
+    </w:p>
+    <w:p>
+      <w:pPr>
+        <w:spacing w:after="120" w:line="300" w:lineRule="auto"/>
+      </w:pPr>
+      <w:r>
+        <w:rPr>
+          <w:rFonts w:ascii="等线" w:hAnsi="等线" w:eastAsia="等线"/>
+          <w:sz w:val="21"/>
+        </w:rPr>
+        <w:t>婚礼候选角色唯一来源为 S.couple.cid。所有入口和内部状态转换都必须复核 weddingEligibleRole；仅在界面隐藏其他角色不算完成。日历普通提醒可继续使用全部联系人，但 wedding 类型必须把角色控件锁定为 couple cid，并在保存和调度阶段再次验证。</w:t>
+      </w:r>
+    </w:p>
+    <w:p>
+      <w:pPr>
+        <w:spacing w:after="120" w:line="300" w:lineRule="auto"/>
+      </w:pPr>
+      <w:r>
+        <w:rPr>
+          <w:rFonts w:ascii="等线" w:hAnsi="等线" w:eastAsia="等线"/>
+          <w:sz w:val="21"/>
+        </w:rPr>
+        <w:t>日历婚礼必须存储 date、time、eventAt、contactId 和稳定 calendar event id。邀请卡必须继承同一个 eventAt；筹备可提前开始，ready 卡只有在准备完成且 Date.now() 不早于 eventAt 时发送。礼成记录优先使用会话继承的 ceremonyAt，确保婚书与结婚日期对应预约时间。</w:t>
+      </w:r>
+    </w:p>
+    <w:p>
+      <w:pPr>
+        <w:spacing w:after="120" w:line="300" w:lineRule="auto"/>
+      </w:pPr>
+      <w:r>
+        <w:rPr>
+          <w:rFonts w:ascii="等线" w:hAnsi="等线" w:eastAsia="等线"/>
+          <w:sz w:val="21"/>
+        </w:rPr>
+        <w:t>邀请格式不得交给模型。模型只允许生成到时普通微信，程序负责 style／preparing／scheduled／ready 卡、按钮事件、schema 修复和 preparedId 恢复。白色玻璃是选择卡及现代入场卡主题；中式入场卡必须使用独立红色玻璃主题类，不能只把文字改成“中式”而沿用现代视觉。尚未完成中式剧情时不得开放可进入流程。</w:t>
+      </w:r>
+    </w:p>
+    <w:p>
+      <w:pPr>
+        <w:spacing w:after="120" w:line="300" w:lineRule="auto"/>
+      </w:pPr>
+      <w:r>
+        <w:rPr>
+          <w:rFonts w:ascii="等线" w:hAnsi="等线" w:eastAsia="等线"/>
+          <w:sz w:val="21"/>
+        </w:rPr>
+        <w:t>私人构建同步后必须检查 app.js、wedding-game.js、wedding-game.css 和小手机.html 与 PhoneWeb.bundle 哈希一致，核对版本号，并自动化跑通模拟零写入、日历精确时间、非情侣拒绝、正式礼成持久化与重复礼成去重。网页发布、Git 提交、Git 推送、Mac 编译与真机验证必须分别记录，禁止互相替代。</w:t>
       </w:r>
     </w:p>
     <w:sectPr>

</xml_diff>

<commit_message>
feat: add wedding chapter regeneration
</commit_message>
<xml_diff>
--- a/docs/maintenance/AI开发项目_Bug修改规范.docx
+++ b/docs/maintenance/AI开发项目_Bug修改规范.docx
@@ -7946,6 +7946,71 @@
           <w:sz w:val="21"/>
         </w:rPr>
         <w:t>私人构建同步后必须检查 app.js、wedding-game.js、wedding-game.css 和小手机.html 与 PhoneWeb.bundle 哈希一致，核对版本号，并自动化跑通模拟零写入、日历精确时间、非情侣拒绝、正式礼成持久化与重复礼成去重。网页发布、Git 提交、Git 推送、Mac 编译与真机验证必须分别记录，禁止互相替代。</w:t>
+      </w:r>
+    </w:p>
+    <w:p>
+      <w:r>
+        <w:br w:type="page"/>
+      </w:r>
+    </w:p>
+    <w:p>
+      <w:pPr>
+        <w:pStyle w:val="Heading1"/>
+      </w:pPr>
+      <w:r>
+        <w:rPr>
+          <w:rFonts w:ascii="等线" w:hAnsi="等线" w:eastAsia="等线"/>
+          <w:sz w:val="32"/>
+        </w:rPr>
+        <w:t>婚礼人物一致性与单幕覆盖规范（v989／1.0.110 起）</w:t>
+      </w:r>
+    </w:p>
+    <w:p>
+      <w:pPr>
+        <w:spacing w:after="120" w:line="300" w:lineRule="auto"/>
+      </w:pPr>
+      <w:r>
+        <w:rPr>
+          <w:rFonts w:ascii="等线" w:hAnsi="等线" w:eastAsia="等线"/>
+          <w:sz w:val="21"/>
+        </w:rPr>
+        <w:t>同一场婚礼必须只有一个人物图像身份锚点，固定为第一幕。第 2～6 幕的首次生成、动作复核失败重试和用户主动单幕重做都只能参考第一幕，不得改为最近成功幕、相邻幕或随机成功幕。提示词身份摘要不能替代实际第一幕图片输入。</w:t>
+      </w:r>
+    </w:p>
+    <w:p>
+      <w:pPr>
+        <w:spacing w:after="120" w:line="300" w:lineRule="auto"/>
+      </w:pPr>
+      <w:r>
+        <w:rPr>
+          <w:rFonts w:ascii="等线" w:hAnsi="等线" w:eastAsia="等线"/>
+          <w:sz w:val="21"/>
+        </w:rPr>
+        <w:t>整场准备必须先让第一幕进入成功图或预设回退终态，再生成第二幕。每一幕的首次失败应当在进入下一幕前完成最多两次重试，避免后续幕在首幕身份尚未确定时独立随机人物。接口不能接收参考图时，不得静默降级为无参考生图并假装保持一致。</w:t>
+      </w:r>
+    </w:p>
+    <w:p>
+      <w:pPr>
+        <w:spacing w:after="120" w:line="300" w:lineRule="auto"/>
+      </w:pPr>
+      <w:r>
+        <w:rPr>
+          <w:rFonts w:ascii="等线" w:hAnsi="等线" w:eastAsia="等线"/>
+          <w:sz w:val="21"/>
+        </w:rPr>
+        <w:t>单幕重做属于安全覆盖事务：开始前读取并保留原 src、verified 与准备记录；新图最多尝试三次，只有通过当前幕动作校验与第一幕人物一致性校验、写入新缓存键后，才更新 prepared.sceneKeys[scene]。任一步失败都恢复原图，不改其他 sceneKeys、婚书、关系或记忆。</w:t>
+      </w:r>
+    </w:p>
+    <w:p>
+      <w:pPr>
+        <w:spacing w:after="120" w:line="300" w:lineRule="auto"/>
+      </w:pPr>
+      <w:r>
+        <w:rPr>
+          <w:rFonts w:ascii="等线" w:hAnsi="等线" w:eastAsia="等线"/>
+          <w:sz w:val="21"/>
+        </w:rPr>
+        <w:t>第一幕自身单独重做时必须把当前旧第一幕作为输入参考，以保持原人物，只修正动作与构图。若用户希望换成全新人物，必须走整场重新生成，不能借单幕按钮暗中换掉身份锚点。</w:t>
       </w:r>
     </w:p>
     <w:sectPr>

</xml_diff>

<commit_message>
Release v996 fixes and isolate private companion
</commit_message>
<xml_diff>
--- a/docs/maintenance/AI开发项目_Bug修改规范.docx
+++ b/docs/maintenance/AI开发项目_Bug修改规范.docx
@@ -8011,6 +8011,168 @@
           <w:sz w:val="21"/>
         </w:rPr>
         <w:t>第一幕自身单独重做时必须把当前旧第一幕作为输入参考，以保持原人物，只修正动作与构图。若用户希望换成全新人物，必须走整场重新生成，不能借单幕按钮暗中换掉身份锚点。</w:t>
+      </w:r>
+    </w:p>
+    <w:p>
+      <w:r>
+        <w:br w:type="page"/>
+      </w:r>
+    </w:p>
+    <w:p>
+      <w:pPr>
+        <w:pStyle w:val="Heading1"/>
+      </w:pPr>
+      <w:r>
+        <w:rPr>
+          <w:rFonts w:ascii="等线" w:hAnsi="等线" w:eastAsia="等线"/>
+          <w:sz w:val="32"/>
+        </w:rPr>
+        <w:t>时间连续性、静默自动任务与独立云边界规范（v996／1.0.117 起）</w:t>
+      </w:r>
+    </w:p>
+    <w:p>
+      <w:pPr>
+        <w:spacing w:after="120" w:line="300" w:lineRule="auto"/>
+      </w:pPr>
+      <w:r>
+        <w:rPr>
+          <w:rFonts w:ascii="等线" w:hAnsi="等线" w:eastAsia="等线"/>
+          <w:sz w:val="21"/>
+        </w:rPr>
+        <w:t>任何显示“已总结、已保存、已绑定、已备份”的成功反馈，都必须发生在对应持久化完成之后；iOS 可能在下一瞬间挂起，延迟 save 不能作为成功依据。云端已有备份时禁止自动上传或下载覆盖，必须先展示来源与时间并由用户选择。</w:t>
+      </w:r>
+    </w:p>
+    <w:p>
+      <w:pPr>
+        <w:spacing w:after="120" w:line="300" w:lineRule="auto"/>
+      </w:pPr>
+      <w:r>
+        <w:rPr>
+          <w:rFonts w:ascii="等线" w:hAnsi="等线" w:eastAsia="等线"/>
+          <w:sz w:val="21"/>
+        </w:rPr>
+        <w:t>角色时间不能只在提示词里写当前小时。跨日事件必须同时保留绝对时间、角色时区、日历日期和持续时长；睡眠/醒来等状态转换要明确区分睡前旧话题与醒来后的新事件。精确报时时在实际送达前再校正。</w:t>
+      </w:r>
+    </w:p>
+    <w:p>
+      <w:pPr>
+        <w:spacing w:after="120" w:line="300" w:lineRule="auto"/>
+      </w:pPr>
+      <w:r>
+        <w:rPr>
+          <w:rFonts w:ascii="等线" w:hAnsi="等线" w:eastAsia="等线"/>
+          <w:sz w:val="21"/>
+        </w:rPr>
+        <w:t>启动、恢复前台、定时扫描等自动任务不得复用手动页面的可见失败提示。自动失败应静默并持久化退避，避免每次启动重复请求；只有用户主动进入对应功能时才显示明确错误和可操作重试。</w:t>
+      </w:r>
+    </w:p>
+    <w:p>
+      <w:pPr>
+        <w:spacing w:after="120" w:line="300" w:lineRule="auto"/>
+      </w:pPr>
+      <w:r>
+        <w:rPr>
+          <w:rFonts w:ascii="等线" w:hAnsi="等线" w:eastAsia="等线"/>
+          <w:sz w:val="21"/>
+        </w:rPr>
+        <w:t>视频通话开启摄像头时，TTS、识别和画面抓帧必须共享稳定的原生媒体会话。不得因每句角色回复暂停、拆除或重建摄像头/音频会话；摄像头关闭后才允许按原流程恢复普通音频会话。</w:t>
+      </w:r>
+    </w:p>
+    <w:p>
+      <w:pPr>
+        <w:spacing w:after="120" w:line="300" w:lineRule="auto"/>
+      </w:pPr>
+      <w:r>
+        <w:rPr>
+          <w:rFonts w:ascii="等线" w:hAnsi="等线" w:eastAsia="等线"/>
+          <w:sz w:val="21"/>
+        </w:rPr>
+        <w:t>意图路由必须先区分“用户自己使用 App”和“要求角色查看/控制 App”。词语“刷、看看”不能单独触发查岗；主语、指令对象和动作方向必须同时成立。早期工具通道即使无数据变化也不能吞掉普通聊天回复。</w:t>
+      </w:r>
+    </w:p>
+    <w:p>
+      <w:pPr>
+        <w:spacing w:after="120" w:line="300" w:lineRule="auto"/>
+      </w:pPr>
+      <w:r>
+        <w:rPr>
+          <w:rFonts w:ascii="等线" w:hAnsi="等线" w:eastAsia="等线"/>
+          <w:sz w:val="21"/>
+        </w:rPr>
+        <w:t>邀请码、旧业务和伴生后台必须保持三条独立云边界：邀请码备用项目只能部署 phone-license；伴生同步、APNs、角色后台任务和私人账号只使用独立伴生项目；其他既有网页业务仍保留旧服务。端点迁移后要同时核对客户端、原生桥、Edge Function、cron、迁移记录和允许域名，禁止把一个项目健康误判成全部链路健康。</w:t>
+      </w:r>
+    </w:p>
+    <w:p>
+      <w:pPr>
+        <w:spacing w:after="120" w:line="300" w:lineRule="auto"/>
+      </w:pPr>
+      <w:r>
+        <w:rPr>
+          <w:rFonts w:ascii="等线" w:hAnsi="等线" w:eastAsia="等线"/>
+          <w:sz w:val="21"/>
+        </w:rPr>
+        <w:t>新建云项目时必须记录项目 ref、区域、迁移清单、函数列表和无密钥运行说明。不得把 PAT、数据库密码、APNs 私钥或用户凭据写入仓库。若建项密码未安全保存，应明确要求后台重置，不能猜测或伪造。</w:t>
+      </w:r>
+    </w:p>
+    <w:p>
+      <w:pPr>
+        <w:pStyle w:val="Heading1"/>
+        <w:pageBreakBefore/>
+      </w:pPr>
+      <w:r>
+        <w:rPr>
+          <w:rFonts w:ascii="等线" w:hAnsi="等线" w:eastAsia="等线"/>
+          <w:sz w:val="32"/>
+        </w:rPr>
+        <w:t>网页版与私人 App 伴生能力隔离规范（v996／1.0.117 起）</w:t>
+      </w:r>
+    </w:p>
+    <w:p>
+      <w:pPr>
+        <w:spacing w:after="120" w:line="300" w:lineRule="auto"/>
+      </w:pPr>
+      <w:r>
+        <w:rPr>
+          <w:rFonts w:ascii="等线" w:hAnsi="等线" w:eastAsia="等线"/>
+          <w:sz w:val="21"/>
+        </w:rPr>
+        <w:t>共享 app.js 只代表共享可复用业务实现，不代表网页版可以获得私人能力。真实 iPhone 伴生、APNs、手机号私人账号、后台角色云队列、Family Controls、Device Activity、HealthKit 和原生控制一律以 privateCompanionAppOn/privateNativeAppOn 为硬门槛。</w:t>
+      </w:r>
+    </w:p>
+    <w:p>
+      <w:pPr>
+        <w:spacing w:after="120" w:line="300" w:lineRule="auto"/>
+      </w:pPr>
+      <w:r>
+        <w:rPr>
+          <w:rFonts w:ascii="等线" w:hAnsi="等线" w:eastAsia="等线"/>
+          <w:sz w:val="21"/>
+        </w:rPr>
+        <w:t>私人能力必须同时隔离四层：网页版不渲染入口；直接调用返回明确的私人 App 限制；定时器、恢复前台和旧数据不能触发网络；角色提示词与动作解析不得读取或复述伴生缓存。只隐藏按钮而保留后台请求，或只拦 RPC 而泄露提示词，都不算隔离完成。</w:t>
+      </w:r>
+    </w:p>
+    <w:p>
+      <w:pPr>
+        <w:spacing w:after="120" w:line="300" w:lineRule="auto"/>
+      </w:pPr>
+      <w:r>
+        <w:rPr>
+          <w:rFonts w:ascii="等线" w:hAnsi="等线" w:eastAsia="等线"/>
+          <w:sz w:val="21"/>
+        </w:rPr>
+        <w:t>共享文件中的独立伴生云 URL 可以作为私人构建所需常量保留，但网页版运行时不得向它发出请求。新增任何伴生端点时必须同时检查 companionRpc 之外的直接 fetch、keepalive、Edge Function 和启动/前台定时器，并加入网页版无原生桥回归。</w:t>
+      </w:r>
+    </w:p>
+    <w:p>
+      <w:pPr>
+        <w:spacing w:after="120" w:line="300" w:lineRule="auto"/>
+      </w:pPr>
+      <w:r>
+        <w:rPr>
+          <w:rFonts w:ascii="等线" w:hAnsi="等线" w:eastAsia="等线"/>
+          <w:sz w:val="21"/>
+        </w:rPr>
+        <w:t>网页版的普通主动消息、网页聊天、网页电话、既有查岗和其他公开功能与私人后台伴生不是同一能力。做隔离时只关闭私人链路，不得借机删除或改变网页自己的正常功能。</w:t>
       </w:r>
     </w:p>
     <w:sectPr>

</xml_diff>

<commit_message>
release: v1003 reply pipeline regression repair
</commit_message>
<xml_diff>
--- a/docs/maintenance/AI开发项目_Bug修改规范.docx
+++ b/docs/maintenance/AI开发项目_Bug修改规范.docx
@@ -8173,6 +8173,250 @@
           <w:sz w:val="21"/>
         </w:rPr>
         <w:t>网页版的普通主动消息、网页聊天、网页电话、既有查岗和其他公开功能与私人后台伴生不是同一能力。做隔离时只关闭私人链路，不得借机删除或改变网页自己的正常功能。</w:t>
+      </w:r>
+    </w:p>
+    <w:p>
+      <w:pPr>
+        <w:pStyle w:val="Heading1"/>
+        <w:pageBreakBefore/>
+      </w:pPr>
+      <w:r>
+        <w:rPr>
+          <w:rFonts w:ascii="等线" w:hAnsi="等线" w:eastAsia="等线"/>
+          <w:sz w:val="32"/>
+        </w:rPr>
+        <w:t>后台真实查询、朋友圈真实性与精确远控规范（v1001／1.0.122 起）</w:t>
+      </w:r>
+    </w:p>
+    <w:p>
+      <w:pPr>
+        <w:spacing w:after="120" w:line="300" w:lineRule="auto"/>
+      </w:pPr>
+      <w:r>
+        <w:rPr>
+          <w:rFonts w:ascii="等线" w:hAnsi="等线" w:eastAsia="等线"/>
+          <w:sz w:val="21"/>
+        </w:rPr>
+        <w:t>后台自动规则必须区分配置开关、临时租约、真实入队、原生执行、快照上传和角色可见投递六层状态。不能因为命令表有记录就宣称功能有效；验收至少要核对命令终态、快照新鲜度、outbox 或可见消息，并防止同类刷新在上一条未完成时反复覆盖。</w:t>
+      </w:r>
+    </w:p>
+    <w:p>
+      <w:pPr>
+        <w:spacing w:after="120" w:line="300" w:lineRule="auto"/>
+      </w:pPr>
+      <w:r>
+        <w:rPr>
+          <w:rFonts w:ascii="等线" w:hAnsi="等线" w:eastAsia="等线"/>
+          <w:sz w:val="21"/>
+        </w:rPr>
+        <w:t>低电、位置、心率和使用记录只能依据真实手机新快照。低电规则要同时判断阈值、是否充电、新鲜度和同轮去重；心率主动查看频率可由角色自主，但难过关心和用户明确要求必须真正排队读取，失败不得编造数值。手动解锁告知只接受原生执行成功记录，不能把角色自己下达的解锁命令当成用户偷偷解锁。</w:t>
+      </w:r>
+    </w:p>
+    <w:p>
+      <w:pPr>
+        <w:spacing w:after="120" w:line="300" w:lineRule="auto"/>
+      </w:pPr>
+      <w:r>
+        <w:rPr>
+          <w:rFonts w:ascii="等线" w:hAnsi="等线" w:eastAsia="等线"/>
+          <w:sz w:val="21"/>
+        </w:rPr>
+        <w:t>每日必查项必须保存按角色时区计算的日键和成功记录。失败、超时或无新快照不算当日已查；普通主动消息节流不得阻止每日必查。时区修正只能解决时段计算，不能替代命令队列、原生执行和结果投递检查。</w:t>
+      </w:r>
+    </w:p>
+    <w:p>
+      <w:pPr>
+        <w:spacing w:after="120" w:line="300" w:lineRule="auto"/>
+      </w:pPr>
+      <w:r>
+        <w:rPr>
+          <w:rFonts w:ascii="等线" w:hAnsi="等线" w:eastAsia="等线"/>
+          <w:sz w:val="21"/>
+        </w:rPr>
+        <w:t>朋友圈评论与照片遵守真实性边界：只有真实模型返回的评论才能入库；失败界面提供重试但不插入占位假话。用户明确要求带图时，发布动作必须等待真实照片复用或真实生图结果，失败如实反馈。置顶只改变显示顺序，不改历史时间或复制动态。</w:t>
+      </w:r>
+    </w:p>
+    <w:p>
+      <w:pPr>
+        <w:spacing w:after="120" w:line="300" w:lineRule="auto"/>
+      </w:pPr>
+      <w:r>
+        <w:rPr>
+          <w:rFonts w:ascii="等线" w:hAnsi="等线" w:eastAsia="等线"/>
+          <w:sz w:val="21"/>
+        </w:rPr>
+        <w:t>聊天头像与消息气泡必须分离点击语义：头像进入联系人/聊天详情，气泡进入消息操作；图片查看从消息菜单继续进入。删除角色拍一拍时同时清理入口、动作函数、输出标签、提示词和虚拟群角色处理，但不得误删真实好友群聊的独立能力。</w:t>
+      </w:r>
+    </w:p>
+    <w:p>
+      <w:pPr>
+        <w:spacing w:after="120" w:line="300" w:lineRule="auto"/>
+      </w:pPr>
+      <w:r>
+        <w:rPr>
+          <w:rFonts w:ascii="等线" w:hAnsi="等线" w:eastAsia="等线"/>
+          <w:sz w:val="21"/>
+        </w:rPr>
+        <w:t>远程查看动作必须绑定具体页面和目标内容，界面应反馈目标名称与进度。不能用随机点击动画冒充已查看；无法定位时应保持可解释状态并重试或结束。</w:t>
+      </w:r>
+    </w:p>
+    <w:p>
+      <w:pPr>
+        <w:pStyle w:val="Heading1"/>
+        <w:pageBreakBefore/>
+      </w:pPr>
+      <w:r>
+        <w:rPr>
+          <w:rFonts w:ascii="等线" w:hAnsi="等线" w:eastAsia="等线"/>
+          <w:sz w:val="32"/>
+        </w:rPr>
+        <w:t>入口语义与异步完成状态规范（v1002／1.0.123 起）</w:t>
+      </w:r>
+    </w:p>
+    <w:p>
+      <w:pPr>
+        <w:spacing w:after="120" w:line="300" w:lineRule="auto"/>
+      </w:pPr>
+      <w:r>
+        <w:rPr>
+          <w:rFonts w:ascii="等线" w:hAnsi="等线" w:eastAsia="等线"/>
+          <w:sz w:val="21"/>
+        </w:rPr>
+        <w:t>同一界面中的头像、右上角更多按钮和消息气泡是三个独立入口。修改其中一个时必须分别断言各自目标，禁止用包含某个路由的宽泛测试掩盖入口合并。</w:t>
+      </w:r>
+    </w:p>
+    <w:p>
+      <w:pPr>
+        <w:spacing w:after="120" w:line="300" w:lineRule="auto"/>
+      </w:pPr>
+      <w:r>
+        <w:rPr>
+          <w:rFonts w:ascii="等线" w:hAnsi="等线" w:eastAsia="等线"/>
+          <w:sz w:val="21"/>
+        </w:rPr>
+        <w:t>设备读取完成与角色回复生成是两个阶段。完成横幅只能反映真实读取阶段，读取结束后必须按固定短延迟关闭，不能被网络模型请求占用。</w:t>
+      </w:r>
+    </w:p>
+    <w:p>
+      <w:pPr>
+        <w:spacing w:after="120" w:line="300" w:lineRule="auto"/>
+      </w:pPr>
+      <w:r>
+        <w:rPr>
+          <w:rFonts w:ascii="等线" w:hAnsi="等线" w:eastAsia="等线"/>
+          <w:sz w:val="21"/>
+        </w:rPr>
+        <w:t>模型回复失败时保存真实读取结果并退避重试；不得重新读取制造重复命令，不得写入固定假回复。跨页面生成的现场回复必须告诉用户真实落点，不能把共同生活消息伪装成微信消息。</w:t>
+      </w:r>
+    </w:p>
+    <w:p>
+      <w:pPr>
+        <w:pStyle w:val="Heading1"/>
+        <w:pageBreakBefore/>
+      </w:pPr>
+      <w:r>
+        <w:rPr>
+          <w:rFonts w:ascii="等线" w:hAnsi="等线" w:eastAsia="等线"/>
+          <w:sz w:val="32"/>
+        </w:rPr>
+        <w:t>持久模型重试不得占用旧稳定回复链（v1002 回复回归后）</w:t>
+      </w:r>
+    </w:p>
+    <w:p>
+      <w:pPr>
+        <w:spacing w:after="120" w:line="300" w:lineRule="auto"/>
+      </w:pPr>
+      <w:r>
+        <w:rPr>
+          <w:rFonts w:ascii="等线" w:hAnsi="等线" w:eastAsia="等线"/>
+          <w:sz w:val="21"/>
+        </w:rPr>
+        <w:t>用户指出明确历史正常版本时，必须把该版本作为最后正常基线，逐行比较新增状态、定时器、全局锁和模型调用次数。不能因为新功能测试通过，就默认普通聊天、朋友圈和模型测试没有被并发链影响。</w:t>
+      </w:r>
+    </w:p>
+    <w:p>
+      <w:pPr>
+        <w:spacing w:after="120" w:line="300" w:lineRule="auto"/>
+      </w:pPr>
+      <w:r>
+        <w:rPr>
+          <w:rFonts w:ascii="等线" w:hAnsi="等线" w:eastAsia="等线"/>
+          <w:sz w:val="21"/>
+        </w:rPr>
+        <w:t>真实数据可以持久保存，但模型生成失败不得由短周期定时器跨重启无限自动重放，更不得在重放期间长期持有会阻止普通回复的全局读取通道。任何自动重试都必须有总次数、总时长、并发所有权和旧功能可用性测试；没有这些保护时只能保存为人工重试状态。</w:t>
+      </w:r>
+    </w:p>
+    <w:p>
+      <w:pPr>
+        <w:spacing w:after="120" w:line="300" w:lineRule="auto"/>
+      </w:pPr>
+      <w:r>
+        <w:rPr>
+          <w:rFonts w:ascii="等线" w:hAnsi="等线" w:eastAsia="等线"/>
+          <w:sz w:val="21"/>
+        </w:rPr>
+        <w:t>回复包装器必须同时识别两种正常读取接管：运行前通道已经占用，以及运行期间读取代次发生变化。两种情况都不得二次请求、不得显示模型空回复或 API 故障提示。</w:t>
+      </w:r>
+    </w:p>
+    <w:p>
+      <w:pPr>
+        <w:spacing w:after="120" w:line="300" w:lineRule="auto"/>
+      </w:pPr>
+      <w:r>
+        <w:rPr>
+          <w:rFonts w:ascii="等线" w:hAnsi="等线" w:eastAsia="等线"/>
+          <w:sz w:val="21"/>
+        </w:rPr>
+        <w:t>朋友圈回复失败或 App 挂起后只显示真实失败和重试入口，禁止补写角色假回复。回归至少覆盖：旧 retryAt 存档迁移、读取通道预先占用、读取中途接管、朋友圈冷启动 pending 修复、普通回复与朋友圈不被后台重放拖慢。</w:t>
+      </w:r>
+    </w:p>
+    <w:p>
+      <w:pPr>
+        <w:pStyle w:val="Heading1"/>
+        <w:pageBreakBefore/>
+      </w:pPr>
+      <w:r>
+        <w:rPr>
+          <w:rFonts w:ascii="等线" w:hAnsi="等线" w:eastAsia="等线"/>
+          <w:sz w:val="32"/>
+        </w:rPr>
+        <w:t>v1003 回复回归发布门槛</w:t>
+      </w:r>
+    </w:p>
+    <w:p>
+      <w:pPr>
+        <w:spacing w:after="120" w:line="300" w:lineRule="auto"/>
+      </w:pPr>
+      <w:r>
+        <w:rPr>
+          <w:rFonts w:ascii="等线" w:hAnsi="等线" w:eastAsia="等线"/>
+          <w:sz w:val="21"/>
+        </w:rPr>
+        <w:t>涉及模型重试、全局读取通道或持久 pending 状态的发布，除功能测试外必须验证旧正常聊天和朋友圈在失败、挂起、重启后的可用性。只断言“有重试”不算覆盖。</w:t>
+      </w:r>
+    </w:p>
+    <w:p>
+      <w:pPr>
+        <w:spacing w:after="120" w:line="300" w:lineRule="auto"/>
+      </w:pPr>
+      <w:r>
+        <w:rPr>
+          <w:rFonts w:ascii="等线" w:hAnsi="等线" w:eastAsia="等线"/>
+          <w:sz w:val="21"/>
+        </w:rPr>
+        <w:t>发布身份必须原子更新网页 APP_VER、HTML build、Service Worker build／cache／注册 URL、index／repair、私人 Bundle Info、十二处 Xcode marketing/build、原生可见构建号、测试断言和安装说明。</w:t>
+      </w:r>
+    </w:p>
+    <w:p>
+      <w:pPr>
+        <w:spacing w:after="120" w:line="300" w:lineRule="auto"/>
+      </w:pPr>
+      <w:r>
+        <w:rPr>
+          <w:rFonts w:ascii="等线" w:hAnsi="等线" w:eastAsia="等线"/>
+          <w:sz w:val="21"/>
+        </w:rPr>
+        <w:t>私人包必须从 manifest 重建唯一 PhoneWeb.bundle，并从全新暂存目录压缩；只允许一个当前安装说明。Windows 850／850 不能替代 Mac 编译和真机回复时延验收。</w:t>
       </w:r>
     </w:p>
     <w:sectPr>

</xml_diff>

<commit_message>
release: v1006 repair background delivery and reply paths
</commit_message>
<xml_diff>
--- a/docs/maintenance/AI开发项目_Bug修改规范.docx
+++ b/docs/maintenance/AI开发项目_Bug修改规范.docx
@@ -8417,6 +8417,91 @@
           <w:sz w:val="21"/>
         </w:rPr>
         <w:t>私人包必须从 manifest 重建唯一 PhoneWeb.bundle，并从全新暂存目录压缩；只允许一个当前安装说明。Windows 850／850 不能替代 Mac 编译和真机回复时延验收。</w:t>
+      </w:r>
+    </w:p>
+    <w:p>
+      <w:pPr>
+        <w:pStyle w:val="Heading1"/>
+        <w:pageBreakBefore/>
+      </w:pPr>
+      <w:r>
+        <w:rPr>
+          <w:rFonts w:ascii="等线" w:hAnsi="等线" w:eastAsia="等线"/>
+          <w:sz w:val="32"/>
+        </w:rPr>
+        <w:t>v1006 后台送达、通话与朋友圈回复回归规则</w:t>
+      </w:r>
+    </w:p>
+    <w:p>
+      <w:pPr>
+        <w:spacing w:after="120" w:line="300" w:lineRule="auto"/>
+      </w:pPr>
+      <w:r>
+        <w:rPr>
+          <w:rFonts w:ascii="等线" w:hAnsi="等线" w:eastAsia="等线"/>
+          <w:sz w:val="21"/>
+        </w:rPr>
+        <w:t>伴生云迁移或新建项目时，必须分别清点数据库／RPC、定时任务、APNs、设备令牌和模型提供方。只看到 APNs 密钥或预检通过，绝不能推断角色已经可以在服务器生成消息。</w:t>
+      </w:r>
+    </w:p>
+    <w:p>
+      <w:pPr>
+        <w:spacing w:after="120" w:line="300" w:lineRule="auto"/>
+      </w:pPr>
+      <w:r>
+        <w:rPr>
+          <w:rFonts w:ascii="等线" w:hAnsi="等线" w:eastAsia="等线"/>
+          <w:sz w:val="21"/>
+        </w:rPr>
+        <w:t>后台测试的入队成功不等于送达成功。必须保留任务 ID，继续核对模型生成、outbox、APNs 状态与错误；界面只能报告实际到达的阶段，不能用倒计时或本地假消息代替回执。</w:t>
+      </w:r>
+    </w:p>
+    <w:p>
+      <w:pPr>
+        <w:spacing w:after="120" w:line="300" w:lineRule="auto"/>
+      </w:pPr>
+      <w:r>
+        <w:rPr>
+          <w:rFonts w:ascii="等线" w:hAnsi="等线" w:eastAsia="等线"/>
+          <w:sz w:val="21"/>
+        </w:rPr>
+        <w:t>私人能力隔离包装必须用 rest 参数完整转发调用参数，并以测试固定 keepalive 等语义参数；禁止包装后静默改变函数契约。</w:t>
+      </w:r>
+    </w:p>
+    <w:p>
+      <w:pPr>
+        <w:spacing w:after="120" w:line="300" w:lineRule="auto"/>
+      </w:pPr>
+      <w:r>
+        <w:rPr>
+          <w:rFonts w:ascii="等线" w:hAnsi="等线" w:eastAsia="等线"/>
+          <w:sz w:val="21"/>
+        </w:rPr>
+        <w:t>凡界面声称使用“当前模型”，必须真的同步角色当前线路并执行服务器端测试。同步地址只允许 HTTPS 且拒绝本机和私网；关闭后台能力时清除线路，并向用户明确披露同步范围。</w:t>
+      </w:r>
+    </w:p>
+    <w:p>
+      <w:pPr>
+        <w:spacing w:after="120" w:line="300" w:lineRule="auto"/>
+      </w:pPr>
+      <w:r>
+        <w:rPr>
+          <w:rFonts w:ascii="等线" w:hAnsi="等线" w:eastAsia="等线"/>
+          <w:sz w:val="21"/>
+        </w:rPr>
+        <w:t>通话和朋友圈模型请求必须设置历史、线程、单条内容与总提示预算，并按当前内容选取长期记忆。朋友圈失败只能显示重试，禁止任何本地假回复或固定兜底冒充角色。</w:t>
+      </w:r>
+    </w:p>
+    <w:p>
+      <w:pPr>
+        <w:spacing w:after="120" w:line="300" w:lineRule="auto"/>
+      </w:pPr>
+      <w:r>
+        <w:rPr>
+          <w:rFonts w:ascii="等线" w:hAnsi="等线" w:eastAsia="等线"/>
+          <w:sz w:val="21"/>
+        </w:rPr>
+        <w:t>Windows 自动测试只能证明代码与回归基线；Mac 编译、Apple 签名、后台挂起、电话音频／字幕和通知展示必须在真实 iPhone 单独验收。</w:t>
       </w:r>
     </w:p>
     <w:sectPr>

</xml_diff>

<commit_message>
fix: repair background inbox and stabilize iOS rendering
</commit_message>
<xml_diff>
--- a/docs/maintenance/AI开发项目_Bug修改规范.docx
+++ b/docs/maintenance/AI开发项目_Bug修改规范.docx
@@ -8502,6 +8502,103 @@
           <w:sz w:val="21"/>
         </w:rPr>
         <w:t>Windows 自动测试只能证明代码与回归基线；Mac 编译、Apple 签名、后台挂起、电话音频／字幕和通知展示必须在真实 iPhone 单独验收。</w:t>
+      </w:r>
+    </w:p>
+    <w:p>
+      <w:pPr>
+        <w:pStyle w:val="Heading1"/>
+        <w:pageBreakBefore/>
+      </w:pPr>
+      <w:r>
+        <w:rPr>
+          <w:rFonts w:ascii="等线" w:hAnsi="等线" w:eastAsia="等线"/>
+          <w:sz w:val="32"/>
+        </w:rPr>
+        <w:t>v1007 后台收件、朋友圈上下文与内心隐藏回归规则</w:t>
+      </w:r>
+    </w:p>
+    <w:p>
+      <w:pPr>
+        <w:spacing w:after="120" w:line="300" w:lineRule="auto"/>
+      </w:pPr>
+      <w:r>
+        <w:rPr>
+          <w:rFonts w:ascii="等线" w:hAnsi="等线" w:eastAsia="等线"/>
+          <w:sz w:val="21"/>
+        </w:rPr>
+        <w:t>APNs 接受只能证明通知投递阶段，不能证明消息已进入微信。服务器行必须在本地消息和本地回执都耐久化成功后才 ACK。</w:t>
+      </w:r>
+    </w:p>
+    <w:p>
+      <w:pPr>
+        <w:spacing w:after="120" w:line="300" w:lineRule="auto"/>
+      </w:pPr>
+      <w:r>
+        <w:rPr>
+          <w:rFonts w:ascii="等线" w:hAnsi="等线" w:eastAsia="等线"/>
+          <w:sz w:val="21"/>
+        </w:rPr>
+        <w:t>后台入站补偿必须复用真实 outbox 正文和稳定 ID，不得在本地构造一条看似成功的假消息；补偿窗口、收件回执容量和保留期必须明确受限。</w:t>
+      </w:r>
+    </w:p>
+    <w:p>
+      <w:pPr>
+        <w:spacing w:after="120" w:line="300" w:lineRule="auto"/>
+      </w:pPr>
+      <w:r>
+        <w:rPr>
+          <w:rFonts w:ascii="等线" w:hAnsi="等线" w:eastAsia="等线"/>
+          <w:sz w:val="21"/>
+        </w:rPr>
+        <w:t>朋友圈模型请求必须明确当前是评论区，并以标明说话人的真实微信私聊作为背景。不得用固定文字、本地模板或第二次假请求补齐回复。</w:t>
+      </w:r>
+    </w:p>
+    <w:p>
+      <w:pPr>
+        <w:spacing w:after="120" w:line="300" w:lineRule="auto"/>
+      </w:pPr>
+      <w:r>
+        <w:rPr>
+          <w:rFonts w:ascii="等线" w:hAnsi="等线" w:eastAsia="等线"/>
+          <w:sz w:val="21"/>
+        </w:rPr>
+        <w:t>内心想法的格式约束和出口过滤要同时存在。微信、朋友圈和通话的可见文本必须共用容错隐藏解析，禁止只依赖模型严格遵循 [内心|……]。</w:t>
+      </w:r>
+    </w:p>
+    <w:p>
+      <w:pPr>
+        <w:spacing w:after="120" w:line="300" w:lineRule="auto"/>
+      </w:pPr>
+      <w:r>
+        <w:rPr>
+          <w:rFonts w:ascii="等线" w:hAnsi="等线" w:eastAsia="等线"/>
+          <w:sz w:val="21"/>
+        </w:rPr>
+        <w:t>iOS WebKit 出现半屏、黑块、触摸失效或异常发热时，先检查合成层数量和后台轮询，不得先归因模型 API。iPhone 专用视觉降级不得扩散到 Android 或桌面网页；明确读取全部数据时仍必须执行真实 Screen Time／HealthKit 读取。</w:t>
+      </w:r>
+    </w:p>
+    <w:p>
+      <w:pPr>
+        <w:spacing w:after="120" w:line="300" w:lineRule="auto"/>
+      </w:pPr>
+      <w:r>
+        <w:rPr>
+          <w:rFonts w:ascii="等线" w:hAnsi="等线" w:eastAsia="等线"/>
+          <w:sz w:val="21"/>
+        </w:rPr>
+        <w:t>版本整理不得归一化全库换行或改写正则转义。必须运行完整回归、检查实际语义 diff，再重建 PhoneWeb.bundle。</w:t>
+      </w:r>
+    </w:p>
+    <w:p>
+      <w:pPr>
+        <w:spacing w:after="120" w:line="300" w:lineRule="auto"/>
+      </w:pPr>
+      <w:r>
+        <w:rPr>
+          <w:rFonts w:ascii="等线" w:hAnsi="等线" w:eastAsia="等线"/>
+          <w:sz w:val="21"/>
+        </w:rPr>
+        <w:t>Windows 自动化不能替代 Mac／Xcode 编译与真实 iPhone 验收；对已收到的某次 APNs 通知可以记录用户实测，但不得外推为全新安装包全链路已通过。</w:t>
       </w:r>
     </w:p>
     <w:sectPr>

</xml_diff>